<commit_message>
Expose peril ID in BSCR aggregate output
</commit_message>
<xml_diff>
--- a/reporting/docs/generated/BSCR-Jan-2026.docx
+++ b/reporting/docs/generated/BSCR-Jan-2026.docx
@@ -525,7 +525,7 @@
           <w:b w:val="0"/>
           <w:i w:val="0"/>
         </w:rPr>
-        <w:t xml:space="preserve">5. Export the aggregate result with these seven headers: </w:t>
+        <w:t xml:space="preserve">5. Export the aggregate result with these eight headers: </w:t>
       </w:r>
       <w:r>
         <w:rPr>
@@ -534,14 +534,78 @@
           <w:i w:val="0"/>
           <w:sz w:val="18"/>
         </w:rPr>
-        <w:t>cntrycode, bscr_entity, region, sum_pml, sum_net, count_policies, is_geocoded</w:t>
+        <w:t>cntrycode, bscr_entity, region, sum_pml, sum_net, count_policies, is_geocoded, peril_id</w:t>
       </w:r>
       <w:r>
         <w:rPr>
           <w:b w:val="0"/>
           <w:i w:val="0"/>
         </w:rPr>
-        <w:t>.</w:t>
+        <w:t xml:space="preserve">. </w:t>
+      </w:r>
+      <w:r>
+        <w:rPr>
+          <w:rFonts w:ascii="Courier New" w:hAnsi="Courier New"/>
+          <w:b w:val="0"/>
+          <w:i w:val="0"/>
+          <w:sz w:val="18"/>
+        </w:rPr>
+        <w:t>peril_id</w:t>
+      </w:r>
+      <w:r>
+        <w:rPr>
+          <w:b w:val="0"/>
+          <w:i w:val="0"/>
+        </w:rPr>
+        <w:t xml:space="preserve"> is explicit: </w:t>
+      </w:r>
+      <w:r>
+        <w:rPr>
+          <w:rFonts w:ascii="Courier New" w:hAnsi="Courier New"/>
+          <w:b w:val="0"/>
+          <w:i w:val="0"/>
+          <w:sz w:val="18"/>
+        </w:rPr>
+        <w:t>1</w:t>
+      </w:r>
+      <w:r>
+        <w:rPr>
+          <w:b w:val="0"/>
+          <w:i w:val="0"/>
+        </w:rPr>
+        <w:t xml:space="preserve"> for earthquake (including </w:t>
+      </w:r>
+      <w:r>
+        <w:rPr>
+          <w:rFonts w:ascii="Courier New" w:hAnsi="Courier New"/>
+          <w:b w:val="0"/>
+          <w:i w:val="0"/>
+          <w:sz w:val="18"/>
+        </w:rPr>
+        <w:t>ALL</w:t>
+      </w:r>
+      <w:r>
+        <w:rPr>
+          <w:b w:val="0"/>
+          <w:i w:val="0"/>
+        </w:rPr>
+        <w:t xml:space="preserve">), </w:t>
+      </w:r>
+      <w:r>
+        <w:rPr>
+          <w:rFonts w:ascii="Courier New" w:hAnsi="Courier New"/>
+          <w:b w:val="0"/>
+          <w:i w:val="0"/>
+          <w:sz w:val="18"/>
+        </w:rPr>
+        <w:t>2</w:t>
+      </w:r>
+      <w:r>
+        <w:rPr>
+          <w:b w:val="0"/>
+          <w:i w:val="0"/>
+        </w:rPr>
+        <w:t xml:space="preserve"> for wind.</w:t>
       </w:r>
     </w:p>
     <w:p>
@@ -1407,21 +1471,21 @@
           <w:b w:val="0"/>
           <w:i w:val="0"/>
         </w:rPr>
-        <w:t xml:space="preserve">3. Load the </w:t>
+        <w:t xml:space="preserve">3. Load only the </w:t>
       </w:r>
       <w:r>
         <w:rPr>
           <w:b/>
           <w:i w:val="0"/>
         </w:rPr>
-        <w:t>seven-column aggregate</w:t>
+        <w:t>first seven columns of the aggregate</w:t>
       </w:r>
       <w:r>
         <w:rPr>
           <w:b w:val="0"/>
           <w:i w:val="0"/>
         </w:rPr>
-        <w:t xml:space="preserve">, not the eight-column raw export, into </w:t>
+        <w:t xml:space="preserve">, not the raw export, into </w:t>
       </w:r>
       <w:r>
         <w:rPr>
@@ -1437,7 +1501,23 @@
           <w:b w:val="0"/>
           <w:i w:val="0"/>
         </w:rPr>
-        <w:t xml:space="preserve"> with headers in row 1. Clear stale controlled input rows. First adapt the currency formulas as described below; preserve unrelated worksheet content.</w:t>
+        <w:t xml:space="preserve"> with headers in row 1. Preserve the eighth column (</w:t>
+      </w:r>
+      <w:r>
+        <w:rPr>
+          <w:rFonts w:ascii="Courier New" w:hAnsi="Courier New"/>
+          <w:b w:val="0"/>
+          <w:i w:val="0"/>
+          <w:sz w:val="18"/>
+        </w:rPr>
+        <w:t>peril_id</w:t>
+      </w:r>
+      <w:r>
+        <w:rPr>
+          <w:b w:val="0"/>
+          <w:i w:val="0"/>
+        </w:rPr>
+        <w:t>) in the CSV for audit; do not paste it into H, which contains workbook formulas. Clear stale controlled input rows. First adapt the currency formulas as described below; preserve unrelated worksheet content.</w:t>
       </w:r>
     </w:p>
     <w:p>

</xml_diff>

<commit_message>
Replace single-peril raw extract with full BSCR aggregate variant
</commit_message>
<xml_diff>
--- a/reporting/docs/generated/BSCR-Jan-2026.docx
+++ b/reporting/docs/generated/BSCR-Jan-2026.docx
@@ -116,6 +116,159 @@
           <w:i w:val="0"/>
         </w:rPr>
         <w:t xml:space="preserve"> before production use.</w:t>
+      </w:r>
+    </w:p>
+    <w:p>
+      <w:r>
+        <w:rPr>
+          <w:b w:val="0"/>
+          <w:i w:val="0"/>
+        </w:rPr>
+        <w:t xml:space="preserve">For a single-peril comparison, use </w:t>
+      </w:r>
+      <w:r>
+        <w:rPr>
+          <w:rFonts w:ascii="Courier New" w:hAnsi="Courier New"/>
+          <w:b w:val="0"/>
+          <w:i w:val="0"/>
+          <w:sz w:val="18"/>
+        </w:rPr>
+        <w:t>bscr/sql/bscr-output-peril1.sql</w:t>
+      </w:r>
+      <w:r>
+        <w:rPr>
+          <w:b w:val="0"/>
+          <w:i w:val="0"/>
+        </w:rPr>
+        <w:t xml:space="preserve">. It runs the full aggregate calculation with </w:t>
+      </w:r>
+      <w:r>
+        <w:rPr>
+          <w:rFonts w:ascii="Courier New" w:hAnsi="Courier New"/>
+          <w:b w:val="0"/>
+          <w:i w:val="0"/>
+          <w:sz w:val="18"/>
+        </w:rPr>
+        <w:t>peril = 1</w:t>
+      </w:r>
+      <w:r>
+        <w:rPr>
+          <w:b w:val="0"/>
+          <w:i w:val="0"/>
+        </w:rPr>
+        <w:t xml:space="preserve"> and </w:t>
+      </w:r>
+      <w:r>
+        <w:rPr>
+          <w:rFonts w:ascii="Courier New" w:hAnsi="Courier New"/>
+          <w:b w:val="0"/>
+          <w:i w:val="0"/>
+          <w:sz w:val="18"/>
+        </w:rPr>
+        <w:t>policytype = 1</w:t>
+      </w:r>
+      <w:r>
+        <w:rPr>
+          <w:b w:val="0"/>
+          <w:i w:val="0"/>
+        </w:rPr>
+        <w:t xml:space="preserve"> for every region, including </w:t>
+      </w:r>
+      <w:r>
+        <w:rPr>
+          <w:rFonts w:ascii="Courier New" w:hAnsi="Courier New"/>
+          <w:b w:val="0"/>
+          <w:i w:val="0"/>
+          <w:sz w:val="18"/>
+        </w:rPr>
+        <w:t>is_nahu</w:t>
+      </w:r>
+      <w:r>
+        <w:rPr>
+          <w:b w:val="0"/>
+          <w:i w:val="0"/>
+        </w:rPr>
+        <w:t xml:space="preserve">, </w:t>
+      </w:r>
+      <w:r>
+        <w:rPr>
+          <w:rFonts w:ascii="Courier New" w:hAnsi="Courier New"/>
+          <w:b w:val="0"/>
+          <w:i w:val="0"/>
+          <w:sz w:val="18"/>
+        </w:rPr>
+        <w:t>is_eu</w:t>
+      </w:r>
+      <w:r>
+        <w:rPr>
+          <w:b w:val="0"/>
+          <w:i w:val="0"/>
+        </w:rPr>
+        <w:t xml:space="preserve"> and </w:t>
+      </w:r>
+      <w:r>
+        <w:rPr>
+          <w:rFonts w:ascii="Courier New" w:hAnsi="Courier New"/>
+          <w:b w:val="0"/>
+          <w:i w:val="0"/>
+          <w:sz w:val="18"/>
+        </w:rPr>
+        <w:t>is_jp</w:t>
+      </w:r>
+      <w:r>
+        <w:rPr>
+          <w:b w:val="0"/>
+          <w:i w:val="0"/>
+        </w:rPr>
+        <w:t xml:space="preserve">. Those labels therefore contain earthquake exposure in this variant, not wind. FX, retention, entity filtering and the eight-column aggregate output are retained; </w:t>
+      </w:r>
+      <w:r>
+        <w:rPr>
+          <w:rFonts w:ascii="Courier New" w:hAnsi="Courier New"/>
+          <w:b w:val="0"/>
+          <w:i w:val="0"/>
+          <w:sz w:val="18"/>
+        </w:rPr>
+        <w:t>peril_id</w:t>
+      </w:r>
+      <w:r>
+        <w:rPr>
+          <w:b w:val="0"/>
+          <w:i w:val="0"/>
+        </w:rPr>
+        <w:t xml:space="preserve"> is always </w:t>
+      </w:r>
+      <w:r>
+        <w:rPr>
+          <w:rFonts w:ascii="Courier New" w:hAnsi="Courier New"/>
+          <w:b w:val="0"/>
+          <w:i w:val="0"/>
+          <w:sz w:val="18"/>
+        </w:rPr>
+        <w:t>1</w:t>
+      </w:r>
+      <w:r>
+        <w:rPr>
+          <w:b w:val="0"/>
+          <w:i w:val="0"/>
+        </w:rPr>
+        <w:t xml:space="preserve">. This replaces the mistakenly supplied </w:t>
+      </w:r>
+      <w:r>
+        <w:rPr>
+          <w:rFonts w:ascii="Courier New" w:hAnsi="Courier New"/>
+          <w:b w:val="0"/>
+          <w:i w:val="0"/>
+          <w:sz w:val="18"/>
+        </w:rPr>
+        <w:t>bscr-extract-peril1.sql</w:t>
+      </w:r>
+      <w:r>
+        <w:rPr>
+          <w:b w:val="0"/>
+          <w:i w:val="0"/>
+        </w:rPr>
+        <w:t xml:space="preserve"> raw extract. The main dual-peril queries are unchanged.</w:t>
       </w:r>
     </w:p>
     <w:p>

</xml_diff>

<commit_message>
Add BSCR reconciliation workbooks and EDM SQL exports
</commit_message>
<xml_diff>
--- a/reporting/docs/generated/BSCR-Jan-2026.docx
+++ b/reporting/docs/generated/BSCR-Jan-2026.docx
@@ -272,7 +272,7 @@
       </w:r>
     </w:p>
     <w:p>
-      <w:bookmarkStart w:id="2" w:name="bm_bscr_runbook_run_the_two_sql_exports"/>
+      <w:bookmarkStart w:id="2" w:name="bm_bscr_runbook_historical_workbook_reconciliation"/>
       <w:pPr>
         <w:pStyle w:val="Heading2"/>
         <w:keepNext/>
@@ -282,7 +282,7 @@
           <w:b w:val="0"/>
           <w:i w:val="0"/>
         </w:rPr>
-        <w:t>Run the two SQL exports</w:t>
+        <w:t>Historical workbook reconciliation</w:t>
       </w:r>
       <w:bookmarkEnd w:id="2"/>
     </w:p>
@@ -292,7 +292,7 @@
           <w:b w:val="0"/>
           <w:i w:val="0"/>
         </w:rPr>
-        <w:t xml:space="preserve">1. In an approved SQL Server client, select the approved EDM database and run </w:t>
+        <w:t xml:space="preserve">The supplied files in </w:t>
       </w:r>
       <w:r>
         <w:rPr>
@@ -301,14 +301,14 @@
           <w:i w:val="0"/>
           <w:sz w:val="18"/>
         </w:rPr>
-        <w:t>bscr/sql/bscr-extract.sql</w:t>
+        <w:t>bscr/reconcile/</w:t>
       </w:r>
       <w:r>
         <w:rPr>
           <w:b w:val="0"/>
           <w:i w:val="0"/>
         </w:rPr>
-        <w:t xml:space="preserve">. Its </w:t>
+        <w:t xml:space="preserve"> are candidate historical evidence, not confirmed submissions. The detailed comparison is </w:t>
       </w:r>
       <w:r>
         <w:rPr>
@@ -317,14 +317,23 @@
           <w:i w:val="0"/>
           <w:sz w:val="18"/>
         </w:rPr>
-        <w:t>peril_selection</w:t>
+        <w:t>bscr/reconcile/results/bscr_workbook_collection_reconciliation.xlsx</w:t>
       </w:r>
       <w:r>
         <w:rPr>
           <w:b w:val="0"/>
           <w:i w:val="0"/>
         </w:rPr>
-        <w:t xml:space="preserve"> selects peril 1 (earthquake) and 2 (wind) together. Both use the single </w:t>
+        <w:t>; its companion CSVs record every template version change, cached error, regional limit comparison, file hash, and control total.</w:t>
+      </w:r>
+    </w:p>
+    <w:p>
+      <w:r>
+        <w:rPr>
+          <w:b w:val="0"/>
+          <w:i w:val="0"/>
+        </w:rPr>
+        <w:t xml:space="preserve">• </w:t>
       </w:r>
       <w:r>
         <w:rPr>
@@ -333,14 +342,30 @@
           <w:i w:val="0"/>
           <w:sz w:val="18"/>
         </w:rPr>
-        <w:t>@policy_type = 1</w:t>
+        <w:t>workings_old_report.xlsx</w:t>
       </w:r>
       <w:r>
         <w:rPr>
           <w:b w:val="0"/>
           <w:i w:val="0"/>
         </w:rPr>
-        <w:t xml:space="preserve"> filter: confirm that policy population is appropriate for both perils; the query does not select a separate policy type per peril.</w:t>
+        <w:t xml:space="preserve"> is byte-identical to </w:t>
+      </w:r>
+      <w:r>
+        <w:rPr>
+          <w:rFonts w:ascii="Courier New" w:hAnsi="Courier New"/>
+          <w:b w:val="0"/>
+          <w:i w:val="0"/>
+          <w:sz w:val="18"/>
+        </w:rPr>
+        <w:t>Workings_with_geocodingFW.xlsx</w:t>
+      </w:r>
+      <w:r>
+        <w:rPr>
+          <w:b w:val="0"/>
+          <w:i w:val="0"/>
+        </w:rPr>
+        <w:t>.</w:t>
       </w:r>
     </w:p>
     <w:p>
@@ -349,7 +374,7 @@
           <w:b w:val="0"/>
           <w:i w:val="0"/>
         </w:rPr>
-        <w:t xml:space="preserve">2. Export the raw/source result with these eight headers, in order: </w:t>
+        <w:t xml:space="preserve">• </w:t>
       </w:r>
       <w:r>
         <w:rPr>
@@ -358,14 +383,14 @@
           <w:i w:val="0"/>
           <w:sz w:val="18"/>
         </w:rPr>
-        <w:t>pml, accgrpid, uwritrname, state, userid1, cntrycode, is_geocoded, peril_id</w:t>
+        <w:t>Workings_with_geocoding.xlsx</w:t>
       </w:r>
       <w:r>
         <w:rPr>
           <w:b w:val="0"/>
           <w:i w:val="0"/>
         </w:rPr>
-        <w:t>. These are already capped account/geography aggregates, not location or individual-policy detail.</w:t>
+        <w:t xml:space="preserve"> and the FW version have the same 47 raw output rows. The first divides by 1,000; FW divides by 1,000,000.</w:t>
       </w:r>
     </w:p>
     <w:p>
@@ -374,7 +399,7 @@
           <w:b w:val="0"/>
           <w:i w:val="0"/>
         </w:rPr>
-        <w:t xml:space="preserve">3. Run </w:t>
+        <w:t xml:space="preserve">• </w:t>
       </w:r>
       <w:r>
         <w:rPr>
@@ -383,28 +408,14 @@
           <w:i w:val="0"/>
           <w:sz w:val="18"/>
         </w:rPr>
-        <w:t>bscr/sql/bscr-output.sql</w:t>
+        <w:t>Workings_with_geocodingFW - Including blanks USD.xlsx</w:t>
       </w:r>
       <w:r>
         <w:rPr>
           <w:b w:val="0"/>
           <w:i w:val="0"/>
         </w:rPr>
-        <w:t xml:space="preserve"> against the </w:t>
-      </w:r>
-      <w:r>
-        <w:rPr>
-          <w:b/>
-          <w:i w:val="0"/>
-        </w:rPr>
-        <w:t>same snapshot</w:t>
-      </w:r>
-      <w:r>
-        <w:rPr>
-          <w:b w:val="0"/>
-          <w:i w:val="0"/>
-        </w:rPr>
-        <w:t xml:space="preserve"> and peril selection. It matches policy type to each peril rather than using the extract's single </w:t>
+        <w:t xml:space="preserve"> restores US exposure to NA hurricane, has 49 output groups, and explicitly applies 1.35 FX followed by division by 1,000,000. Its static output sheet is not linked to </w:t>
       </w:r>
       <w:r>
         <w:rPr>
@@ -413,14 +424,32 @@
           <w:i w:val="0"/>
           <w:sz w:val="18"/>
         </w:rPr>
-        <w:t>@policy_type</w:t>
+        <w:t>Sheet1</w:t>
       </w:r>
       <w:r>
         <w:rPr>
           <w:b w:val="0"/>
           <w:i w:val="0"/>
         </w:rPr>
-        <w:t xml:space="preserve">. It independently calculates the source exposure; it does not read the raw CSV. Leave </w:t>
+        <w:t>; a GB/HIC amount differs between those populations.</w:t>
+      </w:r>
+    </w:p>
+    <w:p>
+      <w:r>
+        <w:rPr>
+          <w:b w:val="0"/>
+          <w:i w:val="0"/>
+        </w:rPr>
+        <w:t>• The February corrected template family is the 33 original plus the four other entities' v2 files. Their total counts and source amounts divided by 1,000 match the workings, despite template US$M labels.</w:t>
+      </w:r>
+    </w:p>
+    <w:p>
+      <w:r>
+        <w:rPr>
+          <w:b w:val="0"/>
+          <w:i w:val="0"/>
+        </w:rPr>
+        <w:t xml:space="preserve">• The five top-level April templates retain the historical total counts. All 46 populated regional gross/net limit cells match the later USD workings within USD 1; four 3624 Japan cells are blank with no source rows. Overall limits are rounded, and modelability categories are reallocated. Do not equate those categories directly with </w:t>
       </w:r>
       <w:r>
         <w:rPr>
@@ -429,87 +458,7 @@
           <w:i w:val="0"/>
           <w:sz w:val="18"/>
         </w:rPr>
-        <w:t>@bscr_entity = NULL</w:t>
-      </w:r>
-      <w:r>
-        <w:rPr>
-          <w:b w:val="0"/>
-          <w:i w:val="0"/>
-        </w:rPr>
-        <w:t xml:space="preserve"> for all entities, including unmapped NULL entities, or set a quoted value such as </w:t>
-      </w:r>
-      <w:r>
-        <w:rPr>
-          <w:rFonts w:ascii="Courier New" w:hAnsi="Courier New"/>
-          <w:b w:val="0"/>
-          <w:i w:val="0"/>
-          <w:sz w:val="18"/>
-        </w:rPr>
-        <w:t>'HIC'</w:t>
-      </w:r>
-      <w:r>
-        <w:rPr>
-          <w:b w:val="0"/>
-          <w:i w:val="0"/>
-        </w:rPr>
-        <w:t xml:space="preserve">, </w:t>
-      </w:r>
-      <w:r>
-        <w:rPr>
-          <w:rFonts w:ascii="Courier New" w:hAnsi="Courier New"/>
-          <w:b w:val="0"/>
-          <w:i w:val="0"/>
-          <w:sz w:val="18"/>
-        </w:rPr>
-        <w:t>'33'</w:t>
-      </w:r>
-      <w:r>
-        <w:rPr>
-          <w:b w:val="0"/>
-          <w:i w:val="0"/>
-        </w:rPr>
-        <w:t xml:space="preserve">, </w:t>
-      </w:r>
-      <w:r>
-        <w:rPr>
-          <w:rFonts w:ascii="Courier New" w:hAnsi="Courier New"/>
-          <w:b w:val="0"/>
-          <w:i w:val="0"/>
-          <w:sz w:val="18"/>
-        </w:rPr>
-        <w:t>'HIG'</w:t>
-      </w:r>
-      <w:r>
-        <w:rPr>
-          <w:b w:val="0"/>
-          <w:i w:val="0"/>
-        </w:rPr>
-        <w:t xml:space="preserve">, </w:t>
-      </w:r>
-      <w:r>
-        <w:rPr>
-          <w:rFonts w:ascii="Courier New" w:hAnsi="Courier New"/>
-          <w:b w:val="0"/>
-          <w:i w:val="0"/>
-          <w:sz w:val="18"/>
-        </w:rPr>
-        <w:t>'HSA'</w:t>
-      </w:r>
-      <w:r>
-        <w:rPr>
-          <w:b w:val="0"/>
-          <w:i w:val="0"/>
-        </w:rPr>
-        <w:t xml:space="preserve">, or </w:t>
-      </w:r>
-      <w:r>
-        <w:rPr>
-          <w:rFonts w:ascii="Courier New" w:hAnsi="Courier New"/>
-          <w:b w:val="0"/>
-          <w:i w:val="0"/>
-          <w:sz w:val="18"/>
-        </w:rPr>
-        <w:t>'3624'</w:t>
+        <w:t>is_geocoded</w:t>
       </w:r>
       <w:r>
         <w:rPr>
@@ -525,253 +474,11 @@
           <w:b w:val="0"/>
           <w:i w:val="0"/>
         </w:rPr>
-        <w:t xml:space="preserve">4. Confirm </w:t>
-      </w:r>
-      <w:r>
-        <w:rPr>
-          <w:rFonts w:ascii="Courier New" w:hAnsi="Courier New"/>
-          <w:b w:val="0"/>
-          <w:i w:val="0"/>
-          <w:sz w:val="18"/>
-        </w:rPr>
-        <w:t>@qs_pct_retention</w:t>
-      </w:r>
-      <w:r>
-        <w:rPr>
-          <w:b w:val="0"/>
-          <w:i w:val="0"/>
-        </w:rPr>
-        <w:t xml:space="preserve"> and </w:t>
-      </w:r>
-      <w:r>
-        <w:rPr>
-          <w:rFonts w:ascii="Courier New" w:hAnsi="Courier New"/>
-          <w:b w:val="0"/>
-          <w:i w:val="0"/>
-          <w:sz w:val="18"/>
-        </w:rPr>
-        <w:t>@srp_pct_retention</w:t>
-      </w:r>
-      <w:r>
-        <w:rPr>
-          <w:b w:val="0"/>
-          <w:i w:val="0"/>
-        </w:rPr>
-        <w:t xml:space="preserve"> (</w:t>
-      </w:r>
-      <w:r>
-        <w:rPr>
-          <w:rFonts w:ascii="Courier New" w:hAnsi="Courier New"/>
-          <w:b w:val="0"/>
-          <w:i w:val="0"/>
-          <w:sz w:val="18"/>
-        </w:rPr>
-        <w:t>0.5</w:t>
-      </w:r>
-      <w:r>
-        <w:rPr>
-          <w:b w:val="0"/>
-          <w:i w:val="0"/>
-        </w:rPr>
-        <w:t xml:space="preserve"> and </w:t>
-      </w:r>
-      <w:r>
-        <w:rPr>
-          <w:rFonts w:ascii="Courier New" w:hAnsi="Courier New"/>
-          <w:b w:val="0"/>
-          <w:i w:val="0"/>
-          <w:sz w:val="18"/>
-        </w:rPr>
-        <w:t>0.3333</w:t>
-      </w:r>
-      <w:r>
-        <w:rPr>
-          <w:b w:val="0"/>
-          <w:i w:val="0"/>
-        </w:rPr>
-        <w:t xml:space="preserve">). They are retained fractions, not percentages to divide by 100. A literal </w:t>
-      </w:r>
-      <w:r>
-        <w:rPr>
-          <w:rFonts w:ascii="Courier New" w:hAnsi="Courier New"/>
-          <w:b w:val="0"/>
-          <w:i w:val="0"/>
-          <w:sz w:val="18"/>
-        </w:rPr>
-        <w:t>_QS</w:t>
-      </w:r>
-      <w:r>
-        <w:rPr>
-          <w:b w:val="0"/>
-          <w:i w:val="0"/>
-        </w:rPr>
-        <w:t xml:space="preserve"> marker in </w:t>
-      </w:r>
-      <w:r>
-        <w:rPr>
-          <w:rFonts w:ascii="Courier New" w:hAnsi="Courier New"/>
-          <w:b w:val="0"/>
-          <w:i w:val="0"/>
-          <w:sz w:val="18"/>
-        </w:rPr>
-        <w:t>userid1</w:t>
-      </w:r>
-      <w:r>
-        <w:rPr>
-          <w:b w:val="0"/>
-          <w:i w:val="0"/>
-        </w:rPr>
-        <w:t xml:space="preserve"> takes precedence over </w:t>
-      </w:r>
-      <w:r>
-        <w:rPr>
-          <w:rFonts w:ascii="Courier New" w:hAnsi="Courier New"/>
-          <w:b w:val="0"/>
-          <w:i w:val="0"/>
-          <w:sz w:val="18"/>
-        </w:rPr>
-        <w:t>_SRP</w:t>
-      </w:r>
-      <w:r>
-        <w:rPr>
-          <w:b w:val="0"/>
-          <w:i w:val="0"/>
-        </w:rPr>
-        <w:t xml:space="preserve">; other rows retain the full amount. Set </w:t>
-      </w:r>
-      <w:r>
-        <w:rPr>
-          <w:rFonts w:ascii="Courier New" w:hAnsi="Courier New"/>
-          <w:b w:val="0"/>
-          <w:i w:val="0"/>
-          <w:sz w:val="18"/>
-        </w:rPr>
-        <w:t>@gbp_to_usd</w:t>
-      </w:r>
-      <w:r>
-        <w:rPr>
-          <w:b w:val="0"/>
-          <w:i w:val="0"/>
-        </w:rPr>
-        <w:t xml:space="preserve"> to the approved USD-per-GBP rate (default </w:t>
-      </w:r>
-      <w:r>
-        <w:rPr>
-          <w:rFonts w:ascii="Courier New" w:hAnsi="Courier New"/>
-          <w:b w:val="0"/>
-          <w:i w:val="0"/>
-          <w:sz w:val="18"/>
-        </w:rPr>
-        <w:t>1.35</w:t>
-      </w:r>
-      <w:r>
-        <w:rPr>
-          <w:b w:val="0"/>
-          <w:i w:val="0"/>
-        </w:rPr>
-        <w:t>). The final SELECT converts gross/net amounts to full USD; counts and grouping are unchanged. No division by 1,000,000 is applied in SQL.</w:t>
+        <w:t>• The templates still contain external links, cached errors and nonnumeric EP-curve placeholders. Premiums, modelability judgments and actual submission status need independent evidence.</w:t>
       </w:r>
     </w:p>
     <w:p>
-      <w:r>
-        <w:rPr>
-          <w:b w:val="0"/>
-          <w:i w:val="0"/>
-        </w:rPr>
-        <w:t xml:space="preserve">5. Export the aggregate result with these eight headers: </w:t>
-      </w:r>
-      <w:r>
-        <w:rPr>
-          <w:rFonts w:ascii="Courier New" w:hAnsi="Courier New"/>
-          <w:b w:val="0"/>
-          <w:i w:val="0"/>
-          <w:sz w:val="18"/>
-        </w:rPr>
-        <w:t>cntrycode, bscr_entity, region, sum_pml, sum_net, count_policies, is_geocoded, peril_id</w:t>
-      </w:r>
-      <w:r>
-        <w:rPr>
-          <w:b w:val="0"/>
-          <w:i w:val="0"/>
-        </w:rPr>
-        <w:t xml:space="preserve">. </w:t>
-      </w:r>
-      <w:r>
-        <w:rPr>
-          <w:rFonts w:ascii="Courier New" w:hAnsi="Courier New"/>
-          <w:b w:val="0"/>
-          <w:i w:val="0"/>
-          <w:sz w:val="18"/>
-        </w:rPr>
-        <w:t>peril_id</w:t>
-      </w:r>
-      <w:r>
-        <w:rPr>
-          <w:b w:val="0"/>
-          <w:i w:val="0"/>
-        </w:rPr>
-        <w:t xml:space="preserve"> is explicit: </w:t>
-      </w:r>
-      <w:r>
-        <w:rPr>
-          <w:rFonts w:ascii="Courier New" w:hAnsi="Courier New"/>
-          <w:b w:val="0"/>
-          <w:i w:val="0"/>
-          <w:sz w:val="18"/>
-        </w:rPr>
-        <w:t>1</w:t>
-      </w:r>
-      <w:r>
-        <w:rPr>
-          <w:b w:val="0"/>
-          <w:i w:val="0"/>
-        </w:rPr>
-        <w:t xml:space="preserve"> for earthquake (including </w:t>
-      </w:r>
-      <w:r>
-        <w:rPr>
-          <w:rFonts w:ascii="Courier New" w:hAnsi="Courier New"/>
-          <w:b w:val="0"/>
-          <w:i w:val="0"/>
-          <w:sz w:val="18"/>
-        </w:rPr>
-        <w:t>ALL</w:t>
-      </w:r>
-      <w:r>
-        <w:rPr>
-          <w:b w:val="0"/>
-          <w:i w:val="0"/>
-        </w:rPr>
-        <w:t xml:space="preserve">), </w:t>
-      </w:r>
-      <w:r>
-        <w:rPr>
-          <w:rFonts w:ascii="Courier New" w:hAnsi="Courier New"/>
-          <w:b w:val="0"/>
-          <w:i w:val="0"/>
-          <w:sz w:val="18"/>
-        </w:rPr>
-        <w:t>2</w:t>
-      </w:r>
-      <w:r>
-        <w:rPr>
-          <w:b w:val="0"/>
-          <w:i w:val="0"/>
-        </w:rPr>
-        <w:t xml:space="preserve"> for wind.</w:t>
-      </w:r>
-    </w:p>
-    <w:p>
-      <w:r>
-        <w:rPr>
-          <w:b w:val="0"/>
-          <w:i w:val="0"/>
-        </w:rPr>
-        <w:t>6. Preserve both SQL files, parameter values, exports, row counts, totals and source-snapshot identity together. A successful export does not resolve the policy-grain or workbook defects below.</w:t>
-      </w:r>
-    </w:p>
-    <w:p>
-      <w:bookmarkStart w:id="3" w:name="bm_bscr_runbook_understand_and_reconcile_the_output"/>
+      <w:bookmarkStart w:id="3" w:name="bm_bscr_runbook_export_raw_edm_data_for_local_diagnosis"/>
       <w:pPr>
         <w:pStyle w:val="Heading2"/>
         <w:keepNext/>
@@ -781,9 +488,1308 @@
           <w:b w:val="0"/>
           <w:i w:val="0"/>
         </w:rPr>
+        <w:t>Export raw EDM data for local diagnosis</w:t>
+      </w:r>
+      <w:bookmarkEnd w:id="3"/>
+    </w:p>
+    <w:p>
+      <w:r>
+        <w:rPr>
+          <w:b w:val="0"/>
+          <w:i w:val="0"/>
+        </w:rPr>
+        <w:t xml:space="preserve">The aggregate exports cannot explain changes at policy/location level. Use </w:t>
+      </w:r>
+      <w:r>
+        <w:rPr>
+          <w:rFonts w:ascii="Courier New" w:hAnsi="Courier New"/>
+          <w:b w:val="0"/>
+          <w:i w:val="0"/>
+          <w:sz w:val="18"/>
+        </w:rPr>
+        <w:t>bscr/sql/bscr-edm-raw-export.sql</w:t>
+      </w:r>
+      <w:r>
+        <w:rPr>
+          <w:b w:val="0"/>
+          <w:i w:val="0"/>
+        </w:rPr>
+        <w:t xml:space="preserve"> on the same approved EDM snapshot as the comparison outputs. It reads source tables only; it does not modify data or enable database settings. It requires existing SNAPSHOT isolation or an immutable read-only database/database snapshot. Otherwise it stops. Use a standalone connection and discard partial results if the batch fails.</w:t>
+      </w:r>
+    </w:p>
+    <w:p>
+      <w:r>
+        <w:rPr>
+          <w:b w:val="0"/>
+          <w:i w:val="0"/>
+        </w:rPr>
+        <w:t xml:space="preserve">Save its six resultsets as UTF-8 CSVs with headers, in a controlled directory outside Git, for example </w:t>
+      </w:r>
+      <w:r>
+        <w:rPr>
+          <w:rFonts w:ascii="Courier New" w:hAnsi="Courier New"/>
+          <w:b w:val="0"/>
+          <w:i w:val="0"/>
+          <w:sz w:val="18"/>
+        </w:rPr>
+        <w:t>$HOME/bscr-edm/snapshot</w:t>
+      </w:r>
+      <w:r>
+        <w:rPr>
+          <w:b w:val="0"/>
+          <w:i w:val="0"/>
+        </w:rPr>
+        <w:t>:</w:t>
+      </w:r>
+    </w:p>
+    <w:tbl>
+      <w:tblPr>
+        <w:tblStyle w:val="TableGrid"/>
+        <w:tblW w:type="auto" w:w="0"/>
+        <w:tblLook w:firstColumn="1" w:firstRow="1" w:lastColumn="0" w:lastRow="0" w:noHBand="0" w:noVBand="1" w:val="04A0"/>
+      </w:tblPr>
+      <w:tblGrid>
+        <w:gridCol w:w="5040"/>
+        <w:gridCol w:w="5040"/>
+      </w:tblGrid>
+      <w:tr>
+        <w:tc>
+          <w:tcPr>
+            <w:tcW w:type="dxa" w:w="5040"/>
+            <w:shd w:fill="D9EAF7"/>
+          </w:tcPr>
+          <w:p>
+            <w:r>
+              <w:rPr>
+                <w:b/>
+              </w:rPr>
+            </w:r>
+            <w:r>
+              <w:rPr>
+                <w:b/>
+                <w:i w:val="0"/>
+              </w:rPr>
+              <w:t>File</w:t>
+            </w:r>
+          </w:p>
+        </w:tc>
+        <w:tc>
+          <w:tcPr>
+            <w:tcW w:type="dxa" w:w="5040"/>
+            <w:shd w:fill="D9EAF7"/>
+          </w:tcPr>
+          <w:p>
+            <w:r>
+              <w:rPr>
+                <w:b/>
+              </w:rPr>
+            </w:r>
+            <w:r>
+              <w:rPr>
+                <w:b/>
+                <w:i w:val="0"/>
+              </w:rPr>
+              <w:t>Content and scope</w:t>
+            </w:r>
+          </w:p>
+        </w:tc>
+      </w:tr>
+      <w:tr>
+        <w:tc>
+          <w:tcPr>
+            <w:tcW w:type="dxa" w:w="5040"/>
+          </w:tcPr>
+          <w:p>
+            <w:r/>
+            <w:r>
+              <w:rPr>
+                <w:rFonts w:ascii="Courier New" w:hAnsi="Courier New"/>
+                <w:b w:val="0"/>
+                <w:i w:val="0"/>
+                <w:sz w:val="18"/>
+              </w:rPr>
+              <w:t>manifest.csv</w:t>
+            </w:r>
+          </w:p>
+        </w:tc>
+        <w:tc>
+          <w:tcPr>
+            <w:tcW w:type="dxa" w:w="5040"/>
+          </w:tcPr>
+          <w:p>
+            <w:r/>
+            <w:r>
+              <w:rPr>
+                <w:b w:val="0"/>
+                <w:i w:val="0"/>
+              </w:rPr>
+              <w:t>Run ID, server/database, UTC start, isolation, four source counts and scopes</w:t>
+            </w:r>
+          </w:p>
+        </w:tc>
+      </w:tr>
+      <w:tr>
+        <w:tc>
+          <w:tcPr>
+            <w:tcW w:type="dxa" w:w="5040"/>
+          </w:tcPr>
+          <w:p>
+            <w:r/>
+            <w:r>
+              <w:rPr>
+                <w:rFonts w:ascii="Courier New" w:hAnsi="Courier New"/>
+                <w:b w:val="0"/>
+                <w:i w:val="0"/>
+                <w:sz w:val="18"/>
+              </w:rPr>
+              <w:t>schema.csv</w:t>
+            </w:r>
+          </w:p>
+        </w:tc>
+        <w:tc>
+          <w:tcPr>
+            <w:tcW w:type="dxa" w:w="5040"/>
+          </w:tcPr>
+          <w:p>
+            <w:r/>
+            <w:r>
+              <w:rPr>
+                <w:b w:val="0"/>
+                <w:i w:val="0"/>
+              </w:rPr>
+              <w:t>Actual source column types, precision, scale and nullability</w:t>
+            </w:r>
+          </w:p>
+        </w:tc>
+      </w:tr>
+      <w:tr>
+        <w:tc>
+          <w:tcPr>
+            <w:tcW w:type="dxa" w:w="5040"/>
+          </w:tcPr>
+          <w:p>
+            <w:r/>
+            <w:r>
+              <w:rPr>
+                <w:rFonts w:ascii="Courier New" w:hAnsi="Courier New"/>
+                <w:b w:val="0"/>
+                <w:i w:val="0"/>
+                <w:sz w:val="18"/>
+              </w:rPr>
+              <w:t>accgrp.csv</w:t>
+            </w:r>
+          </w:p>
+        </w:tc>
+        <w:tc>
+          <w:tcPr>
+            <w:tcW w:type="dxa" w:w="5040"/>
+          </w:tcPr>
+          <w:p>
+            <w:r/>
+            <w:r>
+              <w:rPr>
+                <w:b w:val="0"/>
+                <w:i w:val="0"/>
+              </w:rPr>
+              <w:t>All account IDs, entity/treaty marker, branch and underwriter</w:t>
+            </w:r>
+          </w:p>
+        </w:tc>
+      </w:tr>
+      <w:tr>
+        <w:tc>
+          <w:tcPr>
+            <w:tcW w:type="dxa" w:w="5040"/>
+          </w:tcPr>
+          <w:p>
+            <w:r/>
+            <w:r>
+              <w:rPr>
+                <w:rFonts w:ascii="Courier New" w:hAnsi="Courier New"/>
+                <w:b w:val="0"/>
+                <w:i w:val="0"/>
+                <w:sz w:val="18"/>
+              </w:rPr>
+              <w:t>policy.csv</w:t>
+            </w:r>
+          </w:p>
+        </w:tc>
+        <w:tc>
+          <w:tcPr>
+            <w:tcW w:type="dxa" w:w="5040"/>
+          </w:tcPr>
+          <w:p>
+            <w:r/>
+            <w:r>
+              <w:rPr>
+                <w:b w:val="0"/>
+                <w:i w:val="0"/>
+              </w:rPr>
+              <w:t>Every type-1/type-2 policy ID, account ID and relevant limit/deductible terms</w:t>
+            </w:r>
+          </w:p>
+        </w:tc>
+      </w:tr>
+      <w:tr>
+        <w:tc>
+          <w:tcPr>
+            <w:tcW w:type="dxa" w:w="5040"/>
+          </w:tcPr>
+          <w:p>
+            <w:r/>
+            <w:r>
+              <w:rPr>
+                <w:rFonts w:ascii="Courier New" w:hAnsi="Courier New"/>
+                <w:b w:val="0"/>
+                <w:i w:val="0"/>
+                <w:sz w:val="18"/>
+              </w:rPr>
+              <w:t>loc.csv</w:t>
+            </w:r>
+          </w:p>
+        </w:tc>
+        <w:tc>
+          <w:tcPr>
+            <w:tcW w:type="dxa" w:w="5040"/>
+          </w:tcPr>
+          <w:p>
+            <w:r/>
+            <w:r>
+              <w:rPr>
+                <w:b w:val="0"/>
+                <w:i w:val="0"/>
+              </w:rPr>
+              <w:t>All location/account IDs, location number, geocode flag, state/country and coordinates</w:t>
+            </w:r>
+          </w:p>
+        </w:tc>
+      </w:tr>
+      <w:tr>
+        <w:tc>
+          <w:tcPr>
+            <w:tcW w:type="dxa" w:w="5040"/>
+          </w:tcPr>
+          <w:p>
+            <w:r/>
+            <w:r>
+              <w:rPr>
+                <w:rFonts w:ascii="Courier New" w:hAnsi="Courier New"/>
+                <w:b w:val="0"/>
+                <w:i w:val="0"/>
+                <w:sz w:val="18"/>
+              </w:rPr>
+              <w:t>loccvg.csv</w:t>
+            </w:r>
+          </w:p>
+        </w:tc>
+        <w:tc>
+          <w:tcPr>
+            <w:tcW w:type="dxa" w:w="5040"/>
+          </w:tcPr>
+          <w:p>
+            <w:r/>
+            <w:r>
+              <w:rPr>
+                <w:b w:val="0"/>
+                <w:i w:val="0"/>
+              </w:rPr>
+              <w:t>Every peril-1/peril-2 coverage row, values, deductibles, limits and currencies</w:t>
+            </w:r>
+          </w:p>
+        </w:tc>
+      </w:tr>
+    </w:tbl>
+    <w:p/>
+    <w:p>
+      <w:r>
+        <w:rPr>
+          <w:b w:val="0"/>
+          <w:i w:val="0"/>
+        </w:rPr>
+        <w:t xml:space="preserve">Preserve duplicate coverage rows and orphan/unmapped records. Do not use </w:t>
+      </w:r>
+      <w:r>
+        <w:rPr>
+          <w:rFonts w:ascii="Courier New" w:hAnsi="Courier New"/>
+          <w:b w:val="0"/>
+          <w:i w:val="0"/>
+          <w:sz w:val="18"/>
+        </w:rPr>
+        <w:t>DISTINCT</w:t>
+      </w:r>
+      <w:r>
+        <w:rPr>
+          <w:b w:val="0"/>
+          <w:i w:val="0"/>
+        </w:rPr>
+        <w:t xml:space="preserve">, pre-join the tables, restrict entities, aggregate or apply FX. The exporter uses literal </w:t>
+      </w:r>
+      <w:r>
+        <w:rPr>
+          <w:rFonts w:ascii="Courier New" w:hAnsi="Courier New"/>
+          <w:b w:val="0"/>
+          <w:i w:val="0"/>
+          <w:sz w:val="18"/>
+        </w:rPr>
+        <w:t>\N</w:t>
+      </w:r>
+      <w:r>
+        <w:rPr>
+          <w:b w:val="0"/>
+          <w:i w:val="0"/>
+        </w:rPr>
+        <w:t xml:space="preserve"> for SQL NULL; empty strings are distinct. Use a CSV writer that quotes commas, quotes and embedded newlines correctly; do not open and resave the raw files in Excel. Numeric style-3 conversion requires SQL Server 2016 or later. All four data files carry one run ID.</w:t>
+      </w:r>
+    </w:p>
+    <w:p>
+      <w:r>
+        <w:rPr>
+          <w:b w:val="0"/>
+          <w:i w:val="0"/>
+        </w:rPr>
+        <w:t xml:space="preserve">From the </w:t>
+      </w:r>
+      <w:r>
+        <w:rPr>
+          <w:rFonts w:ascii="Courier New" w:hAnsi="Courier New"/>
+          <w:b w:val="0"/>
+          <w:i w:val="0"/>
+          <w:sz w:val="18"/>
+        </w:rPr>
+        <w:t>reporting/</w:t>
+      </w:r>
+      <w:r>
+        <w:rPr>
+          <w:b w:val="0"/>
+          <w:i w:val="0"/>
+        </w:rPr>
+        <w:t xml:space="preserve"> directory, import the six files:</w:t>
+      </w:r>
+    </w:p>
+    <w:p>
+      <w:pPr>
+        <w:spacing w:after="0"/>
+      </w:pPr>
+      <w:r>
+        <w:rPr>
+          <w:rFonts w:ascii="Courier New" w:hAnsi="Courier New"/>
+          <w:sz w:val="18"/>
+          <w:shd w:fill="F2F2F2"/>
+        </w:rPr>
+        <w:t>uv run --no-project --with duckdb --with sqlglot python bscr/tools/edm_local.py import \</w:t>
+      </w:r>
+    </w:p>
+    <w:p>
+      <w:pPr>
+        <w:spacing w:after="0"/>
+      </w:pPr>
+      <w:r>
+        <w:rPr>
+          <w:rFonts w:ascii="Courier New" w:hAnsi="Courier New"/>
+          <w:sz w:val="18"/>
+          <w:shd w:fill="F2F2F2"/>
+        </w:rPr>
+        <w:t xml:space="preserve">  --input "$HOME/bscr-edm/snapshot" \</w:t>
+      </w:r>
+    </w:p>
+    <w:p>
+      <w:pPr>
+        <w:spacing w:after="0"/>
+      </w:pPr>
+      <w:r>
+        <w:rPr>
+          <w:rFonts w:ascii="Courier New" w:hAnsi="Courier New"/>
+          <w:sz w:val="18"/>
+          <w:shd w:fill="F2F2F2"/>
+        </w:rPr>
+        <w:t xml:space="preserve">  --database "$HOME/bscr-edm/snapshot/source.duckdb"</w:t>
+      </w:r>
+    </w:p>
+    <w:p>
+      <w:r>
+        <w:rPr>
+          <w:b w:val="0"/>
+          <w:i w:val="0"/>
+        </w:rPr>
+        <w:t xml:space="preserve">The importer checks headers, run IDs, counts and numeric conversions before publishing a new database. It preserves lexical source values in </w:t>
+      </w:r>
+      <w:r>
+        <w:rPr>
+          <w:rFonts w:ascii="Courier New" w:hAnsi="Courier New"/>
+          <w:b w:val="0"/>
+          <w:i w:val="0"/>
+          <w:sz w:val="18"/>
+        </w:rPr>
+        <w:t>raw_*</w:t>
+      </w:r>
+      <w:r>
+        <w:rPr>
+          <w:b w:val="0"/>
+          <w:i w:val="0"/>
+        </w:rPr>
+        <w:t xml:space="preserve"> tables, creates typed </w:t>
+      </w:r>
+      <w:r>
+        <w:rPr>
+          <w:rFonts w:ascii="Courier New" w:hAnsi="Courier New"/>
+          <w:b w:val="0"/>
+          <w:i w:val="0"/>
+          <w:sz w:val="18"/>
+        </w:rPr>
+        <w:t>accgrp</w:t>
+      </w:r>
+      <w:r>
+        <w:rPr>
+          <w:b w:val="0"/>
+          <w:i w:val="0"/>
+        </w:rPr>
+        <w:t xml:space="preserve">, </w:t>
+      </w:r>
+      <w:r>
+        <w:rPr>
+          <w:rFonts w:ascii="Courier New" w:hAnsi="Courier New"/>
+          <w:b w:val="0"/>
+          <w:i w:val="0"/>
+          <w:sz w:val="18"/>
+        </w:rPr>
+        <w:t>policy</w:t>
+      </w:r>
+      <w:r>
+        <w:rPr>
+          <w:b w:val="0"/>
+          <w:i w:val="0"/>
+        </w:rPr>
+        <w:t xml:space="preserve">, </w:t>
+      </w:r>
+      <w:r>
+        <w:rPr>
+          <w:rFonts w:ascii="Courier New" w:hAnsi="Courier New"/>
+          <w:b w:val="0"/>
+          <w:i w:val="0"/>
+          <w:sz w:val="18"/>
+        </w:rPr>
+        <w:t>loc</w:t>
+      </w:r>
+      <w:r>
+        <w:rPr>
+          <w:b w:val="0"/>
+          <w:i w:val="0"/>
+        </w:rPr>
+        <w:t xml:space="preserve">, </w:t>
+      </w:r>
+      <w:r>
+        <w:rPr>
+          <w:rFonts w:ascii="Courier New" w:hAnsi="Courier New"/>
+          <w:b w:val="0"/>
+          <w:i w:val="0"/>
+          <w:sz w:val="18"/>
+        </w:rPr>
+        <w:t>loccvg</w:t>
+      </w:r>
+      <w:r>
+        <w:rPr>
+          <w:b w:val="0"/>
+          <w:i w:val="0"/>
+        </w:rPr>
+        <w:t xml:space="preserve"> views, and stores the manifest, schema and CSV SHA-256 hashes. Unexported schema columns are not fabricated as NULL. Existing databases are not overwritten.</w:t>
+      </w:r>
+    </w:p>
+    <w:p>
+      <w:r>
+        <w:rPr>
+          <w:b w:val="0"/>
+          <w:i w:val="0"/>
+        </w:rPr>
+        <w:t>Inspect policy counts without joining to locations:</w:t>
+      </w:r>
+    </w:p>
+    <w:p>
+      <w:pPr>
+        <w:spacing w:after="0"/>
+      </w:pPr>
+      <w:r>
+        <w:rPr>
+          <w:rFonts w:ascii="Courier New" w:hAnsi="Courier New"/>
+          <w:sz w:val="18"/>
+          <w:shd w:fill="F2F2F2"/>
+        </w:rPr>
+        <w:t>uv run --no-project --with duckdb --with sqlglot python bscr/tools/edm_local.py query \</w:t>
+      </w:r>
+    </w:p>
+    <w:p>
+      <w:pPr>
+        <w:spacing w:after="0"/>
+      </w:pPr>
+      <w:r>
+        <w:rPr>
+          <w:rFonts w:ascii="Courier New" w:hAnsi="Courier New"/>
+          <w:sz w:val="18"/>
+          <w:shd w:fill="F2F2F2"/>
+        </w:rPr>
+        <w:t xml:space="preserve">  --database "$HOME/bscr-edm/snapshot/source.duckdb" \</w:t>
+      </w:r>
+    </w:p>
+    <w:p>
+      <w:pPr>
+        <w:spacing w:after="0"/>
+      </w:pPr>
+      <w:r>
+        <w:rPr>
+          <w:rFonts w:ascii="Courier New" w:hAnsi="Courier New"/>
+          <w:sz w:val="18"/>
+          <w:shd w:fill="F2F2F2"/>
+        </w:rPr>
+        <w:t xml:space="preserve">  --sql "SELECT policytype, COUNT(*) AS rows, COUNT(DISTINCT policyid) AS distinct_policy_ids FROM policy GROUP BY policytype"</w:t>
+      </w:r>
+    </w:p>
+    <w:p>
+      <w:r>
+        <w:rPr>
+          <w:b w:val="0"/>
+          <w:i w:val="0"/>
+        </w:rPr>
+        <w:t>Replay an aggregate query locally:</w:t>
+      </w:r>
+    </w:p>
+    <w:p>
+      <w:pPr>
+        <w:spacing w:after="0"/>
+      </w:pPr>
+      <w:r>
+        <w:rPr>
+          <w:rFonts w:ascii="Courier New" w:hAnsi="Courier New"/>
+          <w:sz w:val="18"/>
+          <w:shd w:fill="F2F2F2"/>
+        </w:rPr>
+        <w:t>uv run --no-project --with duckdb --with sqlglot python bscr/tools/edm_local.py replay \</w:t>
+      </w:r>
+    </w:p>
+    <w:p>
+      <w:pPr>
+        <w:spacing w:after="0"/>
+      </w:pPr>
+      <w:r>
+        <w:rPr>
+          <w:rFonts w:ascii="Courier New" w:hAnsi="Courier New"/>
+          <w:sz w:val="18"/>
+          <w:shd w:fill="F2F2F2"/>
+        </w:rPr>
+        <w:t xml:space="preserve">  --database "$HOME/bscr-edm/snapshot/source.duckdb" \</w:t>
+      </w:r>
+    </w:p>
+    <w:p>
+      <w:pPr>
+        <w:spacing w:after="0"/>
+      </w:pPr>
+      <w:r>
+        <w:rPr>
+          <w:rFonts w:ascii="Courier New" w:hAnsi="Courier New"/>
+          <w:sz w:val="18"/>
+          <w:shd w:fill="F2F2F2"/>
+        </w:rPr>
+        <w:t xml:space="preserve">  --query bscr/sql/bscr-output.sql \</w:t>
+      </w:r>
+    </w:p>
+    <w:p>
+      <w:pPr>
+        <w:spacing w:after="0"/>
+      </w:pPr>
+      <w:r>
+        <w:rPr>
+          <w:rFonts w:ascii="Courier New" w:hAnsi="Courier New"/>
+          <w:sz w:val="18"/>
+          <w:shd w:fill="F2F2F2"/>
+        </w:rPr>
+        <w:t xml:space="preserve">  --output "$HOME/bscr-edm/snapshot/current-output.csv"</w:t>
+      </w:r>
+    </w:p>
+    <w:p>
+      <w:r>
+        <w:rPr>
+          <w:b w:val="0"/>
+          <w:i w:val="0"/>
+        </w:rPr>
+        <w:t xml:space="preserve">Repeat with </w:t>
+      </w:r>
+      <w:r>
+        <w:rPr>
+          <w:rFonts w:ascii="Courier New" w:hAnsi="Courier New"/>
+          <w:b w:val="0"/>
+          <w:i w:val="0"/>
+          <w:sz w:val="18"/>
+        </w:rPr>
+        <w:t>bscr/sql/bscr-output_old_logic.sql</w:t>
+      </w:r>
+      <w:r>
+        <w:rPr>
+          <w:b w:val="0"/>
+          <w:i w:val="0"/>
+        </w:rPr>
+        <w:t xml:space="preserve"> and a different output name to isolate the policy-side geocode join; that variant is </w:t>
+      </w:r>
+      <w:r>
+        <w:rPr>
+          <w:b/>
+          <w:i w:val="0"/>
+        </w:rPr>
+        <w:t>not</w:t>
+      </w:r>
+      <w:r>
+        <w:rPr>
+          <w:b w:val="0"/>
+          <w:i w:val="0"/>
+        </w:rPr>
+        <w:t xml:space="preserve"> a complete historical reproduction. </w:t>
+      </w:r>
+      <w:r>
+        <w:rPr>
+          <w:rFonts w:ascii="Courier New" w:hAnsi="Courier New"/>
+          <w:b w:val="0"/>
+          <w:i w:val="0"/>
+          <w:sz w:val="18"/>
+        </w:rPr>
+        <w:t>bscr-output-peril1.sql</w:t>
+      </w:r>
+      <w:r>
+        <w:rPr>
+          <w:b w:val="0"/>
+          <w:i w:val="0"/>
+        </w:rPr>
+        <w:t xml:space="preserve"> uses earthquake for all regions; </w:t>
+      </w:r>
+      <w:r>
+        <w:rPr>
+          <w:rFonts w:ascii="Courier New" w:hAnsi="Courier New"/>
+          <w:b w:val="0"/>
+          <w:i w:val="0"/>
+          <w:sz w:val="18"/>
+        </w:rPr>
+        <w:t>bscr-output-all-perils.sql</w:t>
+      </w:r>
+      <w:r>
+        <w:rPr>
+          <w:b w:val="0"/>
+          <w:i w:val="0"/>
+        </w:rPr>
+        <w:t xml:space="preserve"> provides both perils in every region, including </w:t>
+      </w:r>
+      <w:r>
+        <w:rPr>
+          <w:rFonts w:ascii="Courier New" w:hAnsi="Courier New"/>
+          <w:b w:val="0"/>
+          <w:i w:val="0"/>
+          <w:sz w:val="18"/>
+        </w:rPr>
+        <w:t>ALL</w:t>
+      </w:r>
+      <w:r>
+        <w:rPr>
+          <w:b w:val="0"/>
+          <w:i w:val="0"/>
+        </w:rPr>
+        <w:t xml:space="preserve">. Keep identical source files and parameter values between runs. Optional </w:t>
+      </w:r>
+      <w:r>
+        <w:rPr>
+          <w:rFonts w:ascii="Courier New" w:hAnsi="Courier New"/>
+          <w:b w:val="0"/>
+          <w:i w:val="0"/>
+          <w:sz w:val="18"/>
+        </w:rPr>
+        <w:t>--fx</w:t>
+      </w:r>
+      <w:r>
+        <w:rPr>
+          <w:b w:val="0"/>
+          <w:i w:val="0"/>
+        </w:rPr>
+        <w:t xml:space="preserve"> and </w:t>
+      </w:r>
+      <w:r>
+        <w:rPr>
+          <w:rFonts w:ascii="Courier New" w:hAnsi="Courier New"/>
+          <w:b w:val="0"/>
+          <w:i w:val="0"/>
+          <w:sz w:val="18"/>
+        </w:rPr>
+        <w:t>--entity</w:t>
+      </w:r>
+      <w:r>
+        <w:rPr>
+          <w:b w:val="0"/>
+          <w:i w:val="0"/>
+        </w:rPr>
+        <w:t xml:space="preserve"> overrides are recorded alongside the declared defaults in each output's </w:t>
+      </w:r>
+      <w:r>
+        <w:rPr>
+          <w:rFonts w:ascii="Courier New" w:hAnsi="Courier New"/>
+          <w:b w:val="0"/>
+          <w:i w:val="0"/>
+          <w:sz w:val="18"/>
+        </w:rPr>
+        <w:t>.provenance.json</w:t>
+      </w:r>
+      <w:r>
+        <w:rPr>
+          <w:b w:val="0"/>
+          <w:i w:val="0"/>
+        </w:rPr>
+        <w:t>, with source hashes and engine versions.</w:t>
+      </w:r>
+    </w:p>
+    <w:p>
+      <w:r>
+        <w:rPr>
+          <w:b w:val="0"/>
+          <w:i w:val="0"/>
+        </w:rPr>
+        <w:t xml:space="preserve">Local replay adapts T-SQL to DuckDB; collation and numeric aggregation can differ from SQL Server. First compare the local current-query output with the server output from the </w:t>
+      </w:r>
+      <w:r>
+        <w:rPr>
+          <w:b/>
+          <w:i w:val="0"/>
+        </w:rPr>
+        <w:t>same snapshot</w:t>
+      </w:r>
+      <w:r>
+        <w:rPr>
+          <w:b w:val="0"/>
+          <w:i w:val="0"/>
+        </w:rPr>
+        <w:t xml:space="preserve">. Then change one calculation dimension at a time: geocode join, policy cap grouping, peril selection, regional scope. Trace residuals by account/policy/location before approving a change. </w:t>
+      </w:r>
+      <w:r>
+        <w:rPr>
+          <w:rFonts w:ascii="Courier New" w:hAnsi="Courier New"/>
+          <w:b w:val="0"/>
+          <w:i w:val="0"/>
+          <w:sz w:val="18"/>
+        </w:rPr>
+        <w:t>count_policies</w:t>
+      </w:r>
+      <w:r>
+        <w:rPr>
+          <w:b w:val="0"/>
+          <w:i w:val="0"/>
+        </w:rPr>
+        <w:t xml:space="preserve"> remains a grouped-source-row count; distinct policy IDs are a separate diagnostic, not automatically a contract count.</w:t>
+      </w:r>
+    </w:p>
+    <w:p>
+      <w:bookmarkStart w:id="4" w:name="bm_bscr_runbook_run_the_two_sql_exports"/>
+      <w:pPr>
+        <w:pStyle w:val="Heading2"/>
+        <w:keepNext/>
+      </w:pPr>
+      <w:r>
+        <w:rPr>
+          <w:b w:val="0"/>
+          <w:i w:val="0"/>
+        </w:rPr>
+        <w:t>Run the two SQL exports</w:t>
+      </w:r>
+      <w:bookmarkEnd w:id="4"/>
+    </w:p>
+    <w:p>
+      <w:r>
+        <w:rPr>
+          <w:b w:val="0"/>
+          <w:i w:val="0"/>
+        </w:rPr>
+        <w:t xml:space="preserve">1. In an approved SQL Server client, select the approved EDM database and run </w:t>
+      </w:r>
+      <w:r>
+        <w:rPr>
+          <w:rFonts w:ascii="Courier New" w:hAnsi="Courier New"/>
+          <w:b w:val="0"/>
+          <w:i w:val="0"/>
+          <w:sz w:val="18"/>
+        </w:rPr>
+        <w:t>bscr/sql/bscr-extract.sql</w:t>
+      </w:r>
+      <w:r>
+        <w:rPr>
+          <w:b w:val="0"/>
+          <w:i w:val="0"/>
+        </w:rPr>
+        <w:t xml:space="preserve">. Its </w:t>
+      </w:r>
+      <w:r>
+        <w:rPr>
+          <w:rFonts w:ascii="Courier New" w:hAnsi="Courier New"/>
+          <w:b w:val="0"/>
+          <w:i w:val="0"/>
+          <w:sz w:val="18"/>
+        </w:rPr>
+        <w:t>peril_selection</w:t>
+      </w:r>
+      <w:r>
+        <w:rPr>
+          <w:b w:val="0"/>
+          <w:i w:val="0"/>
+        </w:rPr>
+        <w:t xml:space="preserve"> selects peril 1 (earthquake) and 2 (wind) together. Both use the single </w:t>
+      </w:r>
+      <w:r>
+        <w:rPr>
+          <w:rFonts w:ascii="Courier New" w:hAnsi="Courier New"/>
+          <w:b w:val="0"/>
+          <w:i w:val="0"/>
+          <w:sz w:val="18"/>
+        </w:rPr>
+        <w:t>@policy_type = 1</w:t>
+      </w:r>
+      <w:r>
+        <w:rPr>
+          <w:b w:val="0"/>
+          <w:i w:val="0"/>
+        </w:rPr>
+        <w:t xml:space="preserve"> filter: confirm that policy population is appropriate for both perils; the query does not select a separate policy type per peril.</w:t>
+      </w:r>
+    </w:p>
+    <w:p>
+      <w:r>
+        <w:rPr>
+          <w:b w:val="0"/>
+          <w:i w:val="0"/>
+        </w:rPr>
+        <w:t xml:space="preserve">2. Export the raw/source result with these eight headers, in order: </w:t>
+      </w:r>
+      <w:r>
+        <w:rPr>
+          <w:rFonts w:ascii="Courier New" w:hAnsi="Courier New"/>
+          <w:b w:val="0"/>
+          <w:i w:val="0"/>
+          <w:sz w:val="18"/>
+        </w:rPr>
+        <w:t>pml, accgrpid, uwritrname, state, userid1, cntrycode, is_geocoded, peril_id</w:t>
+      </w:r>
+      <w:r>
+        <w:rPr>
+          <w:b w:val="0"/>
+          <w:i w:val="0"/>
+        </w:rPr>
+        <w:t>. These are already capped account/geography aggregates, not location or individual-policy detail.</w:t>
+      </w:r>
+    </w:p>
+    <w:p>
+      <w:r>
+        <w:rPr>
+          <w:b w:val="0"/>
+          <w:i w:val="0"/>
+        </w:rPr>
+        <w:t xml:space="preserve">3. Run </w:t>
+      </w:r>
+      <w:r>
+        <w:rPr>
+          <w:rFonts w:ascii="Courier New" w:hAnsi="Courier New"/>
+          <w:b w:val="0"/>
+          <w:i w:val="0"/>
+          <w:sz w:val="18"/>
+        </w:rPr>
+        <w:t>bscr/sql/bscr-output.sql</w:t>
+      </w:r>
+      <w:r>
+        <w:rPr>
+          <w:b w:val="0"/>
+          <w:i w:val="0"/>
+        </w:rPr>
+        <w:t xml:space="preserve"> against the </w:t>
+      </w:r>
+      <w:r>
+        <w:rPr>
+          <w:b/>
+          <w:i w:val="0"/>
+        </w:rPr>
+        <w:t>same snapshot</w:t>
+      </w:r>
+      <w:r>
+        <w:rPr>
+          <w:b w:val="0"/>
+          <w:i w:val="0"/>
+        </w:rPr>
+        <w:t xml:space="preserve"> and peril selection. It matches policy type to each peril rather than using the extract's single </w:t>
+      </w:r>
+      <w:r>
+        <w:rPr>
+          <w:rFonts w:ascii="Courier New" w:hAnsi="Courier New"/>
+          <w:b w:val="0"/>
+          <w:i w:val="0"/>
+          <w:sz w:val="18"/>
+        </w:rPr>
+        <w:t>@policy_type</w:t>
+      </w:r>
+      <w:r>
+        <w:rPr>
+          <w:b w:val="0"/>
+          <w:i w:val="0"/>
+        </w:rPr>
+        <w:t xml:space="preserve">. It independently calculates the source exposure; it does not read the raw CSV. Leave </w:t>
+      </w:r>
+      <w:r>
+        <w:rPr>
+          <w:rFonts w:ascii="Courier New" w:hAnsi="Courier New"/>
+          <w:b w:val="0"/>
+          <w:i w:val="0"/>
+          <w:sz w:val="18"/>
+        </w:rPr>
+        <w:t>@bscr_entity = NULL</w:t>
+      </w:r>
+      <w:r>
+        <w:rPr>
+          <w:b w:val="0"/>
+          <w:i w:val="0"/>
+        </w:rPr>
+        <w:t xml:space="preserve"> for all entities, including unmapped NULL entities, or set a quoted value such as </w:t>
+      </w:r>
+      <w:r>
+        <w:rPr>
+          <w:rFonts w:ascii="Courier New" w:hAnsi="Courier New"/>
+          <w:b w:val="0"/>
+          <w:i w:val="0"/>
+          <w:sz w:val="18"/>
+        </w:rPr>
+        <w:t>'HIC'</w:t>
+      </w:r>
+      <w:r>
+        <w:rPr>
+          <w:b w:val="0"/>
+          <w:i w:val="0"/>
+        </w:rPr>
+        <w:t xml:space="preserve">, </w:t>
+      </w:r>
+      <w:r>
+        <w:rPr>
+          <w:rFonts w:ascii="Courier New" w:hAnsi="Courier New"/>
+          <w:b w:val="0"/>
+          <w:i w:val="0"/>
+          <w:sz w:val="18"/>
+        </w:rPr>
+        <w:t>'33'</w:t>
+      </w:r>
+      <w:r>
+        <w:rPr>
+          <w:b w:val="0"/>
+          <w:i w:val="0"/>
+        </w:rPr>
+        <w:t xml:space="preserve">, </w:t>
+      </w:r>
+      <w:r>
+        <w:rPr>
+          <w:rFonts w:ascii="Courier New" w:hAnsi="Courier New"/>
+          <w:b w:val="0"/>
+          <w:i w:val="0"/>
+          <w:sz w:val="18"/>
+        </w:rPr>
+        <w:t>'HIG'</w:t>
+      </w:r>
+      <w:r>
+        <w:rPr>
+          <w:b w:val="0"/>
+          <w:i w:val="0"/>
+        </w:rPr>
+        <w:t xml:space="preserve">, </w:t>
+      </w:r>
+      <w:r>
+        <w:rPr>
+          <w:rFonts w:ascii="Courier New" w:hAnsi="Courier New"/>
+          <w:b w:val="0"/>
+          <w:i w:val="0"/>
+          <w:sz w:val="18"/>
+        </w:rPr>
+        <w:t>'HSA'</w:t>
+      </w:r>
+      <w:r>
+        <w:rPr>
+          <w:b w:val="0"/>
+          <w:i w:val="0"/>
+        </w:rPr>
+        <w:t xml:space="preserve">, or </w:t>
+      </w:r>
+      <w:r>
+        <w:rPr>
+          <w:rFonts w:ascii="Courier New" w:hAnsi="Courier New"/>
+          <w:b w:val="0"/>
+          <w:i w:val="0"/>
+          <w:sz w:val="18"/>
+        </w:rPr>
+        <w:t>'3624'</w:t>
+      </w:r>
+      <w:r>
+        <w:rPr>
+          <w:b w:val="0"/>
+          <w:i w:val="0"/>
+        </w:rPr>
+        <w:t>.</w:t>
+      </w:r>
+    </w:p>
+    <w:p>
+      <w:r>
+        <w:rPr>
+          <w:b w:val="0"/>
+          <w:i w:val="0"/>
+        </w:rPr>
+        <w:t xml:space="preserve">4. Confirm </w:t>
+      </w:r>
+      <w:r>
+        <w:rPr>
+          <w:rFonts w:ascii="Courier New" w:hAnsi="Courier New"/>
+          <w:b w:val="0"/>
+          <w:i w:val="0"/>
+          <w:sz w:val="18"/>
+        </w:rPr>
+        <w:t>@qs_pct_retention</w:t>
+      </w:r>
+      <w:r>
+        <w:rPr>
+          <w:b w:val="0"/>
+          <w:i w:val="0"/>
+        </w:rPr>
+        <w:t xml:space="preserve"> and </w:t>
+      </w:r>
+      <w:r>
+        <w:rPr>
+          <w:rFonts w:ascii="Courier New" w:hAnsi="Courier New"/>
+          <w:b w:val="0"/>
+          <w:i w:val="0"/>
+          <w:sz w:val="18"/>
+        </w:rPr>
+        <w:t>@srp_pct_retention</w:t>
+      </w:r>
+      <w:r>
+        <w:rPr>
+          <w:b w:val="0"/>
+          <w:i w:val="0"/>
+        </w:rPr>
+        <w:t xml:space="preserve"> (</w:t>
+      </w:r>
+      <w:r>
+        <w:rPr>
+          <w:rFonts w:ascii="Courier New" w:hAnsi="Courier New"/>
+          <w:b w:val="0"/>
+          <w:i w:val="0"/>
+          <w:sz w:val="18"/>
+        </w:rPr>
+        <w:t>0.5</w:t>
+      </w:r>
+      <w:r>
+        <w:rPr>
+          <w:b w:val="0"/>
+          <w:i w:val="0"/>
+        </w:rPr>
+        <w:t xml:space="preserve"> and </w:t>
+      </w:r>
+      <w:r>
+        <w:rPr>
+          <w:rFonts w:ascii="Courier New" w:hAnsi="Courier New"/>
+          <w:b w:val="0"/>
+          <w:i w:val="0"/>
+          <w:sz w:val="18"/>
+        </w:rPr>
+        <w:t>0.3333</w:t>
+      </w:r>
+      <w:r>
+        <w:rPr>
+          <w:b w:val="0"/>
+          <w:i w:val="0"/>
+        </w:rPr>
+        <w:t xml:space="preserve">). They are retained fractions, not percentages to divide by 100. A literal </w:t>
+      </w:r>
+      <w:r>
+        <w:rPr>
+          <w:rFonts w:ascii="Courier New" w:hAnsi="Courier New"/>
+          <w:b w:val="0"/>
+          <w:i w:val="0"/>
+          <w:sz w:val="18"/>
+        </w:rPr>
+        <w:t>_QS</w:t>
+      </w:r>
+      <w:r>
+        <w:rPr>
+          <w:b w:val="0"/>
+          <w:i w:val="0"/>
+        </w:rPr>
+        <w:t xml:space="preserve"> marker in </w:t>
+      </w:r>
+      <w:r>
+        <w:rPr>
+          <w:rFonts w:ascii="Courier New" w:hAnsi="Courier New"/>
+          <w:b w:val="0"/>
+          <w:i w:val="0"/>
+          <w:sz w:val="18"/>
+        </w:rPr>
+        <w:t>userid1</w:t>
+      </w:r>
+      <w:r>
+        <w:rPr>
+          <w:b w:val="0"/>
+          <w:i w:val="0"/>
+        </w:rPr>
+        <w:t xml:space="preserve"> takes precedence over </w:t>
+      </w:r>
+      <w:r>
+        <w:rPr>
+          <w:rFonts w:ascii="Courier New" w:hAnsi="Courier New"/>
+          <w:b w:val="0"/>
+          <w:i w:val="0"/>
+          <w:sz w:val="18"/>
+        </w:rPr>
+        <w:t>_SRP</w:t>
+      </w:r>
+      <w:r>
+        <w:rPr>
+          <w:b w:val="0"/>
+          <w:i w:val="0"/>
+        </w:rPr>
+        <w:t xml:space="preserve">; other rows retain the full amount. Set </w:t>
+      </w:r>
+      <w:r>
+        <w:rPr>
+          <w:rFonts w:ascii="Courier New" w:hAnsi="Courier New"/>
+          <w:b w:val="0"/>
+          <w:i w:val="0"/>
+          <w:sz w:val="18"/>
+        </w:rPr>
+        <w:t>@gbp_to_usd</w:t>
+      </w:r>
+      <w:r>
+        <w:rPr>
+          <w:b w:val="0"/>
+          <w:i w:val="0"/>
+        </w:rPr>
+        <w:t xml:space="preserve"> to the approved USD-per-GBP rate (default </w:t>
+      </w:r>
+      <w:r>
+        <w:rPr>
+          <w:rFonts w:ascii="Courier New" w:hAnsi="Courier New"/>
+          <w:b w:val="0"/>
+          <w:i w:val="0"/>
+          <w:sz w:val="18"/>
+        </w:rPr>
+        <w:t>1.35</w:t>
+      </w:r>
+      <w:r>
+        <w:rPr>
+          <w:b w:val="0"/>
+          <w:i w:val="0"/>
+        </w:rPr>
+        <w:t>). The final SELECT converts gross/net amounts to full USD; counts and grouping are unchanged. No division by 1,000,000 is applied in SQL.</w:t>
+      </w:r>
+    </w:p>
+    <w:p>
+      <w:r>
+        <w:rPr>
+          <w:b w:val="0"/>
+          <w:i w:val="0"/>
+        </w:rPr>
+        <w:t xml:space="preserve">5. Export the aggregate result with these eight headers: </w:t>
+      </w:r>
+      <w:r>
+        <w:rPr>
+          <w:rFonts w:ascii="Courier New" w:hAnsi="Courier New"/>
+          <w:b w:val="0"/>
+          <w:i w:val="0"/>
+          <w:sz w:val="18"/>
+        </w:rPr>
+        <w:t>cntrycode, bscr_entity, region, sum_pml, sum_net, count_policies, is_geocoded, peril_id</w:t>
+      </w:r>
+      <w:r>
+        <w:rPr>
+          <w:b w:val="0"/>
+          <w:i w:val="0"/>
+        </w:rPr>
+        <w:t xml:space="preserve">. </w:t>
+      </w:r>
+      <w:r>
+        <w:rPr>
+          <w:rFonts w:ascii="Courier New" w:hAnsi="Courier New"/>
+          <w:b w:val="0"/>
+          <w:i w:val="0"/>
+          <w:sz w:val="18"/>
+        </w:rPr>
+        <w:t>peril_id</w:t>
+      </w:r>
+      <w:r>
+        <w:rPr>
+          <w:b w:val="0"/>
+          <w:i w:val="0"/>
+        </w:rPr>
+        <w:t xml:space="preserve"> is explicit: </w:t>
+      </w:r>
+      <w:r>
+        <w:rPr>
+          <w:rFonts w:ascii="Courier New" w:hAnsi="Courier New"/>
+          <w:b w:val="0"/>
+          <w:i w:val="0"/>
+          <w:sz w:val="18"/>
+        </w:rPr>
+        <w:t>1</w:t>
+      </w:r>
+      <w:r>
+        <w:rPr>
+          <w:b w:val="0"/>
+          <w:i w:val="0"/>
+        </w:rPr>
+        <w:t xml:space="preserve"> for earthquake (including </w:t>
+      </w:r>
+      <w:r>
+        <w:rPr>
+          <w:rFonts w:ascii="Courier New" w:hAnsi="Courier New"/>
+          <w:b w:val="0"/>
+          <w:i w:val="0"/>
+          <w:sz w:val="18"/>
+        </w:rPr>
+        <w:t>ALL</w:t>
+      </w:r>
+      <w:r>
+        <w:rPr>
+          <w:b w:val="0"/>
+          <w:i w:val="0"/>
+        </w:rPr>
+        <w:t xml:space="preserve">), </w:t>
+      </w:r>
+      <w:r>
+        <w:rPr>
+          <w:rFonts w:ascii="Courier New" w:hAnsi="Courier New"/>
+          <w:b w:val="0"/>
+          <w:i w:val="0"/>
+          <w:sz w:val="18"/>
+        </w:rPr>
+        <w:t>2</w:t>
+      </w:r>
+      <w:r>
+        <w:rPr>
+          <w:b w:val="0"/>
+          <w:i w:val="0"/>
+        </w:rPr>
+        <w:t xml:space="preserve"> for wind.</w:t>
+      </w:r>
+    </w:p>
+    <w:p>
+      <w:r>
+        <w:rPr>
+          <w:b w:val="0"/>
+          <w:i w:val="0"/>
+        </w:rPr>
+        <w:t>6. Preserve both SQL files, parameter values, exports, row counts, totals and source-snapshot identity together. A successful export does not resolve the policy-grain or workbook defects below.</w:t>
+      </w:r>
+    </w:p>
+    <w:p>
+      <w:bookmarkStart w:id="5" w:name="bm_bscr_runbook_understand_and_reconcile_the_output"/>
+      <w:pPr>
+        <w:pStyle w:val="Heading2"/>
+        <w:keepNext/>
+      </w:pPr>
+      <w:r>
+        <w:rPr>
+          <w:b w:val="0"/>
+          <w:i w:val="0"/>
+        </w:rPr>
         <w:t>Understand and reconcile the output</w:t>
       </w:r>
-      <w:bookmarkEnd w:id="3"/>
+      <w:bookmarkEnd w:id="5"/>
     </w:p>
     <w:p>
       <w:r>
@@ -1531,7 +2537,7 @@
       </w:r>
     </w:p>
     <w:p>
-      <w:bookmarkStart w:id="4" w:name="bm_bscr_runbook_load_a_controlled_workbook_copy"/>
+      <w:bookmarkStart w:id="6" w:name="bm_bscr_runbook_load_a_controlled_workbook_copy"/>
       <w:pPr>
         <w:pStyle w:val="Heading2"/>
         <w:keepNext/>
@@ -1543,7 +2549,7 @@
         </w:rPr>
         <w:t>Load a controlled workbook copy</w:t>
       </w:r>
-      <w:bookmarkEnd w:id="4"/>
+      <w:bookmarkEnd w:id="6"/>
     </w:p>
     <w:p>
       <w:r>
@@ -1765,7 +2771,7 @@
       </w:r>
     </w:p>
     <w:p>
-      <w:bookmarkStart w:id="5" w:name="bm_bscr_runbook_current_workbook_blockers"/>
+      <w:bookmarkStart w:id="7" w:name="bm_bscr_runbook_current_workbook_blockers"/>
       <w:pPr>
         <w:pStyle w:val="Heading3"/>
         <w:keepNext/>
@@ -1777,7 +2783,7 @@
         </w:rPr>
         <w:t>Current workbook blockers</w:t>
       </w:r>
-      <w:bookmarkEnd w:id="5"/>
+      <w:bookmarkEnd w:id="7"/>
     </w:p>
     <w:p>
       <w:r>
@@ -2073,7 +3079,7 @@
       </w:r>
     </w:p>
     <w:p>
-      <w:bookmarkStart w:id="6" w:name="bm_bscr_runbook_completion_boundary"/>
+      <w:bookmarkStart w:id="8" w:name="bm_bscr_runbook_completion_boundary"/>
       <w:pPr>
         <w:pStyle w:val="Heading2"/>
         <w:keepNext/>
@@ -2085,7 +3091,7 @@
         </w:rPr>
         <w:t>Completion boundary</w:t>
       </w:r>
-      <w:bookmarkEnd w:id="6"/>
+      <w:bookmarkEnd w:id="8"/>
     </w:p>
     <w:p>
       <w:r>

</xml_diff>

<commit_message>
Consolidate BSCR reconciliation and retain legacy and corrected queries
</commit_message>
<xml_diff>
--- a/reporting/docs/generated/BSCR-Jan-2026.docx
+++ b/reporting/docs/generated/BSCR-Jan-2026.docx
@@ -32,24 +32,7 @@
       </w:r>
     </w:p>
     <w:p>
-      <w:pPr>
-        <w:spacing w:after="40"/>
-      </w:pPr>
-      <w:r>
-        <w:t>―</w:t>
-      </w:r>
-    </w:p>
-    <w:p>
-      <w:r>
-        <w:rPr>
-          <w:b w:val="0"/>
-          <w:i w:val="0"/>
-        </w:rPr>
-        <w:t>Report: BSCR Time: 1d ---</w:t>
-      </w:r>
-    </w:p>
-    <w:p>
-      <w:bookmarkStart w:id="1" w:name="bm_bscr_runbook_bscr_sql_only_outputs"/>
+      <w:bookmarkStart w:id="1" w:name="bm_bscr_runbook_bscr_reporting_and_reconciliation"/>
       <w:pPr>
         <w:pStyle w:val="Heading1"/>
         <w:keepNext/>
@@ -59,220 +42,23 @@
           <w:b w:val="0"/>
           <w:i w:val="0"/>
         </w:rPr>
-        <w:t>BSCR — SQL-only outputs</w:t>
+        <w:t>BSCR reporting and reconciliation</w:t>
       </w:r>
       <w:bookmarkEnd w:id="1"/>
     </w:p>
     <w:p>
-      <w:r>
-        <w:rPr>
-          <w:b w:val="0"/>
-          <w:i w:val="0"/>
-        </w:rPr>
-        <w:t xml:space="preserve">Paths below are relative to </w:t>
-      </w:r>
-      <w:r>
-        <w:rPr>
-          <w:rFonts w:ascii="Courier New" w:hAnsi="Courier New"/>
-          <w:b w:val="0"/>
-          <w:i w:val="0"/>
-          <w:sz w:val="18"/>
-        </w:rPr>
-        <w:t>reporting/</w:t>
-      </w:r>
-      <w:r>
-        <w:rPr>
-          <w:b w:val="0"/>
-          <w:i w:val="0"/>
-        </w:rPr>
-        <w:t xml:space="preserve">. The current route is </w:t>
-      </w:r>
-      <w:r>
-        <w:rPr>
-          <w:b/>
-          <w:i w:val="0"/>
-        </w:rPr>
-        <w:t>SQL extraction and aggregation → CSV → Excel</w:t>
-      </w:r>
-      <w:r>
-        <w:rPr>
-          <w:b w:val="0"/>
-          <w:i w:val="0"/>
-        </w:rPr>
-        <w:t xml:space="preserve">. The repository supplies the queries, not an approved database snapshot, connection, or reporting-cycle methodology. Resolve the </w:t>
-      </w:r>
       <w:hyperlink r:id="rId9">
         <w:r>
           <w:rPr>
             <w:color w:val="0563C1"/>
             <w:u w:val="single"/>
           </w:rPr>
-          <w:t>BSCR decisions</w:t>
+          <w:t>Back to reporting index</w:t>
         </w:r>
       </w:hyperlink>
-      <w:r>
-        <w:rPr>
-          <w:b w:val="0"/>
-          <w:i w:val="0"/>
-        </w:rPr>
-        <w:t xml:space="preserve"> before production use.</w:t>
-      </w:r>
     </w:p>
     <w:p>
-      <w:r>
-        <w:rPr>
-          <w:b w:val="0"/>
-          <w:i w:val="0"/>
-        </w:rPr>
-        <w:t xml:space="preserve">For a single-peril comparison, use </w:t>
-      </w:r>
-      <w:r>
-        <w:rPr>
-          <w:rFonts w:ascii="Courier New" w:hAnsi="Courier New"/>
-          <w:b w:val="0"/>
-          <w:i w:val="0"/>
-          <w:sz w:val="18"/>
-        </w:rPr>
-        <w:t>bscr/sql/bscr-output-peril1.sql</w:t>
-      </w:r>
-      <w:r>
-        <w:rPr>
-          <w:b w:val="0"/>
-          <w:i w:val="0"/>
-        </w:rPr>
-        <w:t xml:space="preserve">. It runs the full aggregate calculation with </w:t>
-      </w:r>
-      <w:r>
-        <w:rPr>
-          <w:rFonts w:ascii="Courier New" w:hAnsi="Courier New"/>
-          <w:b w:val="0"/>
-          <w:i w:val="0"/>
-          <w:sz w:val="18"/>
-        </w:rPr>
-        <w:t>peril = 1</w:t>
-      </w:r>
-      <w:r>
-        <w:rPr>
-          <w:b w:val="0"/>
-          <w:i w:val="0"/>
-        </w:rPr>
-        <w:t xml:space="preserve"> and </w:t>
-      </w:r>
-      <w:r>
-        <w:rPr>
-          <w:rFonts w:ascii="Courier New" w:hAnsi="Courier New"/>
-          <w:b w:val="0"/>
-          <w:i w:val="0"/>
-          <w:sz w:val="18"/>
-        </w:rPr>
-        <w:t>policytype = 1</w:t>
-      </w:r>
-      <w:r>
-        <w:rPr>
-          <w:b w:val="0"/>
-          <w:i w:val="0"/>
-        </w:rPr>
-        <w:t xml:space="preserve"> for every region, including </w:t>
-      </w:r>
-      <w:r>
-        <w:rPr>
-          <w:rFonts w:ascii="Courier New" w:hAnsi="Courier New"/>
-          <w:b w:val="0"/>
-          <w:i w:val="0"/>
-          <w:sz w:val="18"/>
-        </w:rPr>
-        <w:t>is_nahu</w:t>
-      </w:r>
-      <w:r>
-        <w:rPr>
-          <w:b w:val="0"/>
-          <w:i w:val="0"/>
-        </w:rPr>
-        <w:t xml:space="preserve">, </w:t>
-      </w:r>
-      <w:r>
-        <w:rPr>
-          <w:rFonts w:ascii="Courier New" w:hAnsi="Courier New"/>
-          <w:b w:val="0"/>
-          <w:i w:val="0"/>
-          <w:sz w:val="18"/>
-        </w:rPr>
-        <w:t>is_eu</w:t>
-      </w:r>
-      <w:r>
-        <w:rPr>
-          <w:b w:val="0"/>
-          <w:i w:val="0"/>
-        </w:rPr>
-        <w:t xml:space="preserve"> and </w:t>
-      </w:r>
-      <w:r>
-        <w:rPr>
-          <w:rFonts w:ascii="Courier New" w:hAnsi="Courier New"/>
-          <w:b w:val="0"/>
-          <w:i w:val="0"/>
-          <w:sz w:val="18"/>
-        </w:rPr>
-        <w:t>is_jp</w:t>
-      </w:r>
-      <w:r>
-        <w:rPr>
-          <w:b w:val="0"/>
-          <w:i w:val="0"/>
-        </w:rPr>
-        <w:t xml:space="preserve">. Those labels therefore contain earthquake exposure in this variant, not wind. FX, retention, entity filtering and the eight-column aggregate output are retained; </w:t>
-      </w:r>
-      <w:r>
-        <w:rPr>
-          <w:rFonts w:ascii="Courier New" w:hAnsi="Courier New"/>
-          <w:b w:val="0"/>
-          <w:i w:val="0"/>
-          <w:sz w:val="18"/>
-        </w:rPr>
-        <w:t>peril_id</w:t>
-      </w:r>
-      <w:r>
-        <w:rPr>
-          <w:b w:val="0"/>
-          <w:i w:val="0"/>
-        </w:rPr>
-        <w:t xml:space="preserve"> is always </w:t>
-      </w:r>
-      <w:r>
-        <w:rPr>
-          <w:rFonts w:ascii="Courier New" w:hAnsi="Courier New"/>
-          <w:b w:val="0"/>
-          <w:i w:val="0"/>
-          <w:sz w:val="18"/>
-        </w:rPr>
-        <w:t>1</w:t>
-      </w:r>
-      <w:r>
-        <w:rPr>
-          <w:b w:val="0"/>
-          <w:i w:val="0"/>
-        </w:rPr>
-        <w:t xml:space="preserve">. This replaces the mistakenly supplied </w:t>
-      </w:r>
-      <w:r>
-        <w:rPr>
-          <w:rFonts w:ascii="Courier New" w:hAnsi="Courier New"/>
-          <w:b w:val="0"/>
-          <w:i w:val="0"/>
-          <w:sz w:val="18"/>
-        </w:rPr>
-        <w:t>bscr-extract-peril1.sql</w:t>
-      </w:r>
-      <w:r>
-        <w:rPr>
-          <w:b w:val="0"/>
-          <w:i w:val="0"/>
-        </w:rPr>
-        <w:t xml:space="preserve"> raw extract. The main dual-peril queries are unchanged.</w:t>
-      </w:r>
-    </w:p>
-    <w:p>
-      <w:bookmarkStart w:id="2" w:name="bm_bscr_runbook_historical_workbook_reconciliation"/>
+      <w:bookmarkStart w:id="2" w:name="bm_bscr_runbook_two_sql_scripts"/>
       <w:pPr>
         <w:pStyle w:val="Heading2"/>
         <w:keepNext/>
@@ -282,9 +68,151 @@
           <w:b w:val="0"/>
           <w:i w:val="0"/>
         </w:rPr>
-        <w:t>Historical workbook reconciliation</w:t>
+        <w:t>Two SQL scripts</w:t>
       </w:r>
       <w:bookmarkEnd w:id="2"/>
+    </w:p>
+    <w:tbl>
+      <w:tblPr>
+        <w:tblStyle w:val="TableGrid"/>
+        <w:tblW w:type="auto" w:w="0"/>
+        <w:tblLook w:firstColumn="1" w:firstRow="1" w:lastColumn="0" w:lastRow="0" w:noHBand="0" w:noVBand="1" w:val="04A0"/>
+      </w:tblPr>
+      <w:tblGrid>
+        <w:gridCol w:w="5040"/>
+        <w:gridCol w:w="5040"/>
+      </w:tblGrid>
+      <w:tr>
+        <w:tc>
+          <w:tcPr>
+            <w:tcW w:type="dxa" w:w="5040"/>
+            <w:shd w:fill="D9EAF7"/>
+          </w:tcPr>
+          <w:p>
+            <w:r>
+              <w:rPr>
+                <w:b/>
+              </w:rPr>
+            </w:r>
+            <w:r>
+              <w:rPr>
+                <w:b/>
+                <w:i w:val="0"/>
+              </w:rPr>
+              <w:t>Script</w:t>
+            </w:r>
+          </w:p>
+        </w:tc>
+        <w:tc>
+          <w:tcPr>
+            <w:tcW w:type="dxa" w:w="5040"/>
+            <w:shd w:fill="D9EAF7"/>
+          </w:tcPr>
+          <w:p>
+            <w:r>
+              <w:rPr>
+                <w:b/>
+              </w:rPr>
+            </w:r>
+            <w:r>
+              <w:rPr>
+                <w:b/>
+                <w:i w:val="0"/>
+              </w:rPr>
+              <w:t>Purpose</w:t>
+            </w:r>
+          </w:p>
+        </w:tc>
+      </w:tr>
+      <w:tr>
+        <w:tc>
+          <w:tcPr>
+            <w:tcW w:type="dxa" w:w="5040"/>
+          </w:tcPr>
+          <w:p>
+            <w:r/>
+            <w:r>
+              <w:rPr>
+                <w:rFonts w:ascii="Courier New" w:hAnsi="Courier New"/>
+                <w:b w:val="0"/>
+                <w:i w:val="0"/>
+                <w:sz w:val="18"/>
+              </w:rPr>
+              <w:t>bscr/sql/bscr-extract-legacy.sql</w:t>
+            </w:r>
+          </w:p>
+        </w:tc>
+        <w:tc>
+          <w:tcPr>
+            <w:tcW w:type="dxa" w:w="5040"/>
+          </w:tcPr>
+          <w:p>
+            <w:r/>
+            <w:r>
+              <w:rPr>
+                <w:b w:val="0"/>
+                <w:i w:val="0"/>
+              </w:rPr>
+              <w:t>Full historical aggregate output, despite the extract name. Earthquake/policy type 1 throughout; preserves the old geocode duplication and cap grouping, plus Python-style case-sensitive geographic matching. Diagnostic only.</w:t>
+            </w:r>
+          </w:p>
+        </w:tc>
+      </w:tr>
+      <w:tr>
+        <w:tc>
+          <w:tcPr>
+            <w:tcW w:type="dxa" w:w="5040"/>
+          </w:tcPr>
+          <w:p>
+            <w:r/>
+            <w:r>
+              <w:rPr>
+                <w:rFonts w:ascii="Courier New" w:hAnsi="Courier New"/>
+                <w:b w:val="0"/>
+                <w:i w:val="0"/>
+                <w:sz w:val="18"/>
+              </w:rPr>
+              <w:t>bscr/sql/bscr-output.sql</w:t>
+            </w:r>
+          </w:p>
+        </w:tc>
+        <w:tc>
+          <w:tcPr>
+            <w:tcW w:type="dxa" w:w="5040"/>
+          </w:tcPr>
+          <w:p>
+            <w:r/>
+            <w:r>
+              <w:rPr>
+                <w:b w:val="0"/>
+                <w:i w:val="0"/>
+              </w:rPr>
+              <w:t>Current aggregate with corrected geocode joins, policy-ID grouping and earthquake/wind routing.</w:t>
+            </w:r>
+          </w:p>
+        </w:tc>
+      </w:tr>
+    </w:tbl>
+    <w:p/>
+    <w:p>
+      <w:r>
+        <w:rPr>
+          <w:b w:val="0"/>
+          <w:i w:val="0"/>
+        </w:rPr>
+        <w:t>Both return:</w:t>
+      </w:r>
+    </w:p>
+    <w:p>
+      <w:r>
+        <w:rPr>
+          <w:rFonts w:ascii="Courier New" w:hAnsi="Courier New"/>
+          <w:b w:val="0"/>
+          <w:i w:val="0"/>
+          <w:sz w:val="18"/>
+        </w:rPr>
+        <w:t>cntrycode, bscr_entity, region, sum_pml, sum_net, count_policies, is_geocoded, peril_id</w:t>
+      </w:r>
     </w:p>
     <w:p>
       <w:r>
@@ -292,7 +220,7 @@
           <w:b w:val="0"/>
           <w:i w:val="0"/>
         </w:rPr>
-        <w:t xml:space="preserve">The supplied files in </w:t>
+        <w:t xml:space="preserve">Both default to full USD using source GBP multiplied by </w:t>
       </w:r>
       <w:r>
         <w:rPr>
@@ -301,14 +229,47 @@
           <w:i w:val="0"/>
           <w:sz w:val="18"/>
         </w:rPr>
-        <w:t>bscr/reconcile/</w:t>
+        <w:t>@gbp_to_usd = 1.35</w:t>
       </w:r>
       <w:r>
         <w:rPr>
           <w:b w:val="0"/>
           <w:i w:val="0"/>
         </w:rPr>
-        <w:t xml:space="preserve"> are candidate historical evidence, not confirmed submissions. The detailed comparison is </w:t>
+        <w:t>. Neither divides by 1,000,000. The legacy script can be run with FX 1 when comparing directly to the historical source-currency CSV. Keep FX, retention and entity parameters identical when comparing the two scripts.</w:t>
+      </w:r>
+    </w:p>
+    <w:p>
+      <w:r>
+        <w:rPr>
+          <w:b w:val="0"/>
+          <w:i w:val="0"/>
+        </w:rPr>
+        <w:t>The scripts are not otherwise equivalent: the legacy query reconstructs the whole old workflow, including earthquake-only regions and case-sensitive geographic classification. The current query intentionally retains its current peril routing and additional regional output views. Do not attribute every regional difference to the geocode correction.</w:t>
+      </w:r>
+    </w:p>
+    <w:p>
+      <w:bookmarkStart w:id="3" w:name="bm_bscr_runbook_concise_reconciliation_workbook"/>
+      <w:pPr>
+        <w:pStyle w:val="Heading2"/>
+        <w:keepNext/>
+      </w:pPr>
+      <w:r>
+        <w:rPr>
+          <w:b w:val="0"/>
+          <w:i w:val="0"/>
+        </w:rPr>
+        <w:t>Concise reconciliation workbook</w:t>
+      </w:r>
+      <w:bookmarkEnd w:id="3"/>
+    </w:p>
+    <w:p>
+      <w:r>
+        <w:rPr>
+          <w:b w:val="0"/>
+          <w:i w:val="0"/>
+        </w:rPr>
+        <w:t xml:space="preserve">Use </w:t>
       </w:r>
       <w:r>
         <w:rPr>
@@ -317,48 +278,7 @@
           <w:i w:val="0"/>
           <w:sz w:val="18"/>
         </w:rPr>
-        <w:t>bscr/reconcile/results/bscr_workbook_collection_reconciliation.xlsx</w:t>
-      </w:r>
-      <w:r>
-        <w:rPr>
-          <w:b w:val="0"/>
-          <w:i w:val="0"/>
-        </w:rPr>
-        <w:t>; its companion CSVs record every template version change, cached error, regional limit comparison, file hash, and control total.</w:t>
-      </w:r>
-    </w:p>
-    <w:p>
-      <w:r>
-        <w:rPr>
-          <w:b w:val="0"/>
-          <w:i w:val="0"/>
-        </w:rPr>
-        <w:t xml:space="preserve">• </w:t>
-      </w:r>
-      <w:r>
-        <w:rPr>
-          <w:rFonts w:ascii="Courier New" w:hAnsi="Courier New"/>
-          <w:b w:val="0"/>
-          <w:i w:val="0"/>
-          <w:sz w:val="18"/>
-        </w:rPr>
-        <w:t>workings_old_report.xlsx</w:t>
-      </w:r>
-      <w:r>
-        <w:rPr>
-          <w:b w:val="0"/>
-          <w:i w:val="0"/>
-        </w:rPr>
-        <w:t xml:space="preserve"> is byte-identical to </w:t>
-      </w:r>
-      <w:r>
-        <w:rPr>
-          <w:rFonts w:ascii="Courier New" w:hAnsi="Courier New"/>
-          <w:b w:val="0"/>
-          <w:i w:val="0"/>
-          <w:sz w:val="18"/>
-        </w:rPr>
-        <w:t>Workings_with_geocodingFW.xlsx</w:t>
+        <w:t>bscr/reconcile/results/BSCR_Reconciliation.xlsx</w:t>
       </w:r>
       <w:r>
         <w:rPr>
@@ -378,19 +298,17 @@
       </w:r>
       <w:r>
         <w:rPr>
-          <w:rFonts w:ascii="Courier New" w:hAnsi="Courier New"/>
-          <w:b w:val="0"/>
+          <w:b/>
           <w:i w:val="0"/>
-          <w:sz w:val="18"/>
         </w:rPr>
-        <w:t>Workings_with_geocoding.xlsx</w:t>
+        <w:t>Read first:</w:t>
       </w:r>
       <w:r>
         <w:rPr>
           <w:b w:val="0"/>
           <w:i w:val="0"/>
         </w:rPr>
-        <w:t xml:space="preserve"> and the FW version have the same 47 raw output rows. The first divides by 1,000; FW divides by 1,000,000.</w:t>
+        <w:t xml:space="preserve"> which saved outputs were reproduced and what was established.</w:t>
       </w:r>
     </w:p>
     <w:p>
@@ -403,19 +321,104 @@
       </w:r>
       <w:r>
         <w:rPr>
-          <w:rFonts w:ascii="Courier New" w:hAnsi="Courier New"/>
-          <w:b w:val="0"/>
+          <w:b/>
           <w:i w:val="0"/>
-          <w:sz w:val="18"/>
         </w:rPr>
-        <w:t>Workings_with_geocodingFW - Including blanks USD.xlsx</w:t>
+        <w:t>Counts:</w:t>
       </w:r>
       <w:r>
         <w:rPr>
           <w:b w:val="0"/>
           <w:i w:val="0"/>
         </w:rPr>
-        <w:t xml:space="preserve"> restores US exposure to NA hurricane, has 49 output groups, and explicitly applies 1.35 FX followed by division by 1,000,000. Its static output sheet is not linked to </w:t>
+        <w:t xml:space="preserve"> old saved output versus legacy query; new saved output versus corrected query; entity totals and the difference.</w:t>
+      </w:r>
+    </w:p>
+    <w:p>
+      <w:r>
+        <w:rPr>
+          <w:b w:val="0"/>
+          <w:i w:val="0"/>
+        </w:rPr>
+        <w:t xml:space="preserve">• </w:t>
+      </w:r>
+      <w:r>
+        <w:rPr>
+          <w:b/>
+          <w:i w:val="0"/>
+        </w:rPr>
+        <w:t>Gross exposure / Net exposure:</w:t>
+      </w:r>
+      <w:r>
+        <w:rPr>
+          <w:b w:val="0"/>
+          <w:i w:val="0"/>
+        </w:rPr>
+        <w:t xml:space="preserve"> the same comparison in USD millions.</w:t>
+      </w:r>
+    </w:p>
+    <w:p>
+      <w:r>
+        <w:rPr>
+          <w:b w:val="0"/>
+          <w:i w:val="0"/>
+        </w:rPr>
+        <w:t xml:space="preserve">• </w:t>
+      </w:r>
+      <w:r>
+        <w:rPr>
+          <w:b/>
+          <w:i w:val="0"/>
+        </w:rPr>
+        <w:t>Why it changed:</w:t>
+      </w:r>
+      <w:r>
+        <w:rPr>
+          <w:b w:val="0"/>
+          <w:i w:val="0"/>
+        </w:rPr>
+        <w:t xml:space="preserve"> the measured effect of changing only the geocode join, and the separate state-matching/peril-routing changes.</w:t>
+      </w:r>
+    </w:p>
+    <w:p>
+      <w:r>
+        <w:rPr>
+          <w:b w:val="0"/>
+          <w:i w:val="0"/>
+        </w:rPr>
+        <w:t xml:space="preserve">• </w:t>
+      </w:r>
+      <w:r>
+        <w:rPr>
+          <w:b/>
+          <w:i w:val="0"/>
+        </w:rPr>
+        <w:t>Queries and source:</w:t>
+      </w:r>
+      <w:r>
+        <w:rPr>
+          <w:b w:val="0"/>
+          <w:i w:val="0"/>
+        </w:rPr>
+        <w:t xml:space="preserve"> the two scripts, source database, raw row counts and hashes.</w:t>
+      </w:r>
+    </w:p>
+    <w:p>
+      <w:r>
+        <w:rPr>
+          <w:b w:val="0"/>
+          <w:i w:val="0"/>
+        </w:rPr>
+        <w:t>Verified on the supplied source snapshot:</w:t>
+      </w:r>
+    </w:p>
+    <w:p>
+      <w:r>
+        <w:rPr>
+          <w:b w:val="0"/>
+          <w:i w:val="0"/>
+        </w:rPr>
+        <w:t xml:space="preserve">1. Original embedded SQL plus original Python aggregation reproduces all 452 rows of </w:t>
       </w:r>
       <w:r>
         <w:rPr>
@@ -424,14 +427,14 @@
           <w:i w:val="0"/>
           <w:sz w:val="18"/>
         </w:rPr>
-        <w:t>Sheet1</w:t>
+        <w:t>bscr/output/bscr-output.csv</w:t>
       </w:r>
       <w:r>
         <w:rPr>
           <w:b w:val="0"/>
           <w:i w:val="0"/>
         </w:rPr>
-        <w:t>; a GB/HIC amount differs between those populations.</w:t>
+        <w:t>, with exact counts and monetary differences below one cent in source currency.</w:t>
       </w:r>
     </w:p>
     <w:p>
@@ -440,7 +443,7 @@
           <w:b w:val="0"/>
           <w:i w:val="0"/>
         </w:rPr>
-        <w:t>• The February corrected template family is the 33 original plus the four other entities' v2 files. Their total counts and source amounts divided by 1,000 match the workings, despite template US$M labels.</w:t>
+        <w:t>2. The retained legacy SQL reproduces those 452 rows after the documented FX conversion and matches all 49 groups in the later March USD workings.</w:t>
       </w:r>
     </w:p>
     <w:p>
@@ -449,7 +452,7 @@
           <w:b w:val="0"/>
           <w:i w:val="0"/>
         </w:rPr>
-        <w:t xml:space="preserve">• The five top-level April templates retain the historical total counts. All 46 populated regional gross/net limit cells match the later USD workings within USD 1; four 3624 Japan cells are blank with no source rows. Overall limits are rounded, and modelability categories are reallocated. Do not equate those categories directly with </w:t>
+        <w:t xml:space="preserve">3. Current SQL reproduces all 737 rows of </w:t>
       </w:r>
       <w:r>
         <w:rPr>
@@ -458,14 +461,14 @@
           <w:i w:val="0"/>
           <w:sz w:val="18"/>
         </w:rPr>
-        <w:t>is_geocoded</w:t>
+        <w:t>bscr/reconcile/bscr_output_wseq.csv</w:t>
       </w:r>
       <w:r>
         <w:rPr>
           <w:b w:val="0"/>
           <w:i w:val="0"/>
         </w:rPr>
-        <w:t>.</w:t>
+        <w:t>, with exact counts and monetary differences below one cent.</w:t>
       </w:r>
     </w:p>
     <w:p>
@@ -474,11 +477,61 @@
           <w:b w:val="0"/>
           <w:i w:val="0"/>
         </w:rPr>
-        <w:t>• The templates still contain external links, cached errors and nonnumeric EP-curve placeholders. Premiums, modelability judgments and actual submission status need independent evidence.</w:t>
+        <w:t xml:space="preserve">4. Changing only the geocode join explains the whole </w:t>
+      </w:r>
+      <w:r>
+        <w:rPr>
+          <w:rFonts w:ascii="Courier New" w:hAnsi="Courier New"/>
+          <w:b w:val="0"/>
+          <w:i w:val="0"/>
+          <w:sz w:val="18"/>
+        </w:rPr>
+        <w:t>ALL</w:t>
+      </w:r>
+      <w:r>
+        <w:rPr>
+          <w:b w:val="0"/>
+          <w:i w:val="0"/>
+        </w:rPr>
+        <w:t xml:space="preserve"> reduction: USD 4.813bn gross, USD 3.051bn net and 285 grouped output rows. All 184 affected accounts have both geocoded and ungeocoded earthquake locations.</w:t>
       </w:r>
     </w:p>
     <w:p>
-      <w:bookmarkStart w:id="3" w:name="bm_bscr_runbook_export_raw_edm_data_for_local_diagnosis"/>
+      <w:r>
+        <w:rPr>
+          <w:b w:val="0"/>
+          <w:i w:val="0"/>
+        </w:rPr>
+        <w:t>5. Policy-ID cap grouping has no material effect on this snapshot: no account has multiple type-1 policies. This does not establish that policy identity is unnecessary on other populations.</w:t>
+      </w:r>
+    </w:p>
+    <w:p>
+      <w:r>
+        <w:rPr>
+          <w:b w:val="0"/>
+          <w:i w:val="0"/>
+        </w:rPr>
+        <w:t xml:space="preserve">These are local DuckDB replays checked against the saved outputs, not live SQL Server executions. SQL Server's case-insensitive comparisons were reproduced locally; the legacy query's geographic comparisons deliberately remain case-sensitive to reproduce Python. </w:t>
+      </w:r>
+      <w:r>
+        <w:rPr>
+          <w:rFonts w:ascii="Courier New" w:hAnsi="Courier New"/>
+          <w:b w:val="0"/>
+          <w:i w:val="0"/>
+          <w:sz w:val="18"/>
+        </w:rPr>
+        <w:t>count_policies</w:t>
+      </w:r>
+      <w:r>
+        <w:rPr>
+          <w:b w:val="0"/>
+          <w:i w:val="0"/>
+        </w:rPr>
+        <w:t xml:space="preserve"> counts grouped source rows, not verified distinct contracts. This is numerical reconciliation, not approval of all policy terms, modelability classifications or regulatory filing figures.</w:t>
+      </w:r>
+    </w:p>
+    <w:p>
+      <w:bookmarkStart w:id="4" w:name="bm_bscr_runbook_preserve_the_source_evidence"/>
       <w:pPr>
         <w:pStyle w:val="Heading2"/>
         <w:keepNext/>
@@ -488,9 +541,9 @@
           <w:b w:val="0"/>
           <w:i w:val="0"/>
         </w:rPr>
-        <w:t>Export raw EDM data for local diagnosis</w:t>
+        <w:t>Preserve the source evidence</w:t>
       </w:r>
-      <w:bookmarkEnd w:id="3"/>
+      <w:bookmarkEnd w:id="4"/>
     </w:p>
     <w:p>
       <w:r>
@@ -498,7 +551,7 @@
           <w:b w:val="0"/>
           <w:i w:val="0"/>
         </w:rPr>
-        <w:t xml:space="preserve">The aggregate exports cannot explain changes at policy/location level. Use </w:t>
+        <w:t xml:space="preserve">The six uploaded CSVs remain under </w:t>
       </w:r>
       <w:r>
         <w:rPr>
@@ -507,39 +560,14 @@
           <w:i w:val="0"/>
           <w:sz w:val="18"/>
         </w:rPr>
-        <w:t>bscr/sql/bscr-edm-raw-export.sql</w:t>
+        <w:t>bscr/sql/edm-parquet/</w:t>
       </w:r>
       <w:r>
         <w:rPr>
           <w:b w:val="0"/>
           <w:i w:val="0"/>
         </w:rPr>
-        <w:t xml:space="preserve"> on the same approved EDM snapshot as the comparison outputs. It reads source tables only; it does not modify data or enable database settings. It requires existing SNAPSHOT isolation or an immutable read-only database/database snapshot. Otherwise it stops. Use a standalone connection and discard partial results if the batch fails.</w:t>
-      </w:r>
-    </w:p>
-    <w:p>
-      <w:r>
-        <w:rPr>
-          <w:b w:val="0"/>
-          <w:i w:val="0"/>
-        </w:rPr>
-        <w:t xml:space="preserve">Save its six resultsets as UTF-8 CSVs with headers, in a controlled directory outside Git, for example </w:t>
-      </w:r>
-      <w:r>
-        <w:rPr>
-          <w:rFonts w:ascii="Courier New" w:hAnsi="Courier New"/>
-          <w:b w:val="0"/>
-          <w:i w:val="0"/>
-          <w:sz w:val="18"/>
-        </w:rPr>
-        <w:t>$HOME/bscr-edm/snapshot</w:t>
-      </w:r>
-      <w:r>
-        <w:rPr>
-          <w:b w:val="0"/>
-          <w:i w:val="0"/>
-        </w:rPr>
-        <w:t>:</w:t>
+        <w:t>; the folder name is historical and the files are CSV, not Parquet:</w:t>
       </w:r>
     </w:p>
     <w:tbl>
@@ -589,7 +617,7 @@
                 <w:b/>
                 <w:i w:val="0"/>
               </w:rPr>
-              <w:t>Content and scope</w:t>
+              <w:t>Verified rows</w:t>
             </w:r>
           </w:p>
         </w:tc>
@@ -608,7 +636,7 @@
                 <w:i w:val="0"/>
                 <w:sz w:val="18"/>
               </w:rPr>
-              <w:t>manifest.csv</w:t>
+              <w:t>01_accgrp.csv</w:t>
             </w:r>
           </w:p>
         </w:tc>
@@ -623,7 +651,7 @@
                 <w:b w:val="0"/>
                 <w:i w:val="0"/>
               </w:rPr>
-              <w:t>Run ID, server/database, UTC start, isolation, four source counts and scopes</w:t>
+              <w:t>354,830</w:t>
             </w:r>
           </w:p>
         </w:tc>
@@ -642,7 +670,7 @@
                 <w:i w:val="0"/>
                 <w:sz w:val="18"/>
               </w:rPr>
-              <w:t>schema.csv</w:t>
+              <w:t>02_policy.csv</w:t>
             </w:r>
           </w:p>
         </w:tc>
@@ -657,7 +685,7 @@
                 <w:b w:val="0"/>
                 <w:i w:val="0"/>
               </w:rPr>
-              <w:t>Actual source column types, precision, scale and nullability</w:t>
+              <w:t>662,306</w:t>
             </w:r>
           </w:p>
         </w:tc>
@@ -676,7 +704,7 @@
                 <w:i w:val="0"/>
                 <w:sz w:val="18"/>
               </w:rPr>
-              <w:t>accgrp.csv</w:t>
+              <w:t>03_loc.csv</w:t>
             </w:r>
           </w:p>
         </w:tc>
@@ -691,7 +719,7 @@
                 <w:b w:val="0"/>
                 <w:i w:val="0"/>
               </w:rPr>
-              <w:t>All account IDs, entity/treaty marker, branch and underwriter</w:t>
+              <w:t>1,008,151</w:t>
             </w:r>
           </w:p>
         </w:tc>
@@ -710,7 +738,7 @@
                 <w:i w:val="0"/>
                 <w:sz w:val="18"/>
               </w:rPr>
-              <w:t>policy.csv</w:t>
+              <w:t>04_loccvg.csv</w:t>
             </w:r>
           </w:p>
         </w:tc>
@@ -725,7 +753,7 @@
                 <w:b w:val="0"/>
                 <w:i w:val="0"/>
               </w:rPr>
-              <w:t>Every type-1/type-2 policy ID, account ID and relevant limit/deductible terms</w:t>
+              <w:t>1,053,391</w:t>
             </w:r>
           </w:p>
         </w:tc>
@@ -744,7 +772,7 @@
                 <w:i w:val="0"/>
                 <w:sz w:val="18"/>
               </w:rPr>
-              <w:t>loc.csv</w:t>
+              <w:t>source_metadata.csv</w:t>
             </w:r>
           </w:p>
         </w:tc>
@@ -759,7 +787,7 @@
                 <w:b w:val="0"/>
                 <w:i w:val="0"/>
               </w:rPr>
-              <w:t>All location/account IDs, location number, geocode flag, state/country and coordinates</w:t>
+              <w:t>1 metadata record</w:t>
             </w:r>
           </w:p>
         </w:tc>
@@ -778,7 +806,7 @@
                 <w:i w:val="0"/>
                 <w:sz w:val="18"/>
               </w:rPr>
-              <w:t>loccvg.csv</w:t>
+              <w:t>06_schema.csv</w:t>
             </w:r>
           </w:p>
         </w:tc>
@@ -793,7 +821,7 @@
                 <w:b w:val="0"/>
                 <w:i w:val="0"/>
               </w:rPr>
-              <w:t>Every peril-1/peril-2 coverage row, values, deductibles, limits and currencies</w:t>
+              <w:t>Source column definitions</w:t>
             </w:r>
           </w:p>
         </w:tc>
@@ -806,7 +834,7 @@
           <w:b w:val="0"/>
           <w:i w:val="0"/>
         </w:rPr>
-        <w:t xml:space="preserve">Preserve duplicate coverage rows and orphan/unmapped records. Do not use </w:t>
+        <w:t xml:space="preserve">Do not deduplicate, apply FX, edit or resave the raw files in Excel. Preserve empty strings separately from SQL NULL representations. The supplied state field has 30 literal </w:t>
       </w:r>
       <w:r>
         <w:rPr>
@@ -815,14 +843,14 @@
           <w:i w:val="0"/>
           <w:sz w:val="18"/>
         </w:rPr>
-        <w:t>DISTINCT</w:t>
+        <w:t>NULL</w:t>
       </w:r>
       <w:r>
         <w:rPr>
           <w:b w:val="0"/>
           <w:i w:val="0"/>
         </w:rPr>
-        <w:t xml:space="preserve">, pre-join the tables, restrict entities, aggregate or apply FX. The exporter uses literal </w:t>
+        <w:t xml:space="preserve"> markers in French/German locations; raw lexical values were preserved for inspection. Source metadata identifies </w:t>
       </w:r>
       <w:r>
         <w:rPr>
@@ -831,14 +859,14 @@
           <w:i w:val="0"/>
           <w:sz w:val="18"/>
         </w:rPr>
-        <w:t>\N</w:t>
+        <w:t>HISCO_UKEU_01JAN26_010126_ROLLUP_ByLOB_GC_EDM</w:t>
       </w:r>
       <w:r>
         <w:rPr>
           <w:b w:val="0"/>
           <w:i w:val="0"/>
         </w:rPr>
-        <w:t xml:space="preserve"> for SQL NULL; empty strings are distinct. Use a CSV writer that quotes commas, quotes and embedded newlines correctly; do not open and resave the raw files in Excel. Numeric style-3 conversion requires SQL Server 2016 or later. All four data files carry one run ID.</w:t>
+        <w:t xml:space="preserve"> and its case-insensitive collation. All four source counts match the metadata.</w:t>
       </w:r>
     </w:p>
     <w:p>
@@ -847,7 +875,7 @@
           <w:b w:val="0"/>
           <w:i w:val="0"/>
         </w:rPr>
-        <w:t xml:space="preserve">From the </w:t>
+        <w:t xml:space="preserve">Historical input workbooks and saved output CSVs are retained unchanged. </w:t>
       </w:r>
       <w:r>
         <w:rPr>
@@ -856,53 +884,46 @@
           <w:i w:val="0"/>
           <w:sz w:val="18"/>
         </w:rPr>
-        <w:t>reporting/</w:t>
+        <w:t>workings_old_report.xlsx</w:t>
       </w:r>
       <w:r>
         <w:rPr>
           <w:b w:val="0"/>
           <w:i w:val="0"/>
         </w:rPr>
-        <w:t xml:space="preserve"> directory, import the six files:</w:t>
+        <w:t xml:space="preserve"> is identical to </w:t>
       </w:r>
-    </w:p>
-    <w:p>
-      <w:pPr>
-        <w:spacing w:after="0"/>
-      </w:pPr>
       <w:r>
         <w:rPr>
           <w:rFonts w:ascii="Courier New" w:hAnsi="Courier New"/>
+          <w:b w:val="0"/>
+          <w:i w:val="0"/>
           <w:sz w:val="18"/>
-          <w:shd w:fill="F2F2F2"/>
         </w:rPr>
-        <w:t>uv run --no-project --with duckdb --with sqlglot python bscr/tools/edm_local.py import \</w:t>
+        <w:t>Workings_with_geocodingFW.xlsx</w:t>
       </w:r>
-    </w:p>
-    <w:p>
-      <w:pPr>
-        <w:spacing w:after="0"/>
-      </w:pPr>
+      <w:r>
+        <w:rPr>
+          <w:b w:val="0"/>
+          <w:i w:val="0"/>
+        </w:rPr>
+        <w:t xml:space="preserve">. The earlier workings divide by 1,000; FW divides by 1,000,000. The later </w:t>
+      </w:r>
       <w:r>
         <w:rPr>
           <w:rFonts w:ascii="Courier New" w:hAnsi="Courier New"/>
+          <w:b w:val="0"/>
+          <w:i w:val="0"/>
           <w:sz w:val="18"/>
-          <w:shd w:fill="F2F2F2"/>
         </w:rPr>
-        <w:t xml:space="preserve">  --input "$HOME/bscr-edm/snapshot" \</w:t>
+        <w:t>Workings_with_geocodingFW - Including blanks USD.xlsx</w:t>
       </w:r>
-    </w:p>
-    <w:p>
-      <w:pPr>
-        <w:spacing w:after="0"/>
-      </w:pPr>
       <w:r>
         <w:rPr>
-          <w:rFonts w:ascii="Courier New" w:hAnsi="Courier New"/>
-          <w:sz w:val="18"/>
-          <w:shd w:fill="F2F2F2"/>
+          <w:b w:val="0"/>
+          <w:i w:val="0"/>
         </w:rPr>
-        <w:t xml:space="preserve">  --database "$HOME/bscr-edm/snapshot/source.duckdb"</w:t>
+        <w:t xml:space="preserve"> applies 1.35 FX and restores US exposure to NA hurricane. Its 49 raw groups match the historical CSV without excluding US. Do not reproduce the earlier workbook's omission as a production rule.</w:t>
       </w:r>
     </w:p>
     <w:p>
@@ -911,7 +932,16 @@
           <w:b w:val="0"/>
           <w:i w:val="0"/>
         </w:rPr>
-        <w:t xml:space="preserve">The importer checks headers, run IDs, counts and numeric conversions before publishing a new database. It preserves lexical source values in </w:t>
+        <w:t>The five April templates retain the historical total counts. All 46 populated regional gross/net exposure limits match the later USD workings within USD 1. Their modelability allocations, premiums, EP placeholders, cached errors and external links remain separate controls; dates do not prove submission.</w:t>
+      </w:r>
+    </w:p>
+    <w:p>
+      <w:r>
+        <w:rPr>
+          <w:b w:val="0"/>
+          <w:i w:val="0"/>
+        </w:rPr>
+        <w:t xml:space="preserve">The original Marimo application remains at </w:t>
       </w:r>
       <w:r>
         <w:rPr>
@@ -920,14 +950,14 @@
           <w:i w:val="0"/>
           <w:sz w:val="18"/>
         </w:rPr>
-        <w:t>raw_*</w:t>
+        <w:t>bscr/BSCR_UKEU_original.py</w:t>
       </w:r>
       <w:r>
         <w:rPr>
           <w:b w:val="0"/>
           <w:i w:val="0"/>
         </w:rPr>
-        <w:t xml:space="preserve"> tables, creates typed </w:t>
+        <w:t xml:space="preserve"> and </w:t>
       </w:r>
       <w:r>
         <w:rPr>
@@ -936,7 +966,156 @@
           <w:i w:val="0"/>
           <w:sz w:val="18"/>
         </w:rPr>
-        <w:t>accgrp</w:t>
+        <w:t>bscr/old-process/BSCR_UKEU.py</w:t>
+      </w:r>
+      <w:r>
+        <w:rPr>
+          <w:b w:val="0"/>
+          <w:i w:val="0"/>
+        </w:rPr>
+        <w:t xml:space="preserve">. The separate </w:t>
+      </w:r>
+      <w:r>
+        <w:rPr>
+          <w:rFonts w:ascii="Courier New" w:hAnsi="Courier New"/>
+          <w:b w:val="0"/>
+          <w:i w:val="0"/>
+          <w:sz w:val="18"/>
+        </w:rPr>
+        <w:t>bscr/BSCR_UKEU.py</w:t>
+      </w:r>
+      <w:r>
+        <w:rPr>
+          <w:b w:val="0"/>
+          <w:i w:val="0"/>
+        </w:rPr>
+        <w:t xml:space="preserve"> is an older seven-column CSV workflow, not a consumer of these eight-column query outputs.</w:t>
+      </w:r>
+    </w:p>
+    <w:p>
+      <w:bookmarkStart w:id="5" w:name="bm_bscr_runbook_running_the_retained_queries"/>
+      <w:pPr>
+        <w:pStyle w:val="Heading2"/>
+        <w:keepNext/>
+      </w:pPr>
+      <w:r>
+        <w:rPr>
+          <w:b w:val="0"/>
+          <w:i w:val="0"/>
+        </w:rPr>
+        <w:t>Running the retained queries</w:t>
+      </w:r>
+      <w:bookmarkEnd w:id="5"/>
+    </w:p>
+    <w:p>
+      <w:r>
+        <w:rPr>
+          <w:b w:val="0"/>
+          <w:i w:val="0"/>
+        </w:rPr>
+        <w:t>1. Select the approved EDM database/snapshot in your SQL client.</w:t>
+      </w:r>
+    </w:p>
+    <w:p>
+      <w:r>
+        <w:rPr>
+          <w:b w:val="0"/>
+          <w:i w:val="0"/>
+        </w:rPr>
+        <w:t xml:space="preserve">2. Run </w:t>
+      </w:r>
+      <w:r>
+        <w:rPr>
+          <w:rFonts w:ascii="Courier New" w:hAnsi="Courier New"/>
+          <w:b w:val="0"/>
+          <w:i w:val="0"/>
+          <w:sz w:val="18"/>
+        </w:rPr>
+        <w:t>bscr-extract-legacy.sql</w:t>
+      </w:r>
+      <w:r>
+        <w:rPr>
+          <w:b w:val="0"/>
+          <w:i w:val="0"/>
+        </w:rPr>
+        <w:t xml:space="preserve"> for the historical comparison and </w:t>
+      </w:r>
+      <w:r>
+        <w:rPr>
+          <w:rFonts w:ascii="Courier New" w:hAnsi="Courier New"/>
+          <w:b w:val="0"/>
+          <w:i w:val="0"/>
+          <w:sz w:val="18"/>
+        </w:rPr>
+        <w:t>bscr-output.sql</w:t>
+      </w:r>
+      <w:r>
+        <w:rPr>
+          <w:b w:val="0"/>
+          <w:i w:val="0"/>
+        </w:rPr>
+        <w:t xml:space="preserve"> for the corrected result. Both are read-only.</w:t>
+      </w:r>
+    </w:p>
+    <w:p>
+      <w:r>
+        <w:rPr>
+          <w:b w:val="0"/>
+          <w:i w:val="0"/>
+        </w:rPr>
+        <w:t>3. Use the same frozen source and the same FX, retention and entity settings.</w:t>
+      </w:r>
+    </w:p>
+    <w:p>
+      <w:r>
+        <w:rPr>
+          <w:b w:val="0"/>
+          <w:i w:val="0"/>
+        </w:rPr>
+        <w:t>4. Save results separately; retain all eight headers and preserve NULLs.</w:t>
+      </w:r>
+    </w:p>
+    <w:p>
+      <w:r>
+        <w:rPr>
+          <w:b w:val="0"/>
+          <w:i w:val="0"/>
+        </w:rPr>
+        <w:t xml:space="preserve">5. Compare </w:t>
+      </w:r>
+      <w:r>
+        <w:rPr>
+          <w:rFonts w:ascii="Courier New" w:hAnsi="Courier New"/>
+          <w:b w:val="0"/>
+          <w:i w:val="0"/>
+          <w:sz w:val="18"/>
+        </w:rPr>
+        <w:t>ALL</w:t>
+      </w:r>
+      <w:r>
+        <w:rPr>
+          <w:b w:val="0"/>
+          <w:i w:val="0"/>
+        </w:rPr>
+        <w:t xml:space="preserve"> for earthquake totals and compare regional populations separately. Never sum across overlapping regional rows.</w:t>
+      </w:r>
+    </w:p>
+    <w:p>
+      <w:r>
+        <w:rPr>
+          <w:b w:val="0"/>
+          <w:i w:val="0"/>
+        </w:rPr>
+        <w:t xml:space="preserve">Current routing: wind (2) feeds </w:t>
+      </w:r>
+      <w:r>
+        <w:rPr>
+          <w:rFonts w:ascii="Courier New" w:hAnsi="Courier New"/>
+          <w:b w:val="0"/>
+          <w:i w:val="0"/>
+          <w:sz w:val="18"/>
+        </w:rPr>
+        <w:t>is_nahu</w:t>
       </w:r>
       <w:r>
         <w:rPr>
@@ -952,7 +1131,7 @@
           <w:i w:val="0"/>
           <w:sz w:val="18"/>
         </w:rPr>
-        <w:t>policy</w:t>
+        <w:t>is_eu</w:t>
       </w:r>
       <w:r>
         <w:rPr>
@@ -968,7 +1147,23 @@
           <w:i w:val="0"/>
           <w:sz w:val="18"/>
         </w:rPr>
-        <w:t>loc</w:t>
+        <w:t>is_jp</w:t>
+      </w:r>
+      <w:r>
+        <w:rPr>
+          <w:b w:val="0"/>
+          <w:i w:val="0"/>
+        </w:rPr>
+        <w:t xml:space="preserve">; earthquake (1) feeds </w:t>
+      </w:r>
+      <w:r>
+        <w:rPr>
+          <w:rFonts w:ascii="Courier New" w:hAnsi="Courier New"/>
+          <w:b w:val="0"/>
+          <w:i w:val="0"/>
+          <w:sz w:val="18"/>
+        </w:rPr>
+        <w:t>ALL</w:t>
       </w:r>
       <w:r>
         <w:rPr>
@@ -984,474 +1179,7 @@
           <w:i w:val="0"/>
           <w:sz w:val="18"/>
         </w:rPr>
-        <w:t>loccvg</w:t>
-      </w:r>
-      <w:r>
-        <w:rPr>
-          <w:b w:val="0"/>
-          <w:i w:val="0"/>
-        </w:rPr>
-        <w:t xml:space="preserve"> views, and stores the manifest, schema and CSV SHA-256 hashes. Unexported schema columns are not fabricated as NULL. Existing databases are not overwritten.</w:t>
-      </w:r>
-    </w:p>
-    <w:p>
-      <w:r>
-        <w:rPr>
-          <w:b w:val="0"/>
-          <w:i w:val="0"/>
-        </w:rPr>
-        <w:t>Inspect policy counts without joining to locations:</w:t>
-      </w:r>
-    </w:p>
-    <w:p>
-      <w:pPr>
-        <w:spacing w:after="0"/>
-      </w:pPr>
-      <w:r>
-        <w:rPr>
-          <w:rFonts w:ascii="Courier New" w:hAnsi="Courier New"/>
-          <w:sz w:val="18"/>
-          <w:shd w:fill="F2F2F2"/>
-        </w:rPr>
-        <w:t>uv run --no-project --with duckdb --with sqlglot python bscr/tools/edm_local.py query \</w:t>
-      </w:r>
-    </w:p>
-    <w:p>
-      <w:pPr>
-        <w:spacing w:after="0"/>
-      </w:pPr>
-      <w:r>
-        <w:rPr>
-          <w:rFonts w:ascii="Courier New" w:hAnsi="Courier New"/>
-          <w:sz w:val="18"/>
-          <w:shd w:fill="F2F2F2"/>
-        </w:rPr>
-        <w:t xml:space="preserve">  --database "$HOME/bscr-edm/snapshot/source.duckdb" \</w:t>
-      </w:r>
-    </w:p>
-    <w:p>
-      <w:pPr>
-        <w:spacing w:after="0"/>
-      </w:pPr>
-      <w:r>
-        <w:rPr>
-          <w:rFonts w:ascii="Courier New" w:hAnsi="Courier New"/>
-          <w:sz w:val="18"/>
-          <w:shd w:fill="F2F2F2"/>
-        </w:rPr>
-        <w:t xml:space="preserve">  --sql "SELECT policytype, COUNT(*) AS rows, COUNT(DISTINCT policyid) AS distinct_policy_ids FROM policy GROUP BY policytype"</w:t>
-      </w:r>
-    </w:p>
-    <w:p>
-      <w:r>
-        <w:rPr>
-          <w:b w:val="0"/>
-          <w:i w:val="0"/>
-        </w:rPr>
-        <w:t>Replay an aggregate query locally:</w:t>
-      </w:r>
-    </w:p>
-    <w:p>
-      <w:pPr>
-        <w:spacing w:after="0"/>
-      </w:pPr>
-      <w:r>
-        <w:rPr>
-          <w:rFonts w:ascii="Courier New" w:hAnsi="Courier New"/>
-          <w:sz w:val="18"/>
-          <w:shd w:fill="F2F2F2"/>
-        </w:rPr>
-        <w:t>uv run --no-project --with duckdb --with sqlglot python bscr/tools/edm_local.py replay \</w:t>
-      </w:r>
-    </w:p>
-    <w:p>
-      <w:pPr>
-        <w:spacing w:after="0"/>
-      </w:pPr>
-      <w:r>
-        <w:rPr>
-          <w:rFonts w:ascii="Courier New" w:hAnsi="Courier New"/>
-          <w:sz w:val="18"/>
-          <w:shd w:fill="F2F2F2"/>
-        </w:rPr>
-        <w:t xml:space="preserve">  --database "$HOME/bscr-edm/snapshot/source.duckdb" \</w:t>
-      </w:r>
-    </w:p>
-    <w:p>
-      <w:pPr>
-        <w:spacing w:after="0"/>
-      </w:pPr>
-      <w:r>
-        <w:rPr>
-          <w:rFonts w:ascii="Courier New" w:hAnsi="Courier New"/>
-          <w:sz w:val="18"/>
-          <w:shd w:fill="F2F2F2"/>
-        </w:rPr>
-        <w:t xml:space="preserve">  --query bscr/sql/bscr-output.sql \</w:t>
-      </w:r>
-    </w:p>
-    <w:p>
-      <w:pPr>
-        <w:spacing w:after="0"/>
-      </w:pPr>
-      <w:r>
-        <w:rPr>
-          <w:rFonts w:ascii="Courier New" w:hAnsi="Courier New"/>
-          <w:sz w:val="18"/>
-          <w:shd w:fill="F2F2F2"/>
-        </w:rPr>
-        <w:t xml:space="preserve">  --output "$HOME/bscr-edm/snapshot/current-output.csv"</w:t>
-      </w:r>
-    </w:p>
-    <w:p>
-      <w:r>
-        <w:rPr>
-          <w:b w:val="0"/>
-          <w:i w:val="0"/>
-        </w:rPr>
-        <w:t xml:space="preserve">Repeat with </w:t>
-      </w:r>
-      <w:r>
-        <w:rPr>
-          <w:rFonts w:ascii="Courier New" w:hAnsi="Courier New"/>
-          <w:b w:val="0"/>
-          <w:i w:val="0"/>
-          <w:sz w:val="18"/>
-        </w:rPr>
-        <w:t>bscr/sql/bscr-output_old_logic.sql</w:t>
-      </w:r>
-      <w:r>
-        <w:rPr>
-          <w:b w:val="0"/>
-          <w:i w:val="0"/>
-        </w:rPr>
-        <w:t xml:space="preserve"> and a different output name to isolate the policy-side geocode join; that variant is </w:t>
-      </w:r>
-      <w:r>
-        <w:rPr>
-          <w:b/>
-          <w:i w:val="0"/>
-        </w:rPr>
-        <w:t>not</w:t>
-      </w:r>
-      <w:r>
-        <w:rPr>
-          <w:b w:val="0"/>
-          <w:i w:val="0"/>
-        </w:rPr>
-        <w:t xml:space="preserve"> a complete historical reproduction. </w:t>
-      </w:r>
-      <w:r>
-        <w:rPr>
-          <w:rFonts w:ascii="Courier New" w:hAnsi="Courier New"/>
-          <w:b w:val="0"/>
-          <w:i w:val="0"/>
-          <w:sz w:val="18"/>
-        </w:rPr>
-        <w:t>bscr-output-peril1.sql</w:t>
-      </w:r>
-      <w:r>
-        <w:rPr>
-          <w:b w:val="0"/>
-          <w:i w:val="0"/>
-        </w:rPr>
-        <w:t xml:space="preserve"> uses earthquake for all regions; </w:t>
-      </w:r>
-      <w:r>
-        <w:rPr>
-          <w:rFonts w:ascii="Courier New" w:hAnsi="Courier New"/>
-          <w:b w:val="0"/>
-          <w:i w:val="0"/>
-          <w:sz w:val="18"/>
-        </w:rPr>
-        <w:t>bscr-output-all-perils.sql</w:t>
-      </w:r>
-      <w:r>
-        <w:rPr>
-          <w:b w:val="0"/>
-          <w:i w:val="0"/>
-        </w:rPr>
-        <w:t xml:space="preserve"> provides both perils in every region, including </w:t>
-      </w:r>
-      <w:r>
-        <w:rPr>
-          <w:rFonts w:ascii="Courier New" w:hAnsi="Courier New"/>
-          <w:b w:val="0"/>
-          <w:i w:val="0"/>
-          <w:sz w:val="18"/>
-        </w:rPr>
-        <w:t>ALL</w:t>
-      </w:r>
-      <w:r>
-        <w:rPr>
-          <w:b w:val="0"/>
-          <w:i w:val="0"/>
-        </w:rPr>
-        <w:t xml:space="preserve">. Keep identical source files and parameter values between runs. Optional </w:t>
-      </w:r>
-      <w:r>
-        <w:rPr>
-          <w:rFonts w:ascii="Courier New" w:hAnsi="Courier New"/>
-          <w:b w:val="0"/>
-          <w:i w:val="0"/>
-          <w:sz w:val="18"/>
-        </w:rPr>
-        <w:t>--fx</w:t>
-      </w:r>
-      <w:r>
-        <w:rPr>
-          <w:b w:val="0"/>
-          <w:i w:val="0"/>
-        </w:rPr>
-        <w:t xml:space="preserve"> and </w:t>
-      </w:r>
-      <w:r>
-        <w:rPr>
-          <w:rFonts w:ascii="Courier New" w:hAnsi="Courier New"/>
-          <w:b w:val="0"/>
-          <w:i w:val="0"/>
-          <w:sz w:val="18"/>
-        </w:rPr>
-        <w:t>--entity</w:t>
-      </w:r>
-      <w:r>
-        <w:rPr>
-          <w:b w:val="0"/>
-          <w:i w:val="0"/>
-        </w:rPr>
-        <w:t xml:space="preserve"> overrides are recorded alongside the declared defaults in each output's </w:t>
-      </w:r>
-      <w:r>
-        <w:rPr>
-          <w:rFonts w:ascii="Courier New" w:hAnsi="Courier New"/>
-          <w:b w:val="0"/>
-          <w:i w:val="0"/>
-          <w:sz w:val="18"/>
-        </w:rPr>
-        <w:t>.provenance.json</w:t>
-      </w:r>
-      <w:r>
-        <w:rPr>
-          <w:b w:val="0"/>
-          <w:i w:val="0"/>
-        </w:rPr>
-        <w:t>, with source hashes and engine versions.</w:t>
-      </w:r>
-    </w:p>
-    <w:p>
-      <w:r>
-        <w:rPr>
-          <w:b w:val="0"/>
-          <w:i w:val="0"/>
-        </w:rPr>
-        <w:t xml:space="preserve">Local replay adapts T-SQL to DuckDB; collation and numeric aggregation can differ from SQL Server. First compare the local current-query output with the server output from the </w:t>
-      </w:r>
-      <w:r>
-        <w:rPr>
-          <w:b/>
-          <w:i w:val="0"/>
-        </w:rPr>
-        <w:t>same snapshot</w:t>
-      </w:r>
-      <w:r>
-        <w:rPr>
-          <w:b w:val="0"/>
-          <w:i w:val="0"/>
-        </w:rPr>
-        <w:t xml:space="preserve">. Then change one calculation dimension at a time: geocode join, policy cap grouping, peril selection, regional scope. Trace residuals by account/policy/location before approving a change. </w:t>
-      </w:r>
-      <w:r>
-        <w:rPr>
-          <w:rFonts w:ascii="Courier New" w:hAnsi="Courier New"/>
-          <w:b w:val="0"/>
-          <w:i w:val="0"/>
-          <w:sz w:val="18"/>
-        </w:rPr>
-        <w:t>count_policies</w:t>
-      </w:r>
-      <w:r>
-        <w:rPr>
-          <w:b w:val="0"/>
-          <w:i w:val="0"/>
-        </w:rPr>
-        <w:t xml:space="preserve"> remains a grouped-source-row count; distinct policy IDs are a separate diagnostic, not automatically a contract count.</w:t>
-      </w:r>
-    </w:p>
-    <w:p>
-      <w:bookmarkStart w:id="4" w:name="bm_bscr_runbook_run_the_two_sql_exports"/>
-      <w:pPr>
-        <w:pStyle w:val="Heading2"/>
-        <w:keepNext/>
-      </w:pPr>
-      <w:r>
-        <w:rPr>
-          <w:b w:val="0"/>
-          <w:i w:val="0"/>
-        </w:rPr>
-        <w:t>Run the two SQL exports</w:t>
-      </w:r>
-      <w:bookmarkEnd w:id="4"/>
-    </w:p>
-    <w:p>
-      <w:r>
-        <w:rPr>
-          <w:b w:val="0"/>
-          <w:i w:val="0"/>
-        </w:rPr>
-        <w:t xml:space="preserve">1. In an approved SQL Server client, select the approved EDM database and run </w:t>
-      </w:r>
-      <w:r>
-        <w:rPr>
-          <w:rFonts w:ascii="Courier New" w:hAnsi="Courier New"/>
-          <w:b w:val="0"/>
-          <w:i w:val="0"/>
-          <w:sz w:val="18"/>
-        </w:rPr>
-        <w:t>bscr/sql/bscr-extract.sql</w:t>
-      </w:r>
-      <w:r>
-        <w:rPr>
-          <w:b w:val="0"/>
-          <w:i w:val="0"/>
-        </w:rPr>
-        <w:t xml:space="preserve">. Its </w:t>
-      </w:r>
-      <w:r>
-        <w:rPr>
-          <w:rFonts w:ascii="Courier New" w:hAnsi="Courier New"/>
-          <w:b w:val="0"/>
-          <w:i w:val="0"/>
-          <w:sz w:val="18"/>
-        </w:rPr>
-        <w:t>peril_selection</w:t>
-      </w:r>
-      <w:r>
-        <w:rPr>
-          <w:b w:val="0"/>
-          <w:i w:val="0"/>
-        </w:rPr>
-        <w:t xml:space="preserve"> selects peril 1 (earthquake) and 2 (wind) together. Both use the single </w:t>
-      </w:r>
-      <w:r>
-        <w:rPr>
-          <w:rFonts w:ascii="Courier New" w:hAnsi="Courier New"/>
-          <w:b w:val="0"/>
-          <w:i w:val="0"/>
-          <w:sz w:val="18"/>
-        </w:rPr>
-        <w:t>@policy_type = 1</w:t>
-      </w:r>
-      <w:r>
-        <w:rPr>
-          <w:b w:val="0"/>
-          <w:i w:val="0"/>
-        </w:rPr>
-        <w:t xml:space="preserve"> filter: confirm that policy population is appropriate for both perils; the query does not select a separate policy type per peril.</w:t>
-      </w:r>
-    </w:p>
-    <w:p>
-      <w:r>
-        <w:rPr>
-          <w:b w:val="0"/>
-          <w:i w:val="0"/>
-        </w:rPr>
-        <w:t xml:space="preserve">2. Export the raw/source result with these eight headers, in order: </w:t>
-      </w:r>
-      <w:r>
-        <w:rPr>
-          <w:rFonts w:ascii="Courier New" w:hAnsi="Courier New"/>
-          <w:b w:val="0"/>
-          <w:i w:val="0"/>
-          <w:sz w:val="18"/>
-        </w:rPr>
-        <w:t>pml, accgrpid, uwritrname, state, userid1, cntrycode, is_geocoded, peril_id</w:t>
-      </w:r>
-      <w:r>
-        <w:rPr>
-          <w:b w:val="0"/>
-          <w:i w:val="0"/>
-        </w:rPr>
-        <w:t>. These are already capped account/geography aggregates, not location or individual-policy detail.</w:t>
-      </w:r>
-    </w:p>
-    <w:p>
-      <w:r>
-        <w:rPr>
-          <w:b w:val="0"/>
-          <w:i w:val="0"/>
-        </w:rPr>
-        <w:t xml:space="preserve">3. Run </w:t>
-      </w:r>
-      <w:r>
-        <w:rPr>
-          <w:rFonts w:ascii="Courier New" w:hAnsi="Courier New"/>
-          <w:b w:val="0"/>
-          <w:i w:val="0"/>
-          <w:sz w:val="18"/>
-        </w:rPr>
-        <w:t>bscr/sql/bscr-output.sql</w:t>
-      </w:r>
-      <w:r>
-        <w:rPr>
-          <w:b w:val="0"/>
-          <w:i w:val="0"/>
-        </w:rPr>
-        <w:t xml:space="preserve"> against the </w:t>
-      </w:r>
-      <w:r>
-        <w:rPr>
-          <w:b/>
-          <w:i w:val="0"/>
-        </w:rPr>
-        <w:t>same snapshot</w:t>
-      </w:r>
-      <w:r>
-        <w:rPr>
-          <w:b w:val="0"/>
-          <w:i w:val="0"/>
-        </w:rPr>
-        <w:t xml:space="preserve"> and peril selection. It matches policy type to each peril rather than using the extract's single </w:t>
-      </w:r>
-      <w:r>
-        <w:rPr>
-          <w:rFonts w:ascii="Courier New" w:hAnsi="Courier New"/>
-          <w:b w:val="0"/>
-          <w:i w:val="0"/>
-          <w:sz w:val="18"/>
-        </w:rPr>
-        <w:t>@policy_type</w:t>
-      </w:r>
-      <w:r>
-        <w:rPr>
-          <w:b w:val="0"/>
-          <w:i w:val="0"/>
-        </w:rPr>
-        <w:t xml:space="preserve">. It independently calculates the source exposure; it does not read the raw CSV. Leave </w:t>
-      </w:r>
-      <w:r>
-        <w:rPr>
-          <w:rFonts w:ascii="Courier New" w:hAnsi="Courier New"/>
-          <w:b w:val="0"/>
-          <w:i w:val="0"/>
-          <w:sz w:val="18"/>
-        </w:rPr>
-        <w:t>@bscr_entity = NULL</w:t>
-      </w:r>
-      <w:r>
-        <w:rPr>
-          <w:b w:val="0"/>
-          <w:i w:val="0"/>
-        </w:rPr>
-        <w:t xml:space="preserve"> for all entities, including unmapped NULL entities, or set a quoted value such as </w:t>
-      </w:r>
-      <w:r>
-        <w:rPr>
-          <w:rFonts w:ascii="Courier New" w:hAnsi="Courier New"/>
-          <w:b w:val="0"/>
-          <w:i w:val="0"/>
-          <w:sz w:val="18"/>
-        </w:rPr>
-        <w:t>'HIC'</w:t>
+        <w:t>is_na_eq</w:t>
       </w:r>
       <w:r>
         <w:rPr>
@@ -1467,7 +1195,7 @@
           <w:i w:val="0"/>
           <w:sz w:val="18"/>
         </w:rPr>
-        <w:t>'33'</w:t>
+        <w:t>is_jp_eq</w:t>
       </w:r>
       <w:r>
         <w:rPr>
@@ -1483,7 +1211,7 @@
           <w:i w:val="0"/>
           <w:sz w:val="18"/>
         </w:rPr>
-        <w:t>'HIG'</w:t>
+        <w:t>is_us_all</w:t>
       </w:r>
       <w:r>
         <w:rPr>
@@ -1499,1440 +1227,6 @@
           <w:i w:val="0"/>
           <w:sz w:val="18"/>
         </w:rPr>
-        <w:t>'HSA'</w:t>
-      </w:r>
-      <w:r>
-        <w:rPr>
-          <w:b w:val="0"/>
-          <w:i w:val="0"/>
-        </w:rPr>
-        <w:t xml:space="preserve">, or </w:t>
-      </w:r>
-      <w:r>
-        <w:rPr>
-          <w:rFonts w:ascii="Courier New" w:hAnsi="Courier New"/>
-          <w:b w:val="0"/>
-          <w:i w:val="0"/>
-          <w:sz w:val="18"/>
-        </w:rPr>
-        <w:t>'3624'</w:t>
-      </w:r>
-      <w:r>
-        <w:rPr>
-          <w:b w:val="0"/>
-          <w:i w:val="0"/>
-        </w:rPr>
-        <w:t>.</w:t>
-      </w:r>
-    </w:p>
-    <w:p>
-      <w:r>
-        <w:rPr>
-          <w:b w:val="0"/>
-          <w:i w:val="0"/>
-        </w:rPr>
-        <w:t xml:space="preserve">4. Confirm </w:t>
-      </w:r>
-      <w:r>
-        <w:rPr>
-          <w:rFonts w:ascii="Courier New" w:hAnsi="Courier New"/>
-          <w:b w:val="0"/>
-          <w:i w:val="0"/>
-          <w:sz w:val="18"/>
-        </w:rPr>
-        <w:t>@qs_pct_retention</w:t>
-      </w:r>
-      <w:r>
-        <w:rPr>
-          <w:b w:val="0"/>
-          <w:i w:val="0"/>
-        </w:rPr>
-        <w:t xml:space="preserve"> and </w:t>
-      </w:r>
-      <w:r>
-        <w:rPr>
-          <w:rFonts w:ascii="Courier New" w:hAnsi="Courier New"/>
-          <w:b w:val="0"/>
-          <w:i w:val="0"/>
-          <w:sz w:val="18"/>
-        </w:rPr>
-        <w:t>@srp_pct_retention</w:t>
-      </w:r>
-      <w:r>
-        <w:rPr>
-          <w:b w:val="0"/>
-          <w:i w:val="0"/>
-        </w:rPr>
-        <w:t xml:space="preserve"> (</w:t>
-      </w:r>
-      <w:r>
-        <w:rPr>
-          <w:rFonts w:ascii="Courier New" w:hAnsi="Courier New"/>
-          <w:b w:val="0"/>
-          <w:i w:val="0"/>
-          <w:sz w:val="18"/>
-        </w:rPr>
-        <w:t>0.5</w:t>
-      </w:r>
-      <w:r>
-        <w:rPr>
-          <w:b w:val="0"/>
-          <w:i w:val="0"/>
-        </w:rPr>
-        <w:t xml:space="preserve"> and </w:t>
-      </w:r>
-      <w:r>
-        <w:rPr>
-          <w:rFonts w:ascii="Courier New" w:hAnsi="Courier New"/>
-          <w:b w:val="0"/>
-          <w:i w:val="0"/>
-          <w:sz w:val="18"/>
-        </w:rPr>
-        <w:t>0.3333</w:t>
-      </w:r>
-      <w:r>
-        <w:rPr>
-          <w:b w:val="0"/>
-          <w:i w:val="0"/>
-        </w:rPr>
-        <w:t xml:space="preserve">). They are retained fractions, not percentages to divide by 100. A literal </w:t>
-      </w:r>
-      <w:r>
-        <w:rPr>
-          <w:rFonts w:ascii="Courier New" w:hAnsi="Courier New"/>
-          <w:b w:val="0"/>
-          <w:i w:val="0"/>
-          <w:sz w:val="18"/>
-        </w:rPr>
-        <w:t>_QS</w:t>
-      </w:r>
-      <w:r>
-        <w:rPr>
-          <w:b w:val="0"/>
-          <w:i w:val="0"/>
-        </w:rPr>
-        <w:t xml:space="preserve"> marker in </w:t>
-      </w:r>
-      <w:r>
-        <w:rPr>
-          <w:rFonts w:ascii="Courier New" w:hAnsi="Courier New"/>
-          <w:b w:val="0"/>
-          <w:i w:val="0"/>
-          <w:sz w:val="18"/>
-        </w:rPr>
-        <w:t>userid1</w:t>
-      </w:r>
-      <w:r>
-        <w:rPr>
-          <w:b w:val="0"/>
-          <w:i w:val="0"/>
-        </w:rPr>
-        <w:t xml:space="preserve"> takes precedence over </w:t>
-      </w:r>
-      <w:r>
-        <w:rPr>
-          <w:rFonts w:ascii="Courier New" w:hAnsi="Courier New"/>
-          <w:b w:val="0"/>
-          <w:i w:val="0"/>
-          <w:sz w:val="18"/>
-        </w:rPr>
-        <w:t>_SRP</w:t>
-      </w:r>
-      <w:r>
-        <w:rPr>
-          <w:b w:val="0"/>
-          <w:i w:val="0"/>
-        </w:rPr>
-        <w:t xml:space="preserve">; other rows retain the full amount. Set </w:t>
-      </w:r>
-      <w:r>
-        <w:rPr>
-          <w:rFonts w:ascii="Courier New" w:hAnsi="Courier New"/>
-          <w:b w:val="0"/>
-          <w:i w:val="0"/>
-          <w:sz w:val="18"/>
-        </w:rPr>
-        <w:t>@gbp_to_usd</w:t>
-      </w:r>
-      <w:r>
-        <w:rPr>
-          <w:b w:val="0"/>
-          <w:i w:val="0"/>
-        </w:rPr>
-        <w:t xml:space="preserve"> to the approved USD-per-GBP rate (default </w:t>
-      </w:r>
-      <w:r>
-        <w:rPr>
-          <w:rFonts w:ascii="Courier New" w:hAnsi="Courier New"/>
-          <w:b w:val="0"/>
-          <w:i w:val="0"/>
-          <w:sz w:val="18"/>
-        </w:rPr>
-        <w:t>1.35</w:t>
-      </w:r>
-      <w:r>
-        <w:rPr>
-          <w:b w:val="0"/>
-          <w:i w:val="0"/>
-        </w:rPr>
-        <w:t>). The final SELECT converts gross/net amounts to full USD; counts and grouping are unchanged. No division by 1,000,000 is applied in SQL.</w:t>
-      </w:r>
-    </w:p>
-    <w:p>
-      <w:r>
-        <w:rPr>
-          <w:b w:val="0"/>
-          <w:i w:val="0"/>
-        </w:rPr>
-        <w:t xml:space="preserve">5. Export the aggregate result with these eight headers: </w:t>
-      </w:r>
-      <w:r>
-        <w:rPr>
-          <w:rFonts w:ascii="Courier New" w:hAnsi="Courier New"/>
-          <w:b w:val="0"/>
-          <w:i w:val="0"/>
-          <w:sz w:val="18"/>
-        </w:rPr>
-        <w:t>cntrycode, bscr_entity, region, sum_pml, sum_net, count_policies, is_geocoded, peril_id</w:t>
-      </w:r>
-      <w:r>
-        <w:rPr>
-          <w:b w:val="0"/>
-          <w:i w:val="0"/>
-        </w:rPr>
-        <w:t xml:space="preserve">. </w:t>
-      </w:r>
-      <w:r>
-        <w:rPr>
-          <w:rFonts w:ascii="Courier New" w:hAnsi="Courier New"/>
-          <w:b w:val="0"/>
-          <w:i w:val="0"/>
-          <w:sz w:val="18"/>
-        </w:rPr>
-        <w:t>peril_id</w:t>
-      </w:r>
-      <w:r>
-        <w:rPr>
-          <w:b w:val="0"/>
-          <w:i w:val="0"/>
-        </w:rPr>
-        <w:t xml:space="preserve"> is explicit: </w:t>
-      </w:r>
-      <w:r>
-        <w:rPr>
-          <w:rFonts w:ascii="Courier New" w:hAnsi="Courier New"/>
-          <w:b w:val="0"/>
-          <w:i w:val="0"/>
-          <w:sz w:val="18"/>
-        </w:rPr>
-        <w:t>1</w:t>
-      </w:r>
-      <w:r>
-        <w:rPr>
-          <w:b w:val="0"/>
-          <w:i w:val="0"/>
-        </w:rPr>
-        <w:t xml:space="preserve"> for earthquake (including </w:t>
-      </w:r>
-      <w:r>
-        <w:rPr>
-          <w:rFonts w:ascii="Courier New" w:hAnsi="Courier New"/>
-          <w:b w:val="0"/>
-          <w:i w:val="0"/>
-          <w:sz w:val="18"/>
-        </w:rPr>
-        <w:t>ALL</w:t>
-      </w:r>
-      <w:r>
-        <w:rPr>
-          <w:b w:val="0"/>
-          <w:i w:val="0"/>
-        </w:rPr>
-        <w:t xml:space="preserve">), </w:t>
-      </w:r>
-      <w:r>
-        <w:rPr>
-          <w:rFonts w:ascii="Courier New" w:hAnsi="Courier New"/>
-          <w:b w:val="0"/>
-          <w:i w:val="0"/>
-          <w:sz w:val="18"/>
-        </w:rPr>
-        <w:t>2</w:t>
-      </w:r>
-      <w:r>
-        <w:rPr>
-          <w:b w:val="0"/>
-          <w:i w:val="0"/>
-        </w:rPr>
-        <w:t xml:space="preserve"> for wind.</w:t>
-      </w:r>
-    </w:p>
-    <w:p>
-      <w:r>
-        <w:rPr>
-          <w:b w:val="0"/>
-          <w:i w:val="0"/>
-        </w:rPr>
-        <w:t>6. Preserve both SQL files, parameter values, exports, row counts, totals and source-snapshot identity together. A successful export does not resolve the policy-grain or workbook defects below.</w:t>
-      </w:r>
-    </w:p>
-    <w:p>
-      <w:bookmarkStart w:id="5" w:name="bm_bscr_runbook_understand_and_reconcile_the_output"/>
-      <w:pPr>
-        <w:pStyle w:val="Heading2"/>
-        <w:keepNext/>
-      </w:pPr>
-      <w:r>
-        <w:rPr>
-          <w:b w:val="0"/>
-          <w:i w:val="0"/>
-        </w:rPr>
-        <w:t>Understand and reconcile the output</w:t>
-      </w:r>
-      <w:bookmarkEnd w:id="5"/>
-    </w:p>
-    <w:p>
-      <w:r>
-        <w:rPr>
-          <w:b w:val="0"/>
-          <w:i w:val="0"/>
-        </w:rPr>
-        <w:t xml:space="preserve">The aggregate grain is country, derived entity, region and geocode status. There is no final </w:t>
-      </w:r>
-      <w:r>
-        <w:rPr>
-          <w:rFonts w:ascii="Courier New" w:hAnsi="Courier New"/>
-          <w:b w:val="0"/>
-          <w:i w:val="0"/>
-          <w:sz w:val="18"/>
-        </w:rPr>
-        <w:t>peril_id</w:t>
-      </w:r>
-      <w:r>
-        <w:rPr>
-          <w:b w:val="0"/>
-          <w:i w:val="0"/>
-        </w:rPr>
-        <w:t xml:space="preserve"> column: the following region routing is part of the output contract.</w:t>
-      </w:r>
-    </w:p>
-    <w:tbl>
-      <w:tblPr>
-        <w:tblStyle w:val="TableGrid"/>
-        <w:tblW w:type="auto" w:w="0"/>
-        <w:tblLook w:firstColumn="1" w:firstRow="1" w:lastColumn="0" w:lastRow="0" w:noHBand="0" w:noVBand="1" w:val="04A0"/>
-      </w:tblPr>
-      <w:tblGrid>
-        <w:gridCol w:w="3360"/>
-        <w:gridCol w:w="3360"/>
-        <w:gridCol w:w="3360"/>
-      </w:tblGrid>
-      <w:tr>
-        <w:tc>
-          <w:tcPr>
-            <w:tcW w:type="dxa" w:w="3360"/>
-            <w:shd w:fill="D9EAF7"/>
-          </w:tcPr>
-          <w:p>
-            <w:r>
-              <w:rPr>
-                <w:b/>
-              </w:rPr>
-            </w:r>
-            <w:r>
-              <w:rPr>
-                <w:b/>
-                <w:i w:val="0"/>
-              </w:rPr>
-              <w:t>Region</w:t>
-            </w:r>
-          </w:p>
-        </w:tc>
-        <w:tc>
-          <w:tcPr>
-            <w:tcW w:type="dxa" w:w="3360"/>
-            <w:shd w:fill="D9EAF7"/>
-          </w:tcPr>
-          <w:p>
-            <w:r>
-              <w:rPr>
-                <w:b/>
-              </w:rPr>
-            </w:r>
-            <w:r>
-              <w:rPr>
-                <w:b/>
-                <w:i w:val="0"/>
-              </w:rPr>
-              <w:t>Peril</w:t>
-            </w:r>
-          </w:p>
-        </w:tc>
-        <w:tc>
-          <w:tcPr>
-            <w:tcW w:type="dxa" w:w="3360"/>
-            <w:shd w:fill="D9EAF7"/>
-          </w:tcPr>
-          <w:p>
-            <w:r>
-              <w:rPr>
-                <w:b/>
-              </w:rPr>
-            </w:r>
-            <w:r>
-              <w:rPr>
-                <w:b/>
-                <w:i w:val="0"/>
-              </w:rPr>
-              <w:t>Current population</w:t>
-            </w:r>
-          </w:p>
-        </w:tc>
-      </w:tr>
-      <w:tr>
-        <w:tc>
-          <w:tcPr>
-            <w:tcW w:type="dxa" w:w="3360"/>
-          </w:tcPr>
-          <w:p>
-            <w:r/>
-            <w:r>
-              <w:rPr>
-                <w:rFonts w:ascii="Courier New" w:hAnsi="Courier New"/>
-                <w:b w:val="0"/>
-                <w:i w:val="0"/>
-                <w:sz w:val="18"/>
-              </w:rPr>
-              <w:t>is_nahu</w:t>
-            </w:r>
-          </w:p>
-        </w:tc>
-        <w:tc>
-          <w:tcPr>
-            <w:tcW w:type="dxa" w:w="3360"/>
-          </w:tcPr>
-          <w:p>
-            <w:r/>
-            <w:r>
-              <w:rPr>
-                <w:b w:val="0"/>
-                <w:i w:val="0"/>
-              </w:rPr>
-              <w:t>2 — wind</w:t>
-            </w:r>
-          </w:p>
-        </w:tc>
-        <w:tc>
-          <w:tcPr>
-            <w:tcW w:type="dxa" w:w="3360"/>
-          </w:tcPr>
-          <w:p>
-            <w:r/>
-            <w:r>
-              <w:rPr>
-                <w:b w:val="0"/>
-                <w:i w:val="0"/>
-              </w:rPr>
-              <w:t>US (all states), CB, TC, BH, JM, VI, MX</w:t>
-            </w:r>
-          </w:p>
-        </w:tc>
-      </w:tr>
-      <w:tr>
-        <w:tc>
-          <w:tcPr>
-            <w:tcW w:type="dxa" w:w="3360"/>
-          </w:tcPr>
-          <w:p>
-            <w:r/>
-            <w:r>
-              <w:rPr>
-                <w:rFonts w:ascii="Courier New" w:hAnsi="Courier New"/>
-                <w:b w:val="0"/>
-                <w:i w:val="0"/>
-                <w:sz w:val="18"/>
-              </w:rPr>
-              <w:t>is_eu</w:t>
-            </w:r>
-          </w:p>
-        </w:tc>
-        <w:tc>
-          <w:tcPr>
-            <w:tcW w:type="dxa" w:w="3360"/>
-          </w:tcPr>
-          <w:p>
-            <w:r/>
-            <w:r>
-              <w:rPr>
-                <w:b w:val="0"/>
-                <w:i w:val="0"/>
-              </w:rPr>
-              <w:t>2 — wind</w:t>
-            </w:r>
-          </w:p>
-        </w:tc>
-        <w:tc>
-          <w:tcPr>
-            <w:tcW w:type="dxa" w:w="3360"/>
-          </w:tcPr>
-          <w:p>
-            <w:r/>
-            <w:r>
-              <w:rPr>
-                <w:b w:val="0"/>
-                <w:i w:val="0"/>
-              </w:rPr>
-              <w:t>GB, UK, FR, DE, BE, NL, LX, AT, DK, SE, PL, CZ</w:t>
-            </w:r>
-          </w:p>
-        </w:tc>
-      </w:tr>
-      <w:tr>
-        <w:tc>
-          <w:tcPr>
-            <w:tcW w:type="dxa" w:w="3360"/>
-          </w:tcPr>
-          <w:p>
-            <w:r/>
-            <w:r>
-              <w:rPr>
-                <w:rFonts w:ascii="Courier New" w:hAnsi="Courier New"/>
-                <w:b w:val="0"/>
-                <w:i w:val="0"/>
-                <w:sz w:val="18"/>
-              </w:rPr>
-              <w:t>is_jp</w:t>
-            </w:r>
-          </w:p>
-        </w:tc>
-        <w:tc>
-          <w:tcPr>
-            <w:tcW w:type="dxa" w:w="3360"/>
-          </w:tcPr>
-          <w:p>
-            <w:r/>
-            <w:r>
-              <w:rPr>
-                <w:b w:val="0"/>
-                <w:i w:val="0"/>
-              </w:rPr>
-              <w:t>2 — wind</w:t>
-            </w:r>
-          </w:p>
-        </w:tc>
-        <w:tc>
-          <w:tcPr>
-            <w:tcW w:type="dxa" w:w="3360"/>
-          </w:tcPr>
-          <w:p>
-            <w:r/>
-            <w:r>
-              <w:rPr>
-                <w:b w:val="0"/>
-                <w:i w:val="0"/>
-              </w:rPr>
-              <w:t>JP</w:t>
-            </w:r>
-          </w:p>
-        </w:tc>
-      </w:tr>
-      <w:tr>
-        <w:tc>
-          <w:tcPr>
-            <w:tcW w:type="dxa" w:w="3360"/>
-          </w:tcPr>
-          <w:p>
-            <w:r/>
-            <w:r>
-              <w:rPr>
-                <w:rFonts w:ascii="Courier New" w:hAnsi="Courier New"/>
-                <w:b w:val="0"/>
-                <w:i w:val="0"/>
-                <w:sz w:val="18"/>
-              </w:rPr>
-              <w:t>is_na_eq</w:t>
-            </w:r>
-          </w:p>
-        </w:tc>
-        <w:tc>
-          <w:tcPr>
-            <w:tcW w:type="dxa" w:w="3360"/>
-          </w:tcPr>
-          <w:p>
-            <w:r/>
-            <w:r>
-              <w:rPr>
-                <w:b w:val="0"/>
-                <w:i w:val="0"/>
-              </w:rPr>
-              <w:t>1 — earthquake</w:t>
-            </w:r>
-          </w:p>
-        </w:tc>
-        <w:tc>
-          <w:tcPr>
-            <w:tcW w:type="dxa" w:w="3360"/>
-          </w:tcPr>
-          <w:p>
-            <w:r/>
-            <w:r>
-              <w:rPr>
-                <w:b w:val="0"/>
-                <w:i w:val="0"/>
-              </w:rPr>
-              <w:t>CA; US California, Washington, Oregon, South Carolina, Tennessee, or NULL state</w:t>
-            </w:r>
-          </w:p>
-        </w:tc>
-      </w:tr>
-      <w:tr>
-        <w:tc>
-          <w:tcPr>
-            <w:tcW w:type="dxa" w:w="3360"/>
-          </w:tcPr>
-          <w:p>
-            <w:r/>
-            <w:r>
-              <w:rPr>
-                <w:rFonts w:ascii="Courier New" w:hAnsi="Courier New"/>
-                <w:b w:val="0"/>
-                <w:i w:val="0"/>
-                <w:sz w:val="18"/>
-              </w:rPr>
-              <w:t>is_jp_eq</w:t>
-            </w:r>
-          </w:p>
-        </w:tc>
-        <w:tc>
-          <w:tcPr>
-            <w:tcW w:type="dxa" w:w="3360"/>
-          </w:tcPr>
-          <w:p>
-            <w:r/>
-            <w:r>
-              <w:rPr>
-                <w:b w:val="0"/>
-                <w:i w:val="0"/>
-              </w:rPr>
-              <w:t>1 — earthquake</w:t>
-            </w:r>
-          </w:p>
-        </w:tc>
-        <w:tc>
-          <w:tcPr>
-            <w:tcW w:type="dxa" w:w="3360"/>
-          </w:tcPr>
-          <w:p>
-            <w:r/>
-            <w:r>
-              <w:rPr>
-                <w:b w:val="0"/>
-                <w:i w:val="0"/>
-              </w:rPr>
-              <w:t>JP</w:t>
-            </w:r>
-          </w:p>
-        </w:tc>
-      </w:tr>
-      <w:tr>
-        <w:tc>
-          <w:tcPr>
-            <w:tcW w:type="dxa" w:w="3360"/>
-          </w:tcPr>
-          <w:p>
-            <w:r/>
-            <w:r>
-              <w:rPr>
-                <w:rFonts w:ascii="Courier New" w:hAnsi="Courier New"/>
-                <w:b w:val="0"/>
-                <w:i w:val="0"/>
-                <w:sz w:val="18"/>
-              </w:rPr>
-              <w:t>is_us_all</w:t>
-            </w:r>
-          </w:p>
-        </w:tc>
-        <w:tc>
-          <w:tcPr>
-            <w:tcW w:type="dxa" w:w="3360"/>
-          </w:tcPr>
-          <w:p>
-            <w:r/>
-            <w:r>
-              <w:rPr>
-                <w:b w:val="0"/>
-                <w:i w:val="0"/>
-              </w:rPr>
-              <w:t>1 — earthquake</w:t>
-            </w:r>
-          </w:p>
-        </w:tc>
-        <w:tc>
-          <w:tcPr>
-            <w:tcW w:type="dxa" w:w="3360"/>
-          </w:tcPr>
-          <w:p>
-            <w:r/>
-            <w:r>
-              <w:rPr>
-                <w:b w:val="0"/>
-                <w:i w:val="0"/>
-              </w:rPr>
-              <w:t>US</w:t>
-            </w:r>
-          </w:p>
-        </w:tc>
-      </w:tr>
-      <w:tr>
-        <w:tc>
-          <w:tcPr>
-            <w:tcW w:type="dxa" w:w="3360"/>
-          </w:tcPr>
-          <w:p>
-            <w:r/>
-            <w:r>
-              <w:rPr>
-                <w:rFonts w:ascii="Courier New" w:hAnsi="Courier New"/>
-                <w:b w:val="0"/>
-                <w:i w:val="0"/>
-                <w:sz w:val="18"/>
-              </w:rPr>
-              <w:t>is_non_us</w:t>
-            </w:r>
-          </w:p>
-        </w:tc>
-        <w:tc>
-          <w:tcPr>
-            <w:tcW w:type="dxa" w:w="3360"/>
-          </w:tcPr>
-          <w:p>
-            <w:r/>
-            <w:r>
-              <w:rPr>
-                <w:b w:val="0"/>
-                <w:i w:val="0"/>
-              </w:rPr>
-              <w:t>1 — earthquake</w:t>
-            </w:r>
-          </w:p>
-        </w:tc>
-        <w:tc>
-          <w:tcPr>
-            <w:tcW w:type="dxa" w:w="3360"/>
-          </w:tcPr>
-          <w:p>
-            <w:r/>
-            <w:r>
-              <w:rPr>
-                <w:b w:val="0"/>
-                <w:i w:val="0"/>
-              </w:rPr>
-              <w:t>Anything other than US, including NULL country</w:t>
-            </w:r>
-          </w:p>
-        </w:tc>
-      </w:tr>
-      <w:tr>
-        <w:tc>
-          <w:tcPr>
-            <w:tcW w:type="dxa" w:w="3360"/>
-          </w:tcPr>
-          <w:p>
-            <w:r/>
-            <w:r>
-              <w:rPr>
-                <w:rFonts w:ascii="Courier New" w:hAnsi="Courier New"/>
-                <w:b w:val="0"/>
-                <w:i w:val="0"/>
-                <w:sz w:val="18"/>
-              </w:rPr>
-              <w:t>ALL</w:t>
-            </w:r>
-          </w:p>
-        </w:tc>
-        <w:tc>
-          <w:tcPr>
-            <w:tcW w:type="dxa" w:w="3360"/>
-          </w:tcPr>
-          <w:p>
-            <w:r/>
-            <w:r>
-              <w:rPr>
-                <w:b w:val="0"/>
-                <w:i w:val="0"/>
-              </w:rPr>
-              <w:t>1 — earthquake</w:t>
-            </w:r>
-          </w:p>
-        </w:tc>
-        <w:tc>
-          <w:tcPr>
-            <w:tcW w:type="dxa" w:w="3360"/>
-          </w:tcPr>
-          <w:p>
-            <w:r/>
-            <w:r>
-              <w:rPr>
-                <w:b w:val="0"/>
-                <w:i w:val="0"/>
-              </w:rPr>
-              <w:t>All source countries</w:t>
-            </w:r>
-          </w:p>
-        </w:tc>
-      </w:tr>
-    </w:tbl>
-    <w:p/>
-    <w:p>
-      <w:r>
-        <w:rPr>
-          <w:b w:val="0"/>
-          <w:i w:val="0"/>
-        </w:rPr>
-        <w:t xml:space="preserve">These are observed mappings, not approved geography definitions. </w:t>
-      </w:r>
-      <w:r>
-        <w:rPr>
-          <w:rFonts w:ascii="Courier New" w:hAnsi="Courier New"/>
-          <w:b w:val="0"/>
-          <w:i w:val="0"/>
-          <w:sz w:val="18"/>
-        </w:rPr>
-        <w:t>LX</w:t>
-      </w:r>
-      <w:r>
-        <w:rPr>
-          <w:b w:val="0"/>
-          <w:i w:val="0"/>
-        </w:rPr>
-        <w:t xml:space="preserve"> is literal; SQL does not substitute </w:t>
-      </w:r>
-      <w:r>
-        <w:rPr>
-          <w:rFonts w:ascii="Courier New" w:hAnsi="Courier New"/>
-          <w:b w:val="0"/>
-          <w:i w:val="0"/>
-          <w:sz w:val="18"/>
-        </w:rPr>
-        <w:t>LU</w:t>
-      </w:r>
-      <w:r>
-        <w:rPr>
-          <w:b w:val="0"/>
-          <w:i w:val="0"/>
-        </w:rPr>
-        <w:t xml:space="preserve">. Empty US state is not the same as NULL. Region rows overlap; </w:t>
-      </w:r>
-      <w:r>
-        <w:rPr>
-          <w:b/>
-          <w:i w:val="0"/>
-        </w:rPr>
-        <w:t>never total all regions together</w:t>
-      </w:r>
-      <w:r>
-        <w:rPr>
-          <w:b w:val="0"/>
-          <w:i w:val="0"/>
-        </w:rPr>
-        <w:t xml:space="preserve">. </w:t>
-      </w:r>
-      <w:r>
-        <w:rPr>
-          <w:rFonts w:ascii="Courier New" w:hAnsi="Courier New"/>
-          <w:b w:val="0"/>
-          <w:i w:val="0"/>
-          <w:sz w:val="18"/>
-        </w:rPr>
-        <w:t>ALL</w:t>
-      </w:r>
-      <w:r>
-        <w:rPr>
-          <w:b w:val="0"/>
-          <w:i w:val="0"/>
-        </w:rPr>
-        <w:t xml:space="preserve"> is earthquake only, not an all-peril or wind control. Wind outside its three regional populations has no aggregate output row.</w:t>
-      </w:r>
-    </w:p>
-    <w:p>
-      <w:r>
-        <w:rPr>
-          <w:b w:val="0"/>
-          <w:i w:val="0"/>
-        </w:rPr>
-        <w:t xml:space="preserve">• Compare </w:t>
-      </w:r>
-      <w:r>
-        <w:rPr>
-          <w:rFonts w:ascii="Courier New" w:hAnsi="Courier New"/>
-          <w:b w:val="0"/>
-          <w:i w:val="0"/>
-          <w:sz w:val="18"/>
-        </w:rPr>
-        <w:t>ALL.sum_pml</w:t>
-      </w:r>
-      <w:r>
-        <w:rPr>
-          <w:b w:val="0"/>
-          <w:i w:val="0"/>
-        </w:rPr>
-        <w:t xml:space="preserve"> to raw </w:t>
-      </w:r>
-      <w:r>
-        <w:rPr>
-          <w:rFonts w:ascii="Courier New" w:hAnsi="Courier New"/>
-          <w:b w:val="0"/>
-          <w:i w:val="0"/>
-          <w:sz w:val="18"/>
-        </w:rPr>
-        <w:t>pml * @gbp_to_usd</w:t>
-      </w:r>
-      <w:r>
-        <w:rPr>
-          <w:b w:val="0"/>
-          <w:i w:val="0"/>
-        </w:rPr>
-        <w:t xml:space="preserve"> filtered to </w:t>
-      </w:r>
-      <w:r>
-        <w:rPr>
-          <w:rFonts w:ascii="Courier New" w:hAnsi="Courier New"/>
-          <w:b w:val="0"/>
-          <w:i w:val="0"/>
-          <w:sz w:val="18"/>
-        </w:rPr>
-        <w:t>peril_id = 1</w:t>
-      </w:r>
-      <w:r>
-        <w:rPr>
-          <w:b w:val="0"/>
-          <w:i w:val="0"/>
-        </w:rPr>
-        <w:t>, using the same entity scope and geocode/country grain. For an entity-filtered aggregate, first apply the same entity classification to the raw result.</w:t>
-      </w:r>
-    </w:p>
-    <w:p>
-      <w:r>
-        <w:rPr>
-          <w:b w:val="0"/>
-          <w:i w:val="0"/>
-        </w:rPr>
-        <w:t xml:space="preserve">• Entity classification searches </w:t>
-      </w:r>
-      <w:r>
-        <w:rPr>
-          <w:rFonts w:ascii="Courier New" w:hAnsi="Courier New"/>
-          <w:b w:val="0"/>
-          <w:i w:val="0"/>
-          <w:sz w:val="18"/>
-        </w:rPr>
-        <w:t>userid1</w:t>
-      </w:r>
-      <w:r>
-        <w:rPr>
-          <w:b w:val="0"/>
-          <w:i w:val="0"/>
-        </w:rPr>
-        <w:t xml:space="preserve"> case-insensitively in this order: HIG, HSA, 33, 3624, HIC. It is substring matching, not an exact portfolio map; unmatched values produce NULL. Investigate those rows before filtering.</w:t>
-      </w:r>
-    </w:p>
-    <w:p>
-      <w:r>
-        <w:rPr>
-          <w:b w:val="0"/>
-          <w:i w:val="0"/>
-        </w:rPr>
-        <w:t>• Check each wind region separately against the corresponding peril-2 raw population after applying the same FX rate. Reconcile gross-to-net movement by QS/SRP category.</w:t>
-      </w:r>
-    </w:p>
-    <w:p>
-      <w:r>
-        <w:rPr>
-          <w:b w:val="0"/>
-          <w:i w:val="0"/>
-        </w:rPr>
-        <w:t xml:space="preserve">• </w:t>
-      </w:r>
-      <w:r>
-        <w:rPr>
-          <w:rFonts w:ascii="Courier New" w:hAnsi="Courier New"/>
-          <w:b w:val="0"/>
-          <w:i w:val="0"/>
-          <w:sz w:val="18"/>
-        </w:rPr>
-        <w:t>count_policies</w:t>
-      </w:r>
-      <w:r>
-        <w:rPr>
-          <w:b w:val="0"/>
-          <w:i w:val="0"/>
-        </w:rPr>
-        <w:t xml:space="preserve"> is </w:t>
-      </w:r>
-      <w:r>
-        <w:rPr>
-          <w:rFonts w:ascii="Courier New" w:hAnsi="Courier New"/>
-          <w:b w:val="0"/>
-          <w:i w:val="0"/>
-          <w:sz w:val="18"/>
-        </w:rPr>
-        <w:t>COUNT_BIG(*)</w:t>
-      </w:r>
-      <w:r>
-        <w:rPr>
-          <w:b w:val="0"/>
-          <w:i w:val="0"/>
-        </w:rPr>
-        <w:t xml:space="preserve"> over contributing source aggregates. It is neither distinct policies nor distinct contracts and is not an approved Schedule X(f) count.</w:t>
-      </w:r>
-    </w:p>
-    <w:p>
-      <w:r>
-        <w:rPr>
-          <w:b w:val="0"/>
-          <w:i w:val="0"/>
-        </w:rPr>
-        <w:t>• The extract retains source currency; the aggregate converts assumed GBP amounts to full USD only in its final SELECT. Confirm all source amounts are GBP independently: currency is absent from both final exports, and a single rate cannot normalize mixed-currency data. Neither query divides by 1,000,000.</w:t>
-      </w:r>
-    </w:p>
-    <w:p>
-      <w:r>
-        <w:rPr>
-          <w:b w:val="0"/>
-          <w:i w:val="0"/>
-        </w:rPr>
-        <w:t xml:space="preserve">• The extract still retains the account-only policy rejoin, policy-side geocode and cap grouping without </w:t>
-      </w:r>
-      <w:r>
-        <w:rPr>
-          <w:rFonts w:ascii="Courier New" w:hAnsi="Courier New"/>
-          <w:b w:val="0"/>
-          <w:i w:val="0"/>
-          <w:sz w:val="18"/>
-        </w:rPr>
-        <w:t>policyid</w:t>
-      </w:r>
-      <w:r>
-        <w:rPr>
-          <w:b w:val="0"/>
-          <w:i w:val="0"/>
-        </w:rPr>
-        <w:t xml:space="preserve">. The aggregate query corrects those joins, matches policies by peril, and applies caps separately per policy within each exposure grouping. Raw-to-aggregate differences can therefore remain after FX conversion. Obtain independent source and before/after-join controls rather than treating the legacy extract as a correctness baseline. See BSCR-002 in the </w:t>
-      </w:r>
-      <w:hyperlink r:id="rId10">
-        <w:r>
-          <w:rPr>
-            <w:color w:val="0563C1"/>
-            <w:u w:val="single"/>
-          </w:rPr>
-          <w:t>discrepancy register</w:t>
-        </w:r>
-      </w:hyperlink>
-      <w:r>
-        <w:rPr>
-          <w:b w:val="0"/>
-          <w:i w:val="0"/>
-        </w:rPr>
-        <w:t>.</w:t>
-      </w:r>
-    </w:p>
-    <w:p>
-      <w:bookmarkStart w:id="6" w:name="bm_bscr_runbook_load_a_controlled_workbook_copy"/>
-      <w:pPr>
-        <w:pStyle w:val="Heading2"/>
-        <w:keepNext/>
-      </w:pPr>
-      <w:r>
-        <w:rPr>
-          <w:b w:val="0"/>
-          <w:i w:val="0"/>
-        </w:rPr>
-        <w:t>Load a controlled workbook copy</w:t>
-      </w:r>
-      <w:bookmarkEnd w:id="6"/>
-    </w:p>
-    <w:p>
-      <w:r>
-        <w:rPr>
-          <w:b w:val="0"/>
-          <w:i w:val="0"/>
-        </w:rPr>
-        <w:t xml:space="preserve">Use </w:t>
-      </w:r>
-      <w:r>
-        <w:rPr>
-          <w:rFonts w:ascii="Courier New" w:hAnsi="Courier New"/>
-          <w:b w:val="0"/>
-          <w:i w:val="0"/>
-          <w:sz w:val="18"/>
-        </w:rPr>
-        <w:t>bscr/workbooks/BSCR_Workings.xlsx</w:t>
-      </w:r>
-      <w:r>
-        <w:rPr>
-          <w:b w:val="0"/>
-          <w:i w:val="0"/>
-        </w:rPr>
-        <w:t xml:space="preserve"> as workings, not as a completed return. Its current input is a worksheet range, </w:t>
-      </w:r>
-      <w:r>
-        <w:rPr>
-          <w:b/>
-          <w:i w:val="0"/>
-        </w:rPr>
-        <w:t>not an Excel table</w:t>
-      </w:r>
-      <w:r>
-        <w:rPr>
-          <w:b w:val="0"/>
-          <w:i w:val="0"/>
-        </w:rPr>
-        <w:t>, and there is no configured Power Query connection.</w:t>
-      </w:r>
-    </w:p>
-    <w:p>
-      <w:r>
-        <w:rPr>
-          <w:b w:val="0"/>
-          <w:i w:val="0"/>
-        </w:rPr>
-        <w:t>1. Resolve the affected workbook blockers below before a production refresh.</w:t>
-      </w:r>
-    </w:p>
-    <w:p>
-      <w:r>
-        <w:rPr>
-          <w:b w:val="0"/>
-          <w:i w:val="0"/>
-        </w:rPr>
-        <w:t xml:space="preserve">2. Set </w:t>
-      </w:r>
-      <w:r>
-        <w:rPr>
-          <w:rFonts w:ascii="Courier New" w:hAnsi="Courier New"/>
-          <w:b w:val="0"/>
-          <w:i w:val="0"/>
-          <w:sz w:val="18"/>
-        </w:rPr>
-        <w:t>Settings!B7</w:t>
-      </w:r>
-      <w:r>
-        <w:rPr>
-          <w:b w:val="0"/>
-          <w:i w:val="0"/>
-        </w:rPr>
-        <w:t xml:space="preserve"> to the entity being prepared. Its validation list contains 33, HIC, HIG, HSA and 3624. If filtering the SQL, use the same entity value.</w:t>
-      </w:r>
-    </w:p>
-    <w:p>
-      <w:r>
-        <w:rPr>
-          <w:b w:val="0"/>
-          <w:i w:val="0"/>
-        </w:rPr>
-        <w:t xml:space="preserve">3. Load only the </w:t>
-      </w:r>
-      <w:r>
-        <w:rPr>
-          <w:b/>
-          <w:i w:val="0"/>
-        </w:rPr>
-        <w:t>first seven columns of the aggregate</w:t>
-      </w:r>
-      <w:r>
-        <w:rPr>
-          <w:b w:val="0"/>
-          <w:i w:val="0"/>
-        </w:rPr>
-        <w:t xml:space="preserve">, not the raw export, into </w:t>
-      </w:r>
-      <w:r>
-        <w:rPr>
-          <w:rFonts w:ascii="Courier New" w:hAnsi="Courier New"/>
-          <w:b w:val="0"/>
-          <w:i w:val="0"/>
-          <w:sz w:val="18"/>
-        </w:rPr>
-        <w:t>BSCR Source Data!A:G</w:t>
-      </w:r>
-      <w:r>
-        <w:rPr>
-          <w:b w:val="0"/>
-          <w:i w:val="0"/>
-        </w:rPr>
-        <w:t xml:space="preserve"> with headers in row 1. Preserve the eighth column (</w:t>
-      </w:r>
-      <w:r>
-        <w:rPr>
-          <w:rFonts w:ascii="Courier New" w:hAnsi="Courier New"/>
-          <w:b w:val="0"/>
-          <w:i w:val="0"/>
-          <w:sz w:val="18"/>
-        </w:rPr>
-        <w:t>peril_id</w:t>
-      </w:r>
-      <w:r>
-        <w:rPr>
-          <w:b w:val="0"/>
-          <w:i w:val="0"/>
-        </w:rPr>
-        <w:t>) in the CSV for audit; do not paste it into H, which contains workbook formulas. Clear stale controlled input rows. First adapt the currency formulas as described below; preserve unrelated worksheet content.</w:t>
-      </w:r>
-    </w:p>
-    <w:p>
-      <w:r>
-        <w:rPr>
-          <w:b w:val="0"/>
-          <w:i w:val="0"/>
-        </w:rPr>
-        <w:t xml:space="preserve">4. </w:t>
-      </w:r>
-      <w:r>
-        <w:rPr>
-          <w:rFonts w:ascii="Courier New" w:hAnsi="Courier New"/>
-          <w:b w:val="0"/>
-          <w:i w:val="0"/>
-          <w:sz w:val="18"/>
-        </w:rPr>
-        <w:t>BSCR Output!C:E</w:t>
-      </w:r>
-      <w:r>
-        <w:rPr>
-          <w:b w:val="0"/>
-          <w:i w:val="0"/>
-        </w:rPr>
-        <w:t xml:space="preserve"> uses </w:t>
-      </w:r>
-      <w:r>
-        <w:rPr>
-          <w:rFonts w:ascii="Courier New" w:hAnsi="Courier New"/>
-          <w:b w:val="0"/>
-          <w:i w:val="0"/>
-          <w:sz w:val="18"/>
-        </w:rPr>
-        <w:t>SUMIFS</w:t>
-      </w:r>
-      <w:r>
-        <w:rPr>
-          <w:b w:val="0"/>
-          <w:i w:val="0"/>
-        </w:rPr>
-        <w:t xml:space="preserve"> over source D:F, matching entity, region and geocode from output A, B and F, and summing across countries. Those grouping keys are a fixed list: ensure every incoming key has an approved output row. Recalculation does not create missing groups.</w:t>
-      </w:r>
-    </w:p>
-    <w:p>
-      <w:r>
-        <w:rPr>
-          <w:b w:val="0"/>
-          <w:i w:val="0"/>
-        </w:rPr>
-        <w:t xml:space="preserve">5. Before loading the USD aggregate, remove or bypass the workbook's GBP-to-USD multiplication on every gross/net path. Retain division by 1,000,000 only where USD millions are required. The checked-in workbook has not been updated for this SQL currency change: loading into its existing formulas would convert twice. Changing </w:t>
-      </w:r>
-      <w:r>
-        <w:rPr>
-          <w:rFonts w:ascii="Courier New" w:hAnsi="Courier New"/>
-          <w:b w:val="0"/>
-          <w:i w:val="0"/>
-          <w:sz w:val="18"/>
-        </w:rPr>
-        <w:t>Settings!B3</w:t>
-      </w:r>
-      <w:r>
-        <w:rPr>
-          <w:b w:val="0"/>
-          <w:i w:val="0"/>
-        </w:rPr>
-        <w:t xml:space="preserve"> alone is insufficient because some formulas hard-code </w:t>
-      </w:r>
-      <w:r>
-        <w:rPr>
-          <w:rFonts w:ascii="Courier New" w:hAnsi="Courier New"/>
-          <w:b w:val="0"/>
-          <w:i w:val="0"/>
-          <w:sz w:val="18"/>
-        </w:rPr>
-        <w:t>1.35</w:t>
-      </w:r>
-      <w:r>
-        <w:rPr>
-          <w:b w:val="0"/>
-          <w:i w:val="0"/>
-        </w:rPr>
-        <w:t>. Reconcile formula coverage before refresh.</w:t>
-      </w:r>
-    </w:p>
-    <w:p>
-      <w:r>
-        <w:rPr>
-          <w:b w:val="0"/>
-          <w:i w:val="0"/>
-        </w:rPr>
-        <w:t>6. Reconcile source → output → pivots → schedule reference cells. Retain a reviewed copy and the final-template transfer record.</w:t>
-      </w:r>
-    </w:p>
-    <w:p>
-      <w:bookmarkStart w:id="7" w:name="bm_bscr_runbook_current_workbook_blockers"/>
-      <w:pPr>
-        <w:pStyle w:val="Heading3"/>
-        <w:keepNext/>
-      </w:pPr>
-      <w:r>
-        <w:rPr>
-          <w:b w:val="0"/>
-          <w:i w:val="0"/>
-        </w:rPr>
-        <w:t>Current workbook blockers</w:t>
-      </w:r>
-      <w:bookmarkEnd w:id="7"/>
-    </w:p>
-    <w:p>
-      <w:r>
-        <w:rPr>
-          <w:b w:val="0"/>
-          <w:i w:val="0"/>
-        </w:rPr>
-        <w:t xml:space="preserve">• </w:t>
-      </w:r>
-      <w:r>
-        <w:rPr>
-          <w:b/>
-          <w:i w:val="0"/>
-        </w:rPr>
-        <w:t>Japanese perils reversed:</w:t>
-      </w:r>
-      <w:r>
-        <w:rPr>
-          <w:b w:val="0"/>
-          <w:i w:val="0"/>
-        </w:rPr>
-        <w:t xml:space="preserve"> </w:t>
-      </w:r>
-      <w:r>
-        <w:rPr>
-          <w:rFonts w:ascii="Courier New" w:hAnsi="Courier New"/>
-          <w:b w:val="0"/>
-          <w:i w:val="0"/>
-          <w:sz w:val="18"/>
-        </w:rPr>
-        <w:t>Schedule X(c)!B7:C7</w:t>
-      </w:r>
-      <w:r>
-        <w:rPr>
-          <w:b w:val="0"/>
-          <w:i w:val="0"/>
-        </w:rPr>
-        <w:t xml:space="preserve"> (earthquake) selects </w:t>
-      </w:r>
-      <w:r>
-        <w:rPr>
-          <w:rFonts w:ascii="Courier New" w:hAnsi="Courier New"/>
-          <w:b w:val="0"/>
-          <w:i w:val="0"/>
-          <w:sz w:val="18"/>
-        </w:rPr>
-        <w:t>is_jp</w:t>
-      </w:r>
-      <w:r>
-        <w:rPr>
-          <w:b w:val="0"/>
-          <w:i w:val="0"/>
-        </w:rPr>
-        <w:t xml:space="preserve">, which SQL now defines as wind. </w:t>
-      </w:r>
-      <w:r>
-        <w:rPr>
-          <w:rFonts w:ascii="Courier New" w:hAnsi="Courier New"/>
-          <w:b w:val="0"/>
-          <w:i w:val="0"/>
-          <w:sz w:val="18"/>
-        </w:rPr>
-        <w:t>B8:C8</w:t>
-      </w:r>
-      <w:r>
-        <w:rPr>
-          <w:b w:val="0"/>
-          <w:i w:val="0"/>
-        </w:rPr>
-        <w:t xml:space="preserve"> (typhoon) selects </w:t>
-      </w:r>
-      <w:r>
-        <w:rPr>
-          <w:rFonts w:ascii="Courier New" w:hAnsi="Courier New"/>
-          <w:b w:val="0"/>
-          <w:i w:val="0"/>
-          <w:sz w:val="18"/>
-        </w:rPr>
-        <w:t>is_jp_eq</w:t>
-      </w:r>
-      <w:r>
-        <w:rPr>
-          <w:b w:val="0"/>
-          <w:i w:val="0"/>
-        </w:rPr>
-        <w:t>, which SQL defines as earthquake. Resolve the formula/key mapping before use.</w:t>
-      </w:r>
-    </w:p>
-    <w:p>
-      <w:r>
-        <w:rPr>
-          <w:b w:val="0"/>
-          <w:i w:val="0"/>
-        </w:rPr>
-        <w:t xml:space="preserve">• </w:t>
-      </w:r>
-      <w:r>
-        <w:rPr>
-          <w:b/>
-          <w:i w:val="0"/>
-        </w:rPr>
-        <w:t>Pivot coverage:</w:t>
-      </w:r>
-      <w:r>
-        <w:rPr>
-          <w:b w:val="0"/>
-          <w:i w:val="0"/>
-        </w:rPr>
-        <w:t xml:space="preserve"> the output pivot cache still uses </w:t>
-      </w:r>
-      <w:r>
-        <w:rPr>
-          <w:rFonts w:ascii="Courier New" w:hAnsi="Courier New"/>
-          <w:b w:val="0"/>
-          <w:i w:val="0"/>
-          <w:sz w:val="18"/>
-        </w:rPr>
-        <w:t>BSCR Output!A1:J50</w:t>
-      </w:r>
-      <w:r>
-        <w:rPr>
-          <w:b w:val="0"/>
-          <w:i w:val="0"/>
-        </w:rPr>
-        <w:t xml:space="preserve">, excluding rows 51–70 for </w:t>
-      </w:r>
-      <w:r>
-        <w:rPr>
-          <w:rFonts w:ascii="Courier New" w:hAnsi="Courier New"/>
-          <w:b w:val="0"/>
-          <w:i w:val="0"/>
-          <w:sz w:val="18"/>
-        </w:rPr>
-        <w:t>is_jp_eq</w:t>
-      </w:r>
-      <w:r>
-        <w:rPr>
-          <w:b w:val="0"/>
-          <w:i w:val="0"/>
-        </w:rPr>
-        <w:t xml:space="preserve"> and </w:t>
-      </w:r>
-      <w:r>
-        <w:rPr>
-          <w:rFonts w:ascii="Courier New" w:hAnsi="Courier New"/>
-          <w:b w:val="0"/>
-          <w:i w:val="0"/>
-          <w:sz w:val="18"/>
-        </w:rPr>
         <w:t>is_non_us</w:t>
       </w:r>
       <w:r>
@@ -2940,85 +1234,7 @@
           <w:b w:val="0"/>
           <w:i w:val="0"/>
         </w:rPr>
-        <w:t xml:space="preserve">. The source pivot uses </w:t>
-      </w:r>
-      <w:r>
-        <w:rPr>
-          <w:rFonts w:ascii="Courier New" w:hAnsi="Courier New"/>
-          <w:b w:val="0"/>
-          <w:i w:val="0"/>
-          <w:sz w:val="18"/>
-        </w:rPr>
-        <w:t>BSCR Source Data!A1:K1048576</w:t>
-      </w:r>
-      <w:r>
-        <w:rPr>
-          <w:b w:val="0"/>
-          <w:i w:val="0"/>
-        </w:rPr>
-        <w:t>; neither is a dynamically sized Excel table.</w:t>
-      </w:r>
-    </w:p>
-    <w:p>
-      <w:r>
-        <w:rPr>
-          <w:b w:val="0"/>
-          <w:i w:val="0"/>
-        </w:rPr>
-        <w:t xml:space="preserve">• </w:t>
-      </w:r>
-      <w:r>
-        <w:rPr>
-          <w:b/>
-          <w:i w:val="0"/>
-        </w:rPr>
-        <w:t>FX is not fully settings-driven:</w:t>
-      </w:r>
-      <w:r>
-        <w:rPr>
-          <w:b w:val="0"/>
-          <w:i w:val="0"/>
-        </w:rPr>
-        <w:t xml:space="preserve"> source H:I rows 3–453 and output G rows 3–50 use shared formulas containing hard-coded </w:t>
-      </w:r>
-      <w:r>
-        <w:rPr>
-          <w:rFonts w:ascii="Courier New" w:hAnsi="Courier New"/>
-          <w:b w:val="0"/>
-          <w:i w:val="0"/>
-          <w:sz w:val="18"/>
-        </w:rPr>
-        <w:t>1.35</w:t>
-      </w:r>
-      <w:r>
-        <w:rPr>
-          <w:b w:val="0"/>
-          <w:i w:val="0"/>
-        </w:rPr>
-        <w:t>. Changing B3 alone does not update those conversions. Resolve and reconcile all affected gross/net paths before applying another rate.</w:t>
-      </w:r>
-    </w:p>
-    <w:p>
-      <w:r>
-        <w:rPr>
-          <w:b w:val="0"/>
-          <w:i w:val="0"/>
-        </w:rPr>
-        <w:t xml:space="preserve">• </w:t>
-      </w:r>
-      <w:r>
-        <w:rPr>
-          <w:b/>
-          <w:i w:val="0"/>
-        </w:rPr>
-        <w:t>Cached data is not a current SQL run:</w:t>
-      </w:r>
-      <w:r>
-        <w:rPr>
-          <w:b w:val="0"/>
-          <w:i w:val="0"/>
-        </w:rPr>
-        <w:t xml:space="preserve"> source rows contain the older six region labels, without </w:t>
+        <w:t xml:space="preserve">. The legacy script uses earthquake for every retained regional label and does not add </w:t>
       </w:r>
       <w:r>
         <w:rPr>
@@ -3050,7 +1266,40 @@
           <w:b w:val="0"/>
           <w:i w:val="0"/>
         </w:rPr>
-        <w:t>. Workbook instructions and audit notes also retain older Python/Power Query wording. Forced recalculation on open does not load new data or repair these inconsistencies.</w:t>
+        <w:t>. Uppercase US states do not match the legacy Python lookup's title-case names; current SQL includes the selected US states through case-insensitive matching. Canada is included in both.</w:t>
+      </w:r>
+    </w:p>
+    <w:p>
+      <w:bookmarkStart w:id="6" w:name="bm_bscr_runbook_loading_the_current_reporting_workbook"/>
+      <w:pPr>
+        <w:pStyle w:val="Heading2"/>
+        <w:keepNext/>
+      </w:pPr>
+      <w:r>
+        <w:rPr>
+          <w:b w:val="0"/>
+          <w:i w:val="0"/>
+        </w:rPr>
+        <w:t>Loading the current reporting workbook</w:t>
+      </w:r>
+      <w:bookmarkEnd w:id="6"/>
+    </w:p>
+    <w:p>
+      <w:r>
+        <w:rPr>
+          <w:rFonts w:ascii="Courier New" w:hAnsi="Courier New"/>
+          <w:b w:val="0"/>
+          <w:i w:val="0"/>
+          <w:sz w:val="18"/>
+        </w:rPr>
+        <w:t>bscr/workbooks/BSCR_Workings.xlsx</w:t>
+      </w:r>
+      <w:r>
+        <w:rPr>
+          <w:b w:val="0"/>
+          <w:i w:val="0"/>
+        </w:rPr>
+        <w:t xml:space="preserve"> is the operational workbook, not the concise reconciliation report. Preserve its approved formulas and controls:</w:t>
       </w:r>
     </w:p>
     <w:p>
@@ -3059,7 +1308,116 @@
           <w:b w:val="0"/>
           <w:i w:val="0"/>
         </w:rPr>
-        <w:t xml:space="preserve">See BSCR-001 and BSCR-007 through BSCR-011 in the </w:t>
+        <w:t xml:space="preserve">1. Back it up before loading. Load only the first seven aggregate columns into </w:t>
+      </w:r>
+      <w:r>
+        <w:rPr>
+          <w:rFonts w:ascii="Courier New" w:hAnsi="Courier New"/>
+          <w:b w:val="0"/>
+          <w:i w:val="0"/>
+          <w:sz w:val="18"/>
+        </w:rPr>
+        <w:t>BSCR Source Data!A:G</w:t>
+      </w:r>
+      <w:r>
+        <w:rPr>
+          <w:b w:val="0"/>
+          <w:i w:val="0"/>
+        </w:rPr>
+        <w:t xml:space="preserve">; retain </w:t>
+      </w:r>
+      <w:r>
+        <w:rPr>
+          <w:rFonts w:ascii="Courier New" w:hAnsi="Courier New"/>
+          <w:b w:val="0"/>
+          <w:i w:val="0"/>
+          <w:sz w:val="18"/>
+        </w:rPr>
+        <w:t>peril_id</w:t>
+      </w:r>
+      <w:r>
+        <w:rPr>
+          <w:b w:val="0"/>
+          <w:i w:val="0"/>
+        </w:rPr>
+        <w:t xml:space="preserve"> in the CSV, not worksheet H.</w:t>
+      </w:r>
+    </w:p>
+    <w:p>
+      <w:r>
+        <w:rPr>
+          <w:b w:val="0"/>
+          <w:i w:val="0"/>
+        </w:rPr>
+        <w:t xml:space="preserve">2. Clear stale input rows and verify complete entity/region/geocode coverage. </w:t>
+      </w:r>
+      <w:r>
+        <w:rPr>
+          <w:rFonts w:ascii="Courier New" w:hAnsi="Courier New"/>
+          <w:b w:val="0"/>
+          <w:i w:val="0"/>
+          <w:sz w:val="18"/>
+        </w:rPr>
+        <w:t>BSCR Output!A2:F70</w:t>
+      </w:r>
+      <w:r>
+        <w:rPr>
+          <w:b w:val="0"/>
+          <w:i w:val="0"/>
+        </w:rPr>
+        <w:t xml:space="preserve"> has a fixed list of keys; new keys are not added by recalculation.</w:t>
+      </w:r>
+    </w:p>
+    <w:p>
+      <w:r>
+        <w:rPr>
+          <w:b w:val="0"/>
+          <w:i w:val="0"/>
+        </w:rPr>
+        <w:t xml:space="preserve">3. Bypass workbook FX on every gross/net path before loading USD query output. Some formulas hard-code 1.35, so changing </w:t>
+      </w:r>
+      <w:r>
+        <w:rPr>
+          <w:rFonts w:ascii="Courier New" w:hAnsi="Courier New"/>
+          <w:b w:val="0"/>
+          <w:i w:val="0"/>
+          <w:sz w:val="18"/>
+        </w:rPr>
+        <w:t>Settings!B3</w:t>
+      </w:r>
+      <w:r>
+        <w:rPr>
+          <w:b w:val="0"/>
+          <w:i w:val="0"/>
+        </w:rPr>
+        <w:t xml:space="preserve"> alone is insufficient. Retain division by 1,000,000 only where USD millions are required.</w:t>
+      </w:r>
+    </w:p>
+    <w:p>
+      <w:r>
+        <w:rPr>
+          <w:b w:val="0"/>
+          <w:i w:val="0"/>
+        </w:rPr>
+        <w:t>4. Reconcile cached/formula outputs after Excel refresh. Do not infer modelled, modellable, detailed or data-deficient classifications solely from geocoding.</w:t>
+      </w:r>
+    </w:p>
+    <w:p>
+      <w:r>
+        <w:rPr>
+          <w:b w:val="0"/>
+          <w:i w:val="0"/>
+        </w:rPr>
+        <w:t>5. Review the controlled final template, external links, premium source, modelability decisions and EP results before transfer or sign-off.</w:t>
+      </w:r>
+    </w:p>
+    <w:p>
+      <w:r>
+        <w:rPr>
+          <w:b w:val="0"/>
+          <w:i w:val="0"/>
+        </w:rPr>
+        <w:t xml:space="preserve">See the </w:t>
       </w:r>
       <w:hyperlink r:id="rId10">
         <w:r>
@@ -3075,115 +1433,7 @@
           <w:b w:val="0"/>
           <w:i w:val="0"/>
         </w:rPr>
-        <w:t>.</w:t>
-      </w:r>
-    </w:p>
-    <w:p>
-      <w:bookmarkStart w:id="8" w:name="bm_bscr_runbook_completion_boundary"/>
-      <w:pPr>
-        <w:pStyle w:val="Heading2"/>
-        <w:keepNext/>
-      </w:pPr>
-      <w:r>
-        <w:rPr>
-          <w:b w:val="0"/>
-          <w:i w:val="0"/>
-        </w:rPr>
-        <w:t>Completion boundary</w:t>
-      </w:r>
-      <w:bookmarkEnd w:id="8"/>
-    </w:p>
-    <w:p>
-      <w:r>
-        <w:rPr>
-          <w:b w:val="0"/>
-          <w:i w:val="0"/>
-        </w:rPr>
-        <w:t xml:space="preserve">Schedule X(a) and X(b) require independent approved EP-curve and premium sources. X(c) contains combined regional exposure references, not all required premium/limit splits. X(f) needs distinct-contract and modelability sources. Approve the final template and field-by-field mapping before submission; files in </w:t>
-      </w:r>
-      <w:r>
-        <w:rPr>
-          <w:rFonts w:ascii="Courier New" w:hAnsi="Courier New"/>
-          <w:b w:val="0"/>
-          <w:i w:val="0"/>
-          <w:sz w:val="18"/>
-        </w:rPr>
-        <w:t>bscr/old-process/Workings/</w:t>
-      </w:r>
-      <w:r>
-        <w:rPr>
-          <w:b w:val="0"/>
-          <w:i w:val="0"/>
-        </w:rPr>
-        <w:t xml:space="preserve"> are historical presentation evidence, not SQL inputs or proof of current template approval.</w:t>
-      </w:r>
-    </w:p>
-    <w:p>
-      <w:r>
-        <w:rPr>
-          <w:rFonts w:ascii="Courier New" w:hAnsi="Courier New"/>
-          <w:b w:val="0"/>
-          <w:i w:val="0"/>
-          <w:sz w:val="18"/>
-        </w:rPr>
-        <w:t>bscr/BSCR_UKEU.py</w:t>
-      </w:r>
-      <w:r>
-        <w:rPr>
-          <w:b w:val="0"/>
-          <w:i w:val="0"/>
-        </w:rPr>
-        <w:t xml:space="preserve"> is retained for historical comparison only. Its strict seven-column source contract rejects the current eight-column extract, and its aggregation does not implement the current dual-peril routing or the new region keys. Do not remove </w:t>
-      </w:r>
-      <w:r>
-        <w:rPr>
-          <w:rFonts w:ascii="Courier New" w:hAnsi="Courier New"/>
-          <w:b w:val="0"/>
-          <w:i w:val="0"/>
-          <w:sz w:val="18"/>
-        </w:rPr>
-        <w:t>peril_id</w:t>
-      </w:r>
-      <w:r>
-        <w:rPr>
-          <w:b w:val="0"/>
-          <w:i w:val="0"/>
-        </w:rPr>
-        <w:t xml:space="preserve"> and feed combined-peril rows into it.</w:t>
-      </w:r>
-    </w:p>
-    <w:p>
-      <w:r>
-        <w:rPr>
-          <w:rFonts w:ascii="Courier New" w:hAnsi="Courier New"/>
-          <w:b w:val="0"/>
-          <w:i w:val="0"/>
-          <w:sz w:val="18"/>
-        </w:rPr>
-        <w:t>bscr/BSCR_UKEU_original.py</w:t>
-      </w:r>
-      <w:r>
-        <w:rPr>
-          <w:b w:val="0"/>
-          <w:i w:val="0"/>
-        </w:rPr>
-        <w:t xml:space="preserve"> preserves the original Marimo application, also archived at </w:t>
-      </w:r>
-      <w:r>
-        <w:rPr>
-          <w:rFonts w:ascii="Courier New" w:hAnsi="Courier New"/>
-          <w:b w:val="0"/>
-          <w:i w:val="0"/>
-          <w:sz w:val="18"/>
-        </w:rPr>
-        <w:t>bscr/old-process/BSCR_UKEU.py</w:t>
-      </w:r>
-      <w:r>
-        <w:rPr>
-          <w:b w:val="0"/>
-          <w:i w:val="0"/>
-        </w:rPr>
-        <w:t>. It connects directly to SQL Server and runs its embedded earthquake-only query before the Python aggregation. Its original policy/geocoding calculation defects are preserved, so its totals are not a correctness baseline for the corrected SQL output.</w:t>
+        <w:t xml:space="preserve"> for remaining controls, especially policy-cap allocation grain and distinct contract counting.</w:t>
       </w:r>
     </w:p>
     <w:sectPr>

</xml_diff>

<commit_message>
Clarify template currency mismatch in BSCR reconciliation
</commit_message>
<xml_diff>
--- a/reporting/docs/generated/BSCR-Jan-2026.docx
+++ b/reporting/docs/generated/BSCR-Jan-2026.docx
@@ -301,14 +301,37 @@
           <w:b/>
           <w:i w:val="0"/>
         </w:rPr>
-        <w:t>Read first:</w:t>
+        <w:t>What this tests:</w:t>
       </w:r>
       <w:r>
         <w:rPr>
           <w:b w:val="0"/>
           <w:i w:val="0"/>
         </w:rPr>
-        <w:t xml:space="preserve"> which saved outputs were reproduced and what was established.</w:t>
+        <w:t xml:space="preserve"> the evidence chain, pass criteria, units and limits.</w:t>
+      </w:r>
+    </w:p>
+    <w:p>
+      <w:r>
+        <w:rPr>
+          <w:b w:val="0"/>
+          <w:i w:val="0"/>
+        </w:rPr>
+        <w:t xml:space="preserve">• </w:t>
+      </w:r>
+      <w:r>
+        <w:rPr>
+          <w:b/>
+          <w:i w:val="0"/>
+        </w:rPr>
+        <w:t>Schedule X(f):</w:t>
+      </w:r>
+      <w:r>
+        <w:rPr>
+          <w:b w:val="0"/>
+          <w:i w:val="0"/>
+        </w:rPr>
+        <w:t xml:space="preserve"> the 33 original and 3624/HIC/HIG/HSA v2 templates reconciled to the old saved output and legacy query. Fifteen summary count/gross/net values are shown first; expand the supporting rows for all 528 populated count/exposure cells tested, including source-cell references.</w:t>
       </w:r>
     </w:p>
     <w:p>
@@ -331,7 +354,7 @@
           <w:b w:val="0"/>
           <w:i w:val="0"/>
         </w:rPr>
-        <w:t xml:space="preserve"> old saved output versus legacy query; new saved output versus corrected query; entity totals and the difference.</w:t>
+        <w:t xml:space="preserve"> old saved output, legacy query, corrected query and new saved output side by side; the change is corrected minus legacy.</w:t>
       </w:r>
     </w:p>
     <w:p>
@@ -363,44 +386,21 @@
           <w:b w:val="0"/>
           <w:i w:val="0"/>
         </w:rPr>
-        <w:t xml:space="preserve">• </w:t>
+        <w:t xml:space="preserve">The February templates' cached amounts match the old </w:t>
       </w:r>
       <w:r>
         <w:rPr>
           <w:b/>
           <w:i w:val="0"/>
         </w:rPr>
-        <w:t>Why it changed:</w:t>
+        <w:t>pre-FX</w:t>
       </w:r>
       <w:r>
         <w:rPr>
           <w:b w:val="0"/>
           <w:i w:val="0"/>
         </w:rPr>
-        <w:t xml:space="preserve"> the measured effect of changing only the geocode join, and the separate state-matching/peril-routing changes.</w:t>
-      </w:r>
-    </w:p>
-    <w:p>
-      <w:r>
-        <w:rPr>
-          <w:b w:val="0"/>
-          <w:i w:val="0"/>
-        </w:rPr>
-        <w:t xml:space="preserve">• </w:t>
-      </w:r>
-      <w:r>
-        <w:rPr>
-          <w:b/>
-          <w:i w:val="0"/>
-        </w:rPr>
-        <w:t>Queries and source:</w:t>
-      </w:r>
-      <w:r>
-        <w:rPr>
-          <w:b w:val="0"/>
-          <w:i w:val="0"/>
-        </w:rPr>
-        <w:t xml:space="preserve"> the two scripts, source database, raw row counts and hashes.</w:t>
+        <w:t xml:space="preserve"> output divided by 1,000. Their USD headings are not supported by those saved monetary values: the later USD workings' 1.35 conversion is missing. This currency mismatch is separate from the thousand/million scaling issue and the geocoding correction. The Schedule X(f) summary shows the actual saved template value, matching pre-FX output/query values, the USD value after multiplying by 1.35 without changing scale, and finally USD millions after dividing by 1,000. Counts are unscaled. The expandable checks use normalized USDm to establish lineage; a numeric match after normalization does not validate the template as saved. Premiums, EP curves, narratives, percentage fields, unpopulated/zero-placeholder categories and later April reclassifications are outside this Schedule X(f) test.</w:t>
       </w:r>
     </w:p>
     <w:p>

</xml_diff>

<commit_message>
Add formula-driven multi-entity BSCR population workbook
</commit_message>
<xml_diff>
--- a/reporting/docs/generated/BSCR-Jan-2026.docx
+++ b/reporting/docs/generated/BSCR-Jan-2026.docx
@@ -249,7 +249,408 @@
       </w:r>
     </w:p>
     <w:p>
-      <w:bookmarkStart w:id="3" w:name="bm_bscr_runbook_concise_reconciliation_workbook"/>
+      <w:bookmarkStart w:id="3" w:name="bm_bscr_runbook_automatic_multi_entity_population_workbook"/>
+      <w:pPr>
+        <w:pStyle w:val="Heading2"/>
+        <w:keepNext/>
+      </w:pPr>
+      <w:r>
+        <w:rPr>
+          <w:b w:val="0"/>
+          <w:i w:val="0"/>
+        </w:rPr>
+        <w:t>Automatic multi-entity population workbook</w:t>
+      </w:r>
+      <w:bookmarkEnd w:id="3"/>
+    </w:p>
+    <w:p>
+      <w:r>
+        <w:rPr>
+          <w:b w:val="0"/>
+          <w:i w:val="0"/>
+        </w:rPr>
+        <w:t xml:space="preserve">Use </w:t>
+      </w:r>
+      <w:r>
+        <w:rPr>
+          <w:rFonts w:ascii="Courier New" w:hAnsi="Courier New"/>
+          <w:b w:val="0"/>
+          <w:i w:val="0"/>
+          <w:sz w:val="18"/>
+        </w:rPr>
+        <w:t>bscr/workbooks/BSCR_Auto_Population.xlsx</w:t>
+      </w:r>
+      <w:r>
+        <w:rPr>
+          <w:b w:val="0"/>
+          <w:i w:val="0"/>
+        </w:rPr>
+        <w:t xml:space="preserve">. It is separate from both the reconciliation report and the older </w:t>
+      </w:r>
+      <w:r>
+        <w:rPr>
+          <w:rFonts w:ascii="Courier New" w:hAnsi="Courier New"/>
+          <w:b w:val="0"/>
+          <w:i w:val="0"/>
+          <w:sz w:val="18"/>
+        </w:rPr>
+        <w:t>BSCR_Workings.xlsx</w:t>
+      </w:r>
+      <w:r>
+        <w:rPr>
+          <w:b w:val="0"/>
+          <w:i w:val="0"/>
+        </w:rPr>
+        <w:t>; those files are unchanged. The delivered workbook needs Excel only: no Python, macros, external workbook links or database connection.</w:t>
+      </w:r>
+    </w:p>
+    <w:p>
+      <w:r>
+        <w:rPr>
+          <w:b w:val="0"/>
+          <w:i w:val="0"/>
+        </w:rPr>
+        <w:t xml:space="preserve">Tabs: </w:t>
+      </w:r>
+      <w:r>
+        <w:rPr>
+          <w:b/>
+          <w:i w:val="0"/>
+        </w:rPr>
+        <w:t>Instructions</w:t>
+      </w:r>
+      <w:r>
+        <w:rPr>
+          <w:b w:val="0"/>
+          <w:i w:val="0"/>
+        </w:rPr>
+        <w:t xml:space="preserve">, </w:t>
+      </w:r>
+      <w:r>
+        <w:rPr>
+          <w:b/>
+          <w:i w:val="0"/>
+        </w:rPr>
+        <w:t>SQL input</w:t>
+      </w:r>
+      <w:r>
+        <w:rPr>
+          <w:b w:val="0"/>
+          <w:i w:val="0"/>
+        </w:rPr>
+        <w:t xml:space="preserve">, </w:t>
+      </w:r>
+      <w:r>
+        <w:rPr>
+          <w:b/>
+          <w:i w:val="0"/>
+        </w:rPr>
+        <w:t>33</w:t>
+      </w:r>
+      <w:r>
+        <w:rPr>
+          <w:b w:val="0"/>
+          <w:i w:val="0"/>
+        </w:rPr>
+        <w:t xml:space="preserve">, </w:t>
+      </w:r>
+      <w:r>
+        <w:rPr>
+          <w:b/>
+          <w:i w:val="0"/>
+        </w:rPr>
+        <w:t>3624</w:t>
+      </w:r>
+      <w:r>
+        <w:rPr>
+          <w:b w:val="0"/>
+          <w:i w:val="0"/>
+        </w:rPr>
+        <w:t xml:space="preserve">, </w:t>
+      </w:r>
+      <w:r>
+        <w:rPr>
+          <w:b/>
+          <w:i w:val="0"/>
+        </w:rPr>
+        <w:t>HIC</w:t>
+      </w:r>
+      <w:r>
+        <w:rPr>
+          <w:b w:val="0"/>
+          <w:i w:val="0"/>
+        </w:rPr>
+        <w:t xml:space="preserve">, </w:t>
+      </w:r>
+      <w:r>
+        <w:rPr>
+          <w:b/>
+          <w:i w:val="0"/>
+        </w:rPr>
+        <w:t>HIG</w:t>
+      </w:r>
+      <w:r>
+        <w:rPr>
+          <w:b w:val="0"/>
+          <w:i w:val="0"/>
+        </w:rPr>
+        <w:t xml:space="preserve">, </w:t>
+      </w:r>
+      <w:r>
+        <w:rPr>
+          <w:b/>
+          <w:i w:val="0"/>
+        </w:rPr>
+        <w:t>HSA</w:t>
+      </w:r>
+      <w:r>
+        <w:rPr>
+          <w:b w:val="0"/>
+          <w:i w:val="0"/>
+        </w:rPr>
+        <w:t xml:space="preserve">, </w:t>
+      </w:r>
+      <w:r>
+        <w:rPr>
+          <w:b/>
+          <w:i w:val="0"/>
+        </w:rPr>
+        <w:t>Historical checks</w:t>
+      </w:r>
+      <w:r>
+        <w:rPr>
+          <w:b w:val="0"/>
+          <w:i w:val="0"/>
+        </w:rPr>
+        <w:t>. Each entity tab stacks the visible sections of Schedules X(a), X(b), X(c) and X(f), with navigation links and print breaks.</w:t>
+      </w:r>
+    </w:p>
+    <w:p>
+      <w:r>
+        <w:rPr>
+          <w:b w:val="0"/>
+          <w:i w:val="0"/>
+        </w:rPr>
+        <w:t xml:space="preserve">1. Run </w:t>
+      </w:r>
+      <w:r>
+        <w:rPr>
+          <w:rFonts w:ascii="Courier New" w:hAnsi="Courier New"/>
+          <w:b w:val="0"/>
+          <w:i w:val="0"/>
+          <w:sz w:val="18"/>
+        </w:rPr>
+        <w:t>bscr-output.sql</w:t>
+      </w:r>
+      <w:r>
+        <w:rPr>
+          <w:b w:val="0"/>
+          <w:i w:val="0"/>
+        </w:rPr>
+        <w:t xml:space="preserve"> with all entities selected. The workbook is initially populated with the supplied </w:t>
+      </w:r>
+      <w:r>
+        <w:rPr>
+          <w:rFonts w:ascii="Courier New" w:hAnsi="Courier New"/>
+          <w:b w:val="0"/>
+          <w:i w:val="0"/>
+          <w:sz w:val="18"/>
+        </w:rPr>
+        <w:t>bscr_output_wseq.csv</w:t>
+      </w:r>
+      <w:r>
+        <w:rPr>
+          <w:b w:val="0"/>
+          <w:i w:val="0"/>
+        </w:rPr>
+        <w:t>.</w:t>
+      </w:r>
+    </w:p>
+    <w:p>
+      <w:r>
+        <w:rPr>
+          <w:b w:val="0"/>
+          <w:i w:val="0"/>
+        </w:rPr>
+        <w:t xml:space="preserve">2. Clear all previous data rows in the </w:t>
+      </w:r>
+      <w:r>
+        <w:rPr>
+          <w:b/>
+          <w:i w:val="0"/>
+        </w:rPr>
+        <w:t>SQL input</w:t>
+      </w:r>
+      <w:r>
+        <w:rPr>
+          <w:b w:val="0"/>
+          <w:i w:val="0"/>
+        </w:rPr>
+        <w:t xml:space="preserve"> Excel table. Paste the eight output columns as values below the existing headers. Keep the table; it expands for additional rows. Do not leave stale rows below a shorter replacement. Recalculate in Excel.</w:t>
+      </w:r>
+    </w:p>
+    <w:p>
+      <w:r>
+        <w:rPr>
+          <w:b w:val="0"/>
+          <w:i w:val="0"/>
+        </w:rPr>
+        <w:t xml:space="preserve">3. Leave </w:t>
+      </w:r>
+      <w:r>
+        <w:rPr>
+          <w:b/>
+          <w:i w:val="0"/>
+        </w:rPr>
+        <w:t>Input basis</w:t>
+      </w:r>
+      <w:r>
+        <w:rPr>
+          <w:b w:val="0"/>
+          <w:i w:val="0"/>
+        </w:rPr>
+        <w:t xml:space="preserve"> as </w:t>
+      </w:r>
+      <w:r>
+        <w:rPr>
+          <w:b/>
+          <w:i w:val="0"/>
+        </w:rPr>
+        <w:t>Current SQL</w:t>
+      </w:r>
+      <w:r>
+        <w:rPr>
+          <w:b w:val="0"/>
+          <w:i w:val="0"/>
+        </w:rPr>
+        <w:t xml:space="preserve">. </w:t>
+      </w:r>
+      <w:r>
+        <w:rPr>
+          <w:b/>
+          <w:i w:val="0"/>
+        </w:rPr>
+        <w:t>Legacy check</w:t>
+      </w:r>
+      <w:r>
+        <w:rPr>
+          <w:b w:val="0"/>
+          <w:i w:val="0"/>
+        </w:rPr>
+        <w:t xml:space="preserve"> is only for the retained legacy query's eight-column, USD-converted output.</w:t>
+      </w:r>
+    </w:p>
+    <w:p>
+      <w:r>
+        <w:rPr>
+          <w:b w:val="0"/>
+          <w:i w:val="0"/>
+        </w:rPr>
+        <w:t>4. Review input controls. Unknown/blank entities, missing entity populations, invalid flags and nonnumeric measures require attention. The supplied current output contains two blank-entity wind rows; they are exposed by the controls, not silently allocated to an entity.</w:t>
+      </w:r>
+    </w:p>
+    <w:p>
+      <w:r>
+        <w:rPr>
+          <w:b w:val="0"/>
+          <w:i w:val="0"/>
+        </w:rPr>
+        <w:t>5. Green cells are automatic and locked. Blue fields are manual and start blank: premiums, models/EP losses, questionnaires and narratives. Old template values are not silently carried into a new return.</w:t>
+      </w:r>
+    </w:p>
+    <w:p>
+      <w:r>
+        <w:rPr>
+          <w:b w:val="0"/>
+          <w:i w:val="0"/>
+        </w:rPr>
+        <w:t xml:space="preserve">The agreed X(f) proxy is applied consistently: geocoded rows are modellable/modelled/detailed; ungeocoded rows are not modellable/not modelled/data deficient. US uses earthquake </w:t>
+      </w:r>
+      <w:r>
+        <w:rPr>
+          <w:rFonts w:ascii="Courier New" w:hAnsi="Courier New"/>
+          <w:b w:val="0"/>
+          <w:i w:val="0"/>
+          <w:sz w:val="18"/>
+        </w:rPr>
+        <w:t>ALL</w:t>
+      </w:r>
+      <w:r>
+        <w:rPr>
+          <w:b w:val="0"/>
+          <w:i w:val="0"/>
+        </w:rPr>
+        <w:t xml:space="preserve"> rows with country US; all-other contracts are </w:t>
+      </w:r>
+      <w:r>
+        <w:rPr>
+          <w:rFonts w:ascii="Courier New" w:hAnsi="Courier New"/>
+          <w:b w:val="0"/>
+          <w:i w:val="0"/>
+          <w:sz w:val="18"/>
+        </w:rPr>
+        <w:t>ALL</w:t>
+      </w:r>
+      <w:r>
+        <w:rPr>
+          <w:b w:val="0"/>
+          <w:i w:val="0"/>
+        </w:rPr>
+        <w:t xml:space="preserve"> minus US with the same geocode selection. Historical repeated schedule presentations are retained. Other modelability categories are zero under this proxy, not copied from April reallocations. Exposure is mapped to the historical all-other-lines fields; statutory property-catastrophe fields require separate manual input.</w:t>
+      </w:r>
+    </w:p>
+    <w:p>
+      <w:r>
+        <w:rPr>
+          <w:b w:val="0"/>
+          <w:i w:val="0"/>
+        </w:rPr>
+        <w:t>SQL money is already USD: automatic formulas divide by 1,000,000 once and never apply FX again. Counts remain the SQL grouped-row count.</w:t>
+      </w:r>
+    </w:p>
+    <w:p>
+      <w:r>
+        <w:rPr>
+          <w:b/>
+          <w:i w:val="0"/>
+        </w:rPr>
+        <w:t>Historical checks</w:t>
+      </w:r>
+      <w:r>
+        <w:rPr>
+          <w:b w:val="0"/>
+          <w:i w:val="0"/>
+        </w:rPr>
+        <w:t xml:space="preserve"> shows April saved values, the old-output baseline and live generated values separately. With legacy input, formulas reproduce the historical baseline. All five April overall counts and all 46 populated regional gross/net limits match that baseline; April's rounded totals and manual classification splits can differ. Current-input differences remain visible and are not treated as proof the corrected calculation is wrong.</w:t>
+      </w:r>
+    </w:p>
+    <w:p>
+      <w:r>
+        <w:rPr>
+          <w:b w:val="0"/>
+          <w:i w:val="0"/>
+        </w:rPr>
+        <w:t xml:space="preserve">The builder </w:t>
+      </w:r>
+      <w:r>
+        <w:rPr>
+          <w:rFonts w:ascii="Courier New" w:hAnsi="Courier New"/>
+          <w:b w:val="0"/>
+          <w:i w:val="0"/>
+          <w:sz w:val="18"/>
+        </w:rPr>
+        <w:t>bscr/tools/build_population_workbook.py</w:t>
+      </w:r>
+      <w:r>
+        <w:rPr>
+          <w:b w:val="0"/>
+          <w:i w:val="0"/>
+        </w:rPr>
+        <w:t xml:space="preserve"> is for local maintenance only. It verifies 630 automatic mappings with an independent Excel-function engine using both current and legacy data, and stores cached results so the delivered workbook opens populated. Excel remains responsible for refreshing formulas after subsequent pastes. Native Excel rendering/recalculation was not available during local verification.</w:t>
+      </w:r>
+    </w:p>
+    <w:p>
+      <w:bookmarkStart w:id="4" w:name="bm_bscr_runbook_concise_reconciliation_workbook"/>
       <w:pPr>
         <w:pStyle w:val="Heading2"/>
         <w:keepNext/>
@@ -261,7 +662,7 @@
         </w:rPr>
         <w:t>Concise reconciliation workbook</w:t>
       </w:r>
-      <w:bookmarkEnd w:id="3"/>
+      <w:bookmarkEnd w:id="4"/>
     </w:p>
     <w:p>
       <w:r>
@@ -531,7 +932,7 @@
       </w:r>
     </w:p>
     <w:p>
-      <w:bookmarkStart w:id="4" w:name="bm_bscr_runbook_preserve_the_source_evidence"/>
+      <w:bookmarkStart w:id="5" w:name="bm_bscr_runbook_preserve_the_source_evidence"/>
       <w:pPr>
         <w:pStyle w:val="Heading2"/>
         <w:keepNext/>
@@ -543,7 +944,7 @@
         </w:rPr>
         <w:t>Preserve the source evidence</w:t>
       </w:r>
-      <w:bookmarkEnd w:id="4"/>
+      <w:bookmarkEnd w:id="5"/>
     </w:p>
     <w:p>
       <w:r>
@@ -993,7 +1394,7 @@
       </w:r>
     </w:p>
     <w:p>
-      <w:bookmarkStart w:id="5" w:name="bm_bscr_runbook_running_the_retained_queries"/>
+      <w:bookmarkStart w:id="6" w:name="bm_bscr_runbook_running_the_retained_queries"/>
       <w:pPr>
         <w:pStyle w:val="Heading2"/>
         <w:keepNext/>
@@ -1005,7 +1406,7 @@
         </w:rPr>
         <w:t>Running the retained queries</w:t>
       </w:r>
-      <w:bookmarkEnd w:id="5"/>
+      <w:bookmarkEnd w:id="6"/>
     </w:p>
     <w:p>
       <w:r>
@@ -1270,7 +1671,7 @@
       </w:r>
     </w:p>
     <w:p>
-      <w:bookmarkStart w:id="6" w:name="bm_bscr_runbook_loading_the_current_reporting_workbook"/>
+      <w:bookmarkStart w:id="7" w:name="bm_bscr_runbook_loading_the_current_reporting_workbook"/>
       <w:pPr>
         <w:pStyle w:val="Heading2"/>
         <w:keepNext/>
@@ -1282,7 +1683,7 @@
         </w:rPr>
         <w:t>Loading the current reporting workbook</w:t>
       </w:r>
-      <w:bookmarkEnd w:id="6"/>
+      <w:bookmarkEnd w:id="7"/>
     </w:p>
     <w:p>
       <w:r>

</xml_diff>

<commit_message>
Simplify BSCR population workbook to a two-step refresh
</commit_message>
<xml_diff>
--- a/reporting/docs/generated/BSCR-Jan-2026.docx
+++ b/reporting/docs/generated/BSCR-Jan-2026.docx
@@ -408,20 +408,6 @@
           <w:b w:val="0"/>
           <w:i w:val="0"/>
         </w:rPr>
-        <w:t xml:space="preserve">, </w:t>
-      </w:r>
-      <w:r>
-        <w:rPr>
-          <w:b/>
-          <w:i w:val="0"/>
-        </w:rPr>
-        <w:t>Historical checks</w:t>
-      </w:r>
-      <w:r>
-        <w:rPr>
-          <w:b w:val="0"/>
-          <w:i w:val="0"/>
-        </w:rPr>
         <w:t>. Each entity tab stacks the visible sections of Schedules X(a), X(b), X(c) and X(f), with navigation links and print breaks.</w:t>
       </w:r>
     </w:p>
@@ -431,7 +417,30 @@
           <w:b w:val="0"/>
           <w:i w:val="0"/>
         </w:rPr>
-        <w:t xml:space="preserve">1. Run </w:t>
+        <w:t xml:space="preserve">1. Clear the old data on </w:t>
+      </w:r>
+      <w:r>
+        <w:rPr>
+          <w:b/>
+          <w:i w:val="0"/>
+        </w:rPr>
+        <w:t>SQL input</w:t>
+      </w:r>
+      <w:r>
+        <w:rPr>
+          <w:b w:val="0"/>
+          <w:i w:val="0"/>
+        </w:rPr>
+        <w:t>, keeping the header row and table.</w:t>
+      </w:r>
+    </w:p>
+    <w:p>
+      <w:r>
+        <w:rPr>
+          <w:b w:val="0"/>
+          <w:i w:val="0"/>
+        </w:rPr>
+        <w:t xml:space="preserve">2. Paste the new eight-column results from </w:t>
       </w:r>
       <w:r>
         <w:rPr>
@@ -447,7 +456,16 @@
           <w:b w:val="0"/>
           <w:i w:val="0"/>
         </w:rPr>
-        <w:t xml:space="preserve"> with all entities selected. The workbook is initially populated with the supplied </w:t>
+        <w:t xml:space="preserve"> below the headers. The entity tabs populate automatically.</w:t>
+      </w:r>
+    </w:p>
+    <w:p>
+      <w:r>
+        <w:rPr>
+          <w:b w:val="0"/>
+          <w:i w:val="0"/>
+        </w:rPr>
+        <w:t xml:space="preserve">The initial input is copied from the uploaded </w:t>
       </w:r>
       <w:r>
         <w:rPr>
@@ -456,14 +474,14 @@
           <w:i w:val="0"/>
           <w:sz w:val="18"/>
         </w:rPr>
-        <w:t>bscr_output_wseq.csv</w:t>
+        <w:t>bscr/reconcile/bscr_output_wseq.csv</w:t>
       </w:r>
       <w:r>
         <w:rPr>
           <w:b w:val="0"/>
           <w:i w:val="0"/>
         </w:rPr>
-        <w:t>.</w:t>
+        <w:t xml:space="preserve"> (737 rows), not sample data or a live database connection. Its source is recorded in the SQL input header comment. This workbook accepts current SQL output only; historical reconciliation is kept in the separate reconciliation workbook.</w:t>
       </w:r>
     </w:p>
     <w:p>
@@ -472,90 +490,7 @@
           <w:b w:val="0"/>
           <w:i w:val="0"/>
         </w:rPr>
-        <w:t xml:space="preserve">2. Clear all previous data rows in the </w:t>
-      </w:r>
-      <w:r>
-        <w:rPr>
-          <w:b/>
-          <w:i w:val="0"/>
-        </w:rPr>
-        <w:t>SQL input</w:t>
-      </w:r>
-      <w:r>
-        <w:rPr>
-          <w:b w:val="0"/>
-          <w:i w:val="0"/>
-        </w:rPr>
-        <w:t xml:space="preserve"> Excel table. Paste the eight output columns as values below the existing headers. Keep the table; it expands for additional rows. Do not leave stale rows below a shorter replacement. Recalculate in Excel.</w:t>
-      </w:r>
-    </w:p>
-    <w:p>
-      <w:r>
-        <w:rPr>
-          <w:b w:val="0"/>
-          <w:i w:val="0"/>
-        </w:rPr>
-        <w:t xml:space="preserve">3. Leave </w:t>
-      </w:r>
-      <w:r>
-        <w:rPr>
-          <w:b/>
-          <w:i w:val="0"/>
-        </w:rPr>
-        <w:t>Input basis</w:t>
-      </w:r>
-      <w:r>
-        <w:rPr>
-          <w:b w:val="0"/>
-          <w:i w:val="0"/>
-        </w:rPr>
-        <w:t xml:space="preserve"> as </w:t>
-      </w:r>
-      <w:r>
-        <w:rPr>
-          <w:b/>
-          <w:i w:val="0"/>
-        </w:rPr>
-        <w:t>Current SQL</w:t>
-      </w:r>
-      <w:r>
-        <w:rPr>
-          <w:b w:val="0"/>
-          <w:i w:val="0"/>
-        </w:rPr>
-        <w:t xml:space="preserve">. </w:t>
-      </w:r>
-      <w:r>
-        <w:rPr>
-          <w:b/>
-          <w:i w:val="0"/>
-        </w:rPr>
-        <w:t>Legacy check</w:t>
-      </w:r>
-      <w:r>
-        <w:rPr>
-          <w:b w:val="0"/>
-          <w:i w:val="0"/>
-        </w:rPr>
-        <w:t xml:space="preserve"> is only for the retained legacy query's eight-column, USD-converted output.</w:t>
-      </w:r>
-    </w:p>
-    <w:p>
-      <w:r>
-        <w:rPr>
-          <w:b w:val="0"/>
-          <w:i w:val="0"/>
-        </w:rPr>
-        <w:t>4. Review input controls. Unknown/blank entities, missing entity populations, invalid flags and nonnumeric measures require attention. The supplied current output contains two blank-entity wind rows; they are exposed by the controls, not silently allocated to an entity.</w:t>
-      </w:r>
-    </w:p>
-    <w:p>
-      <w:r>
-        <w:rPr>
-          <w:b w:val="0"/>
-          <w:i w:val="0"/>
-        </w:rPr>
-        <w:t>5. Green cells are automatic and locked. Blue fields are manual and start blank: premiums, models/EP losses, questionnaires and narratives. Old template values are not silently carried into a new return.</w:t>
+        <w:t>Green entity-sheet cells are automatic and locked. Blue fields remain manual: premiums, EP losses, questionnaires and narratives. They start blank, not zero. The two blank-entity wind rows in the supplied input are not assigned to an entity.</w:t>
       </w:r>
     </w:p>
     <w:p>
@@ -611,17 +546,26 @@
     <w:p>
       <w:r>
         <w:rPr>
-          <w:b/>
+          <w:b w:val="0"/>
           <w:i w:val="0"/>
         </w:rPr>
-        <w:t>Historical checks</w:t>
+        <w:t xml:space="preserve">There is no historical-comparison tab or legacy mode in this working workbook. Old-versus-new evidence and the historical template checks are documented in </w:t>
+      </w:r>
+      <w:r>
+        <w:rPr>
+          <w:rFonts w:ascii="Courier New" w:hAnsi="Courier New"/>
+          <w:b w:val="0"/>
+          <w:i w:val="0"/>
+          <w:sz w:val="18"/>
+        </w:rPr>
+        <w:t>bscr/reconcile/results/BSCR_Reconciliation.xlsx</w:t>
       </w:r>
       <w:r>
         <w:rPr>
           <w:b w:val="0"/>
           <w:i w:val="0"/>
         </w:rPr>
-        <w:t xml:space="preserve"> shows April saved values, the old-output baseline and live generated values separately. With legacy input, formulas reproduce the historical baseline. All five April overall counts and all 46 populated regional gross/net limits match that baseline; April's rounded totals and manual classification splits can differ. Current-input differences remain visible and are not treated as proof the corrected calculation is wrong.</w:t>
+        <w:t>, not mixed into the population workflow.</w:t>
       </w:r>
     </w:p>
     <w:p>
@@ -646,7 +590,7 @@
           <w:b w:val="0"/>
           <w:i w:val="0"/>
         </w:rPr>
-        <w:t xml:space="preserve"> is for local maintenance only. It verifies 630 automatic mappings with an independent Excel-function engine using both current and legacy data, and stores cached results so the delivered workbook opens populated. Excel remains responsible for refreshing formulas after subsequent pastes. Native Excel rendering/recalculation was not available during local verification.</w:t>
+        <w:t xml:space="preserve"> is for local maintenance only. It verifies 630 automatic mappings with an independent Excel-function engine using current data, and stores cached results so the delivered workbook opens populated. Excel remains responsible for refreshing formulas after subsequent pastes. Native Excel rendering/recalculation was not available during local verification.</w:t>
       </w:r>
     </w:p>
     <w:p>

</xml_diff>

<commit_message>
Align BSCR documentation with current population and reconciliation workflow
</commit_message>
<xml_diff>
--- a/reporting/docs/generated/BSCR-Jan-2026.docx
+++ b/reporting/docs/generated/BSCR-Jan-2026.docx
@@ -32,7 +32,7 @@
       </w:r>
     </w:p>
     <w:p>
-      <w:bookmarkStart w:id="1" w:name="bm_bscr_runbook_bscr_reporting_and_reconciliation"/>
+      <w:bookmarkStart w:id="1" w:name="bm_bscr_runbook_bscr_populate_the_schedules"/>
       <w:pPr>
         <w:pStyle w:val="Heading1"/>
         <w:keepNext/>
@@ -42,7 +42,7 @@
           <w:b w:val="0"/>
           <w:i w:val="0"/>
         </w:rPr>
-        <w:t>BSCR reporting and reconciliation</w:t>
+        <w:t>BSCR — populate the schedules</w:t>
       </w:r>
       <w:bookmarkEnd w:id="1"/>
     </w:p>
@@ -53,12 +53,12 @@
             <w:color w:val="0563C1"/>
             <w:u w:val="single"/>
           </w:rPr>
-          <w:t>Back to reporting index</w:t>
+          <w:t>Back to reporting guides</w:t>
         </w:r>
       </w:hyperlink>
     </w:p>
     <w:p>
-      <w:bookmarkStart w:id="2" w:name="bm_bscr_runbook_two_sql_scripts"/>
+      <w:bookmarkStart w:id="2" w:name="bm_bscr_runbook_use_these_files"/>
       <w:pPr>
         <w:pStyle w:val="Heading2"/>
         <w:keepNext/>
@@ -68,7 +68,7 @@
           <w:b w:val="0"/>
           <w:i w:val="0"/>
         </w:rPr>
-        <w:t>Two SQL scripts</w:t>
+        <w:t>Use these files</w:t>
       </w:r>
       <w:bookmarkEnd w:id="2"/>
     </w:p>
@@ -99,7 +99,7 @@
                 <w:b/>
                 <w:i w:val="0"/>
               </w:rPr>
-              <w:t>Script</w:t>
+              <w:t>Purpose</w:t>
             </w:r>
           </w:p>
         </w:tc>
@@ -119,7 +119,7 @@
                 <w:b/>
                 <w:i w:val="0"/>
               </w:rPr>
-              <w:t>Purpose</w:t>
+              <w:t>File</w:t>
             </w:r>
           </w:p>
         </w:tc>
@@ -133,12 +133,10 @@
             <w:r/>
             <w:r>
               <w:rPr>
-                <w:rFonts w:ascii="Courier New" w:hAnsi="Courier New"/>
                 <w:b w:val="0"/>
                 <w:i w:val="0"/>
-                <w:sz w:val="18"/>
               </w:rPr>
-              <w:t>bscr/sql/bscr-extract-legacy.sql</w:t>
+              <w:t>Produce current results in SQL Server</w:t>
             </w:r>
           </w:p>
         </w:tc>
@@ -148,13 +146,15 @@
           </w:tcPr>
           <w:p>
             <w:r/>
-            <w:r>
-              <w:rPr>
-                <w:b w:val="0"/>
-                <w:i w:val="0"/>
-              </w:rPr>
-              <w:t>Full historical aggregate output, despite the extract name. Earthquake/policy type 1 throughout; preserves the old geocode duplication and cap grouping, plus Python-style case-sensitive geographic matching. Diagnostic only.</w:t>
-            </w:r>
+            <w:hyperlink r:id="rId10">
+              <w:r>
+                <w:rPr>
+                  <w:color w:val="0563C1"/>
+                  <w:u w:val="single"/>
+                </w:rPr>
+                <w:t>bscr-output.sql</w:t>
+              </w:r>
+            </w:hyperlink>
           </w:p>
         </w:tc>
       </w:tr>
@@ -167,15 +167,32 @@
             <w:r/>
             <w:r>
               <w:rPr>
-                <w:rFonts w:ascii="Courier New" w:hAnsi="Courier New"/>
                 <w:b w:val="0"/>
                 <w:i w:val="0"/>
-                <w:sz w:val="18"/>
               </w:rPr>
-              <w:t>bscr/sql/bscr-output.sql</w:t>
+              <w:t>Populate the schedules in Excel</w:t>
             </w:r>
           </w:p>
         </w:tc>
+        <w:tc>
+          <w:tcPr>
+            <w:tcW w:type="dxa" w:w="5040"/>
+          </w:tcPr>
+          <w:p>
+            <w:r/>
+            <w:hyperlink r:id="rId11">
+              <w:r>
+                <w:rPr>
+                  <w:color w:val="0563C1"/>
+                  <w:u w:val="single"/>
+                </w:rPr>
+                <w:t>BSCR_Auto_Population.xlsx</w:t>
+              </w:r>
+            </w:hyperlink>
+          </w:p>
+        </w:tc>
+      </w:tr>
+      <w:tr>
         <w:tc>
           <w:tcPr>
             <w:tcW w:type="dxa" w:w="5040"/>
@@ -187,8 +204,25 @@
                 <w:b w:val="0"/>
                 <w:i w:val="0"/>
               </w:rPr>
-              <w:t>Current aggregate with corrected geocode joins, policy-ID grouping and earthquake/wind routing.</w:t>
+              <w:t>Review old-versus-new evidence separately</w:t>
             </w:r>
+          </w:p>
+        </w:tc>
+        <w:tc>
+          <w:tcPr>
+            <w:tcW w:type="dxa" w:w="5040"/>
+          </w:tcPr>
+          <w:p>
+            <w:r/>
+            <w:hyperlink r:id="rId12">
+              <w:r>
+                <w:rPr>
+                  <w:color w:val="0563C1"/>
+                  <w:u w:val="single"/>
+                </w:rPr>
+                <w:t>BSCR_Reconciliation.xlsx</w:t>
+              </w:r>
+            </w:hyperlink>
           </w:p>
         </w:tc>
       </w:tr>
@@ -200,117 +234,7 @@
           <w:b w:val="0"/>
           <w:i w:val="0"/>
         </w:rPr>
-        <w:t>Both return:</w:t>
-      </w:r>
-    </w:p>
-    <w:p>
-      <w:r>
-        <w:rPr>
-          <w:rFonts w:ascii="Courier New" w:hAnsi="Courier New"/>
-          <w:b w:val="0"/>
-          <w:i w:val="0"/>
-          <w:sz w:val="18"/>
-        </w:rPr>
-        <w:t>cntrycode, bscr_entity, region, sum_pml, sum_net, count_policies, is_geocoded, peril_id</w:t>
-      </w:r>
-    </w:p>
-    <w:p>
-      <w:r>
-        <w:rPr>
-          <w:b w:val="0"/>
-          <w:i w:val="0"/>
-        </w:rPr>
-        <w:t xml:space="preserve">Both default to full USD using source GBP multiplied by </w:t>
-      </w:r>
-      <w:r>
-        <w:rPr>
-          <w:rFonts w:ascii="Courier New" w:hAnsi="Courier New"/>
-          <w:b w:val="0"/>
-          <w:i w:val="0"/>
-          <w:sz w:val="18"/>
-        </w:rPr>
-        <w:t>@gbp_to_usd = 1.35</w:t>
-      </w:r>
-      <w:r>
-        <w:rPr>
-          <w:b w:val="0"/>
-          <w:i w:val="0"/>
-        </w:rPr>
-        <w:t>. Neither divides by 1,000,000. The legacy script can be run with FX 1 when comparing directly to the historical source-currency CSV. Keep FX, retention and entity parameters identical when comparing the two scripts.</w:t>
-      </w:r>
-    </w:p>
-    <w:p>
-      <w:r>
-        <w:rPr>
-          <w:b w:val="0"/>
-          <w:i w:val="0"/>
-        </w:rPr>
-        <w:t>The scripts are not otherwise equivalent: the legacy query reconstructs the whole old workflow, including earthquake-only regions and case-sensitive geographic classification. The current query intentionally retains its current peril routing and additional regional output views. Do not attribute every regional difference to the geocode correction.</w:t>
-      </w:r>
-    </w:p>
-    <w:p>
-      <w:bookmarkStart w:id="3" w:name="bm_bscr_runbook_automatic_multi_entity_population_workbook"/>
-      <w:pPr>
-        <w:pStyle w:val="Heading2"/>
-        <w:keepNext/>
-      </w:pPr>
-      <w:r>
-        <w:rPr>
-          <w:b w:val="0"/>
-          <w:i w:val="0"/>
-        </w:rPr>
-        <w:t>Automatic multi-entity population workbook</w:t>
-      </w:r>
-      <w:bookmarkEnd w:id="3"/>
-    </w:p>
-    <w:p>
-      <w:r>
-        <w:rPr>
-          <w:b w:val="0"/>
-          <w:i w:val="0"/>
-        </w:rPr>
-        <w:t xml:space="preserve">Use </w:t>
-      </w:r>
-      <w:r>
-        <w:rPr>
-          <w:rFonts w:ascii="Courier New" w:hAnsi="Courier New"/>
-          <w:b w:val="0"/>
-          <w:i w:val="0"/>
-          <w:sz w:val="18"/>
-        </w:rPr>
-        <w:t>bscr/workbooks/BSCR_Auto_Population.xlsx</w:t>
-      </w:r>
-      <w:r>
-        <w:rPr>
-          <w:b w:val="0"/>
-          <w:i w:val="0"/>
-        </w:rPr>
-        <w:t xml:space="preserve">. It is separate from both the reconciliation report and the older </w:t>
-      </w:r>
-      <w:r>
-        <w:rPr>
-          <w:rFonts w:ascii="Courier New" w:hAnsi="Courier New"/>
-          <w:b w:val="0"/>
-          <w:i w:val="0"/>
-          <w:sz w:val="18"/>
-        </w:rPr>
-        <w:t>BSCR_Workings.xlsx</w:t>
-      </w:r>
-      <w:r>
-        <w:rPr>
-          <w:b w:val="0"/>
-          <w:i w:val="0"/>
-        </w:rPr>
-        <w:t>; those files are unchanged. The delivered workbook needs Excel only: no Python, macros, external workbook links or database connection.</w:t>
-      </w:r>
-    </w:p>
-    <w:p>
-      <w:r>
-        <w:rPr>
-          <w:b w:val="0"/>
-          <w:i w:val="0"/>
-        </w:rPr>
-        <w:t xml:space="preserve">Tabs: </w:t>
+        <w:t xml:space="preserve">The population workbook needs Excel only: no Python, macros, database connection or external workbook links. Its seven tabs are </w:t>
       </w:r>
       <w:r>
         <w:rPr>
@@ -394,7 +318,7 @@
           <w:b w:val="0"/>
           <w:i w:val="0"/>
         </w:rPr>
-        <w:t xml:space="preserve">, </w:t>
+        <w:t xml:space="preserve"> and </w:t>
       </w:r>
       <w:r>
         <w:rPr>
@@ -408,8 +332,23 @@
           <w:b w:val="0"/>
           <w:i w:val="0"/>
         </w:rPr>
-        <w:t>. Each entity tab stacks the visible sections of Schedules X(a), X(b), X(c) and X(f), with navigation links and print breaks.</w:t>
+        <w:t>. Each entity tab contains Schedules X(a), X(b), X(c) and X(f), with navigation links and print breaks.</w:t>
       </w:r>
+    </w:p>
+    <w:p>
+      <w:bookmarkStart w:id="3" w:name="bm_bscr_runbook_refresh_the_population_workbook"/>
+      <w:pPr>
+        <w:pStyle w:val="Heading2"/>
+        <w:keepNext/>
+      </w:pPr>
+      <w:r>
+        <w:rPr>
+          <w:b w:val="0"/>
+          <w:i w:val="0"/>
+        </w:rPr>
+        <w:t>Refresh the population workbook</w:t>
+      </w:r>
+      <w:bookmarkEnd w:id="3"/>
     </w:p>
     <w:p>
       <w:r>
@@ -444,10 +383,8 @@
       </w:r>
       <w:r>
         <w:rPr>
-          <w:rFonts w:ascii="Courier New" w:hAnsi="Courier New"/>
-          <w:b w:val="0"/>
+          <w:b/>
           <w:i w:val="0"/>
-          <w:sz w:val="18"/>
         </w:rPr>
         <w:t>bscr-output.sql</w:t>
       </w:r>
@@ -465,7 +402,790 @@
           <w:b w:val="0"/>
           <w:i w:val="0"/>
         </w:rPr>
-        <w:t xml:space="preserve">The initial input is copied from the uploaded </w:t>
+        <w:t xml:space="preserve">Use the full output for all entities. Excel calculation must be automatic; if values do not refresh, use </w:t>
+      </w:r>
+      <w:r>
+        <w:rPr>
+          <w:b/>
+          <w:i w:val="0"/>
+        </w:rPr>
+        <w:t>Calculate Now</w:t>
+      </w:r>
+      <w:r>
+        <w:rPr>
+          <w:b w:val="0"/>
+          <w:i w:val="0"/>
+        </w:rPr>
+        <w:t>. Do not leave old data rows below a shorter replacement.</w:t>
+      </w:r>
+    </w:p>
+    <w:p>
+      <w:r>
+        <w:rPr>
+          <w:b w:val="0"/>
+          <w:i w:val="0"/>
+        </w:rPr>
+        <w:t>The input columns, in order, are:</w:t>
+      </w:r>
+    </w:p>
+    <w:p>
+      <w:r>
+        <w:rPr>
+          <w:rFonts w:ascii="Courier New" w:hAnsi="Courier New"/>
+          <w:b w:val="0"/>
+          <w:i w:val="0"/>
+          <w:sz w:val="18"/>
+        </w:rPr>
+        <w:t>cntrycode, bscr_entity, region, sum_pml, sum_net, count_policies, is_geocoded, peril_id</w:t>
+      </w:r>
+    </w:p>
+    <w:p>
+      <w:r>
+        <w:rPr>
+          <w:b w:val="0"/>
+          <w:i w:val="0"/>
+        </w:rPr>
+        <w:t>There is no historical-check tab or legacy mode in this population workbook. Do not paste the legacy query's output into it as a historical comparison; use the separate reconciliation workbook for that evidence.</w:t>
+      </w:r>
+    </w:p>
+    <w:p>
+      <w:bookmarkStart w:id="4" w:name="bm_bscr_runbook_what_populates_automatically"/>
+      <w:pPr>
+        <w:pStyle w:val="Heading2"/>
+        <w:keepNext/>
+      </w:pPr>
+      <w:r>
+        <w:rPr>
+          <w:b w:val="0"/>
+          <w:i w:val="0"/>
+        </w:rPr>
+        <w:t>What populates automatically</w:t>
+      </w:r>
+      <w:bookmarkEnd w:id="4"/>
+    </w:p>
+    <w:p>
+      <w:r>
+        <w:rPr>
+          <w:b w:val="0"/>
+          <w:i w:val="0"/>
+        </w:rPr>
+        <w:t>Green cells are automatic and locked. Blue cells remain manual and start blank: premiums, EP/model losses, questionnaires and narratives. Blank does not mean zero. The workbook is a population aid, not a complete or approved regulatory return.</w:t>
+      </w:r>
+    </w:p>
+    <w:tbl>
+      <w:tblPr>
+        <w:tblStyle w:val="TableGrid"/>
+        <w:tblW w:type="auto" w:w="0"/>
+        <w:tblLook w:firstColumn="1" w:firstRow="1" w:lastColumn="0" w:lastRow="0" w:noHBand="0" w:noVBand="1" w:val="04A0"/>
+      </w:tblPr>
+      <w:tblGrid>
+        <w:gridCol w:w="5040"/>
+        <w:gridCol w:w="5040"/>
+      </w:tblGrid>
+      <w:tr>
+        <w:tc>
+          <w:tcPr>
+            <w:tcW w:type="dxa" w:w="5040"/>
+            <w:shd w:fill="D9EAF7"/>
+          </w:tcPr>
+          <w:p>
+            <w:r>
+              <w:rPr>
+                <w:b/>
+              </w:rPr>
+            </w:r>
+            <w:r>
+              <w:rPr>
+                <w:b/>
+                <w:i w:val="0"/>
+              </w:rPr>
+              <w:t>Population / measure</w:t>
+            </w:r>
+          </w:p>
+        </w:tc>
+        <w:tc>
+          <w:tcPr>
+            <w:tcW w:type="dxa" w:w="5040"/>
+            <w:shd w:fill="D9EAF7"/>
+          </w:tcPr>
+          <w:p>
+            <w:r>
+              <w:rPr>
+                <w:b/>
+              </w:rPr>
+            </w:r>
+            <w:r>
+              <w:rPr>
+                <w:b/>
+                <w:i w:val="0"/>
+              </w:rPr>
+              <w:t>Agreed mapping</w:t>
+            </w:r>
+          </w:p>
+        </w:tc>
+      </w:tr>
+      <w:tr>
+        <w:tc>
+          <w:tcPr>
+            <w:tcW w:type="dxa" w:w="5040"/>
+          </w:tcPr>
+          <w:p>
+            <w:r/>
+            <w:r>
+              <w:rPr>
+                <w:b w:val="0"/>
+                <w:i w:val="0"/>
+              </w:rPr>
+              <w:t>Modellable / modelled / detailed exposure</w:t>
+            </w:r>
+          </w:p>
+        </w:tc>
+        <w:tc>
+          <w:tcPr>
+            <w:tcW w:type="dxa" w:w="5040"/>
+          </w:tcPr>
+          <w:p>
+            <w:r/>
+            <w:r>
+              <w:rPr>
+                <w:rFonts w:ascii="Courier New" w:hAnsi="Courier New"/>
+                <w:b w:val="0"/>
+                <w:i w:val="0"/>
+                <w:sz w:val="18"/>
+              </w:rPr>
+              <w:t>is_geocoded = 1</w:t>
+            </w:r>
+          </w:p>
+        </w:tc>
+      </w:tr>
+      <w:tr>
+        <w:tc>
+          <w:tcPr>
+            <w:tcW w:type="dxa" w:w="5040"/>
+          </w:tcPr>
+          <w:p>
+            <w:r/>
+            <w:r>
+              <w:rPr>
+                <w:b w:val="0"/>
+                <w:i w:val="0"/>
+              </w:rPr>
+              <w:t>Not modellable / not modelled / data deficient</w:t>
+            </w:r>
+          </w:p>
+        </w:tc>
+        <w:tc>
+          <w:tcPr>
+            <w:tcW w:type="dxa" w:w="5040"/>
+          </w:tcPr>
+          <w:p>
+            <w:r/>
+            <w:r>
+              <w:rPr>
+                <w:rFonts w:ascii="Courier New" w:hAnsi="Courier New"/>
+                <w:b w:val="0"/>
+                <w:i w:val="0"/>
+                <w:sz w:val="18"/>
+              </w:rPr>
+              <w:t>is_geocoded = 0</w:t>
+            </w:r>
+          </w:p>
+        </w:tc>
+      </w:tr>
+      <w:tr>
+        <w:tc>
+          <w:tcPr>
+            <w:tcW w:type="dxa" w:w="5040"/>
+          </w:tcPr>
+          <w:p>
+            <w:r/>
+            <w:r>
+              <w:rPr>
+                <w:b w:val="0"/>
+                <w:i w:val="0"/>
+              </w:rPr>
+              <w:t>US contracts in X(f)</w:t>
+            </w:r>
+          </w:p>
+        </w:tc>
+        <w:tc>
+          <w:tcPr>
+            <w:tcW w:type="dxa" w:w="5040"/>
+          </w:tcPr>
+          <w:p>
+            <w:r/>
+            <w:r>
+              <w:rPr>
+                <w:b w:val="0"/>
+                <w:i w:val="0"/>
+              </w:rPr>
+              <w:t xml:space="preserve">Earthquake </w:t>
+            </w:r>
+            <w:r>
+              <w:rPr>
+                <w:rFonts w:ascii="Courier New" w:hAnsi="Courier New"/>
+                <w:b w:val="0"/>
+                <w:i w:val="0"/>
+                <w:sz w:val="18"/>
+              </w:rPr>
+              <w:t>ALL</w:t>
+            </w:r>
+            <w:r>
+              <w:rPr>
+                <w:b w:val="0"/>
+                <w:i w:val="0"/>
+              </w:rPr>
+              <w:t xml:space="preserve"> rows with </w:t>
+            </w:r>
+            <w:r>
+              <w:rPr>
+                <w:rFonts w:ascii="Courier New" w:hAnsi="Courier New"/>
+                <w:b w:val="0"/>
+                <w:i w:val="0"/>
+                <w:sz w:val="18"/>
+              </w:rPr>
+              <w:t>cntrycode = 'US'</w:t>
+            </w:r>
+          </w:p>
+        </w:tc>
+      </w:tr>
+      <w:tr>
+        <w:tc>
+          <w:tcPr>
+            <w:tcW w:type="dxa" w:w="5040"/>
+          </w:tcPr>
+          <w:p>
+            <w:r/>
+            <w:r>
+              <w:rPr>
+                <w:b w:val="0"/>
+                <w:i w:val="0"/>
+              </w:rPr>
+              <w:t>All other contracts in X(f)</w:t>
+            </w:r>
+          </w:p>
+        </w:tc>
+        <w:tc>
+          <w:tcPr>
+            <w:tcW w:type="dxa" w:w="5040"/>
+          </w:tcPr>
+          <w:p>
+            <w:r/>
+            <w:r>
+              <w:rPr>
+                <w:b w:val="0"/>
+                <w:i w:val="0"/>
+              </w:rPr>
+              <w:t xml:space="preserve">Earthquake </w:t>
+            </w:r>
+            <w:r>
+              <w:rPr>
+                <w:rFonts w:ascii="Courier New" w:hAnsi="Courier New"/>
+                <w:b w:val="0"/>
+                <w:i w:val="0"/>
+                <w:sz w:val="18"/>
+              </w:rPr>
+              <w:t>ALL</w:t>
+            </w:r>
+            <w:r>
+              <w:rPr>
+                <w:b w:val="0"/>
+                <w:i w:val="0"/>
+              </w:rPr>
+              <w:t xml:space="preserve"> minus US, using the same geocode selection</w:t>
+            </w:r>
+          </w:p>
+        </w:tc>
+      </w:tr>
+      <w:tr>
+        <w:tc>
+          <w:tcPr>
+            <w:tcW w:type="dxa" w:w="5040"/>
+          </w:tcPr>
+          <w:p>
+            <w:r/>
+            <w:r>
+              <w:rPr>
+                <w:b w:val="0"/>
+                <w:i w:val="0"/>
+              </w:rPr>
+              <w:t>Count</w:t>
+            </w:r>
+          </w:p>
+        </w:tc>
+        <w:tc>
+          <w:tcPr>
+            <w:tcW w:type="dxa" w:w="5040"/>
+          </w:tcPr>
+          <w:p>
+            <w:r/>
+            <w:r>
+              <w:rPr>
+                <w:b w:val="0"/>
+                <w:i w:val="0"/>
+              </w:rPr>
+              <w:t xml:space="preserve">Sum the supplied </w:t>
+            </w:r>
+            <w:r>
+              <w:rPr>
+                <w:rFonts w:ascii="Courier New" w:hAnsi="Courier New"/>
+                <w:b w:val="0"/>
+                <w:i w:val="0"/>
+                <w:sz w:val="18"/>
+              </w:rPr>
+              <w:t>count_policies</w:t>
+            </w:r>
+            <w:r>
+              <w:rPr>
+                <w:b w:val="0"/>
+                <w:i w:val="0"/>
+              </w:rPr>
+              <w:t>; do not scale or apply FX</w:t>
+            </w:r>
+          </w:p>
+        </w:tc>
+      </w:tr>
+      <w:tr>
+        <w:tc>
+          <w:tcPr>
+            <w:tcW w:type="dxa" w:w="5040"/>
+          </w:tcPr>
+          <w:p>
+            <w:r/>
+            <w:r>
+              <w:rPr>
+                <w:b w:val="0"/>
+                <w:i w:val="0"/>
+              </w:rPr>
+              <w:t>Gross / net exposure</w:t>
+            </w:r>
+          </w:p>
+        </w:tc>
+        <w:tc>
+          <w:tcPr>
+            <w:tcW w:type="dxa" w:w="5040"/>
+          </w:tcPr>
+          <w:p>
+            <w:r/>
+            <w:r>
+              <w:rPr>
+                <w:b w:val="0"/>
+                <w:i w:val="0"/>
+              </w:rPr>
+              <w:t>Sum the relevant SQL gross/net values and divide by 1,000,000</w:t>
+            </w:r>
+          </w:p>
+        </w:tc>
+      </w:tr>
+    </w:tbl>
+    <w:p/>
+    <w:p>
+      <w:r>
+        <w:rPr>
+          <w:b w:val="0"/>
+          <w:i w:val="0"/>
+        </w:rPr>
+        <w:t>The geocoding classification is the agreed workbook proxy. It does not reproduce April's separate manual reallocations. Other modelability categories are zero under this proxy. Repeated schedule presentations are intentional; do not sum all regions or schedules into a portfolio total.</w:t>
+      </w:r>
+    </w:p>
+    <w:p>
+      <w:r>
+        <w:rPr>
+          <w:b w:val="0"/>
+          <w:i w:val="0"/>
+        </w:rPr>
+        <w:t xml:space="preserve">The automatic X(a)/X(b) exposure fields are the </w:t>
+      </w:r>
+      <w:r>
+        <w:rPr>
+          <w:b/>
+          <w:i w:val="0"/>
+        </w:rPr>
+        <w:t>all-other-lines</w:t>
+      </w:r>
+      <w:r>
+        <w:rPr>
+          <w:b w:val="0"/>
+          <w:i w:val="0"/>
+        </w:rPr>
+        <w:t xml:space="preserve"> limits, split between modelled and not modelled. Statutory property-catastrophe fields require separate manual inputs; the SQL does not identify that classification.</w:t>
+      </w:r>
+    </w:p>
+    <w:p>
+      <w:bookmarkStart w:id="5" w:name="bm_bscr_runbook_regional_limits_in_x_c"/>
+      <w:pPr>
+        <w:pStyle w:val="Heading3"/>
+        <w:keepNext/>
+      </w:pPr>
+      <w:r>
+        <w:rPr>
+          <w:b w:val="0"/>
+          <w:i w:val="0"/>
+        </w:rPr>
+        <w:t>Regional limits in X(c)</w:t>
+      </w:r>
+      <w:bookmarkEnd w:id="5"/>
+    </w:p>
+    <w:tbl>
+      <w:tblPr>
+        <w:tblStyle w:val="TableGrid"/>
+        <w:tblW w:type="auto" w:w="0"/>
+        <w:tblLook w:firstColumn="1" w:firstRow="1" w:lastColumn="0" w:lastRow="0" w:noHBand="0" w:noVBand="1" w:val="04A0"/>
+      </w:tblPr>
+      <w:tblGrid>
+        <w:gridCol w:w="3360"/>
+        <w:gridCol w:w="3360"/>
+        <w:gridCol w:w="3360"/>
+      </w:tblGrid>
+      <w:tr>
+        <w:tc>
+          <w:tcPr>
+            <w:tcW w:type="dxa" w:w="3360"/>
+            <w:shd w:fill="D9EAF7"/>
+          </w:tcPr>
+          <w:p>
+            <w:r>
+              <w:rPr>
+                <w:b/>
+              </w:rPr>
+            </w:r>
+            <w:r>
+              <w:rPr>
+                <w:b/>
+                <w:i w:val="0"/>
+              </w:rPr>
+              <w:t>Schedule region</w:t>
+            </w:r>
+          </w:p>
+        </w:tc>
+        <w:tc>
+          <w:tcPr>
+            <w:tcW w:type="dxa" w:w="3360"/>
+            <w:shd w:fill="D9EAF7"/>
+          </w:tcPr>
+          <w:p>
+            <w:r>
+              <w:rPr>
+                <w:b/>
+              </w:rPr>
+            </w:r>
+            <w:r>
+              <w:rPr>
+                <w:b/>
+                <w:i w:val="0"/>
+              </w:rPr>
+              <w:t>SQL region</w:t>
+            </w:r>
+          </w:p>
+        </w:tc>
+        <w:tc>
+          <w:tcPr>
+            <w:tcW w:type="dxa" w:w="3360"/>
+            <w:shd w:fill="D9EAF7"/>
+          </w:tcPr>
+          <w:p>
+            <w:r>
+              <w:rPr>
+                <w:b/>
+              </w:rPr>
+            </w:r>
+            <w:r>
+              <w:rPr>
+                <w:b/>
+                <w:i w:val="0"/>
+              </w:rPr>
+              <w:t>Peril</w:t>
+            </w:r>
+          </w:p>
+        </w:tc>
+      </w:tr>
+      <w:tr>
+        <w:tc>
+          <w:tcPr>
+            <w:tcW w:type="dxa" w:w="3360"/>
+          </w:tcPr>
+          <w:p>
+            <w:r/>
+            <w:r>
+              <w:rPr>
+                <w:b w:val="0"/>
+                <w:i w:val="0"/>
+              </w:rPr>
+              <w:t>Atlantic hurricane</w:t>
+            </w:r>
+          </w:p>
+        </w:tc>
+        <w:tc>
+          <w:tcPr>
+            <w:tcW w:type="dxa" w:w="3360"/>
+          </w:tcPr>
+          <w:p>
+            <w:r/>
+            <w:r>
+              <w:rPr>
+                <w:rFonts w:ascii="Courier New" w:hAnsi="Courier New"/>
+                <w:b w:val="0"/>
+                <w:i w:val="0"/>
+                <w:sz w:val="18"/>
+              </w:rPr>
+              <w:t>is_nahu</w:t>
+            </w:r>
+          </w:p>
+        </w:tc>
+        <w:tc>
+          <w:tcPr>
+            <w:tcW w:type="dxa" w:w="3360"/>
+          </w:tcPr>
+          <w:p>
+            <w:r/>
+            <w:r>
+              <w:rPr>
+                <w:b w:val="0"/>
+                <w:i w:val="0"/>
+              </w:rPr>
+              <w:t>Wind, 2</w:t>
+            </w:r>
+          </w:p>
+        </w:tc>
+      </w:tr>
+      <w:tr>
+        <w:tc>
+          <w:tcPr>
+            <w:tcW w:type="dxa" w:w="3360"/>
+          </w:tcPr>
+          <w:p>
+            <w:r/>
+            <w:r>
+              <w:rPr>
+                <w:b w:val="0"/>
+                <w:i w:val="0"/>
+              </w:rPr>
+              <w:t>North American earthquake</w:t>
+            </w:r>
+          </w:p>
+        </w:tc>
+        <w:tc>
+          <w:tcPr>
+            <w:tcW w:type="dxa" w:w="3360"/>
+          </w:tcPr>
+          <w:p>
+            <w:r/>
+            <w:r>
+              <w:rPr>
+                <w:rFonts w:ascii="Courier New" w:hAnsi="Courier New"/>
+                <w:b w:val="0"/>
+                <w:i w:val="0"/>
+                <w:sz w:val="18"/>
+              </w:rPr>
+              <w:t>is_na_eq</w:t>
+            </w:r>
+          </w:p>
+        </w:tc>
+        <w:tc>
+          <w:tcPr>
+            <w:tcW w:type="dxa" w:w="3360"/>
+          </w:tcPr>
+          <w:p>
+            <w:r/>
+            <w:r>
+              <w:rPr>
+                <w:b w:val="0"/>
+                <w:i w:val="0"/>
+              </w:rPr>
+              <w:t>Earthquake, 1</w:t>
+            </w:r>
+          </w:p>
+        </w:tc>
+      </w:tr>
+      <w:tr>
+        <w:tc>
+          <w:tcPr>
+            <w:tcW w:type="dxa" w:w="3360"/>
+          </w:tcPr>
+          <w:p>
+            <w:r/>
+            <w:r>
+              <w:rPr>
+                <w:b w:val="0"/>
+                <w:i w:val="0"/>
+              </w:rPr>
+              <w:t>European windstorm</w:t>
+            </w:r>
+          </w:p>
+        </w:tc>
+        <w:tc>
+          <w:tcPr>
+            <w:tcW w:type="dxa" w:w="3360"/>
+          </w:tcPr>
+          <w:p>
+            <w:r/>
+            <w:r>
+              <w:rPr>
+                <w:rFonts w:ascii="Courier New" w:hAnsi="Courier New"/>
+                <w:b w:val="0"/>
+                <w:i w:val="0"/>
+                <w:sz w:val="18"/>
+              </w:rPr>
+              <w:t>is_eu</w:t>
+            </w:r>
+          </w:p>
+        </w:tc>
+        <w:tc>
+          <w:tcPr>
+            <w:tcW w:type="dxa" w:w="3360"/>
+          </w:tcPr>
+          <w:p>
+            <w:r/>
+            <w:r>
+              <w:rPr>
+                <w:b w:val="0"/>
+                <w:i w:val="0"/>
+              </w:rPr>
+              <w:t>Wind, 2</w:t>
+            </w:r>
+          </w:p>
+        </w:tc>
+      </w:tr>
+      <w:tr>
+        <w:tc>
+          <w:tcPr>
+            <w:tcW w:type="dxa" w:w="3360"/>
+          </w:tcPr>
+          <w:p>
+            <w:r/>
+            <w:r>
+              <w:rPr>
+                <w:b w:val="0"/>
+                <w:i w:val="0"/>
+              </w:rPr>
+              <w:t>Japanese earthquake</w:t>
+            </w:r>
+          </w:p>
+        </w:tc>
+        <w:tc>
+          <w:tcPr>
+            <w:tcW w:type="dxa" w:w="3360"/>
+          </w:tcPr>
+          <w:p>
+            <w:r/>
+            <w:r>
+              <w:rPr>
+                <w:rFonts w:ascii="Courier New" w:hAnsi="Courier New"/>
+                <w:b w:val="0"/>
+                <w:i w:val="0"/>
+                <w:sz w:val="18"/>
+              </w:rPr>
+              <w:t>is_jp_eq</w:t>
+            </w:r>
+          </w:p>
+        </w:tc>
+        <w:tc>
+          <w:tcPr>
+            <w:tcW w:type="dxa" w:w="3360"/>
+          </w:tcPr>
+          <w:p>
+            <w:r/>
+            <w:r>
+              <w:rPr>
+                <w:b w:val="0"/>
+                <w:i w:val="0"/>
+              </w:rPr>
+              <w:t>Earthquake, 1</w:t>
+            </w:r>
+          </w:p>
+        </w:tc>
+      </w:tr>
+      <w:tr>
+        <w:tc>
+          <w:tcPr>
+            <w:tcW w:type="dxa" w:w="3360"/>
+          </w:tcPr>
+          <w:p>
+            <w:r/>
+            <w:r>
+              <w:rPr>
+                <w:b w:val="0"/>
+                <w:i w:val="0"/>
+              </w:rPr>
+              <w:t>Japanese typhoon</w:t>
+            </w:r>
+          </w:p>
+        </w:tc>
+        <w:tc>
+          <w:tcPr>
+            <w:tcW w:type="dxa" w:w="3360"/>
+          </w:tcPr>
+          <w:p>
+            <w:r/>
+            <w:r>
+              <w:rPr>
+                <w:rFonts w:ascii="Courier New" w:hAnsi="Courier New"/>
+                <w:b w:val="0"/>
+                <w:i w:val="0"/>
+                <w:sz w:val="18"/>
+              </w:rPr>
+              <w:t>is_jp</w:t>
+            </w:r>
+          </w:p>
+        </w:tc>
+        <w:tc>
+          <w:tcPr>
+            <w:tcW w:type="dxa" w:w="3360"/>
+          </w:tcPr>
+          <w:p>
+            <w:r/>
+            <w:r>
+              <w:rPr>
+                <w:b w:val="0"/>
+                <w:i w:val="0"/>
+              </w:rPr>
+              <w:t>Wind, 2</w:t>
+            </w:r>
+          </w:p>
+        </w:tc>
+      </w:tr>
+    </w:tbl>
+    <w:p/>
+    <w:p>
+      <w:r>
+        <w:rPr>
+          <w:rFonts w:ascii="Courier New" w:hAnsi="Courier New"/>
+          <w:b w:val="0"/>
+          <w:i w:val="0"/>
+          <w:sz w:val="18"/>
+        </w:rPr>
+        <w:t>ALL</w:t>
+      </w:r>
+      <w:r>
+        <w:rPr>
+          <w:b w:val="0"/>
+          <w:i w:val="0"/>
+        </w:rPr>
+        <w:t xml:space="preserve"> is earthquake only. Regional populations overlap. Canada is included in NA earthquake, alongside the selected US states in the current query. NA hurricane currently includes all US exposure.</w:t>
+      </w:r>
+    </w:p>
+    <w:p>
+      <w:bookmarkStart w:id="6" w:name="bm_bscr_runbook_currency_and_the_preloaded_input"/>
+      <w:pPr>
+        <w:pStyle w:val="Heading2"/>
+        <w:keepNext/>
+      </w:pPr>
+      <w:r>
+        <w:rPr>
+          <w:b w:val="0"/>
+          <w:i w:val="0"/>
+        </w:rPr>
+        <w:t>Currency and the preloaded input</w:t>
+      </w:r>
+      <w:bookmarkEnd w:id="6"/>
+    </w:p>
+    <w:p>
+      <w:r>
+        <w:rPr>
+          <w:b w:val="0"/>
+          <w:i w:val="0"/>
+        </w:rPr>
+        <w:t xml:space="preserve">The SQL assumes source GBP and applies </w:t>
       </w:r>
       <w:r>
         <w:rPr>
@@ -474,14 +1194,56 @@
           <w:i w:val="0"/>
           <w:sz w:val="18"/>
         </w:rPr>
-        <w:t>bscr/reconcile/bscr_output_wseq.csv</w:t>
+        <w:t>@gbp_to_usd</w:t>
       </w:r>
       <w:r>
         <w:rPr>
           <w:b w:val="0"/>
           <w:i w:val="0"/>
         </w:rPr>
-        <w:t xml:space="preserve"> (737 rows), not sample data or a live database connection. Its source is recorded in the SQL input header comment. This workbook accepts current SQL output only; historical reconciliation is kept in the separate reconciliation workbook.</w:t>
+        <w:t xml:space="preserve"> once in its final SELECT (default </w:t>
+      </w:r>
+      <w:r>
+        <w:rPr>
+          <w:b/>
+          <w:i w:val="0"/>
+        </w:rPr>
+        <w:t>1.35</w:t>
+      </w:r>
+      <w:r>
+        <w:rPr>
+          <w:b w:val="0"/>
+          <w:i w:val="0"/>
+        </w:rPr>
+        <w:t xml:space="preserve">). It returns </w:t>
+      </w:r>
+      <w:r>
+        <w:rPr>
+          <w:b/>
+          <w:i w:val="0"/>
+        </w:rPr>
+        <w:t>full USD</w:t>
+      </w:r>
+      <w:r>
+        <w:rPr>
+          <w:b w:val="0"/>
+          <w:i w:val="0"/>
+        </w:rPr>
+        <w:t xml:space="preserve">, not USD millions. The population workbook divides monetary amounts by one million and does </w:t>
+      </w:r>
+      <w:r>
+        <w:rPr>
+          <w:b/>
+          <w:i w:val="0"/>
+        </w:rPr>
+        <w:t>not</w:t>
+      </w:r>
+      <w:r>
+        <w:rPr>
+          <w:b w:val="0"/>
+          <w:i w:val="0"/>
+        </w:rPr>
+        <w:t xml:space="preserve"> apply FX again.</w:t>
       </w:r>
     </w:p>
     <w:p>
@@ -490,7 +1252,23 @@
           <w:b w:val="0"/>
           <w:i w:val="0"/>
         </w:rPr>
-        <w:t>Green entity-sheet cells are automatic and locked. Blue fields remain manual: premiums, EP losses, questionnaires and narratives. They start blank, not zero. The two blank-entity wind rows in the supplied input are not assigned to an entity.</w:t>
+        <w:t xml:space="preserve">The initial 737 input rows were copied from the uploaded </w:t>
+      </w:r>
+      <w:hyperlink r:id="rId13">
+        <w:r>
+          <w:rPr>
+            <w:color w:val="0563C1"/>
+            <w:u w:val="single"/>
+          </w:rPr>
+          <w:t>bscr_output_wseq.csv</w:t>
+        </w:r>
+      </w:hyperlink>
+      <w:r>
+        <w:rPr>
+          <w:b w:val="0"/>
+          <w:i w:val="0"/>
+        </w:rPr>
+        <w:t>. They are not sample data or a live query result. We reproduced all 737 rows from the uploaded EDM tables, with exact counts and monetary differences below one cent. The initial filename is recorded in the SQL input header comment; it does not change automatically when new results are pasted.</w:t>
       </w:r>
     </w:p>
     <w:p>
@@ -499,7 +1277,7 @@
           <w:b w:val="0"/>
           <w:i w:val="0"/>
         </w:rPr>
-        <w:t xml:space="preserve">The agreed X(f) proxy is applied consistently: geocoded rows are modellable/modelled/detailed; ungeocoded rows are not modellable/not modelled/data deficient. US uses earthquake </w:t>
+        <w:t xml:space="preserve">Two supplied GB wind rows have no recognized entity. They are retained in the input but not assigned to one of the five entity tabs. Their gross/net exposure totals approximately USD 26.353bn; this is separate from earthquake </w:t>
       </w:r>
       <w:r>
         <w:rPr>
@@ -515,7 +1293,294 @@
           <w:b w:val="0"/>
           <w:i w:val="0"/>
         </w:rPr>
-        <w:t xml:space="preserve"> rows with country US; all-other contracts are </w:t>
+        <w:t>.</w:t>
+      </w:r>
+    </w:p>
+    <w:p>
+      <w:bookmarkStart w:id="7" w:name="bm_bscr_runbook_reconciliation_evidence"/>
+      <w:pPr>
+        <w:pStyle w:val="Heading2"/>
+        <w:keepNext/>
+      </w:pPr>
+      <w:r>
+        <w:rPr>
+          <w:b w:val="0"/>
+          <w:i w:val="0"/>
+        </w:rPr>
+        <w:t>Reconciliation evidence</w:t>
+      </w:r>
+      <w:bookmarkEnd w:id="7"/>
+    </w:p>
+    <w:p>
+      <w:hyperlink r:id="rId12">
+        <w:r>
+          <w:rPr>
+            <w:color w:val="0563C1"/>
+            <w:u w:val="single"/>
+          </w:rPr>
+          <w:t>BSCR_Reconciliation.xlsx</w:t>
+        </w:r>
+      </w:hyperlink>
+      <w:r>
+        <w:rPr>
+          <w:b w:val="0"/>
+          <w:i w:val="0"/>
+        </w:rPr>
+        <w:t xml:space="preserve"> has five tabs: </w:t>
+      </w:r>
+      <w:r>
+        <w:rPr>
+          <w:b/>
+          <w:i w:val="0"/>
+        </w:rPr>
+        <w:t>What this tests</w:t>
+      </w:r>
+      <w:r>
+        <w:rPr>
+          <w:b w:val="0"/>
+          <w:i w:val="0"/>
+        </w:rPr>
+        <w:t xml:space="preserve">, </w:t>
+      </w:r>
+      <w:r>
+        <w:rPr>
+          <w:b/>
+          <w:i w:val="0"/>
+        </w:rPr>
+        <w:t>Schedule X(f)</w:t>
+      </w:r>
+      <w:r>
+        <w:rPr>
+          <w:b w:val="0"/>
+          <w:i w:val="0"/>
+        </w:rPr>
+        <w:t xml:space="preserve">, </w:t>
+      </w:r>
+      <w:r>
+        <w:rPr>
+          <w:b/>
+          <w:i w:val="0"/>
+        </w:rPr>
+        <w:t>Counts</w:t>
+      </w:r>
+      <w:r>
+        <w:rPr>
+          <w:b w:val="0"/>
+          <w:i w:val="0"/>
+        </w:rPr>
+        <w:t xml:space="preserve">, </w:t>
+      </w:r>
+      <w:r>
+        <w:rPr>
+          <w:b/>
+          <w:i w:val="0"/>
+        </w:rPr>
+        <w:t>Gross exposure</w:t>
+      </w:r>
+      <w:r>
+        <w:rPr>
+          <w:b w:val="0"/>
+          <w:i w:val="0"/>
+        </w:rPr>
+        <w:t xml:space="preserve"> and </w:t>
+      </w:r>
+      <w:r>
+        <w:rPr>
+          <w:b/>
+          <w:i w:val="0"/>
+        </w:rPr>
+        <w:t>Net exposure</w:t>
+      </w:r>
+      <w:r>
+        <w:rPr>
+          <w:b w:val="0"/>
+          <w:i w:val="0"/>
+        </w:rPr>
+        <w:t>. It keeps reconciliation separate from routine population.</w:t>
+      </w:r>
+    </w:p>
+    <w:p>
+      <w:r>
+        <w:rPr>
+          <w:b w:val="0"/>
+          <w:i w:val="0"/>
+        </w:rPr>
+        <w:t>The evidence chain is:</w:t>
+      </w:r>
+    </w:p>
+    <w:p>
+      <w:r>
+        <w:rPr>
+          <w:b/>
+          <w:i w:val="0"/>
+        </w:rPr>
+        <w:t>Corrected February templates → old saved output → legacy query → corrected query → new saved output.</w:t>
+      </w:r>
+    </w:p>
+    <w:p>
+      <w:r>
+        <w:rPr>
+          <w:b w:val="0"/>
+          <w:i w:val="0"/>
+        </w:rPr>
+        <w:t xml:space="preserve">• The template check uses the </w:t>
+      </w:r>
+      <w:r>
+        <w:rPr>
+          <w:b/>
+          <w:i w:val="0"/>
+        </w:rPr>
+        <w:t>33 original</w:t>
+      </w:r>
+      <w:r>
+        <w:rPr>
+          <w:b w:val="0"/>
+          <w:i w:val="0"/>
+        </w:rPr>
+        <w:t xml:space="preserve"> and </w:t>
+      </w:r>
+      <w:r>
+        <w:rPr>
+          <w:b/>
+          <w:i w:val="0"/>
+        </w:rPr>
+        <w:t>3624/HIC/HIG/HSA v2</w:t>
+      </w:r>
+      <w:r>
+        <w:rPr>
+          <w:b w:val="0"/>
+          <w:i w:val="0"/>
+        </w:rPr>
+        <w:t xml:space="preserve"> files in </w:t>
+      </w:r>
+      <w:r>
+        <w:rPr>
+          <w:rFonts w:ascii="Courier New" w:hAnsi="Courier New"/>
+          <w:b w:val="0"/>
+          <w:i w:val="0"/>
+          <w:sz w:val="18"/>
+        </w:rPr>
+        <w:t>bscr/reconcile/filled in templates/</w:t>
+      </w:r>
+      <w:r>
+        <w:rPr>
+          <w:b w:val="0"/>
+          <w:i w:val="0"/>
+        </w:rPr>
+        <w:t>. All 528 populated count/exposure cells tested in the selected X(f) blocks match the old pre-FX output and legacy query within rounding. Other fields are not certified by that test.</w:t>
+      </w:r>
+    </w:p>
+    <w:p>
+      <w:r>
+        <w:rPr>
+          <w:b w:val="0"/>
+          <w:i w:val="0"/>
+        </w:rPr>
+        <w:t xml:space="preserve">• Those saved February monetary values are </w:t>
+      </w:r>
+      <w:r>
+        <w:rPr>
+          <w:b/>
+          <w:i w:val="0"/>
+        </w:rPr>
+        <w:t>pre-FX amounts divided by 1,000</w:t>
+      </w:r>
+      <w:r>
+        <w:rPr>
+          <w:b w:val="0"/>
+          <w:i w:val="0"/>
+        </w:rPr>
+        <w:t xml:space="preserve">, despite USD headings. The later workings' </w:t>
+      </w:r>
+      <w:r>
+        <w:rPr>
+          <w:b/>
+          <w:i w:val="0"/>
+        </w:rPr>
+        <w:t>1.35 USD conversion was missing</w:t>
+      </w:r>
+      <w:r>
+        <w:rPr>
+          <w:b w:val="0"/>
+          <w:i w:val="0"/>
+        </w:rPr>
+        <w:t xml:space="preserve">. Currency and thousand/million scaling are separate issues. The reconciliation shows the saved value, USD conversion at the same scale, and USD millions. Green </w:t>
+      </w:r>
+      <w:r>
+        <w:rPr>
+          <w:rFonts w:ascii="Courier New" w:hAnsi="Courier New"/>
+          <w:b w:val="0"/>
+          <w:i w:val="0"/>
+          <w:sz w:val="18"/>
+        </w:rPr>
+        <w:t>MATCH</w:t>
+      </w:r>
+      <w:r>
+        <w:rPr>
+          <w:b w:val="0"/>
+          <w:i w:val="0"/>
+        </w:rPr>
+        <w:t xml:space="preserve"> means agreement </w:t>
+      </w:r>
+      <w:r>
+        <w:rPr>
+          <w:b/>
+          <w:i w:val="0"/>
+        </w:rPr>
+        <w:t>after the stated conversion</w:t>
+      </w:r>
+      <w:r>
+        <w:rPr>
+          <w:b w:val="0"/>
+          <w:i w:val="0"/>
+        </w:rPr>
+        <w:t>, not that the original template was already in USD. Counts never receive FX.</w:t>
+      </w:r>
+    </w:p>
+    <w:p>
+      <w:r>
+        <w:rPr>
+          <w:b w:val="0"/>
+          <w:i w:val="0"/>
+        </w:rPr>
+        <w:t xml:space="preserve">• The original SQL and Python aggregation reproduce all </w:t>
+      </w:r>
+      <w:r>
+        <w:rPr>
+          <w:b/>
+          <w:i w:val="0"/>
+        </w:rPr>
+        <w:t>452 historical CSV rows</w:t>
+      </w:r>
+      <w:r>
+        <w:rPr>
+          <w:b w:val="0"/>
+          <w:i w:val="0"/>
+        </w:rPr>
+        <w:t xml:space="preserve">. The retained legacy SQL also matches the </w:t>
+      </w:r>
+      <w:r>
+        <w:rPr>
+          <w:b/>
+          <w:i w:val="0"/>
+        </w:rPr>
+        <w:t>49 groups</w:t>
+      </w:r>
+      <w:r>
+        <w:rPr>
+          <w:b w:val="0"/>
+          <w:i w:val="0"/>
+        </w:rPr>
+        <w:t xml:space="preserve"> in the later March USD workings. Counts are exact and monetary residuals are below one cent.</w:t>
+      </w:r>
+    </w:p>
+    <w:p>
+      <w:r>
+        <w:rPr>
+          <w:b w:val="0"/>
+          <w:i w:val="0"/>
+        </w:rPr>
+        <w:t xml:space="preserve">• Fixing only the geocode join explains the whole earthquake </w:t>
       </w:r>
       <w:r>
         <w:rPr>
@@ -531,7 +1596,35 @@
           <w:b w:val="0"/>
           <w:i w:val="0"/>
         </w:rPr>
-        <w:t xml:space="preserve"> minus US with the same geocode selection. Historical repeated schedule presentations are retained. Other modelability categories are zero under this proxy, not copied from April reallocations. Exposure is mapped to the historical all-other-lines fields; statutory property-catastrophe fields require separate manual input.</w:t>
+        <w:t xml:space="preserve"> reduction: </w:t>
+      </w:r>
+      <w:r>
+        <w:rPr>
+          <w:b/>
+          <w:i w:val="0"/>
+        </w:rPr>
+        <w:t>USD 4.813bn gross, USD 3.051bn net and 285 grouped rows</w:t>
+      </w:r>
+      <w:r>
+        <w:rPr>
+          <w:b w:val="0"/>
+          <w:i w:val="0"/>
+        </w:rPr>
+        <w:t xml:space="preserve">, across </w:t>
+      </w:r>
+      <w:r>
+        <w:rPr>
+          <w:b/>
+          <w:i w:val="0"/>
+        </w:rPr>
+        <w:t>184 accounts</w:t>
+      </w:r>
+      <w:r>
+        <w:rPr>
+          <w:b w:val="0"/>
+          <w:i w:val="0"/>
+        </w:rPr>
+        <w:t xml:space="preserve"> with both geocode flags. The old join duplicated exposure between buckets; source policies were not deleted.</w:t>
       </w:r>
     </w:p>
     <w:p>
@@ -540,7 +1633,7 @@
           <w:b w:val="0"/>
           <w:i w:val="0"/>
         </w:rPr>
-        <w:t>SQL money is already USD: automatic formulas divide by 1,000,000 once and never apply FX again. Counts remain the SQL grouped-row count.</w:t>
+        <w:t>• Policy-ID grouping has no material effect on this snapshot because no account has multiple type-1 policies. This is not a rule for other datasets.</w:t>
       </w:r>
     </w:p>
     <w:p>
@@ -549,23 +1642,7 @@
           <w:b w:val="0"/>
           <w:i w:val="0"/>
         </w:rPr>
-        <w:t xml:space="preserve">There is no historical-comparison tab or legacy mode in this working workbook. Old-versus-new evidence and the historical template checks are documented in </w:t>
-      </w:r>
-      <w:r>
-        <w:rPr>
-          <w:rFonts w:ascii="Courier New" w:hAnsi="Courier New"/>
-          <w:b w:val="0"/>
-          <w:i w:val="0"/>
-          <w:sz w:val="18"/>
-        </w:rPr>
-        <w:t>bscr/reconcile/results/BSCR_Reconciliation.xlsx</w:t>
-      </w:r>
-      <w:r>
-        <w:rPr>
-          <w:b w:val="0"/>
-          <w:i w:val="0"/>
-        </w:rPr>
-        <w:t>, not mixed into the population workflow.</w:t>
+        <w:t>• All five April total counts and all 46 populated regional gross/net limits match the later historical workings (regional money within USD 1). Rounded overall amounts and manually reallocated classification splits can differ.</w:t>
       </w:r>
     </w:p>
     <w:p>
@@ -574,27 +1651,11 @@
           <w:b w:val="0"/>
           <w:i w:val="0"/>
         </w:rPr>
-        <w:t xml:space="preserve">The builder </w:t>
-      </w:r>
-      <w:r>
-        <w:rPr>
-          <w:rFonts w:ascii="Courier New" w:hAnsi="Courier New"/>
-          <w:b w:val="0"/>
-          <w:i w:val="0"/>
-          <w:sz w:val="18"/>
-        </w:rPr>
-        <w:t>bscr/tools/build_population_workbook.py</w:t>
-      </w:r>
-      <w:r>
-        <w:rPr>
-          <w:b w:val="0"/>
-          <w:i w:val="0"/>
-        </w:rPr>
-        <w:t xml:space="preserve"> is for local maintenance only. It verifies 630 automatic mappings with an independent Excel-function engine using current data, and stores cached results so the delivered workbook opens populated. Excel remains responsible for refreshing formulas after subsequent pastes. Native Excel rendering/recalculation was not available during local verification.</w:t>
+        <w:t>These checks were local DuckDB replays against saved outputs, not live SQL Server executions. Case-insensitive source comparisons and legacy Python's case-sensitive geographic comparisons were distinguished. File dates do not prove submission.</w:t>
       </w:r>
     </w:p>
     <w:p>
-      <w:bookmarkStart w:id="4" w:name="bm_bscr_runbook_concise_reconciliation_workbook"/>
+      <w:bookmarkStart w:id="8" w:name="bm_bscr_runbook_legacy_query_and_reference_workbooks"/>
       <w:pPr>
         <w:pStyle w:val="Heading2"/>
         <w:keepNext/>
@@ -604,9 +1665,9 @@
           <w:b w:val="0"/>
           <w:i w:val="0"/>
         </w:rPr>
-        <w:t>Concise reconciliation workbook</w:t>
+        <w:t>Legacy query and reference workbooks</w:t>
       </w:r>
-      <w:bookmarkEnd w:id="4"/>
+      <w:bookmarkEnd w:id="8"/>
     </w:p>
     <w:p>
       <w:r>
@@ -614,7 +1675,156 @@
           <w:b w:val="0"/>
           <w:i w:val="0"/>
         </w:rPr>
-        <w:t xml:space="preserve">Use </w:t>
+        <w:t>Only two SQL scripts are retained:</w:t>
+      </w:r>
+    </w:p>
+    <w:tbl>
+      <w:tblPr>
+        <w:tblStyle w:val="TableGrid"/>
+        <w:tblW w:type="auto" w:w="0"/>
+        <w:tblLook w:firstColumn="1" w:firstRow="1" w:lastColumn="0" w:lastRow="0" w:noHBand="0" w:noVBand="1" w:val="04A0"/>
+      </w:tblPr>
+      <w:tblGrid>
+        <w:gridCol w:w="5040"/>
+        <w:gridCol w:w="5040"/>
+      </w:tblGrid>
+      <w:tr>
+        <w:tc>
+          <w:tcPr>
+            <w:tcW w:type="dxa" w:w="5040"/>
+            <w:shd w:fill="D9EAF7"/>
+          </w:tcPr>
+          <w:p>
+            <w:r>
+              <w:rPr>
+                <w:b/>
+              </w:rPr>
+            </w:r>
+            <w:r>
+              <w:rPr>
+                <w:b/>
+                <w:i w:val="0"/>
+              </w:rPr>
+              <w:t>Script</w:t>
+            </w:r>
+          </w:p>
+        </w:tc>
+        <w:tc>
+          <w:tcPr>
+            <w:tcW w:type="dxa" w:w="5040"/>
+            <w:shd w:fill="D9EAF7"/>
+          </w:tcPr>
+          <w:p>
+            <w:r>
+              <w:rPr>
+                <w:b/>
+              </w:rPr>
+            </w:r>
+            <w:r>
+              <w:rPr>
+                <w:b/>
+                <w:i w:val="0"/>
+              </w:rPr>
+              <w:t>Role</w:t>
+            </w:r>
+          </w:p>
+        </w:tc>
+      </w:tr>
+      <w:tr>
+        <w:tc>
+          <w:tcPr>
+            <w:tcW w:type="dxa" w:w="5040"/>
+          </w:tcPr>
+          <w:p>
+            <w:r/>
+            <w:r>
+              <w:rPr>
+                <w:rFonts w:ascii="Courier New" w:hAnsi="Courier New"/>
+                <w:b w:val="0"/>
+                <w:i w:val="0"/>
+                <w:sz w:val="18"/>
+              </w:rPr>
+              <w:t>bscr-output.sql</w:t>
+            </w:r>
+          </w:p>
+        </w:tc>
+        <w:tc>
+          <w:tcPr>
+            <w:tcW w:type="dxa" w:w="5040"/>
+          </w:tcPr>
+          <w:p>
+            <w:r/>
+            <w:r>
+              <w:rPr>
+                <w:b w:val="0"/>
+                <w:i w:val="0"/>
+              </w:rPr>
+              <w:t>Current calculation and input to the population workbook</w:t>
+            </w:r>
+          </w:p>
+        </w:tc>
+      </w:tr>
+      <w:tr>
+        <w:tc>
+          <w:tcPr>
+            <w:tcW w:type="dxa" w:w="5040"/>
+          </w:tcPr>
+          <w:p>
+            <w:r/>
+            <w:hyperlink r:id="rId14">
+              <w:r>
+                <w:rPr>
+                  <w:color w:val="0563C1"/>
+                  <w:u w:val="single"/>
+                </w:rPr>
+                <w:t>bscr-extract-legacy.sql</w:t>
+              </w:r>
+            </w:hyperlink>
+          </w:p>
+        </w:tc>
+        <w:tc>
+          <w:tcPr>
+            <w:tcW w:type="dxa" w:w="5040"/>
+          </w:tcPr>
+          <w:p>
+            <w:r/>
+            <w:r>
+              <w:rPr>
+                <w:b w:val="0"/>
+                <w:i w:val="0"/>
+              </w:rPr>
+              <w:t>Full historical aggregate, despite its name; diagnostic only</w:t>
+            </w:r>
+          </w:p>
+        </w:tc>
+      </w:tr>
+    </w:tbl>
+    <w:p/>
+    <w:p>
+      <w:r>
+        <w:rPr>
+          <w:b w:val="0"/>
+          <w:i w:val="0"/>
+        </w:rPr>
+        <w:t>The legacy query intentionally retains old geocode duplication, cap grouping without policy ID, earthquake/policy type 1 for every region, and Python-style case-sensitive geography. Both queries return eight columns and default to full USD at FX 1.35. Set legacy FX to 1 only to compare directly with the old unconverted CSV. The queries differ in more than geocoding; the controlled reconciliation isolated each change rather than attributing every region's difference to the join.</w:t>
+      </w:r>
+    </w:p>
+    <w:p>
+      <w:r>
+        <w:rPr>
+          <w:rFonts w:ascii="Courier New" w:hAnsi="Courier New"/>
+          <w:b w:val="0"/>
+          <w:i w:val="0"/>
+          <w:sz w:val="18"/>
+        </w:rPr>
+        <w:t>workings_old_report.xlsx</w:t>
+      </w:r>
+      <w:r>
+        <w:rPr>
+          <w:b w:val="0"/>
+          <w:i w:val="0"/>
+        </w:rPr>
+        <w:t xml:space="preserve"> is identical to </w:t>
       </w:r>
       <w:r>
         <w:rPr>
@@ -623,14 +1833,30 @@
           <w:i w:val="0"/>
           <w:sz w:val="18"/>
         </w:rPr>
-        <w:t>bscr/reconcile/results/BSCR_Reconciliation.xlsx</w:t>
+        <w:t>Workings_with_geocodingFW.xlsx</w:t>
       </w:r>
       <w:r>
         <w:rPr>
           <w:b w:val="0"/>
           <w:i w:val="0"/>
         </w:rPr>
-        <w:t>.</w:t>
+        <w:t xml:space="preserve">. The earlier workings divide by 1,000; FW divides by 1,000,000. The later </w:t>
+      </w:r>
+      <w:r>
+        <w:rPr>
+          <w:rFonts w:ascii="Courier New" w:hAnsi="Courier New"/>
+          <w:b w:val="0"/>
+          <w:i w:val="0"/>
+          <w:sz w:val="18"/>
+        </w:rPr>
+        <w:t>Workings_with_geocodingFW - Including blanks USD.xlsx</w:t>
+      </w:r>
+      <w:r>
+        <w:rPr>
+          <w:b w:val="0"/>
+          <w:i w:val="0"/>
+        </w:rPr>
+        <w:t xml:space="preserve"> applies FX and restores US exposure to NA hurricane. Do not reproduce the earlier workbook's US omission in the current calculation.</w:t>
       </w:r>
     </w:p>
     <w:p>
@@ -639,21 +1865,53 @@
           <w:b w:val="0"/>
           <w:i w:val="0"/>
         </w:rPr>
-        <w:t xml:space="preserve">• </w:t>
+        <w:t xml:space="preserve">The older </w:t>
+      </w:r>
+      <w:r>
+        <w:rPr>
+          <w:rFonts w:ascii="Courier New" w:hAnsi="Courier New"/>
+          <w:b w:val="0"/>
+          <w:i w:val="0"/>
+          <w:sz w:val="18"/>
+        </w:rPr>
+        <w:t>bscr/workbooks/BSCR_Workings.xlsx</w:t>
+      </w:r>
+      <w:r>
+        <w:rPr>
+          <w:b w:val="0"/>
+          <w:i w:val="0"/>
+        </w:rPr>
+        <w:t xml:space="preserve"> is </w:t>
       </w:r>
       <w:r>
         <w:rPr>
           <w:b/>
           <w:i w:val="0"/>
         </w:rPr>
-        <w:t>What this tests:</w:t>
+        <w:t>not the current population workbook</w:t>
       </w:r>
       <w:r>
         <w:rPr>
           <w:b w:val="0"/>
           <w:i w:val="0"/>
         </w:rPr>
-        <w:t xml:space="preserve"> the evidence chain, pass criteria, units and limits.</w:t>
+        <w:t xml:space="preserve">. Its fixed key/pivot ranges, reversed Japanese peril references and hard-coded workbook FX are documented historical-workbook risks, not descriptions of </w:t>
+      </w:r>
+      <w:r>
+        <w:rPr>
+          <w:rFonts w:ascii="Courier New" w:hAnsi="Courier New"/>
+          <w:b w:val="0"/>
+          <w:i w:val="0"/>
+          <w:sz w:val="18"/>
+        </w:rPr>
+        <w:t>BSCR_Auto_Population.xlsx</w:t>
+      </w:r>
+      <w:r>
+        <w:rPr>
+          <w:b w:val="0"/>
+          <w:i w:val="0"/>
+        </w:rPr>
+        <w:t>. Do not follow its A:G loading route for the new workbook, which takes all eight columns in its Excel table.</w:t>
       </w:r>
     </w:p>
     <w:p>
@@ -662,108 +1920,7 @@
           <w:b w:val="0"/>
           <w:i w:val="0"/>
         </w:rPr>
-        <w:t xml:space="preserve">• </w:t>
-      </w:r>
-      <w:r>
-        <w:rPr>
-          <w:b/>
-          <w:i w:val="0"/>
-        </w:rPr>
-        <w:t>Schedule X(f):</w:t>
-      </w:r>
-      <w:r>
-        <w:rPr>
-          <w:b w:val="0"/>
-          <w:i w:val="0"/>
-        </w:rPr>
-        <w:t xml:space="preserve"> the 33 original and 3624/HIC/HIG/HSA v2 templates reconciled to the old saved output and legacy query. Fifteen summary count/gross/net values are shown first; expand the supporting rows for all 528 populated count/exposure cells tested, including source-cell references.</w:t>
-      </w:r>
-    </w:p>
-    <w:p>
-      <w:r>
-        <w:rPr>
-          <w:b w:val="0"/>
-          <w:i w:val="0"/>
-        </w:rPr>
-        <w:t xml:space="preserve">• </w:t>
-      </w:r>
-      <w:r>
-        <w:rPr>
-          <w:b/>
-          <w:i w:val="0"/>
-        </w:rPr>
-        <w:t>Counts:</w:t>
-      </w:r>
-      <w:r>
-        <w:rPr>
-          <w:b w:val="0"/>
-          <w:i w:val="0"/>
-        </w:rPr>
-        <w:t xml:space="preserve"> old saved output, legacy query, corrected query and new saved output side by side; the change is corrected minus legacy.</w:t>
-      </w:r>
-    </w:p>
-    <w:p>
-      <w:r>
-        <w:rPr>
-          <w:b w:val="0"/>
-          <w:i w:val="0"/>
-        </w:rPr>
-        <w:t xml:space="preserve">• </w:t>
-      </w:r>
-      <w:r>
-        <w:rPr>
-          <w:b/>
-          <w:i w:val="0"/>
-        </w:rPr>
-        <w:t>Gross exposure / Net exposure:</w:t>
-      </w:r>
-      <w:r>
-        <w:rPr>
-          <w:b w:val="0"/>
-          <w:i w:val="0"/>
-        </w:rPr>
-        <w:t xml:space="preserve"> the same comparison in USD millions.</w:t>
-      </w:r>
-    </w:p>
-    <w:p>
-      <w:r>
-        <w:rPr>
-          <w:b w:val="0"/>
-          <w:i w:val="0"/>
-        </w:rPr>
-        <w:t xml:space="preserve">The February templates' cached amounts match the old </w:t>
-      </w:r>
-      <w:r>
-        <w:rPr>
-          <w:b/>
-          <w:i w:val="0"/>
-        </w:rPr>
-        <w:t>pre-FX</w:t>
-      </w:r>
-      <w:r>
-        <w:rPr>
-          <w:b w:val="0"/>
-          <w:i w:val="0"/>
-        </w:rPr>
-        <w:t xml:space="preserve"> output divided by 1,000. Their USD headings are not supported by those saved monetary values: the later USD workings' 1.35 conversion is missing. This currency mismatch is separate from the thousand/million scaling issue and the geocoding correction. The Schedule X(f) summary shows the actual saved template value, matching pre-FX output/query values, the USD value after multiplying by 1.35 without changing scale, and finally USD millions after dividing by 1,000. Counts are unscaled. The expandable checks use normalized USDm to establish lineage; a numeric match after normalization does not validate the template as saved. Premiums, EP curves, narratives, percentage fields, unpopulated/zero-placeholder categories and later April reclassifications are outside this Schedule X(f) test.</w:t>
-      </w:r>
-    </w:p>
-    <w:p>
-      <w:r>
-        <w:rPr>
-          <w:b w:val="0"/>
-          <w:i w:val="0"/>
-        </w:rPr>
-        <w:t>Verified on the supplied source snapshot:</w:t>
-      </w:r>
-    </w:p>
-    <w:p>
-      <w:r>
-        <w:rPr>
-          <w:b w:val="0"/>
-          <w:i w:val="0"/>
-        </w:rPr>
-        <w:t xml:space="preserve">1. Original embedded SQL plus original Python aggregation reproduces all 452 rows of </w:t>
+        <w:t xml:space="preserve">The original Marimo script remains in </w:t>
       </w:r>
       <w:r>
         <w:rPr>
@@ -772,32 +1929,14 @@
           <w:i w:val="0"/>
           <w:sz w:val="18"/>
         </w:rPr>
-        <w:t>bscr/output/bscr-output.csv</w:t>
+        <w:t>BSCR_UKEU_original.py</w:t>
       </w:r>
       <w:r>
         <w:rPr>
           <w:b w:val="0"/>
           <w:i w:val="0"/>
         </w:rPr>
-        <w:t>, with exact counts and monetary differences below one cent in source currency.</w:t>
-      </w:r>
-    </w:p>
-    <w:p>
-      <w:r>
-        <w:rPr>
-          <w:b w:val="0"/>
-          <w:i w:val="0"/>
-        </w:rPr>
-        <w:t>2. The retained legacy SQL reproduces those 452 rows after the documented FX conversion and matches all 49 groups in the later March USD workings.</w:t>
-      </w:r>
-    </w:p>
-    <w:p>
-      <w:r>
-        <w:rPr>
-          <w:b w:val="0"/>
-          <w:i w:val="0"/>
-        </w:rPr>
-        <w:t xml:space="preserve">3. Current SQL reproduces all 737 rows of </w:t>
+        <w:t xml:space="preserve"> and </w:t>
       </w:r>
       <w:r>
         <w:rPr>
@@ -806,23 +1945,14 @@
           <w:i w:val="0"/>
           <w:sz w:val="18"/>
         </w:rPr>
-        <w:t>bscr/reconcile/bscr_output_wseq.csv</w:t>
+        <w:t>old-process/</w:t>
       </w:r>
       <w:r>
         <w:rPr>
           <w:b w:val="0"/>
           <w:i w:val="0"/>
         </w:rPr>
-        <w:t>, with exact counts and monetary differences below one cent.</w:t>
-      </w:r>
-    </w:p>
-    <w:p>
-      <w:r>
-        <w:rPr>
-          <w:b w:val="0"/>
-          <w:i w:val="0"/>
-        </w:rPr>
-        <w:t xml:space="preserve">4. Changing only the geocode join explains the whole </w:t>
+        <w:t xml:space="preserve">. The separate </w:t>
       </w:r>
       <w:r>
         <w:rPr>
@@ -831,52 +1961,18 @@
           <w:i w:val="0"/>
           <w:sz w:val="18"/>
         </w:rPr>
-        <w:t>ALL</w:t>
+        <w:t>BSCR_UKEU.py</w:t>
       </w:r>
       <w:r>
         <w:rPr>
           <w:b w:val="0"/>
           <w:i w:val="0"/>
         </w:rPr>
-        <w:t xml:space="preserve"> reduction: USD 4.813bn gross, USD 3.051bn net and 285 grouped output rows. All 184 affected accounts have both geocoded and ungeocoded earthquake locations.</w:t>
+        <w:t xml:space="preserve"> is an older seven-column CSV workflow and is not the current producer. Source templates, raw workbooks and historical CSVs remain unchanged as evidence; their cached errors, external links and placeholders do not constitute approved current inputs.</w:t>
       </w:r>
     </w:p>
     <w:p>
-      <w:r>
-        <w:rPr>
-          <w:b w:val="0"/>
-          <w:i w:val="0"/>
-        </w:rPr>
-        <w:t>5. Policy-ID cap grouping has no material effect on this snapshot: no account has multiple type-1 policies. This does not establish that policy identity is unnecessary on other populations.</w:t>
-      </w:r>
-    </w:p>
-    <w:p>
-      <w:r>
-        <w:rPr>
-          <w:b w:val="0"/>
-          <w:i w:val="0"/>
-        </w:rPr>
-        <w:t xml:space="preserve">These are local DuckDB replays checked against the saved outputs, not live SQL Server executions. SQL Server's case-insensitive comparisons were reproduced locally; the legacy query's geographic comparisons deliberately remain case-sensitive to reproduce Python. </w:t>
-      </w:r>
-      <w:r>
-        <w:rPr>
-          <w:rFonts w:ascii="Courier New" w:hAnsi="Courier New"/>
-          <w:b w:val="0"/>
-          <w:i w:val="0"/>
-          <w:sz w:val="18"/>
-        </w:rPr>
-        <w:t>count_policies</w:t>
-      </w:r>
-      <w:r>
-        <w:rPr>
-          <w:b w:val="0"/>
-          <w:i w:val="0"/>
-        </w:rPr>
-        <w:t xml:space="preserve"> counts grouped source rows, not verified distinct contracts. This is numerical reconciliation, not approval of all policy terms, modelability classifications or regulatory filing figures.</w:t>
-      </w:r>
-    </w:p>
-    <w:p>
-      <w:bookmarkStart w:id="5" w:name="bm_bscr_runbook_preserve_the_source_evidence"/>
+      <w:bookmarkStart w:id="9" w:name="bm_bscr_runbook_raw_source_data_and_verification_limits"/>
       <w:pPr>
         <w:pStyle w:val="Heading2"/>
         <w:keepNext/>
@@ -886,9 +1982,9 @@
           <w:b w:val="0"/>
           <w:i w:val="0"/>
         </w:rPr>
-        <w:t>Preserve the source evidence</w:t>
+        <w:t>Raw source data and verification limits</w:t>
       </w:r>
-      <w:bookmarkEnd w:id="5"/>
+      <w:bookmarkEnd w:id="9"/>
     </w:p>
     <w:p>
       <w:r>
@@ -896,7 +1992,7 @@
           <w:b w:val="0"/>
           <w:i w:val="0"/>
         </w:rPr>
-        <w:t xml:space="preserve">The six uploaded CSVs remain under </w:t>
+        <w:t xml:space="preserve">The six uploaded files in </w:t>
       </w:r>
       <w:r>
         <w:rPr>
@@ -912,7 +2008,21 @@
           <w:b w:val="0"/>
           <w:i w:val="0"/>
         </w:rPr>
-        <w:t>; the folder name is historical and the files are CSV, not Parquet:</w:t>
+        <w:t xml:space="preserve"> are </w:t>
+      </w:r>
+      <w:r>
+        <w:rPr>
+          <w:b/>
+          <w:i w:val="0"/>
+        </w:rPr>
+        <w:t>CSV</w:t>
+      </w:r>
+      <w:r>
+        <w:rPr>
+          <w:b w:val="0"/>
+          <w:i w:val="0"/>
+        </w:rPr>
+        <w:t>, despite the folder name:</w:t>
       </w:r>
     </w:p>
     <w:tbl>
@@ -962,7 +2072,7 @@
                 <w:b/>
                 <w:i w:val="0"/>
               </w:rPr>
-              <w:t>Verified rows</w:t>
+              <w:t>Verified rows / content</w:t>
             </w:r>
           </w:p>
         </w:tc>
@@ -1132,7 +2242,7 @@
                 <w:b w:val="0"/>
                 <w:i w:val="0"/>
               </w:rPr>
-              <w:t>1 metadata record</w:t>
+              <w:t>Database, time, collation and row counts</w:t>
             </w:r>
           </w:p>
         </w:tc>
@@ -1179,7 +2289,23 @@
           <w:b w:val="0"/>
           <w:i w:val="0"/>
         </w:rPr>
-        <w:t xml:space="preserve">Do not deduplicate, apply FX, edit or resave the raw files in Excel. Preserve empty strings separately from SQL NULL representations. The supplied state field has 30 literal </w:t>
+        <w:t xml:space="preserve">All four source counts match the metadata for </w:t>
+      </w:r>
+      <w:r>
+        <w:rPr>
+          <w:rFonts w:ascii="Courier New" w:hAnsi="Courier New"/>
+          <w:b w:val="0"/>
+          <w:i w:val="0"/>
+          <w:sz w:val="18"/>
+        </w:rPr>
+        <w:t>HISCO_UKEU_01JAN26_010126_ROLLUP_ByLOB_GC_EDM</w:t>
+      </w:r>
+      <w:r>
+        <w:rPr>
+          <w:b w:val="0"/>
+          <w:i w:val="0"/>
+        </w:rPr>
+        <w:t xml:space="preserve">. Preserve duplicates, native values and empty strings versus NULL representations. Do not apply FX or resave the raw CSVs in Excel. The 30 literal </w:t>
       </w:r>
       <w:r>
         <w:rPr>
@@ -1195,7 +2321,16 @@
           <w:b w:val="0"/>
           <w:i w:val="0"/>
         </w:rPr>
-        <w:t xml:space="preserve"> markers in French/German locations; raw lexical values were preserved for inspection. Source metadata identifies </w:t>
+        <w:t xml:space="preserve"> state markers occur in French/German locations; raw lexical values were preserved during inspection.</w:t>
+      </w:r>
+    </w:p>
+    <w:p>
+      <w:r>
+        <w:rPr>
+          <w:b w:val="0"/>
+          <w:i w:val="0"/>
+        </w:rPr>
+        <w:t xml:space="preserve">The local builder </w:t>
       </w:r>
       <w:r>
         <w:rPr>
@@ -1204,14 +2339,28 @@
           <w:i w:val="0"/>
           <w:sz w:val="18"/>
         </w:rPr>
-        <w:t>HISCO_UKEU_01JAN26_010126_ROLLUP_ByLOB_GC_EDM</w:t>
+        <w:t>bscr/tools/build_population_workbook.py</w:t>
       </w:r>
       <w:r>
         <w:rPr>
           <w:b w:val="0"/>
           <w:i w:val="0"/>
         </w:rPr>
-        <w:t xml:space="preserve"> and its case-insensitive collation. All four source counts match the metadata.</w:t>
+        <w:t xml:space="preserve"> verifies </w:t>
+      </w:r>
+      <w:r>
+        <w:rPr>
+          <w:b/>
+          <w:i w:val="0"/>
+        </w:rPr>
+        <w:t>630 automatic mappings</w:t>
+      </w:r>
+      <w:r>
+        <w:rPr>
+          <w:b w:val="0"/>
+          <w:i w:val="0"/>
+        </w:rPr>
+        <w:t xml:space="preserve"> with an independent Excel-function engine and writes cached formula results. Input-change tests covered counts, gross/net, US subtraction, wind routing and missing-entity warnings. Native Excel rendering/recalculation was not available locally; the work-laptop review remains necessary.</w:t>
       </w:r>
     </w:p>
     <w:p>
@@ -1220,551 +2369,25 @@
           <w:b w:val="0"/>
           <w:i w:val="0"/>
         </w:rPr>
-        <w:t xml:space="preserve">Historical input workbooks and saved output CSVs are retained unchanged. </w:t>
+        <w:t xml:space="preserve">Remaining controls include the source currency/rate for each new run, policy-cap allocation grain, grouped-row versus distinct-contract counts, unmapped entities, manual supplemental inputs and final-template approval. The agreed geocode proxy is implemented; it is not a claim that all April manual classifications were reproduced. See </w:t>
       </w:r>
-      <w:r>
-        <w:rPr>
-          <w:rFonts w:ascii="Courier New" w:hAnsi="Courier New"/>
-          <w:b w:val="0"/>
-          <w:i w:val="0"/>
-          <w:sz w:val="18"/>
-        </w:rPr>
-        <w:t>workings_old_report.xlsx</w:t>
-      </w:r>
+      <w:hyperlink r:id="rId15">
+        <w:r>
+          <w:rPr>
+            <w:color w:val="0563C1"/>
+            <w:u w:val="single"/>
+          </w:rPr>
+          <w:t>decisions</w:t>
+        </w:r>
+      </w:hyperlink>
       <w:r>
         <w:rPr>
           <w:b w:val="0"/>
           <w:i w:val="0"/>
         </w:rPr>
-        <w:t xml:space="preserve"> is identical to </w:t>
+        <w:t xml:space="preserve"> and the </w:t>
       </w:r>
-      <w:r>
-        <w:rPr>
-          <w:rFonts w:ascii="Courier New" w:hAnsi="Courier New"/>
-          <w:b w:val="0"/>
-          <w:i w:val="0"/>
-          <w:sz w:val="18"/>
-        </w:rPr>
-        <w:t>Workings_with_geocodingFW.xlsx</w:t>
-      </w:r>
-      <w:r>
-        <w:rPr>
-          <w:b w:val="0"/>
-          <w:i w:val="0"/>
-        </w:rPr>
-        <w:t xml:space="preserve">. The earlier workings divide by 1,000; FW divides by 1,000,000. The later </w:t>
-      </w:r>
-      <w:r>
-        <w:rPr>
-          <w:rFonts w:ascii="Courier New" w:hAnsi="Courier New"/>
-          <w:b w:val="0"/>
-          <w:i w:val="0"/>
-          <w:sz w:val="18"/>
-        </w:rPr>
-        <w:t>Workings_with_geocodingFW - Including blanks USD.xlsx</w:t>
-      </w:r>
-      <w:r>
-        <w:rPr>
-          <w:b w:val="0"/>
-          <w:i w:val="0"/>
-        </w:rPr>
-        <w:t xml:space="preserve"> applies 1.35 FX and restores US exposure to NA hurricane. Its 49 raw groups match the historical CSV without excluding US. Do not reproduce the earlier workbook's omission as a production rule.</w:t>
-      </w:r>
-    </w:p>
-    <w:p>
-      <w:r>
-        <w:rPr>
-          <w:b w:val="0"/>
-          <w:i w:val="0"/>
-        </w:rPr>
-        <w:t>The five April templates retain the historical total counts. All 46 populated regional gross/net exposure limits match the later USD workings within USD 1. Their modelability allocations, premiums, EP placeholders, cached errors and external links remain separate controls; dates do not prove submission.</w:t>
-      </w:r>
-    </w:p>
-    <w:p>
-      <w:r>
-        <w:rPr>
-          <w:b w:val="0"/>
-          <w:i w:val="0"/>
-        </w:rPr>
-        <w:t xml:space="preserve">The original Marimo application remains at </w:t>
-      </w:r>
-      <w:r>
-        <w:rPr>
-          <w:rFonts w:ascii="Courier New" w:hAnsi="Courier New"/>
-          <w:b w:val="0"/>
-          <w:i w:val="0"/>
-          <w:sz w:val="18"/>
-        </w:rPr>
-        <w:t>bscr/BSCR_UKEU_original.py</w:t>
-      </w:r>
-      <w:r>
-        <w:rPr>
-          <w:b w:val="0"/>
-          <w:i w:val="0"/>
-        </w:rPr>
-        <w:t xml:space="preserve"> and </w:t>
-      </w:r>
-      <w:r>
-        <w:rPr>
-          <w:rFonts w:ascii="Courier New" w:hAnsi="Courier New"/>
-          <w:b w:val="0"/>
-          <w:i w:val="0"/>
-          <w:sz w:val="18"/>
-        </w:rPr>
-        <w:t>bscr/old-process/BSCR_UKEU.py</w:t>
-      </w:r>
-      <w:r>
-        <w:rPr>
-          <w:b w:val="0"/>
-          <w:i w:val="0"/>
-        </w:rPr>
-        <w:t xml:space="preserve">. The separate </w:t>
-      </w:r>
-      <w:r>
-        <w:rPr>
-          <w:rFonts w:ascii="Courier New" w:hAnsi="Courier New"/>
-          <w:b w:val="0"/>
-          <w:i w:val="0"/>
-          <w:sz w:val="18"/>
-        </w:rPr>
-        <w:t>bscr/BSCR_UKEU.py</w:t>
-      </w:r>
-      <w:r>
-        <w:rPr>
-          <w:b w:val="0"/>
-          <w:i w:val="0"/>
-        </w:rPr>
-        <w:t xml:space="preserve"> is an older seven-column CSV workflow, not a consumer of these eight-column query outputs.</w:t>
-      </w:r>
-    </w:p>
-    <w:p>
-      <w:bookmarkStart w:id="6" w:name="bm_bscr_runbook_running_the_retained_queries"/>
-      <w:pPr>
-        <w:pStyle w:val="Heading2"/>
-        <w:keepNext/>
-      </w:pPr>
-      <w:r>
-        <w:rPr>
-          <w:b w:val="0"/>
-          <w:i w:val="0"/>
-        </w:rPr>
-        <w:t>Running the retained queries</w:t>
-      </w:r>
-      <w:bookmarkEnd w:id="6"/>
-    </w:p>
-    <w:p>
-      <w:r>
-        <w:rPr>
-          <w:b w:val="0"/>
-          <w:i w:val="0"/>
-        </w:rPr>
-        <w:t>1. Select the approved EDM database/snapshot in your SQL client.</w:t>
-      </w:r>
-    </w:p>
-    <w:p>
-      <w:r>
-        <w:rPr>
-          <w:b w:val="0"/>
-          <w:i w:val="0"/>
-        </w:rPr>
-        <w:t xml:space="preserve">2. Run </w:t>
-      </w:r>
-      <w:r>
-        <w:rPr>
-          <w:rFonts w:ascii="Courier New" w:hAnsi="Courier New"/>
-          <w:b w:val="0"/>
-          <w:i w:val="0"/>
-          <w:sz w:val="18"/>
-        </w:rPr>
-        <w:t>bscr-extract-legacy.sql</w:t>
-      </w:r>
-      <w:r>
-        <w:rPr>
-          <w:b w:val="0"/>
-          <w:i w:val="0"/>
-        </w:rPr>
-        <w:t xml:space="preserve"> for the historical comparison and </w:t>
-      </w:r>
-      <w:r>
-        <w:rPr>
-          <w:rFonts w:ascii="Courier New" w:hAnsi="Courier New"/>
-          <w:b w:val="0"/>
-          <w:i w:val="0"/>
-          <w:sz w:val="18"/>
-        </w:rPr>
-        <w:t>bscr-output.sql</w:t>
-      </w:r>
-      <w:r>
-        <w:rPr>
-          <w:b w:val="0"/>
-          <w:i w:val="0"/>
-        </w:rPr>
-        <w:t xml:space="preserve"> for the corrected result. Both are read-only.</w:t>
-      </w:r>
-    </w:p>
-    <w:p>
-      <w:r>
-        <w:rPr>
-          <w:b w:val="0"/>
-          <w:i w:val="0"/>
-        </w:rPr>
-        <w:t>3. Use the same frozen source and the same FX, retention and entity settings.</w:t>
-      </w:r>
-    </w:p>
-    <w:p>
-      <w:r>
-        <w:rPr>
-          <w:b w:val="0"/>
-          <w:i w:val="0"/>
-        </w:rPr>
-        <w:t>4. Save results separately; retain all eight headers and preserve NULLs.</w:t>
-      </w:r>
-    </w:p>
-    <w:p>
-      <w:r>
-        <w:rPr>
-          <w:b w:val="0"/>
-          <w:i w:val="0"/>
-        </w:rPr>
-        <w:t xml:space="preserve">5. Compare </w:t>
-      </w:r>
-      <w:r>
-        <w:rPr>
-          <w:rFonts w:ascii="Courier New" w:hAnsi="Courier New"/>
-          <w:b w:val="0"/>
-          <w:i w:val="0"/>
-          <w:sz w:val="18"/>
-        </w:rPr>
-        <w:t>ALL</w:t>
-      </w:r>
-      <w:r>
-        <w:rPr>
-          <w:b w:val="0"/>
-          <w:i w:val="0"/>
-        </w:rPr>
-        <w:t xml:space="preserve"> for earthquake totals and compare regional populations separately. Never sum across overlapping regional rows.</w:t>
-      </w:r>
-    </w:p>
-    <w:p>
-      <w:r>
-        <w:rPr>
-          <w:b w:val="0"/>
-          <w:i w:val="0"/>
-        </w:rPr>
-        <w:t xml:space="preserve">Current routing: wind (2) feeds </w:t>
-      </w:r>
-      <w:r>
-        <w:rPr>
-          <w:rFonts w:ascii="Courier New" w:hAnsi="Courier New"/>
-          <w:b w:val="0"/>
-          <w:i w:val="0"/>
-          <w:sz w:val="18"/>
-        </w:rPr>
-        <w:t>is_nahu</w:t>
-      </w:r>
-      <w:r>
-        <w:rPr>
-          <w:b w:val="0"/>
-          <w:i w:val="0"/>
-        </w:rPr>
-        <w:t xml:space="preserve">, </w:t>
-      </w:r>
-      <w:r>
-        <w:rPr>
-          <w:rFonts w:ascii="Courier New" w:hAnsi="Courier New"/>
-          <w:b w:val="0"/>
-          <w:i w:val="0"/>
-          <w:sz w:val="18"/>
-        </w:rPr>
-        <w:t>is_eu</w:t>
-      </w:r>
-      <w:r>
-        <w:rPr>
-          <w:b w:val="0"/>
-          <w:i w:val="0"/>
-        </w:rPr>
-        <w:t xml:space="preserve">, </w:t>
-      </w:r>
-      <w:r>
-        <w:rPr>
-          <w:rFonts w:ascii="Courier New" w:hAnsi="Courier New"/>
-          <w:b w:val="0"/>
-          <w:i w:val="0"/>
-          <w:sz w:val="18"/>
-        </w:rPr>
-        <w:t>is_jp</w:t>
-      </w:r>
-      <w:r>
-        <w:rPr>
-          <w:b w:val="0"/>
-          <w:i w:val="0"/>
-        </w:rPr>
-        <w:t xml:space="preserve">; earthquake (1) feeds </w:t>
-      </w:r>
-      <w:r>
-        <w:rPr>
-          <w:rFonts w:ascii="Courier New" w:hAnsi="Courier New"/>
-          <w:b w:val="0"/>
-          <w:i w:val="0"/>
-          <w:sz w:val="18"/>
-        </w:rPr>
-        <w:t>ALL</w:t>
-      </w:r>
-      <w:r>
-        <w:rPr>
-          <w:b w:val="0"/>
-          <w:i w:val="0"/>
-        </w:rPr>
-        <w:t xml:space="preserve">, </w:t>
-      </w:r>
-      <w:r>
-        <w:rPr>
-          <w:rFonts w:ascii="Courier New" w:hAnsi="Courier New"/>
-          <w:b w:val="0"/>
-          <w:i w:val="0"/>
-          <w:sz w:val="18"/>
-        </w:rPr>
-        <w:t>is_na_eq</w:t>
-      </w:r>
-      <w:r>
-        <w:rPr>
-          <w:b w:val="0"/>
-          <w:i w:val="0"/>
-        </w:rPr>
-        <w:t xml:space="preserve">, </w:t>
-      </w:r>
-      <w:r>
-        <w:rPr>
-          <w:rFonts w:ascii="Courier New" w:hAnsi="Courier New"/>
-          <w:b w:val="0"/>
-          <w:i w:val="0"/>
-          <w:sz w:val="18"/>
-        </w:rPr>
-        <w:t>is_jp_eq</w:t>
-      </w:r>
-      <w:r>
-        <w:rPr>
-          <w:b w:val="0"/>
-          <w:i w:val="0"/>
-        </w:rPr>
-        <w:t xml:space="preserve">, </w:t>
-      </w:r>
-      <w:r>
-        <w:rPr>
-          <w:rFonts w:ascii="Courier New" w:hAnsi="Courier New"/>
-          <w:b w:val="0"/>
-          <w:i w:val="0"/>
-          <w:sz w:val="18"/>
-        </w:rPr>
-        <w:t>is_us_all</w:t>
-      </w:r>
-      <w:r>
-        <w:rPr>
-          <w:b w:val="0"/>
-          <w:i w:val="0"/>
-        </w:rPr>
-        <w:t xml:space="preserve">, </w:t>
-      </w:r>
-      <w:r>
-        <w:rPr>
-          <w:rFonts w:ascii="Courier New" w:hAnsi="Courier New"/>
-          <w:b w:val="0"/>
-          <w:i w:val="0"/>
-          <w:sz w:val="18"/>
-        </w:rPr>
-        <w:t>is_non_us</w:t>
-      </w:r>
-      <w:r>
-        <w:rPr>
-          <w:b w:val="0"/>
-          <w:i w:val="0"/>
-        </w:rPr>
-        <w:t xml:space="preserve">. The legacy script uses earthquake for every retained regional label and does not add </w:t>
-      </w:r>
-      <w:r>
-        <w:rPr>
-          <w:rFonts w:ascii="Courier New" w:hAnsi="Courier New"/>
-          <w:b w:val="0"/>
-          <w:i w:val="0"/>
-          <w:sz w:val="18"/>
-        </w:rPr>
-        <w:t>is_jp_eq</w:t>
-      </w:r>
-      <w:r>
-        <w:rPr>
-          <w:b w:val="0"/>
-          <w:i w:val="0"/>
-        </w:rPr>
-        <w:t xml:space="preserve"> or </w:t>
-      </w:r>
-      <w:r>
-        <w:rPr>
-          <w:rFonts w:ascii="Courier New" w:hAnsi="Courier New"/>
-          <w:b w:val="0"/>
-          <w:i w:val="0"/>
-          <w:sz w:val="18"/>
-        </w:rPr>
-        <w:t>is_non_us</w:t>
-      </w:r>
-      <w:r>
-        <w:rPr>
-          <w:b w:val="0"/>
-          <w:i w:val="0"/>
-        </w:rPr>
-        <w:t>. Uppercase US states do not match the legacy Python lookup's title-case names; current SQL includes the selected US states through case-insensitive matching. Canada is included in both.</w:t>
-      </w:r>
-    </w:p>
-    <w:p>
-      <w:bookmarkStart w:id="7" w:name="bm_bscr_runbook_loading_the_current_reporting_workbook"/>
-      <w:pPr>
-        <w:pStyle w:val="Heading2"/>
-        <w:keepNext/>
-      </w:pPr>
-      <w:r>
-        <w:rPr>
-          <w:b w:val="0"/>
-          <w:i w:val="0"/>
-        </w:rPr>
-        <w:t>Loading the current reporting workbook</w:t>
-      </w:r>
-      <w:bookmarkEnd w:id="7"/>
-    </w:p>
-    <w:p>
-      <w:r>
-        <w:rPr>
-          <w:rFonts w:ascii="Courier New" w:hAnsi="Courier New"/>
-          <w:b w:val="0"/>
-          <w:i w:val="0"/>
-          <w:sz w:val="18"/>
-        </w:rPr>
-        <w:t>bscr/workbooks/BSCR_Workings.xlsx</w:t>
-      </w:r>
-      <w:r>
-        <w:rPr>
-          <w:b w:val="0"/>
-          <w:i w:val="0"/>
-        </w:rPr>
-        <w:t xml:space="preserve"> is the operational workbook, not the concise reconciliation report. Preserve its approved formulas and controls:</w:t>
-      </w:r>
-    </w:p>
-    <w:p>
-      <w:r>
-        <w:rPr>
-          <w:b w:val="0"/>
-          <w:i w:val="0"/>
-        </w:rPr>
-        <w:t xml:space="preserve">1. Back it up before loading. Load only the first seven aggregate columns into </w:t>
-      </w:r>
-      <w:r>
-        <w:rPr>
-          <w:rFonts w:ascii="Courier New" w:hAnsi="Courier New"/>
-          <w:b w:val="0"/>
-          <w:i w:val="0"/>
-          <w:sz w:val="18"/>
-        </w:rPr>
-        <w:t>BSCR Source Data!A:G</w:t>
-      </w:r>
-      <w:r>
-        <w:rPr>
-          <w:b w:val="0"/>
-          <w:i w:val="0"/>
-        </w:rPr>
-        <w:t xml:space="preserve">; retain </w:t>
-      </w:r>
-      <w:r>
-        <w:rPr>
-          <w:rFonts w:ascii="Courier New" w:hAnsi="Courier New"/>
-          <w:b w:val="0"/>
-          <w:i w:val="0"/>
-          <w:sz w:val="18"/>
-        </w:rPr>
-        <w:t>peril_id</w:t>
-      </w:r>
-      <w:r>
-        <w:rPr>
-          <w:b w:val="0"/>
-          <w:i w:val="0"/>
-        </w:rPr>
-        <w:t xml:space="preserve"> in the CSV, not worksheet H.</w:t>
-      </w:r>
-    </w:p>
-    <w:p>
-      <w:r>
-        <w:rPr>
-          <w:b w:val="0"/>
-          <w:i w:val="0"/>
-        </w:rPr>
-        <w:t xml:space="preserve">2. Clear stale input rows and verify complete entity/region/geocode coverage. </w:t>
-      </w:r>
-      <w:r>
-        <w:rPr>
-          <w:rFonts w:ascii="Courier New" w:hAnsi="Courier New"/>
-          <w:b w:val="0"/>
-          <w:i w:val="0"/>
-          <w:sz w:val="18"/>
-        </w:rPr>
-        <w:t>BSCR Output!A2:F70</w:t>
-      </w:r>
-      <w:r>
-        <w:rPr>
-          <w:b w:val="0"/>
-          <w:i w:val="0"/>
-        </w:rPr>
-        <w:t xml:space="preserve"> has a fixed list of keys; new keys are not added by recalculation.</w:t>
-      </w:r>
-    </w:p>
-    <w:p>
-      <w:r>
-        <w:rPr>
-          <w:b w:val="0"/>
-          <w:i w:val="0"/>
-        </w:rPr>
-        <w:t xml:space="preserve">3. Bypass workbook FX on every gross/net path before loading USD query output. Some formulas hard-code 1.35, so changing </w:t>
-      </w:r>
-      <w:r>
-        <w:rPr>
-          <w:rFonts w:ascii="Courier New" w:hAnsi="Courier New"/>
-          <w:b w:val="0"/>
-          <w:i w:val="0"/>
-          <w:sz w:val="18"/>
-        </w:rPr>
-        <w:t>Settings!B3</w:t>
-      </w:r>
-      <w:r>
-        <w:rPr>
-          <w:b w:val="0"/>
-          <w:i w:val="0"/>
-        </w:rPr>
-        <w:t xml:space="preserve"> alone is insufficient. Retain division by 1,000,000 only where USD millions are required.</w:t>
-      </w:r>
-    </w:p>
-    <w:p>
-      <w:r>
-        <w:rPr>
-          <w:b w:val="0"/>
-          <w:i w:val="0"/>
-        </w:rPr>
-        <w:t>4. Reconcile cached/formula outputs after Excel refresh. Do not infer modelled, modellable, detailed or data-deficient classifications solely from geocoding.</w:t>
-      </w:r>
-    </w:p>
-    <w:p>
-      <w:r>
-        <w:rPr>
-          <w:b w:val="0"/>
-          <w:i w:val="0"/>
-        </w:rPr>
-        <w:t>5. Review the controlled final template, external links, premium source, modelability decisions and EP results before transfer or sign-off.</w:t>
-      </w:r>
-    </w:p>
-    <w:p>
-      <w:r>
-        <w:rPr>
-          <w:b w:val="0"/>
-          <w:i w:val="0"/>
-        </w:rPr>
-        <w:t xml:space="preserve">See the </w:t>
-      </w:r>
-      <w:hyperlink r:id="rId10">
+      <w:hyperlink r:id="rId16">
         <w:r>
           <w:rPr>
             <w:color w:val="0563C1"/>
@@ -1778,7 +2401,7 @@
           <w:b w:val="0"/>
           <w:i w:val="0"/>
         </w:rPr>
-        <w:t xml:space="preserve"> for remaining controls, especially policy-cap allocation grain and distinct contract counting.</w:t>
+        <w:t>.</w:t>
       </w:r>
     </w:p>
     <w:sectPr>

</xml_diff>

<commit_message>
Put BSCR workbook locations at top of guide
</commit_message>
<xml_diff>
--- a/reporting/docs/generated/BSCR-Jan-2026.docx
+++ b/reporting/docs/generated/BSCR-Jan-2026.docx
@@ -47,7 +47,80 @@
       <w:bookmarkEnd w:id="1"/>
     </w:p>
     <w:p>
+      <w:r>
+        <w:rPr>
+          <w:b w:val="0"/>
+          <w:i w:val="0"/>
+        </w:rPr>
+        <w:t xml:space="preserve">The reconciliation workbook is </w:t>
+      </w:r>
       <w:hyperlink r:id="rId9">
+        <w:r>
+          <w:rPr>
+            <w:color w:val="0563C1"/>
+            <w:u w:val="single"/>
+          </w:rPr>
+          <w:t>BSCR_Reconciliation.xlsx</w:t>
+        </w:r>
+      </w:hyperlink>
+      <w:r>
+        <w:rPr>
+          <w:b w:val="0"/>
+          <w:i w:val="0"/>
+        </w:rPr>
+        <w:t xml:space="preserve"> in </w:t>
+      </w:r>
+      <w:r>
+        <w:rPr>
+          <w:rFonts w:ascii="Courier New" w:hAnsi="Courier New"/>
+          <w:b w:val="0"/>
+          <w:i w:val="0"/>
+          <w:sz w:val="18"/>
+        </w:rPr>
+        <w:t>bscr/reconcile/results/</w:t>
+      </w:r>
+      <w:r>
+        <w:rPr>
+          <w:b w:val="0"/>
+          <w:i w:val="0"/>
+        </w:rPr>
+        <w:t xml:space="preserve">; the auto-population workbook is </w:t>
+      </w:r>
+      <w:hyperlink r:id="rId10">
+        <w:r>
+          <w:rPr>
+            <w:color w:val="0563C1"/>
+            <w:u w:val="single"/>
+          </w:rPr>
+          <w:t>BSCR_Auto_Population.xlsx</w:t>
+        </w:r>
+      </w:hyperlink>
+      <w:r>
+        <w:rPr>
+          <w:b w:val="0"/>
+          <w:i w:val="0"/>
+        </w:rPr>
+        <w:t xml:space="preserve"> in </w:t>
+      </w:r>
+      <w:r>
+        <w:rPr>
+          <w:rFonts w:ascii="Courier New" w:hAnsi="Courier New"/>
+          <w:b w:val="0"/>
+          <w:i w:val="0"/>
+          <w:sz w:val="18"/>
+        </w:rPr>
+        <w:t>bscr/workbooks/</w:t>
+      </w:r>
+      <w:r>
+        <w:rPr>
+          <w:b w:val="0"/>
+          <w:i w:val="0"/>
+        </w:rPr>
+        <w:t>.</w:t>
+      </w:r>
+    </w:p>
+    <w:p>
+      <w:hyperlink r:id="rId11">
         <w:r>
           <w:rPr>
             <w:color w:val="0563C1"/>
@@ -146,7 +219,7 @@
           </w:tcPr>
           <w:p>
             <w:r/>
-            <w:hyperlink r:id="rId10">
+            <w:hyperlink r:id="rId12">
               <w:r>
                 <w:rPr>
                   <w:color w:val="0563C1"/>
@@ -180,7 +253,7 @@
           </w:tcPr>
           <w:p>
             <w:r/>
-            <w:hyperlink r:id="rId11">
+            <w:hyperlink r:id="rId10">
               <w:r>
                 <w:rPr>
                   <w:color w:val="0563C1"/>
@@ -214,7 +287,7 @@
           </w:tcPr>
           <w:p>
             <w:r/>
-            <w:hyperlink r:id="rId12">
+            <w:hyperlink r:id="rId9">
               <w:r>
                 <w:rPr>
                   <w:color w:val="0563C1"/>
@@ -1312,7 +1385,7 @@
       <w:bookmarkEnd w:id="7"/>
     </w:p>
     <w:p>
-      <w:hyperlink r:id="rId12">
+      <w:hyperlink r:id="rId9">
         <w:r>
           <w:rPr>
             <w:color w:val="0563C1"/>

</xml_diff>

<commit_message>
Restore earlier BSCR workings and archive historical Python entrypoints
</commit_message>
<xml_diff>
--- a/reporting/docs/generated/BSCR-Jan-2026.docx
+++ b/reporting/docs/generated/BSCR-Jan-2026.docx
@@ -1968,7 +1968,7 @@
           <w:b w:val="0"/>
           <w:i w:val="0"/>
         </w:rPr>
-        <w:t xml:space="preserve">. Its fixed key/pivot ranges, reversed Japanese peril references and hard-coded workbook FX are documented historical-workbook risks, not descriptions of </w:t>
+        <w:t xml:space="preserve">. It has been restored byte-for-byte from Git revision </w:t>
       </w:r>
       <w:r>
         <w:rPr>
@@ -1977,14 +1977,14 @@
           <w:i w:val="0"/>
           <w:sz w:val="18"/>
         </w:rPr>
-        <w:t>BSCR_Auto_Population.xlsx</w:t>
+        <w:t>d6aedfe</w:t>
       </w:r>
       <w:r>
         <w:rPr>
           <w:b w:val="0"/>
           <w:i w:val="0"/>
         </w:rPr>
-        <w:t>. Do not follow its A:G loading route for the new workbook, which takes all eight columns in its Excel table.</w:t>
+        <w:t xml:space="preserve"> (21 September 2026), the preceding distinct version after a later workbook was reported corrupt. The restored package/XML and formula/cached-value loading pass local checks, but native Excel opening still needs confirmation. Earlier versions' fixed ranges, Japanese peril references and workbook FX remain historical risks. Use the new eight-column population workbook for the current route, not this restored reference file.</w:t>
       </w:r>
     </w:p>
     <w:p>
@@ -1993,7 +1993,7 @@
           <w:b w:val="0"/>
           <w:i w:val="0"/>
         </w:rPr>
-        <w:t xml:space="preserve">The original Marimo script remains in </w:t>
+        <w:t xml:space="preserve">Historical Python scripts are archived in </w:t>
       </w:r>
       <w:r>
         <w:rPr>
@@ -2002,30 +2002,14 @@
           <w:i w:val="0"/>
           <w:sz w:val="18"/>
         </w:rPr>
-        <w:t>BSCR_UKEU_original.py</w:t>
+        <w:t>bscr/old-process/</w:t>
       </w:r>
       <w:r>
         <w:rPr>
           <w:b w:val="0"/>
           <w:i w:val="0"/>
         </w:rPr>
-        <w:t xml:space="preserve"> and </w:t>
-      </w:r>
-      <w:r>
-        <w:rPr>
-          <w:rFonts w:ascii="Courier New" w:hAnsi="Courier New"/>
-          <w:b w:val="0"/>
-          <w:i w:val="0"/>
-          <w:sz w:val="18"/>
-        </w:rPr>
-        <w:t>old-process/</w:t>
-      </w:r>
-      <w:r>
-        <w:rPr>
-          <w:b w:val="0"/>
-          <w:i w:val="0"/>
-        </w:rPr>
-        <w:t xml:space="preserve">. The separate </w:t>
+        <w:t xml:space="preserve">: </w:t>
       </w:r>
       <w:r>
         <w:rPr>
@@ -2041,7 +2025,39 @@
           <w:b w:val="0"/>
           <w:i w:val="0"/>
         </w:rPr>
-        <w:t xml:space="preserve"> is an older seven-column CSV workflow and is not the current producer. Source templates, raw workbooks and historical CSVs remain unchanged as evidence; their cached errors, external links and placeholders do not constitute approved current inputs.</w:t>
+        <w:t xml:space="preserve"> is the original Marimo application and </w:t>
+      </w:r>
+      <w:r>
+        <w:rPr>
+          <w:rFonts w:ascii="Courier New" w:hAnsi="Courier New"/>
+          <w:b w:val="0"/>
+          <w:i w:val="0"/>
+          <w:sz w:val="18"/>
+        </w:rPr>
+        <w:t>BSCR_UKEU_offline.py</w:t>
+      </w:r>
+      <w:r>
+        <w:rPr>
+          <w:b w:val="0"/>
+          <w:i w:val="0"/>
+        </w:rPr>
+        <w:t xml:space="preserve"> is the older seven-column CSV workflow. The duplicate top-level Marimo copy was removed after verifying identical contents. Neither is the current producer; active local builders remain in </w:t>
+      </w:r>
+      <w:r>
+        <w:rPr>
+          <w:rFonts w:ascii="Courier New" w:hAnsi="Courier New"/>
+          <w:b w:val="0"/>
+          <w:i w:val="0"/>
+          <w:sz w:val="18"/>
+        </w:rPr>
+        <w:t>bscr/tools/</w:t>
+      </w:r>
+      <w:r>
+        <w:rPr>
+          <w:b w:val="0"/>
+          <w:i w:val="0"/>
+        </w:rPr>
+        <w:t>. Source templates, raw workbooks and historical CSVs remain unchanged as evidence; their cached errors, external links and placeholders do not constitute approved current inputs.</w:t>
       </w:r>
     </w:p>
     <w:p>

</xml_diff>

<commit_message>
Split concise BSCR runbook from reconciliation notes
</commit_message>
<xml_diff>
--- a/reporting/docs/generated/BSCR-Jan-2026.docx
+++ b/reporting/docs/generated/BSCR-Jan-2026.docx
@@ -32,7 +32,7 @@
       </w:r>
     </w:p>
     <w:p>
-      <w:bookmarkStart w:id="1" w:name="bm_bscr_runbook_bscr_populate_the_schedules"/>
+      <w:bookmarkStart w:id="1" w:name="bm_bscr_runbook_bscr_runbook"/>
       <w:pPr>
         <w:pStyle w:val="Heading1"/>
         <w:keepNext/>
@@ -42,9 +42,67 @@
           <w:b w:val="0"/>
           <w:i w:val="0"/>
         </w:rPr>
-        <w:t>BSCR — populate the schedules</w:t>
+        <w:t>BSCR runbook</w:t>
       </w:r>
       <w:bookmarkEnd w:id="1"/>
+    </w:p>
+    <w:p>
+      <w:hyperlink r:id="rId9">
+        <w:r>
+          <w:rPr>
+            <w:color w:val="0563C1"/>
+            <w:u w:val="single"/>
+          </w:rPr>
+          <w:t>Population workbook</w:t>
+        </w:r>
+      </w:hyperlink>
+      <w:r>
+        <w:rPr>
+          <w:b w:val="0"/>
+          <w:i w:val="0"/>
+        </w:rPr>
+        <w:t xml:space="preserve"> · </w:t>
+      </w:r>
+      <w:hyperlink r:id="rId10">
+        <w:r>
+          <w:rPr>
+            <w:color w:val="0563C1"/>
+            <w:u w:val="single"/>
+          </w:rPr>
+          <w:t>Reconciliation workbook</w:t>
+        </w:r>
+      </w:hyperlink>
+      <w:r>
+        <w:rPr>
+          <w:b w:val="0"/>
+          <w:i w:val="0"/>
+        </w:rPr>
+        <w:t xml:space="preserve"> · </w:t>
+      </w:r>
+      <w:hyperlink r:id="rId11">
+        <w:r>
+          <w:rPr>
+            <w:color w:val="0563C1"/>
+            <w:u w:val="single"/>
+          </w:rPr>
+          <w:t>Reconciliation notes</w:t>
+        </w:r>
+      </w:hyperlink>
+    </w:p>
+    <w:p>
+      <w:bookmarkStart w:id="2" w:name="bm_bscr_runbook_1_get_and_run_the_sql"/>
+      <w:pPr>
+        <w:pStyle w:val="Heading2"/>
+        <w:keepNext/>
+      </w:pPr>
+      <w:r>
+        <w:rPr>
+          <w:b w:val="0"/>
+          <w:i w:val="0"/>
+        </w:rPr>
+        <w:t>1. Get and run the SQL</w:t>
+      </w:r>
+      <w:bookmarkEnd w:id="2"/>
     </w:p>
     <w:p>
       <w:r>
@@ -52,15 +110,15 @@
           <w:b w:val="0"/>
           <w:i w:val="0"/>
         </w:rPr>
-        <w:t xml:space="preserve">The reconciliation workbook is </w:t>
+        <w:t xml:space="preserve">Open </w:t>
       </w:r>
-      <w:hyperlink r:id="rId9">
+      <w:hyperlink r:id="rId12">
         <w:r>
           <w:rPr>
             <w:color w:val="0563C1"/>
             <w:u w:val="single"/>
           </w:rPr>
-          <w:t>BSCR_Reconciliation.xlsx</w:t>
+          <w:t>bscr-output.sql</w:t>
         </w:r>
       </w:hyperlink>
       <w:r>
@@ -68,7 +126,7 @@
           <w:b w:val="0"/>
           <w:i w:val="0"/>
         </w:rPr>
-        <w:t xml:space="preserve"> in </w:t>
+        <w:t xml:space="preserve"> in your SQL client and select the approved EDM snapshot. Leave </w:t>
       </w:r>
       <w:r>
         <w:rPr>
@@ -77,16 +135,83 @@
           <w:i w:val="0"/>
           <w:sz w:val="18"/>
         </w:rPr>
-        <w:t>bscr/reconcile/results/</w:t>
+        <w:t>@bscr_entity = NULL</w:t>
       </w:r>
       <w:r>
         <w:rPr>
           <w:b w:val="0"/>
           <w:i w:val="0"/>
         </w:rPr>
-        <w:t xml:space="preserve">; the auto-population workbook is </w:t>
+        <w:t xml:space="preserve"> for all entities and check the FX and retention parameters. Run the complete script.</w:t>
       </w:r>
-      <w:hyperlink r:id="rId10">
+    </w:p>
+    <w:p>
+      <w:r>
+        <w:rPr>
+          <w:b w:val="0"/>
+          <w:i w:val="0"/>
+        </w:rPr>
+        <w:t>The result has eight columns:</w:t>
+      </w:r>
+    </w:p>
+    <w:p>
+      <w:r>
+        <w:rPr>
+          <w:rFonts w:ascii="Courier New" w:hAnsi="Courier New"/>
+          <w:b w:val="0"/>
+          <w:i w:val="0"/>
+          <w:sz w:val="18"/>
+        </w:rPr>
+        <w:t>cntrycode, bscr_entity, region, sum_pml, sum_net, count_policies, is_geocoded, peril_id</w:t>
+      </w:r>
+    </w:p>
+    <w:p>
+      <w:r>
+        <w:rPr>
+          <w:b w:val="0"/>
+          <w:i w:val="0"/>
+        </w:rPr>
+        <w:t xml:space="preserve">Amounts are </w:t>
+      </w:r>
+      <w:r>
+        <w:rPr>
+          <w:b/>
+          <w:i w:val="0"/>
+        </w:rPr>
+        <w:t>full USD</w:t>
+      </w:r>
+      <w:r>
+        <w:rPr>
+          <w:b w:val="0"/>
+          <w:i w:val="0"/>
+        </w:rPr>
+        <w:t>, with FX already applied. Use the current script—not the legacy comparison query.</w:t>
+      </w:r>
+    </w:p>
+    <w:p>
+      <w:bookmarkStart w:id="3" w:name="bm_bscr_runbook_2_populate_the_workbook"/>
+      <w:pPr>
+        <w:pStyle w:val="Heading2"/>
+        <w:keepNext/>
+      </w:pPr>
+      <w:r>
+        <w:rPr>
+          <w:b w:val="0"/>
+          <w:i w:val="0"/>
+        </w:rPr>
+        <w:t>2. Populate the workbook</w:t>
+      </w:r>
+      <w:bookmarkEnd w:id="3"/>
+    </w:p>
+    <w:p>
+      <w:r>
+        <w:rPr>
+          <w:b w:val="0"/>
+          <w:i w:val="0"/>
+        </w:rPr>
+        <w:t xml:space="preserve">Open </w:t>
+      </w:r>
+      <w:hyperlink r:id="rId9">
         <w:r>
           <w:rPr>
             <w:color w:val="0563C1"/>
@@ -100,328 +225,8 @@
           <w:b w:val="0"/>
           <w:i w:val="0"/>
         </w:rPr>
-        <w:t xml:space="preserve"> in </w:t>
-      </w:r>
-      <w:r>
-        <w:rPr>
-          <w:rFonts w:ascii="Courier New" w:hAnsi="Courier New"/>
-          <w:b w:val="0"/>
-          <w:i w:val="0"/>
-          <w:sz w:val="18"/>
-        </w:rPr>
-        <w:t>bscr/workbooks/</w:t>
-      </w:r>
-      <w:r>
-        <w:rPr>
-          <w:b w:val="0"/>
-          <w:i w:val="0"/>
-        </w:rPr>
         <w:t>.</w:t>
       </w:r>
-    </w:p>
-    <w:p>
-      <w:hyperlink r:id="rId11">
-        <w:r>
-          <w:rPr>
-            <w:color w:val="0563C1"/>
-            <w:u w:val="single"/>
-          </w:rPr>
-          <w:t>Back to reporting guides</w:t>
-        </w:r>
-      </w:hyperlink>
-    </w:p>
-    <w:p>
-      <w:bookmarkStart w:id="2" w:name="bm_bscr_runbook_use_these_files"/>
-      <w:pPr>
-        <w:pStyle w:val="Heading2"/>
-        <w:keepNext/>
-      </w:pPr>
-      <w:r>
-        <w:rPr>
-          <w:b w:val="0"/>
-          <w:i w:val="0"/>
-        </w:rPr>
-        <w:t>Use these files</w:t>
-      </w:r>
-      <w:bookmarkEnd w:id="2"/>
-    </w:p>
-    <w:tbl>
-      <w:tblPr>
-        <w:tblStyle w:val="TableGrid"/>
-        <w:tblW w:type="auto" w:w="0"/>
-        <w:tblLook w:firstColumn="1" w:firstRow="1" w:lastColumn="0" w:lastRow="0" w:noHBand="0" w:noVBand="1" w:val="04A0"/>
-      </w:tblPr>
-      <w:tblGrid>
-        <w:gridCol w:w="5040"/>
-        <w:gridCol w:w="5040"/>
-      </w:tblGrid>
-      <w:tr>
-        <w:tc>
-          <w:tcPr>
-            <w:tcW w:type="dxa" w:w="5040"/>
-            <w:shd w:fill="D9EAF7"/>
-          </w:tcPr>
-          <w:p>
-            <w:r>
-              <w:rPr>
-                <w:b/>
-              </w:rPr>
-            </w:r>
-            <w:r>
-              <w:rPr>
-                <w:b/>
-                <w:i w:val="0"/>
-              </w:rPr>
-              <w:t>Purpose</w:t>
-            </w:r>
-          </w:p>
-        </w:tc>
-        <w:tc>
-          <w:tcPr>
-            <w:tcW w:type="dxa" w:w="5040"/>
-            <w:shd w:fill="D9EAF7"/>
-          </w:tcPr>
-          <w:p>
-            <w:r>
-              <w:rPr>
-                <w:b/>
-              </w:rPr>
-            </w:r>
-            <w:r>
-              <w:rPr>
-                <w:b/>
-                <w:i w:val="0"/>
-              </w:rPr>
-              <w:t>File</w:t>
-            </w:r>
-          </w:p>
-        </w:tc>
-      </w:tr>
-      <w:tr>
-        <w:tc>
-          <w:tcPr>
-            <w:tcW w:type="dxa" w:w="5040"/>
-          </w:tcPr>
-          <w:p>
-            <w:r/>
-            <w:r>
-              <w:rPr>
-                <w:b w:val="0"/>
-                <w:i w:val="0"/>
-              </w:rPr>
-              <w:t>Produce current results in SQL Server</w:t>
-            </w:r>
-          </w:p>
-        </w:tc>
-        <w:tc>
-          <w:tcPr>
-            <w:tcW w:type="dxa" w:w="5040"/>
-          </w:tcPr>
-          <w:p>
-            <w:r/>
-            <w:hyperlink r:id="rId12">
-              <w:r>
-                <w:rPr>
-                  <w:color w:val="0563C1"/>
-                  <w:u w:val="single"/>
-                </w:rPr>
-                <w:t>bscr-output.sql</w:t>
-              </w:r>
-            </w:hyperlink>
-          </w:p>
-        </w:tc>
-      </w:tr>
-      <w:tr>
-        <w:tc>
-          <w:tcPr>
-            <w:tcW w:type="dxa" w:w="5040"/>
-          </w:tcPr>
-          <w:p>
-            <w:r/>
-            <w:r>
-              <w:rPr>
-                <w:b w:val="0"/>
-                <w:i w:val="0"/>
-              </w:rPr>
-              <w:t>Populate the schedules in Excel</w:t>
-            </w:r>
-          </w:p>
-        </w:tc>
-        <w:tc>
-          <w:tcPr>
-            <w:tcW w:type="dxa" w:w="5040"/>
-          </w:tcPr>
-          <w:p>
-            <w:r/>
-            <w:hyperlink r:id="rId10">
-              <w:r>
-                <w:rPr>
-                  <w:color w:val="0563C1"/>
-                  <w:u w:val="single"/>
-                </w:rPr>
-                <w:t>BSCR_Auto_Population.xlsx</w:t>
-              </w:r>
-            </w:hyperlink>
-          </w:p>
-        </w:tc>
-      </w:tr>
-      <w:tr>
-        <w:tc>
-          <w:tcPr>
-            <w:tcW w:type="dxa" w:w="5040"/>
-          </w:tcPr>
-          <w:p>
-            <w:r/>
-            <w:r>
-              <w:rPr>
-                <w:b w:val="0"/>
-                <w:i w:val="0"/>
-              </w:rPr>
-              <w:t>Review old-versus-new evidence separately</w:t>
-            </w:r>
-          </w:p>
-        </w:tc>
-        <w:tc>
-          <w:tcPr>
-            <w:tcW w:type="dxa" w:w="5040"/>
-          </w:tcPr>
-          <w:p>
-            <w:r/>
-            <w:hyperlink r:id="rId9">
-              <w:r>
-                <w:rPr>
-                  <w:color w:val="0563C1"/>
-                  <w:u w:val="single"/>
-                </w:rPr>
-                <w:t>BSCR_Reconciliation.xlsx</w:t>
-              </w:r>
-            </w:hyperlink>
-          </w:p>
-        </w:tc>
-      </w:tr>
-    </w:tbl>
-    <w:p/>
-    <w:p>
-      <w:r>
-        <w:rPr>
-          <w:b w:val="0"/>
-          <w:i w:val="0"/>
-        </w:rPr>
-        <w:t xml:space="preserve">The population workbook needs Excel only: no Python, macros, database connection or external workbook links. Its seven tabs are </w:t>
-      </w:r>
-      <w:r>
-        <w:rPr>
-          <w:b/>
-          <w:i w:val="0"/>
-        </w:rPr>
-        <w:t>Instructions</w:t>
-      </w:r>
-      <w:r>
-        <w:rPr>
-          <w:b w:val="0"/>
-          <w:i w:val="0"/>
-        </w:rPr>
-        <w:t xml:space="preserve">, </w:t>
-      </w:r>
-      <w:r>
-        <w:rPr>
-          <w:b/>
-          <w:i w:val="0"/>
-        </w:rPr>
-        <w:t>SQL input</w:t>
-      </w:r>
-      <w:r>
-        <w:rPr>
-          <w:b w:val="0"/>
-          <w:i w:val="0"/>
-        </w:rPr>
-        <w:t xml:space="preserve">, </w:t>
-      </w:r>
-      <w:r>
-        <w:rPr>
-          <w:b/>
-          <w:i w:val="0"/>
-        </w:rPr>
-        <w:t>33</w:t>
-      </w:r>
-      <w:r>
-        <w:rPr>
-          <w:b w:val="0"/>
-          <w:i w:val="0"/>
-        </w:rPr>
-        <w:t xml:space="preserve">, </w:t>
-      </w:r>
-      <w:r>
-        <w:rPr>
-          <w:b/>
-          <w:i w:val="0"/>
-        </w:rPr>
-        <w:t>3624</w:t>
-      </w:r>
-      <w:r>
-        <w:rPr>
-          <w:b w:val="0"/>
-          <w:i w:val="0"/>
-        </w:rPr>
-        <w:t xml:space="preserve">, </w:t>
-      </w:r>
-      <w:r>
-        <w:rPr>
-          <w:b/>
-          <w:i w:val="0"/>
-        </w:rPr>
-        <w:t>HIC</w:t>
-      </w:r>
-      <w:r>
-        <w:rPr>
-          <w:b w:val="0"/>
-          <w:i w:val="0"/>
-        </w:rPr>
-        <w:t xml:space="preserve">, </w:t>
-      </w:r>
-      <w:r>
-        <w:rPr>
-          <w:b/>
-          <w:i w:val="0"/>
-        </w:rPr>
-        <w:t>HIG</w:t>
-      </w:r>
-      <w:r>
-        <w:rPr>
-          <w:b w:val="0"/>
-          <w:i w:val="0"/>
-        </w:rPr>
-        <w:t xml:space="preserve"> and </w:t>
-      </w:r>
-      <w:r>
-        <w:rPr>
-          <w:b/>
-          <w:i w:val="0"/>
-        </w:rPr>
-        <w:t>HSA</w:t>
-      </w:r>
-      <w:r>
-        <w:rPr>
-          <w:b w:val="0"/>
-          <w:i w:val="0"/>
-        </w:rPr>
-        <w:t>. Each entity tab contains Schedules X(a), X(b), X(c) and X(f), with navigation links and print breaks.</w:t>
-      </w:r>
-    </w:p>
-    <w:p>
-      <w:bookmarkStart w:id="3" w:name="bm_bscr_runbook_refresh_the_population_workbook"/>
-      <w:pPr>
-        <w:pStyle w:val="Heading2"/>
-        <w:keepNext/>
-      </w:pPr>
-      <w:r>
-        <w:rPr>
-          <w:b w:val="0"/>
-          <w:i w:val="0"/>
-        </w:rPr>
-        <w:t>Refresh the population workbook</w:t>
-      </w:r>
-      <w:bookmarkEnd w:id="3"/>
     </w:p>
     <w:p>
       <w:r>
@@ -443,7 +248,7 @@
           <w:b w:val="0"/>
           <w:i w:val="0"/>
         </w:rPr>
-        <w:t>, keeping the header row and table.</w:t>
+        <w:t>, keeping the headers and table.</w:t>
       </w:r>
     </w:p>
     <w:p>
@@ -452,21 +257,7 @@
           <w:b w:val="0"/>
           <w:i w:val="0"/>
         </w:rPr>
-        <w:t xml:space="preserve">2. Paste the new eight-column results from </w:t>
-      </w:r>
-      <w:r>
-        <w:rPr>
-          <w:b/>
-          <w:i w:val="0"/>
-        </w:rPr>
-        <w:t>bscr-output.sql</w:t>
-      </w:r>
-      <w:r>
-        <w:rPr>
-          <w:b w:val="0"/>
-          <w:i w:val="0"/>
-        </w:rPr>
-        <w:t xml:space="preserve"> below the headers. The entity tabs populate automatically.</w:t>
+        <w:t>2. Paste the new eight-column results below the headers. The entity tabs populate automatically.</w:t>
       </w:r>
     </w:p>
     <w:p>
@@ -475,7 +266,7 @@
           <w:b w:val="0"/>
           <w:i w:val="0"/>
         </w:rPr>
-        <w:t xml:space="preserve">Use the full output for all entities. Excel calculation must be automatic; if values do not refresh, use </w:t>
+        <w:t xml:space="preserve">Do not leave stale rows below a shorter replacement. Use </w:t>
       </w:r>
       <w:r>
         <w:rPr>
@@ -489,40 +280,11 @@
           <w:b w:val="0"/>
           <w:i w:val="0"/>
         </w:rPr>
-        <w:t>. Do not leave old data rows below a shorter replacement.</w:t>
+        <w:t xml:space="preserve"> if Excel does not refresh. No Python or macros are required.</w:t>
       </w:r>
     </w:p>
     <w:p>
-      <w:r>
-        <w:rPr>
-          <w:b w:val="0"/>
-          <w:i w:val="0"/>
-        </w:rPr>
-        <w:t>The input columns, in order, are:</w:t>
-      </w:r>
-    </w:p>
-    <w:p>
-      <w:r>
-        <w:rPr>
-          <w:rFonts w:ascii="Courier New" w:hAnsi="Courier New"/>
-          <w:b w:val="0"/>
-          <w:i w:val="0"/>
-          <w:sz w:val="18"/>
-        </w:rPr>
-        <w:t>cntrycode, bscr_entity, region, sum_pml, sum_net, count_policies, is_geocoded, peril_id</w:t>
-      </w:r>
-    </w:p>
-    <w:p>
-      <w:r>
-        <w:rPr>
-          <w:b w:val="0"/>
-          <w:i w:val="0"/>
-        </w:rPr>
-        <w:t>There is no historical-check tab or legacy mode in this population workbook. Do not paste the legacy query's output into it as a historical comparison; use the separate reconciliation workbook for that evidence.</w:t>
-      </w:r>
-    </w:p>
-    <w:p>
-      <w:bookmarkStart w:id="4" w:name="bm_bscr_runbook_what_populates_automatically"/>
+      <w:bookmarkStart w:id="4" w:name="bm_bscr_runbook_3_review_and_save"/>
       <w:pPr>
         <w:pStyle w:val="Heading2"/>
         <w:keepNext/>
@@ -532,7 +294,7 @@
           <w:b w:val="0"/>
           <w:i w:val="0"/>
         </w:rPr>
-        <w:t>What populates automatically</w:t>
+        <w:t>3. Review and save</w:t>
       </w:r>
       <w:bookmarkEnd w:id="4"/>
     </w:p>
@@ -542,323 +304,21 @@
           <w:b w:val="0"/>
           <w:i w:val="0"/>
         </w:rPr>
-        <w:t>Green cells are automatic and locked. Blue cells remain manual and start blank: premiums, EP/model losses, questionnaires and narratives. Blank does not mean zero. The workbook is a population aid, not a complete or approved regulatory return.</w:t>
+        <w:t xml:space="preserve">• Review the </w:t>
       </w:r>
-    </w:p>
-    <w:tbl>
-      <w:tblPr>
-        <w:tblStyle w:val="TableGrid"/>
-        <w:tblW w:type="auto" w:w="0"/>
-        <w:tblLook w:firstColumn="1" w:firstRow="1" w:lastColumn="0" w:lastRow="0" w:noHBand="0" w:noVBand="1" w:val="04A0"/>
-      </w:tblPr>
-      <w:tblGrid>
-        <w:gridCol w:w="5040"/>
-        <w:gridCol w:w="5040"/>
-      </w:tblGrid>
-      <w:tr>
-        <w:tc>
-          <w:tcPr>
-            <w:tcW w:type="dxa" w:w="5040"/>
-            <w:shd w:fill="D9EAF7"/>
-          </w:tcPr>
-          <w:p>
-            <w:r>
-              <w:rPr>
-                <w:b/>
-              </w:rPr>
-            </w:r>
-            <w:r>
-              <w:rPr>
-                <w:b/>
-                <w:i w:val="0"/>
-              </w:rPr>
-              <w:t>Population / measure</w:t>
-            </w:r>
-          </w:p>
-        </w:tc>
-        <w:tc>
-          <w:tcPr>
-            <w:tcW w:type="dxa" w:w="5040"/>
-            <w:shd w:fill="D9EAF7"/>
-          </w:tcPr>
-          <w:p>
-            <w:r>
-              <w:rPr>
-                <w:b/>
-              </w:rPr>
-            </w:r>
-            <w:r>
-              <w:rPr>
-                <w:b/>
-                <w:i w:val="0"/>
-              </w:rPr>
-              <w:t>Agreed mapping</w:t>
-            </w:r>
-          </w:p>
-        </w:tc>
-      </w:tr>
-      <w:tr>
-        <w:tc>
-          <w:tcPr>
-            <w:tcW w:type="dxa" w:w="5040"/>
-          </w:tcPr>
-          <w:p>
-            <w:r/>
-            <w:r>
-              <w:rPr>
-                <w:b w:val="0"/>
-                <w:i w:val="0"/>
-              </w:rPr>
-              <w:t>Modellable / modelled / detailed exposure</w:t>
-            </w:r>
-          </w:p>
-        </w:tc>
-        <w:tc>
-          <w:tcPr>
-            <w:tcW w:type="dxa" w:w="5040"/>
-          </w:tcPr>
-          <w:p>
-            <w:r/>
-            <w:r>
-              <w:rPr>
-                <w:rFonts w:ascii="Courier New" w:hAnsi="Courier New"/>
-                <w:b w:val="0"/>
-                <w:i w:val="0"/>
-                <w:sz w:val="18"/>
-              </w:rPr>
-              <w:t>is_geocoded = 1</w:t>
-            </w:r>
-          </w:p>
-        </w:tc>
-      </w:tr>
-      <w:tr>
-        <w:tc>
-          <w:tcPr>
-            <w:tcW w:type="dxa" w:w="5040"/>
-          </w:tcPr>
-          <w:p>
-            <w:r/>
-            <w:r>
-              <w:rPr>
-                <w:b w:val="0"/>
-                <w:i w:val="0"/>
-              </w:rPr>
-              <w:t>Not modellable / not modelled / data deficient</w:t>
-            </w:r>
-          </w:p>
-        </w:tc>
-        <w:tc>
-          <w:tcPr>
-            <w:tcW w:type="dxa" w:w="5040"/>
-          </w:tcPr>
-          <w:p>
-            <w:r/>
-            <w:r>
-              <w:rPr>
-                <w:rFonts w:ascii="Courier New" w:hAnsi="Courier New"/>
-                <w:b w:val="0"/>
-                <w:i w:val="0"/>
-                <w:sz w:val="18"/>
-              </w:rPr>
-              <w:t>is_geocoded = 0</w:t>
-            </w:r>
-          </w:p>
-        </w:tc>
-      </w:tr>
-      <w:tr>
-        <w:tc>
-          <w:tcPr>
-            <w:tcW w:type="dxa" w:w="5040"/>
-          </w:tcPr>
-          <w:p>
-            <w:r/>
-            <w:r>
-              <w:rPr>
-                <w:b w:val="0"/>
-                <w:i w:val="0"/>
-              </w:rPr>
-              <w:t>US contracts in X(f)</w:t>
-            </w:r>
-          </w:p>
-        </w:tc>
-        <w:tc>
-          <w:tcPr>
-            <w:tcW w:type="dxa" w:w="5040"/>
-          </w:tcPr>
-          <w:p>
-            <w:r/>
-            <w:r>
-              <w:rPr>
-                <w:b w:val="0"/>
-                <w:i w:val="0"/>
-              </w:rPr>
-              <w:t xml:space="preserve">Earthquake </w:t>
-            </w:r>
-            <w:r>
-              <w:rPr>
-                <w:rFonts w:ascii="Courier New" w:hAnsi="Courier New"/>
-                <w:b w:val="0"/>
-                <w:i w:val="0"/>
-                <w:sz w:val="18"/>
-              </w:rPr>
-              <w:t>ALL</w:t>
-            </w:r>
-            <w:r>
-              <w:rPr>
-                <w:b w:val="0"/>
-                <w:i w:val="0"/>
-              </w:rPr>
-              <w:t xml:space="preserve"> rows with </w:t>
-            </w:r>
-            <w:r>
-              <w:rPr>
-                <w:rFonts w:ascii="Courier New" w:hAnsi="Courier New"/>
-                <w:b w:val="0"/>
-                <w:i w:val="0"/>
-                <w:sz w:val="18"/>
-              </w:rPr>
-              <w:t>cntrycode = 'US'</w:t>
-            </w:r>
-          </w:p>
-        </w:tc>
-      </w:tr>
-      <w:tr>
-        <w:tc>
-          <w:tcPr>
-            <w:tcW w:type="dxa" w:w="5040"/>
-          </w:tcPr>
-          <w:p>
-            <w:r/>
-            <w:r>
-              <w:rPr>
-                <w:b w:val="0"/>
-                <w:i w:val="0"/>
-              </w:rPr>
-              <w:t>All other contracts in X(f)</w:t>
-            </w:r>
-          </w:p>
-        </w:tc>
-        <w:tc>
-          <w:tcPr>
-            <w:tcW w:type="dxa" w:w="5040"/>
-          </w:tcPr>
-          <w:p>
-            <w:r/>
-            <w:r>
-              <w:rPr>
-                <w:b w:val="0"/>
-                <w:i w:val="0"/>
-              </w:rPr>
-              <w:t xml:space="preserve">Earthquake </w:t>
-            </w:r>
-            <w:r>
-              <w:rPr>
-                <w:rFonts w:ascii="Courier New" w:hAnsi="Courier New"/>
-                <w:b w:val="0"/>
-                <w:i w:val="0"/>
-                <w:sz w:val="18"/>
-              </w:rPr>
-              <w:t>ALL</w:t>
-            </w:r>
-            <w:r>
-              <w:rPr>
-                <w:b w:val="0"/>
-                <w:i w:val="0"/>
-              </w:rPr>
-              <w:t xml:space="preserve"> minus US, using the same geocode selection</w:t>
-            </w:r>
-          </w:p>
-        </w:tc>
-      </w:tr>
-      <w:tr>
-        <w:tc>
-          <w:tcPr>
-            <w:tcW w:type="dxa" w:w="5040"/>
-          </w:tcPr>
-          <w:p>
-            <w:r/>
-            <w:r>
-              <w:rPr>
-                <w:b w:val="0"/>
-                <w:i w:val="0"/>
-              </w:rPr>
-              <w:t>Count</w:t>
-            </w:r>
-          </w:p>
-        </w:tc>
-        <w:tc>
-          <w:tcPr>
-            <w:tcW w:type="dxa" w:w="5040"/>
-          </w:tcPr>
-          <w:p>
-            <w:r/>
-            <w:r>
-              <w:rPr>
-                <w:b w:val="0"/>
-                <w:i w:val="0"/>
-              </w:rPr>
-              <w:t xml:space="preserve">Sum the supplied </w:t>
-            </w:r>
-            <w:r>
-              <w:rPr>
-                <w:rFonts w:ascii="Courier New" w:hAnsi="Courier New"/>
-                <w:b w:val="0"/>
-                <w:i w:val="0"/>
-                <w:sz w:val="18"/>
-              </w:rPr>
-              <w:t>count_policies</w:t>
-            </w:r>
-            <w:r>
-              <w:rPr>
-                <w:b w:val="0"/>
-                <w:i w:val="0"/>
-              </w:rPr>
-              <w:t>; do not scale or apply FX</w:t>
-            </w:r>
-          </w:p>
-        </w:tc>
-      </w:tr>
-      <w:tr>
-        <w:tc>
-          <w:tcPr>
-            <w:tcW w:type="dxa" w:w="5040"/>
-          </w:tcPr>
-          <w:p>
-            <w:r/>
-            <w:r>
-              <w:rPr>
-                <w:b w:val="0"/>
-                <w:i w:val="0"/>
-              </w:rPr>
-              <w:t>Gross / net exposure</w:t>
-            </w:r>
-          </w:p>
-        </w:tc>
-        <w:tc>
-          <w:tcPr>
-            <w:tcW w:type="dxa" w:w="5040"/>
-          </w:tcPr>
-          <w:p>
-            <w:r/>
-            <w:r>
-              <w:rPr>
-                <w:b w:val="0"/>
-                <w:i w:val="0"/>
-              </w:rPr>
-              <w:t>Sum the relevant SQL gross/net values and divide by 1,000,000</w:t>
-            </w:r>
-          </w:p>
-        </w:tc>
-      </w:tr>
-    </w:tbl>
-    <w:p/>
-    <w:p>
+      <w:r>
+        <w:rPr>
+          <w:b/>
+          <w:i w:val="0"/>
+        </w:rPr>
+        <w:t>33, 3624, HIC, HIG and HSA</w:t>
+      </w:r>
       <w:r>
         <w:rPr>
           <w:b w:val="0"/>
           <w:i w:val="0"/>
         </w:rPr>
-        <w:t>The geocoding classification is the agreed workbook proxy. It does not reproduce April's separate manual reallocations. Other modelability categories are zero under this proxy. Repeated schedule presentations are intentional; do not sum all regions or schedules into a portfolio total.</w:t>
+        <w:t xml:space="preserve"> tabs.</w:t>
       </w:r>
     </w:p>
     <w:p>
@@ -867,359 +327,42 @@
           <w:b w:val="0"/>
           <w:i w:val="0"/>
         </w:rPr>
-        <w:t xml:space="preserve">The automatic X(a)/X(b) exposure fields are the </w:t>
+        <w:t>• Green cells are automatic; complete the blue manual fields, including premiums and EP losses.</w:t>
+      </w:r>
+    </w:p>
+    <w:p>
+      <w:r>
+        <w:rPr>
+          <w:b w:val="0"/>
+          <w:i w:val="0"/>
+        </w:rPr>
+        <w:t xml:space="preserve">• Money is displayed in USD millions. </w:t>
       </w:r>
       <w:r>
         <w:rPr>
           <w:b/>
           <w:i w:val="0"/>
         </w:rPr>
-        <w:t>all-other-lines</w:t>
+        <w:t>Do not apply FX again.</w:t>
       </w:r>
+    </w:p>
+    <w:p>
       <w:r>
         <w:rPr>
           <w:b w:val="0"/>
           <w:i w:val="0"/>
         </w:rPr>
-        <w:t xml:space="preserve"> limits, split between modelled and not modelled. Statutory property-catastrophe fields require separate manual inputs; the SQL does not identify that classification.</w:t>
+        <w:t>• Geocoded means modelled/modellable; ungeocoded means not modelled/not modellable. Non-US is total minus US.</w:t>
       </w:r>
     </w:p>
     <w:p>
-      <w:bookmarkStart w:id="5" w:name="bm_bscr_runbook_regional_limits_in_x_c"/>
-      <w:pPr>
-        <w:pStyle w:val="Heading3"/>
-        <w:keepNext/>
-      </w:pPr>
       <w:r>
         <w:rPr>
           <w:b w:val="0"/>
           <w:i w:val="0"/>
         </w:rPr>
-        <w:t>Regional limits in X(c)</w:t>
+        <w:t xml:space="preserve">• </w:t>
       </w:r>
-      <w:bookmarkEnd w:id="5"/>
-    </w:p>
-    <w:tbl>
-      <w:tblPr>
-        <w:tblStyle w:val="TableGrid"/>
-        <w:tblW w:type="auto" w:w="0"/>
-        <w:tblLook w:firstColumn="1" w:firstRow="1" w:lastColumn="0" w:lastRow="0" w:noHBand="0" w:noVBand="1" w:val="04A0"/>
-      </w:tblPr>
-      <w:tblGrid>
-        <w:gridCol w:w="3360"/>
-        <w:gridCol w:w="3360"/>
-        <w:gridCol w:w="3360"/>
-      </w:tblGrid>
-      <w:tr>
-        <w:tc>
-          <w:tcPr>
-            <w:tcW w:type="dxa" w:w="3360"/>
-            <w:shd w:fill="D9EAF7"/>
-          </w:tcPr>
-          <w:p>
-            <w:r>
-              <w:rPr>
-                <w:b/>
-              </w:rPr>
-            </w:r>
-            <w:r>
-              <w:rPr>
-                <w:b/>
-                <w:i w:val="0"/>
-              </w:rPr>
-              <w:t>Schedule region</w:t>
-            </w:r>
-          </w:p>
-        </w:tc>
-        <w:tc>
-          <w:tcPr>
-            <w:tcW w:type="dxa" w:w="3360"/>
-            <w:shd w:fill="D9EAF7"/>
-          </w:tcPr>
-          <w:p>
-            <w:r>
-              <w:rPr>
-                <w:b/>
-              </w:rPr>
-            </w:r>
-            <w:r>
-              <w:rPr>
-                <w:b/>
-                <w:i w:val="0"/>
-              </w:rPr>
-              <w:t>SQL region</w:t>
-            </w:r>
-          </w:p>
-        </w:tc>
-        <w:tc>
-          <w:tcPr>
-            <w:tcW w:type="dxa" w:w="3360"/>
-            <w:shd w:fill="D9EAF7"/>
-          </w:tcPr>
-          <w:p>
-            <w:r>
-              <w:rPr>
-                <w:b/>
-              </w:rPr>
-            </w:r>
-            <w:r>
-              <w:rPr>
-                <w:b/>
-                <w:i w:val="0"/>
-              </w:rPr>
-              <w:t>Peril</w:t>
-            </w:r>
-          </w:p>
-        </w:tc>
-      </w:tr>
-      <w:tr>
-        <w:tc>
-          <w:tcPr>
-            <w:tcW w:type="dxa" w:w="3360"/>
-          </w:tcPr>
-          <w:p>
-            <w:r/>
-            <w:r>
-              <w:rPr>
-                <w:b w:val="0"/>
-                <w:i w:val="0"/>
-              </w:rPr>
-              <w:t>Atlantic hurricane</w:t>
-            </w:r>
-          </w:p>
-        </w:tc>
-        <w:tc>
-          <w:tcPr>
-            <w:tcW w:type="dxa" w:w="3360"/>
-          </w:tcPr>
-          <w:p>
-            <w:r/>
-            <w:r>
-              <w:rPr>
-                <w:rFonts w:ascii="Courier New" w:hAnsi="Courier New"/>
-                <w:b w:val="0"/>
-                <w:i w:val="0"/>
-                <w:sz w:val="18"/>
-              </w:rPr>
-              <w:t>is_nahu</w:t>
-            </w:r>
-          </w:p>
-        </w:tc>
-        <w:tc>
-          <w:tcPr>
-            <w:tcW w:type="dxa" w:w="3360"/>
-          </w:tcPr>
-          <w:p>
-            <w:r/>
-            <w:r>
-              <w:rPr>
-                <w:b w:val="0"/>
-                <w:i w:val="0"/>
-              </w:rPr>
-              <w:t>Wind, 2</w:t>
-            </w:r>
-          </w:p>
-        </w:tc>
-      </w:tr>
-      <w:tr>
-        <w:tc>
-          <w:tcPr>
-            <w:tcW w:type="dxa" w:w="3360"/>
-          </w:tcPr>
-          <w:p>
-            <w:r/>
-            <w:r>
-              <w:rPr>
-                <w:b w:val="0"/>
-                <w:i w:val="0"/>
-              </w:rPr>
-              <w:t>North American earthquake</w:t>
-            </w:r>
-          </w:p>
-        </w:tc>
-        <w:tc>
-          <w:tcPr>
-            <w:tcW w:type="dxa" w:w="3360"/>
-          </w:tcPr>
-          <w:p>
-            <w:r/>
-            <w:r>
-              <w:rPr>
-                <w:rFonts w:ascii="Courier New" w:hAnsi="Courier New"/>
-                <w:b w:val="0"/>
-                <w:i w:val="0"/>
-                <w:sz w:val="18"/>
-              </w:rPr>
-              <w:t>is_na_eq</w:t>
-            </w:r>
-          </w:p>
-        </w:tc>
-        <w:tc>
-          <w:tcPr>
-            <w:tcW w:type="dxa" w:w="3360"/>
-          </w:tcPr>
-          <w:p>
-            <w:r/>
-            <w:r>
-              <w:rPr>
-                <w:b w:val="0"/>
-                <w:i w:val="0"/>
-              </w:rPr>
-              <w:t>Earthquake, 1</w:t>
-            </w:r>
-          </w:p>
-        </w:tc>
-      </w:tr>
-      <w:tr>
-        <w:tc>
-          <w:tcPr>
-            <w:tcW w:type="dxa" w:w="3360"/>
-          </w:tcPr>
-          <w:p>
-            <w:r/>
-            <w:r>
-              <w:rPr>
-                <w:b w:val="0"/>
-                <w:i w:val="0"/>
-              </w:rPr>
-              <w:t>European windstorm</w:t>
-            </w:r>
-          </w:p>
-        </w:tc>
-        <w:tc>
-          <w:tcPr>
-            <w:tcW w:type="dxa" w:w="3360"/>
-          </w:tcPr>
-          <w:p>
-            <w:r/>
-            <w:r>
-              <w:rPr>
-                <w:rFonts w:ascii="Courier New" w:hAnsi="Courier New"/>
-                <w:b w:val="0"/>
-                <w:i w:val="0"/>
-                <w:sz w:val="18"/>
-              </w:rPr>
-              <w:t>is_eu</w:t>
-            </w:r>
-          </w:p>
-        </w:tc>
-        <w:tc>
-          <w:tcPr>
-            <w:tcW w:type="dxa" w:w="3360"/>
-          </w:tcPr>
-          <w:p>
-            <w:r/>
-            <w:r>
-              <w:rPr>
-                <w:b w:val="0"/>
-                <w:i w:val="0"/>
-              </w:rPr>
-              <w:t>Wind, 2</w:t>
-            </w:r>
-          </w:p>
-        </w:tc>
-      </w:tr>
-      <w:tr>
-        <w:tc>
-          <w:tcPr>
-            <w:tcW w:type="dxa" w:w="3360"/>
-          </w:tcPr>
-          <w:p>
-            <w:r/>
-            <w:r>
-              <w:rPr>
-                <w:b w:val="0"/>
-                <w:i w:val="0"/>
-              </w:rPr>
-              <w:t>Japanese earthquake</w:t>
-            </w:r>
-          </w:p>
-        </w:tc>
-        <w:tc>
-          <w:tcPr>
-            <w:tcW w:type="dxa" w:w="3360"/>
-          </w:tcPr>
-          <w:p>
-            <w:r/>
-            <w:r>
-              <w:rPr>
-                <w:rFonts w:ascii="Courier New" w:hAnsi="Courier New"/>
-                <w:b w:val="0"/>
-                <w:i w:val="0"/>
-                <w:sz w:val="18"/>
-              </w:rPr>
-              <w:t>is_jp_eq</w:t>
-            </w:r>
-          </w:p>
-        </w:tc>
-        <w:tc>
-          <w:tcPr>
-            <w:tcW w:type="dxa" w:w="3360"/>
-          </w:tcPr>
-          <w:p>
-            <w:r/>
-            <w:r>
-              <w:rPr>
-                <w:b w:val="0"/>
-                <w:i w:val="0"/>
-              </w:rPr>
-              <w:t>Earthquake, 1</w:t>
-            </w:r>
-          </w:p>
-        </w:tc>
-      </w:tr>
-      <w:tr>
-        <w:tc>
-          <w:tcPr>
-            <w:tcW w:type="dxa" w:w="3360"/>
-          </w:tcPr>
-          <w:p>
-            <w:r/>
-            <w:r>
-              <w:rPr>
-                <w:b w:val="0"/>
-                <w:i w:val="0"/>
-              </w:rPr>
-              <w:t>Japanese typhoon</w:t>
-            </w:r>
-          </w:p>
-        </w:tc>
-        <w:tc>
-          <w:tcPr>
-            <w:tcW w:type="dxa" w:w="3360"/>
-          </w:tcPr>
-          <w:p>
-            <w:r/>
-            <w:r>
-              <w:rPr>
-                <w:rFonts w:ascii="Courier New" w:hAnsi="Courier New"/>
-                <w:b w:val="0"/>
-                <w:i w:val="0"/>
-                <w:sz w:val="18"/>
-              </w:rPr>
-              <w:t>is_jp</w:t>
-            </w:r>
-          </w:p>
-        </w:tc>
-        <w:tc>
-          <w:tcPr>
-            <w:tcW w:type="dxa" w:w="3360"/>
-          </w:tcPr>
-          <w:p>
-            <w:r/>
-            <w:r>
-              <w:rPr>
-                <w:b w:val="0"/>
-                <w:i w:val="0"/>
-              </w:rPr>
-              <w:t>Wind, 2</w:t>
-            </w:r>
-          </w:p>
-        </w:tc>
-      </w:tr>
-    </w:tbl>
-    <w:p/>
-    <w:p>
       <w:r>
         <w:rPr>
           <w:rFonts w:ascii="Courier New" w:hAnsi="Courier New"/>
@@ -1234,89 +377,7 @@
           <w:b w:val="0"/>
           <w:i w:val="0"/>
         </w:rPr>
-        <w:t xml:space="preserve"> is earthquake only. Regional populations overlap. Canada is included in NA earthquake, alongside the selected US states in the current query. NA hurricane currently includes all US exposure.</w:t>
-      </w:r>
-    </w:p>
-    <w:p>
-      <w:bookmarkStart w:id="6" w:name="bm_bscr_runbook_currency_and_the_preloaded_input"/>
-      <w:pPr>
-        <w:pStyle w:val="Heading2"/>
-        <w:keepNext/>
-      </w:pPr>
-      <w:r>
-        <w:rPr>
-          <w:b w:val="0"/>
-          <w:i w:val="0"/>
-        </w:rPr>
-        <w:t>Currency and the preloaded input</w:t>
-      </w:r>
-      <w:bookmarkEnd w:id="6"/>
-    </w:p>
-    <w:p>
-      <w:r>
-        <w:rPr>
-          <w:b w:val="0"/>
-          <w:i w:val="0"/>
-        </w:rPr>
-        <w:t xml:space="preserve">The SQL assumes source GBP and applies </w:t>
-      </w:r>
-      <w:r>
-        <w:rPr>
-          <w:rFonts w:ascii="Courier New" w:hAnsi="Courier New"/>
-          <w:b w:val="0"/>
-          <w:i w:val="0"/>
-          <w:sz w:val="18"/>
-        </w:rPr>
-        <w:t>@gbp_to_usd</w:t>
-      </w:r>
-      <w:r>
-        <w:rPr>
-          <w:b w:val="0"/>
-          <w:i w:val="0"/>
-        </w:rPr>
-        <w:t xml:space="preserve"> once in its final SELECT (default </w:t>
-      </w:r>
-      <w:r>
-        <w:rPr>
-          <w:b/>
-          <w:i w:val="0"/>
-        </w:rPr>
-        <w:t>1.35</w:t>
-      </w:r>
-      <w:r>
-        <w:rPr>
-          <w:b w:val="0"/>
-          <w:i w:val="0"/>
-        </w:rPr>
-        <w:t xml:space="preserve">). It returns </w:t>
-      </w:r>
-      <w:r>
-        <w:rPr>
-          <w:b/>
-          <w:i w:val="0"/>
-        </w:rPr>
-        <w:t>full USD</w:t>
-      </w:r>
-      <w:r>
-        <w:rPr>
-          <w:b w:val="0"/>
-          <w:i w:val="0"/>
-        </w:rPr>
-        <w:t xml:space="preserve">, not USD millions. The population workbook divides monetary amounts by one million and does </w:t>
-      </w:r>
-      <w:r>
-        <w:rPr>
-          <w:b/>
-          <w:i w:val="0"/>
-        </w:rPr>
-        <w:t>not</w:t>
-      </w:r>
-      <w:r>
-        <w:rPr>
-          <w:b w:val="0"/>
-          <w:i w:val="0"/>
-        </w:rPr>
-        <w:t xml:space="preserve"> apply FX again.</w:t>
+        <w:t xml:space="preserve"> is earthquake only. Do not add overlapping regional totals together.</w:t>
       </w:r>
     </w:p>
     <w:p>
@@ -1325,7 +386,25 @@
           <w:b w:val="0"/>
           <w:i w:val="0"/>
         </w:rPr>
-        <w:t xml:space="preserve">The initial 737 input rows were copied from the uploaded </w:t>
+        <w:t>• Resolve unmapped entities; counts are grouped rows, not verified distinct contracts.</w:t>
+      </w:r>
+    </w:p>
+    <w:p>
+      <w:r>
+        <w:rPr>
+          <w:b w:val="0"/>
+          <w:i w:val="0"/>
+        </w:rPr>
+        <w:t>Save the workbook with the SQL results and source/parameter record. Review before submission.</w:t>
+      </w:r>
+    </w:p>
+    <w:p>
+      <w:r>
+        <w:rPr>
+          <w:b w:val="0"/>
+          <w:i w:val="0"/>
+        </w:rPr>
+        <w:t xml:space="preserve">The preloaded data are the 737 uploaded rows from </w:t>
       </w:r>
       <w:hyperlink r:id="rId13">
         <w:r>
@@ -1341,1148 +420,15 @@
           <w:b w:val="0"/>
           <w:i w:val="0"/>
         </w:rPr>
-        <w:t>. They are not sample data or a live query result. We reproduced all 737 rows from the uploaded EDM tables, with exact counts and monetary differences below one cent. The initial filename is recorded in the SQL input header comment; it does not change automatically when new results are pasted.</w:t>
+        <w:t xml:space="preserve">, not a live database connection. Historical comparisons are kept in the </w:t>
       </w:r>
-    </w:p>
-    <w:p>
-      <w:r>
-        <w:rPr>
-          <w:b w:val="0"/>
-          <w:i w:val="0"/>
-        </w:rPr>
-        <w:t xml:space="preserve">Two supplied GB wind rows have no recognized entity. They are retained in the input but not assigned to one of the five entity tabs. Their gross/net exposure totals approximately USD 26.353bn; this is separate from earthquake </w:t>
-      </w:r>
-      <w:r>
-        <w:rPr>
-          <w:rFonts w:ascii="Courier New" w:hAnsi="Courier New"/>
-          <w:b w:val="0"/>
-          <w:i w:val="0"/>
-          <w:sz w:val="18"/>
-        </w:rPr>
-        <w:t>ALL</w:t>
-      </w:r>
-      <w:r>
-        <w:rPr>
-          <w:b w:val="0"/>
-          <w:i w:val="0"/>
-        </w:rPr>
-        <w:t>.</w:t>
-      </w:r>
-    </w:p>
-    <w:p>
-      <w:bookmarkStart w:id="7" w:name="bm_bscr_runbook_reconciliation_evidence"/>
-      <w:pPr>
-        <w:pStyle w:val="Heading2"/>
-        <w:keepNext/>
-      </w:pPr>
-      <w:r>
-        <w:rPr>
-          <w:b w:val="0"/>
-          <w:i w:val="0"/>
-        </w:rPr>
-        <w:t>Reconciliation evidence</w:t>
-      </w:r>
-      <w:bookmarkEnd w:id="7"/>
-    </w:p>
-    <w:p>
-      <w:hyperlink r:id="rId9">
+      <w:hyperlink r:id="rId11">
         <w:r>
           <w:rPr>
             <w:color w:val="0563C1"/>
             <w:u w:val="single"/>
           </w:rPr>
-          <w:t>BSCR_Reconciliation.xlsx</w:t>
-        </w:r>
-      </w:hyperlink>
-      <w:r>
-        <w:rPr>
-          <w:b w:val="0"/>
-          <w:i w:val="0"/>
-        </w:rPr>
-        <w:t xml:space="preserve"> has five tabs: </w:t>
-      </w:r>
-      <w:r>
-        <w:rPr>
-          <w:b/>
-          <w:i w:val="0"/>
-        </w:rPr>
-        <w:t>What this tests</w:t>
-      </w:r>
-      <w:r>
-        <w:rPr>
-          <w:b w:val="0"/>
-          <w:i w:val="0"/>
-        </w:rPr>
-        <w:t xml:space="preserve">, </w:t>
-      </w:r>
-      <w:r>
-        <w:rPr>
-          <w:b/>
-          <w:i w:val="0"/>
-        </w:rPr>
-        <w:t>Schedule X(f)</w:t>
-      </w:r>
-      <w:r>
-        <w:rPr>
-          <w:b w:val="0"/>
-          <w:i w:val="0"/>
-        </w:rPr>
-        <w:t xml:space="preserve">, </w:t>
-      </w:r>
-      <w:r>
-        <w:rPr>
-          <w:b/>
-          <w:i w:val="0"/>
-        </w:rPr>
-        <w:t>Counts</w:t>
-      </w:r>
-      <w:r>
-        <w:rPr>
-          <w:b w:val="0"/>
-          <w:i w:val="0"/>
-        </w:rPr>
-        <w:t xml:space="preserve">, </w:t>
-      </w:r>
-      <w:r>
-        <w:rPr>
-          <w:b/>
-          <w:i w:val="0"/>
-        </w:rPr>
-        <w:t>Gross exposure</w:t>
-      </w:r>
-      <w:r>
-        <w:rPr>
-          <w:b w:val="0"/>
-          <w:i w:val="0"/>
-        </w:rPr>
-        <w:t xml:space="preserve"> and </w:t>
-      </w:r>
-      <w:r>
-        <w:rPr>
-          <w:b/>
-          <w:i w:val="0"/>
-        </w:rPr>
-        <w:t>Net exposure</w:t>
-      </w:r>
-      <w:r>
-        <w:rPr>
-          <w:b w:val="0"/>
-          <w:i w:val="0"/>
-        </w:rPr>
-        <w:t>. It keeps reconciliation separate from routine population.</w:t>
-      </w:r>
-    </w:p>
-    <w:p>
-      <w:r>
-        <w:rPr>
-          <w:b w:val="0"/>
-          <w:i w:val="0"/>
-        </w:rPr>
-        <w:t>The evidence chain is:</w:t>
-      </w:r>
-    </w:p>
-    <w:p>
-      <w:r>
-        <w:rPr>
-          <w:b/>
-          <w:i w:val="0"/>
-        </w:rPr>
-        <w:t>Corrected February templates → old saved output → legacy query → corrected query → new saved output.</w:t>
-      </w:r>
-    </w:p>
-    <w:p>
-      <w:r>
-        <w:rPr>
-          <w:b w:val="0"/>
-          <w:i w:val="0"/>
-        </w:rPr>
-        <w:t xml:space="preserve">• The template check uses the </w:t>
-      </w:r>
-      <w:r>
-        <w:rPr>
-          <w:b/>
-          <w:i w:val="0"/>
-        </w:rPr>
-        <w:t>33 original</w:t>
-      </w:r>
-      <w:r>
-        <w:rPr>
-          <w:b w:val="0"/>
-          <w:i w:val="0"/>
-        </w:rPr>
-        <w:t xml:space="preserve"> and </w:t>
-      </w:r>
-      <w:r>
-        <w:rPr>
-          <w:b/>
-          <w:i w:val="0"/>
-        </w:rPr>
-        <w:t>3624/HIC/HIG/HSA v2</w:t>
-      </w:r>
-      <w:r>
-        <w:rPr>
-          <w:b w:val="0"/>
-          <w:i w:val="0"/>
-        </w:rPr>
-        <w:t xml:space="preserve"> files in </w:t>
-      </w:r>
-      <w:r>
-        <w:rPr>
-          <w:rFonts w:ascii="Courier New" w:hAnsi="Courier New"/>
-          <w:b w:val="0"/>
-          <w:i w:val="0"/>
-          <w:sz w:val="18"/>
-        </w:rPr>
-        <w:t>bscr/reconcile/filled in templates/</w:t>
-      </w:r>
-      <w:r>
-        <w:rPr>
-          <w:b w:val="0"/>
-          <w:i w:val="0"/>
-        </w:rPr>
-        <w:t>. All 528 populated count/exposure cells tested in the selected X(f) blocks match the old pre-FX output and legacy query within rounding. Other fields are not certified by that test.</w:t>
-      </w:r>
-    </w:p>
-    <w:p>
-      <w:r>
-        <w:rPr>
-          <w:b w:val="0"/>
-          <w:i w:val="0"/>
-        </w:rPr>
-        <w:t xml:space="preserve">• Those saved February monetary values are </w:t>
-      </w:r>
-      <w:r>
-        <w:rPr>
-          <w:b/>
-          <w:i w:val="0"/>
-        </w:rPr>
-        <w:t>pre-FX amounts divided by 1,000</w:t>
-      </w:r>
-      <w:r>
-        <w:rPr>
-          <w:b w:val="0"/>
-          <w:i w:val="0"/>
-        </w:rPr>
-        <w:t xml:space="preserve">, despite USD headings. The later workings' </w:t>
-      </w:r>
-      <w:r>
-        <w:rPr>
-          <w:b/>
-          <w:i w:val="0"/>
-        </w:rPr>
-        <w:t>1.35 USD conversion was missing</w:t>
-      </w:r>
-      <w:r>
-        <w:rPr>
-          <w:b w:val="0"/>
-          <w:i w:val="0"/>
-        </w:rPr>
-        <w:t xml:space="preserve">. Currency and thousand/million scaling are separate issues. The reconciliation shows the saved value, USD conversion at the same scale, and USD millions. Green </w:t>
-      </w:r>
-      <w:r>
-        <w:rPr>
-          <w:rFonts w:ascii="Courier New" w:hAnsi="Courier New"/>
-          <w:b w:val="0"/>
-          <w:i w:val="0"/>
-          <w:sz w:val="18"/>
-        </w:rPr>
-        <w:t>MATCH</w:t>
-      </w:r>
-      <w:r>
-        <w:rPr>
-          <w:b w:val="0"/>
-          <w:i w:val="0"/>
-        </w:rPr>
-        <w:t xml:space="preserve"> means agreement </w:t>
-      </w:r>
-      <w:r>
-        <w:rPr>
-          <w:b/>
-          <w:i w:val="0"/>
-        </w:rPr>
-        <w:t>after the stated conversion</w:t>
-      </w:r>
-      <w:r>
-        <w:rPr>
-          <w:b w:val="0"/>
-          <w:i w:val="0"/>
-        </w:rPr>
-        <w:t>, not that the original template was already in USD. Counts never receive FX.</w:t>
-      </w:r>
-    </w:p>
-    <w:p>
-      <w:r>
-        <w:rPr>
-          <w:b w:val="0"/>
-          <w:i w:val="0"/>
-        </w:rPr>
-        <w:t xml:space="preserve">• The original SQL and Python aggregation reproduce all </w:t>
-      </w:r>
-      <w:r>
-        <w:rPr>
-          <w:b/>
-          <w:i w:val="0"/>
-        </w:rPr>
-        <w:t>452 historical CSV rows</w:t>
-      </w:r>
-      <w:r>
-        <w:rPr>
-          <w:b w:val="0"/>
-          <w:i w:val="0"/>
-        </w:rPr>
-        <w:t xml:space="preserve">. The retained legacy SQL also matches the </w:t>
-      </w:r>
-      <w:r>
-        <w:rPr>
-          <w:b/>
-          <w:i w:val="0"/>
-        </w:rPr>
-        <w:t>49 groups</w:t>
-      </w:r>
-      <w:r>
-        <w:rPr>
-          <w:b w:val="0"/>
-          <w:i w:val="0"/>
-        </w:rPr>
-        <w:t xml:space="preserve"> in the later March USD workings. Counts are exact and monetary residuals are below one cent.</w:t>
-      </w:r>
-    </w:p>
-    <w:p>
-      <w:r>
-        <w:rPr>
-          <w:b w:val="0"/>
-          <w:i w:val="0"/>
-        </w:rPr>
-        <w:t xml:space="preserve">• Fixing only the geocode join explains the whole earthquake </w:t>
-      </w:r>
-      <w:r>
-        <w:rPr>
-          <w:rFonts w:ascii="Courier New" w:hAnsi="Courier New"/>
-          <w:b w:val="0"/>
-          <w:i w:val="0"/>
-          <w:sz w:val="18"/>
-        </w:rPr>
-        <w:t>ALL</w:t>
-      </w:r>
-      <w:r>
-        <w:rPr>
-          <w:b w:val="0"/>
-          <w:i w:val="0"/>
-        </w:rPr>
-        <w:t xml:space="preserve"> reduction: </w:t>
-      </w:r>
-      <w:r>
-        <w:rPr>
-          <w:b/>
-          <w:i w:val="0"/>
-        </w:rPr>
-        <w:t>USD 4.813bn gross, USD 3.051bn net and 285 grouped rows</w:t>
-      </w:r>
-      <w:r>
-        <w:rPr>
-          <w:b w:val="0"/>
-          <w:i w:val="0"/>
-        </w:rPr>
-        <w:t xml:space="preserve">, across </w:t>
-      </w:r>
-      <w:r>
-        <w:rPr>
-          <w:b/>
-          <w:i w:val="0"/>
-        </w:rPr>
-        <w:t>184 accounts</w:t>
-      </w:r>
-      <w:r>
-        <w:rPr>
-          <w:b w:val="0"/>
-          <w:i w:val="0"/>
-        </w:rPr>
-        <w:t xml:space="preserve"> with both geocode flags. The old join duplicated exposure between buckets; source policies were not deleted.</w:t>
-      </w:r>
-    </w:p>
-    <w:p>
-      <w:r>
-        <w:rPr>
-          <w:b w:val="0"/>
-          <w:i w:val="0"/>
-        </w:rPr>
-        <w:t>• Policy-ID grouping has no material effect on this snapshot because no account has multiple type-1 policies. This is not a rule for other datasets.</w:t>
-      </w:r>
-    </w:p>
-    <w:p>
-      <w:r>
-        <w:rPr>
-          <w:b w:val="0"/>
-          <w:i w:val="0"/>
-        </w:rPr>
-        <w:t>• All five April total counts and all 46 populated regional gross/net limits match the later historical workings (regional money within USD 1). Rounded overall amounts and manually reallocated classification splits can differ.</w:t>
-      </w:r>
-    </w:p>
-    <w:p>
-      <w:r>
-        <w:rPr>
-          <w:b w:val="0"/>
-          <w:i w:val="0"/>
-        </w:rPr>
-        <w:t>These checks were local DuckDB replays against saved outputs, not live SQL Server executions. Case-insensitive source comparisons and legacy Python's case-sensitive geographic comparisons were distinguished. File dates do not prove submission.</w:t>
-      </w:r>
-    </w:p>
-    <w:p>
-      <w:bookmarkStart w:id="8" w:name="bm_bscr_runbook_legacy_query_and_reference_workbooks"/>
-      <w:pPr>
-        <w:pStyle w:val="Heading2"/>
-        <w:keepNext/>
-      </w:pPr>
-      <w:r>
-        <w:rPr>
-          <w:b w:val="0"/>
-          <w:i w:val="0"/>
-        </w:rPr>
-        <w:t>Legacy query and reference workbooks</w:t>
-      </w:r>
-      <w:bookmarkEnd w:id="8"/>
-    </w:p>
-    <w:p>
-      <w:r>
-        <w:rPr>
-          <w:b w:val="0"/>
-          <w:i w:val="0"/>
-        </w:rPr>
-        <w:t>Only two SQL scripts are retained:</w:t>
-      </w:r>
-    </w:p>
-    <w:tbl>
-      <w:tblPr>
-        <w:tblStyle w:val="TableGrid"/>
-        <w:tblW w:type="auto" w:w="0"/>
-        <w:tblLook w:firstColumn="1" w:firstRow="1" w:lastColumn="0" w:lastRow="0" w:noHBand="0" w:noVBand="1" w:val="04A0"/>
-      </w:tblPr>
-      <w:tblGrid>
-        <w:gridCol w:w="5040"/>
-        <w:gridCol w:w="5040"/>
-      </w:tblGrid>
-      <w:tr>
-        <w:tc>
-          <w:tcPr>
-            <w:tcW w:type="dxa" w:w="5040"/>
-            <w:shd w:fill="D9EAF7"/>
-          </w:tcPr>
-          <w:p>
-            <w:r>
-              <w:rPr>
-                <w:b/>
-              </w:rPr>
-            </w:r>
-            <w:r>
-              <w:rPr>
-                <w:b/>
-                <w:i w:val="0"/>
-              </w:rPr>
-              <w:t>Script</w:t>
-            </w:r>
-          </w:p>
-        </w:tc>
-        <w:tc>
-          <w:tcPr>
-            <w:tcW w:type="dxa" w:w="5040"/>
-            <w:shd w:fill="D9EAF7"/>
-          </w:tcPr>
-          <w:p>
-            <w:r>
-              <w:rPr>
-                <w:b/>
-              </w:rPr>
-            </w:r>
-            <w:r>
-              <w:rPr>
-                <w:b/>
-                <w:i w:val="0"/>
-              </w:rPr>
-              <w:t>Role</w:t>
-            </w:r>
-          </w:p>
-        </w:tc>
-      </w:tr>
-      <w:tr>
-        <w:tc>
-          <w:tcPr>
-            <w:tcW w:type="dxa" w:w="5040"/>
-          </w:tcPr>
-          <w:p>
-            <w:r/>
-            <w:r>
-              <w:rPr>
-                <w:rFonts w:ascii="Courier New" w:hAnsi="Courier New"/>
-                <w:b w:val="0"/>
-                <w:i w:val="0"/>
-                <w:sz w:val="18"/>
-              </w:rPr>
-              <w:t>bscr-output.sql</w:t>
-            </w:r>
-          </w:p>
-        </w:tc>
-        <w:tc>
-          <w:tcPr>
-            <w:tcW w:type="dxa" w:w="5040"/>
-          </w:tcPr>
-          <w:p>
-            <w:r/>
-            <w:r>
-              <w:rPr>
-                <w:b w:val="0"/>
-                <w:i w:val="0"/>
-              </w:rPr>
-              <w:t>Current calculation and input to the population workbook</w:t>
-            </w:r>
-          </w:p>
-        </w:tc>
-      </w:tr>
-      <w:tr>
-        <w:tc>
-          <w:tcPr>
-            <w:tcW w:type="dxa" w:w="5040"/>
-          </w:tcPr>
-          <w:p>
-            <w:r/>
-            <w:hyperlink r:id="rId14">
-              <w:r>
-                <w:rPr>
-                  <w:color w:val="0563C1"/>
-                  <w:u w:val="single"/>
-                </w:rPr>
-                <w:t>bscr-extract-legacy.sql</w:t>
-              </w:r>
-            </w:hyperlink>
-          </w:p>
-        </w:tc>
-        <w:tc>
-          <w:tcPr>
-            <w:tcW w:type="dxa" w:w="5040"/>
-          </w:tcPr>
-          <w:p>
-            <w:r/>
-            <w:r>
-              <w:rPr>
-                <w:b w:val="0"/>
-                <w:i w:val="0"/>
-              </w:rPr>
-              <w:t>Full historical aggregate, despite its name; diagnostic only</w:t>
-            </w:r>
-          </w:p>
-        </w:tc>
-      </w:tr>
-    </w:tbl>
-    <w:p/>
-    <w:p>
-      <w:r>
-        <w:rPr>
-          <w:b w:val="0"/>
-          <w:i w:val="0"/>
-        </w:rPr>
-        <w:t>The legacy query intentionally retains old geocode duplication, cap grouping without policy ID, earthquake/policy type 1 for every region, and Python-style case-sensitive geography. Both queries return eight columns and default to full USD at FX 1.35. Set legacy FX to 1 only to compare directly with the old unconverted CSV. The queries differ in more than geocoding; the controlled reconciliation isolated each change rather than attributing every region's difference to the join.</w:t>
-      </w:r>
-    </w:p>
-    <w:p>
-      <w:r>
-        <w:rPr>
-          <w:rFonts w:ascii="Courier New" w:hAnsi="Courier New"/>
-          <w:b w:val="0"/>
-          <w:i w:val="0"/>
-          <w:sz w:val="18"/>
-        </w:rPr>
-        <w:t>workings_old_report.xlsx</w:t>
-      </w:r>
-      <w:r>
-        <w:rPr>
-          <w:b w:val="0"/>
-          <w:i w:val="0"/>
-        </w:rPr>
-        <w:t xml:space="preserve"> is identical to </w:t>
-      </w:r>
-      <w:r>
-        <w:rPr>
-          <w:rFonts w:ascii="Courier New" w:hAnsi="Courier New"/>
-          <w:b w:val="0"/>
-          <w:i w:val="0"/>
-          <w:sz w:val="18"/>
-        </w:rPr>
-        <w:t>Workings_with_geocodingFW.xlsx</w:t>
-      </w:r>
-      <w:r>
-        <w:rPr>
-          <w:b w:val="0"/>
-          <w:i w:val="0"/>
-        </w:rPr>
-        <w:t xml:space="preserve">. The earlier workings divide by 1,000; FW divides by 1,000,000. The later </w:t>
-      </w:r>
-      <w:r>
-        <w:rPr>
-          <w:rFonts w:ascii="Courier New" w:hAnsi="Courier New"/>
-          <w:b w:val="0"/>
-          <w:i w:val="0"/>
-          <w:sz w:val="18"/>
-        </w:rPr>
-        <w:t>Workings_with_geocodingFW - Including blanks USD.xlsx</w:t>
-      </w:r>
-      <w:r>
-        <w:rPr>
-          <w:b w:val="0"/>
-          <w:i w:val="0"/>
-        </w:rPr>
-        <w:t xml:space="preserve"> applies FX and restores US exposure to NA hurricane. Do not reproduce the earlier workbook's US omission in the current calculation.</w:t>
-      </w:r>
-    </w:p>
-    <w:p>
-      <w:r>
-        <w:rPr>
-          <w:b w:val="0"/>
-          <w:i w:val="0"/>
-        </w:rPr>
-        <w:t xml:space="preserve">The older </w:t>
-      </w:r>
-      <w:r>
-        <w:rPr>
-          <w:rFonts w:ascii="Courier New" w:hAnsi="Courier New"/>
-          <w:b w:val="0"/>
-          <w:i w:val="0"/>
-          <w:sz w:val="18"/>
-        </w:rPr>
-        <w:t>bscr/workbooks/BSCR_Workings.xlsx</w:t>
-      </w:r>
-      <w:r>
-        <w:rPr>
-          <w:b w:val="0"/>
-          <w:i w:val="0"/>
-        </w:rPr>
-        <w:t xml:space="preserve"> is </w:t>
-      </w:r>
-      <w:r>
-        <w:rPr>
-          <w:b/>
-          <w:i w:val="0"/>
-        </w:rPr>
-        <w:t>not the current population workbook</w:t>
-      </w:r>
-      <w:r>
-        <w:rPr>
-          <w:b w:val="0"/>
-          <w:i w:val="0"/>
-        </w:rPr>
-        <w:t xml:space="preserve">. It has been restored byte-for-byte from Git revision </w:t>
-      </w:r>
-      <w:r>
-        <w:rPr>
-          <w:rFonts w:ascii="Courier New" w:hAnsi="Courier New"/>
-          <w:b w:val="0"/>
-          <w:i w:val="0"/>
-          <w:sz w:val="18"/>
-        </w:rPr>
-        <w:t>d6aedfe</w:t>
-      </w:r>
-      <w:r>
-        <w:rPr>
-          <w:b w:val="0"/>
-          <w:i w:val="0"/>
-        </w:rPr>
-        <w:t xml:space="preserve"> (21 September 2026), the preceding distinct version after a later workbook was reported corrupt. The restored package/XML and formula/cached-value loading pass local checks, but native Excel opening still needs confirmation. Earlier versions' fixed ranges, Japanese peril references and workbook FX remain historical risks. Use the new eight-column population workbook for the current route, not this restored reference file.</w:t>
-      </w:r>
-    </w:p>
-    <w:p>
-      <w:r>
-        <w:rPr>
-          <w:b w:val="0"/>
-          <w:i w:val="0"/>
-        </w:rPr>
-        <w:t xml:space="preserve">Historical Python scripts are archived in </w:t>
-      </w:r>
-      <w:r>
-        <w:rPr>
-          <w:rFonts w:ascii="Courier New" w:hAnsi="Courier New"/>
-          <w:b w:val="0"/>
-          <w:i w:val="0"/>
-          <w:sz w:val="18"/>
-        </w:rPr>
-        <w:t>bscr/old-process/</w:t>
-      </w:r>
-      <w:r>
-        <w:rPr>
-          <w:b w:val="0"/>
-          <w:i w:val="0"/>
-        </w:rPr>
-        <w:t xml:space="preserve">: </w:t>
-      </w:r>
-      <w:r>
-        <w:rPr>
-          <w:rFonts w:ascii="Courier New" w:hAnsi="Courier New"/>
-          <w:b w:val="0"/>
-          <w:i w:val="0"/>
-          <w:sz w:val="18"/>
-        </w:rPr>
-        <w:t>BSCR_UKEU.py</w:t>
-      </w:r>
-      <w:r>
-        <w:rPr>
-          <w:b w:val="0"/>
-          <w:i w:val="0"/>
-        </w:rPr>
-        <w:t xml:space="preserve"> is the original Marimo application and </w:t>
-      </w:r>
-      <w:r>
-        <w:rPr>
-          <w:rFonts w:ascii="Courier New" w:hAnsi="Courier New"/>
-          <w:b w:val="0"/>
-          <w:i w:val="0"/>
-          <w:sz w:val="18"/>
-        </w:rPr>
-        <w:t>BSCR_UKEU_offline.py</w:t>
-      </w:r>
-      <w:r>
-        <w:rPr>
-          <w:b w:val="0"/>
-          <w:i w:val="0"/>
-        </w:rPr>
-        <w:t xml:space="preserve"> is the older seven-column CSV workflow. The duplicate top-level Marimo copy was removed after verifying identical contents. Neither is the current producer; active local builders remain in </w:t>
-      </w:r>
-      <w:r>
-        <w:rPr>
-          <w:rFonts w:ascii="Courier New" w:hAnsi="Courier New"/>
-          <w:b w:val="0"/>
-          <w:i w:val="0"/>
-          <w:sz w:val="18"/>
-        </w:rPr>
-        <w:t>bscr/tools/</w:t>
-      </w:r>
-      <w:r>
-        <w:rPr>
-          <w:b w:val="0"/>
-          <w:i w:val="0"/>
-        </w:rPr>
-        <w:t>. Source templates, raw workbooks and historical CSVs remain unchanged as evidence; their cached errors, external links and placeholders do not constitute approved current inputs.</w:t>
-      </w:r>
-    </w:p>
-    <w:p>
-      <w:bookmarkStart w:id="9" w:name="bm_bscr_runbook_raw_source_data_and_verification_limits"/>
-      <w:pPr>
-        <w:pStyle w:val="Heading2"/>
-        <w:keepNext/>
-      </w:pPr>
-      <w:r>
-        <w:rPr>
-          <w:b w:val="0"/>
-          <w:i w:val="0"/>
-        </w:rPr>
-        <w:t>Raw source data and verification limits</w:t>
-      </w:r>
-      <w:bookmarkEnd w:id="9"/>
-    </w:p>
-    <w:p>
-      <w:r>
-        <w:rPr>
-          <w:b w:val="0"/>
-          <w:i w:val="0"/>
-        </w:rPr>
-        <w:t xml:space="preserve">The six uploaded files in </w:t>
-      </w:r>
-      <w:r>
-        <w:rPr>
-          <w:rFonts w:ascii="Courier New" w:hAnsi="Courier New"/>
-          <w:b w:val="0"/>
-          <w:i w:val="0"/>
-          <w:sz w:val="18"/>
-        </w:rPr>
-        <w:t>bscr/sql/edm-parquet/</w:t>
-      </w:r>
-      <w:r>
-        <w:rPr>
-          <w:b w:val="0"/>
-          <w:i w:val="0"/>
-        </w:rPr>
-        <w:t xml:space="preserve"> are </w:t>
-      </w:r>
-      <w:r>
-        <w:rPr>
-          <w:b/>
-          <w:i w:val="0"/>
-        </w:rPr>
-        <w:t>CSV</w:t>
-      </w:r>
-      <w:r>
-        <w:rPr>
-          <w:b w:val="0"/>
-          <w:i w:val="0"/>
-        </w:rPr>
-        <w:t>, despite the folder name:</w:t>
-      </w:r>
-    </w:p>
-    <w:tbl>
-      <w:tblPr>
-        <w:tblStyle w:val="TableGrid"/>
-        <w:tblW w:type="auto" w:w="0"/>
-        <w:tblLook w:firstColumn="1" w:firstRow="1" w:lastColumn="0" w:lastRow="0" w:noHBand="0" w:noVBand="1" w:val="04A0"/>
-      </w:tblPr>
-      <w:tblGrid>
-        <w:gridCol w:w="5040"/>
-        <w:gridCol w:w="5040"/>
-      </w:tblGrid>
-      <w:tr>
-        <w:tc>
-          <w:tcPr>
-            <w:tcW w:type="dxa" w:w="5040"/>
-            <w:shd w:fill="D9EAF7"/>
-          </w:tcPr>
-          <w:p>
-            <w:r>
-              <w:rPr>
-                <w:b/>
-              </w:rPr>
-            </w:r>
-            <w:r>
-              <w:rPr>
-                <w:b/>
-                <w:i w:val="0"/>
-              </w:rPr>
-              <w:t>File</w:t>
-            </w:r>
-          </w:p>
-        </w:tc>
-        <w:tc>
-          <w:tcPr>
-            <w:tcW w:type="dxa" w:w="5040"/>
-            <w:shd w:fill="D9EAF7"/>
-          </w:tcPr>
-          <w:p>
-            <w:r>
-              <w:rPr>
-                <w:b/>
-              </w:rPr>
-            </w:r>
-            <w:r>
-              <w:rPr>
-                <w:b/>
-                <w:i w:val="0"/>
-              </w:rPr>
-              <w:t>Verified rows / content</w:t>
-            </w:r>
-          </w:p>
-        </w:tc>
-      </w:tr>
-      <w:tr>
-        <w:tc>
-          <w:tcPr>
-            <w:tcW w:type="dxa" w:w="5040"/>
-          </w:tcPr>
-          <w:p>
-            <w:r/>
-            <w:r>
-              <w:rPr>
-                <w:rFonts w:ascii="Courier New" w:hAnsi="Courier New"/>
-                <w:b w:val="0"/>
-                <w:i w:val="0"/>
-                <w:sz w:val="18"/>
-              </w:rPr>
-              <w:t>01_accgrp.csv</w:t>
-            </w:r>
-          </w:p>
-        </w:tc>
-        <w:tc>
-          <w:tcPr>
-            <w:tcW w:type="dxa" w:w="5040"/>
-          </w:tcPr>
-          <w:p>
-            <w:r/>
-            <w:r>
-              <w:rPr>
-                <w:b w:val="0"/>
-                <w:i w:val="0"/>
-              </w:rPr>
-              <w:t>354,830</w:t>
-            </w:r>
-          </w:p>
-        </w:tc>
-      </w:tr>
-      <w:tr>
-        <w:tc>
-          <w:tcPr>
-            <w:tcW w:type="dxa" w:w="5040"/>
-          </w:tcPr>
-          <w:p>
-            <w:r/>
-            <w:r>
-              <w:rPr>
-                <w:rFonts w:ascii="Courier New" w:hAnsi="Courier New"/>
-                <w:b w:val="0"/>
-                <w:i w:val="0"/>
-                <w:sz w:val="18"/>
-              </w:rPr>
-              <w:t>02_policy.csv</w:t>
-            </w:r>
-          </w:p>
-        </w:tc>
-        <w:tc>
-          <w:tcPr>
-            <w:tcW w:type="dxa" w:w="5040"/>
-          </w:tcPr>
-          <w:p>
-            <w:r/>
-            <w:r>
-              <w:rPr>
-                <w:b w:val="0"/>
-                <w:i w:val="0"/>
-              </w:rPr>
-              <w:t>662,306</w:t>
-            </w:r>
-          </w:p>
-        </w:tc>
-      </w:tr>
-      <w:tr>
-        <w:tc>
-          <w:tcPr>
-            <w:tcW w:type="dxa" w:w="5040"/>
-          </w:tcPr>
-          <w:p>
-            <w:r/>
-            <w:r>
-              <w:rPr>
-                <w:rFonts w:ascii="Courier New" w:hAnsi="Courier New"/>
-                <w:b w:val="0"/>
-                <w:i w:val="0"/>
-                <w:sz w:val="18"/>
-              </w:rPr>
-              <w:t>03_loc.csv</w:t>
-            </w:r>
-          </w:p>
-        </w:tc>
-        <w:tc>
-          <w:tcPr>
-            <w:tcW w:type="dxa" w:w="5040"/>
-          </w:tcPr>
-          <w:p>
-            <w:r/>
-            <w:r>
-              <w:rPr>
-                <w:b w:val="0"/>
-                <w:i w:val="0"/>
-              </w:rPr>
-              <w:t>1,008,151</w:t>
-            </w:r>
-          </w:p>
-        </w:tc>
-      </w:tr>
-      <w:tr>
-        <w:tc>
-          <w:tcPr>
-            <w:tcW w:type="dxa" w:w="5040"/>
-          </w:tcPr>
-          <w:p>
-            <w:r/>
-            <w:r>
-              <w:rPr>
-                <w:rFonts w:ascii="Courier New" w:hAnsi="Courier New"/>
-                <w:b w:val="0"/>
-                <w:i w:val="0"/>
-                <w:sz w:val="18"/>
-              </w:rPr>
-              <w:t>04_loccvg.csv</w:t>
-            </w:r>
-          </w:p>
-        </w:tc>
-        <w:tc>
-          <w:tcPr>
-            <w:tcW w:type="dxa" w:w="5040"/>
-          </w:tcPr>
-          <w:p>
-            <w:r/>
-            <w:r>
-              <w:rPr>
-                <w:b w:val="0"/>
-                <w:i w:val="0"/>
-              </w:rPr>
-              <w:t>1,053,391</w:t>
-            </w:r>
-          </w:p>
-        </w:tc>
-      </w:tr>
-      <w:tr>
-        <w:tc>
-          <w:tcPr>
-            <w:tcW w:type="dxa" w:w="5040"/>
-          </w:tcPr>
-          <w:p>
-            <w:r/>
-            <w:r>
-              <w:rPr>
-                <w:rFonts w:ascii="Courier New" w:hAnsi="Courier New"/>
-                <w:b w:val="0"/>
-                <w:i w:val="0"/>
-                <w:sz w:val="18"/>
-              </w:rPr>
-              <w:t>source_metadata.csv</w:t>
-            </w:r>
-          </w:p>
-        </w:tc>
-        <w:tc>
-          <w:tcPr>
-            <w:tcW w:type="dxa" w:w="5040"/>
-          </w:tcPr>
-          <w:p>
-            <w:r/>
-            <w:r>
-              <w:rPr>
-                <w:b w:val="0"/>
-                <w:i w:val="0"/>
-              </w:rPr>
-              <w:t>Database, time, collation and row counts</w:t>
-            </w:r>
-          </w:p>
-        </w:tc>
-      </w:tr>
-      <w:tr>
-        <w:tc>
-          <w:tcPr>
-            <w:tcW w:type="dxa" w:w="5040"/>
-          </w:tcPr>
-          <w:p>
-            <w:r/>
-            <w:r>
-              <w:rPr>
-                <w:rFonts w:ascii="Courier New" w:hAnsi="Courier New"/>
-                <w:b w:val="0"/>
-                <w:i w:val="0"/>
-                <w:sz w:val="18"/>
-              </w:rPr>
-              <w:t>06_schema.csv</w:t>
-            </w:r>
-          </w:p>
-        </w:tc>
-        <w:tc>
-          <w:tcPr>
-            <w:tcW w:type="dxa" w:w="5040"/>
-          </w:tcPr>
-          <w:p>
-            <w:r/>
-            <w:r>
-              <w:rPr>
-                <w:b w:val="0"/>
-                <w:i w:val="0"/>
-              </w:rPr>
-              <w:t>Source column definitions</w:t>
-            </w:r>
-          </w:p>
-        </w:tc>
-      </w:tr>
-    </w:tbl>
-    <w:p/>
-    <w:p>
-      <w:r>
-        <w:rPr>
-          <w:b w:val="0"/>
-          <w:i w:val="0"/>
-        </w:rPr>
-        <w:t xml:space="preserve">All four source counts match the metadata for </w:t>
-      </w:r>
-      <w:r>
-        <w:rPr>
-          <w:rFonts w:ascii="Courier New" w:hAnsi="Courier New"/>
-          <w:b w:val="0"/>
-          <w:i w:val="0"/>
-          <w:sz w:val="18"/>
-        </w:rPr>
-        <w:t>HISCO_UKEU_01JAN26_010126_ROLLUP_ByLOB_GC_EDM</w:t>
-      </w:r>
-      <w:r>
-        <w:rPr>
-          <w:b w:val="0"/>
-          <w:i w:val="0"/>
-        </w:rPr>
-        <w:t xml:space="preserve">. Preserve duplicates, native values and empty strings versus NULL representations. Do not apply FX or resave the raw CSVs in Excel. The 30 literal </w:t>
-      </w:r>
-      <w:r>
-        <w:rPr>
-          <w:rFonts w:ascii="Courier New" w:hAnsi="Courier New"/>
-          <w:b w:val="0"/>
-          <w:i w:val="0"/>
-          <w:sz w:val="18"/>
-        </w:rPr>
-        <w:t>NULL</w:t>
-      </w:r>
-      <w:r>
-        <w:rPr>
-          <w:b w:val="0"/>
-          <w:i w:val="0"/>
-        </w:rPr>
-        <w:t xml:space="preserve"> state markers occur in French/German locations; raw lexical values were preserved during inspection.</w:t>
-      </w:r>
-    </w:p>
-    <w:p>
-      <w:r>
-        <w:rPr>
-          <w:b w:val="0"/>
-          <w:i w:val="0"/>
-        </w:rPr>
-        <w:t xml:space="preserve">The local builder </w:t>
-      </w:r>
-      <w:r>
-        <w:rPr>
-          <w:rFonts w:ascii="Courier New" w:hAnsi="Courier New"/>
-          <w:b w:val="0"/>
-          <w:i w:val="0"/>
-          <w:sz w:val="18"/>
-        </w:rPr>
-        <w:t>bscr/tools/build_population_workbook.py</w:t>
-      </w:r>
-      <w:r>
-        <w:rPr>
-          <w:b w:val="0"/>
-          <w:i w:val="0"/>
-        </w:rPr>
-        <w:t xml:space="preserve"> verifies </w:t>
-      </w:r>
-      <w:r>
-        <w:rPr>
-          <w:b/>
-          <w:i w:val="0"/>
-        </w:rPr>
-        <w:t>630 automatic mappings</w:t>
-      </w:r>
-      <w:r>
-        <w:rPr>
-          <w:b w:val="0"/>
-          <w:i w:val="0"/>
-        </w:rPr>
-        <w:t xml:space="preserve"> with an independent Excel-function engine and writes cached formula results. Input-change tests covered counts, gross/net, US subtraction, wind routing and missing-entity warnings. Native Excel rendering/recalculation was not available locally; the work-laptop review remains necessary.</w:t>
-      </w:r>
-    </w:p>
-    <w:p>
-      <w:r>
-        <w:rPr>
-          <w:b w:val="0"/>
-          <w:i w:val="0"/>
-        </w:rPr>
-        <w:t xml:space="preserve">Remaining controls include the source currency/rate for each new run, policy-cap allocation grain, grouped-row versus distinct-contract counts, unmapped entities, manual supplemental inputs and final-template approval. The agreed geocode proxy is implemented; it is not a claim that all April manual classifications were reproduced. See </w:t>
-      </w:r>
-      <w:hyperlink r:id="rId15">
-        <w:r>
-          <w:rPr>
-            <w:color w:val="0563C1"/>
-            <w:u w:val="single"/>
-          </w:rPr>
-          <w:t>decisions</w:t>
-        </w:r>
-      </w:hyperlink>
-      <w:r>
-        <w:rPr>
-          <w:b w:val="0"/>
-          <w:i w:val="0"/>
-        </w:rPr>
-        <w:t xml:space="preserve"> and the </w:t>
-      </w:r>
-      <w:hyperlink r:id="rId16">
-        <w:r>
-          <w:rPr>
-            <w:color w:val="0563C1"/>
-            <w:u w:val="single"/>
-          </w:rPr>
-          <w:t>discrepancy register</w:t>
+          <w:t>separate reconciliation</w:t>
         </w:r>
       </w:hyperlink>
       <w:r>

</xml_diff>